<commit_message>
Record adjudicated screening batch B2
</commit_message>
<xml_diff>
--- a/Avian_review_paper_submission_ready.docx
+++ b/Avian_review_paper_submission_ready.docx
@@ -32,8 +32,7 @@
         <w:spacing w:before="0" w:after="120"/>
       </w:pPr>
       <w:r>
-        <w:rPr/>
-        <w:t>Background: Avian influenza viruses (AIVs) have caused recurrent poultry outbreaks and molecularly distinct detections in Nigeria since 2006. Objective: This submission-stage protocol prespecifies a systematic review of emergence, temporal and geographic distribution, host range, and molecular/clade/reassortment dynamics of Nigeria-specific AIVs. Methods: The protocol uses a CoCoPop/PEO framework and is aligned with PRISMA 2020, PRISMA-S and SWiM. The study/search window is 2006–2026; the operational status snapshot is 20 September 2026. Results status: 2,367 source rows had been reconciled into 1,877 provisional identities; 140 title/metadata records have been screened, yielding 98 clear exclusions and 42 provisional full-text candidates. Final screening, full-text assessment, extraction, risk-of-bias appraisal, synthesis and a PRISMA flow are not complete. Conclusion: This document is a protocol and search/record-management status report, not a completed systematic review.</w:t>
+        <w:t>Background: Avian influenza viruses (AIVs) have caused recurrent poultry outbreaks and molecularly distinct detections in Nigeria since 2006. Objective: This submission-stage protocol prespecifies a systematic review of emergence, temporal and geographic distribution, host range, and molecular/clade/reassortment dynamics of Nigeria-specific AIVs. Methods: The protocol uses a CoCoPop/PEO framework and is aligned with PRISMA 2020, PRISMA-S and SWiM. The study/search window is 2006-2026; the operational status snapshot is 20 September 2026. Results status: 2,367 source rows had been reconciled into 1,877 provisional identities; 240 title/metadata records have been screened, yielding 181 clear exclusions and 59 provisional full-text candidates. Final screening, full-text assessment, extraction, risk-of-bias appraisal, synthesis and a PRISMA flow are not complete. Conclusion: This document is a protocol and search/record-management status report, not a completed systematic review.</w:t>
       </w:r>
     </w:p>
     <w:p>
@@ -42,13 +41,7 @@
         <w:ind w:left="216" w:right="216"/>
       </w:pPr>
       <w:r>
-        <w:rPr>
-          <w:rFonts w:ascii="Times New Roman" w:hAnsi="Times New Roman"/>
-          <w:b/>
-          <w:color w:val="800000"/>
-          <w:sz w:val="21"/>
-        </w:rPr>
-        <w:t>STATUS NOTE – 22 September 2026: Gate C remains open. The adjudicated R1/R2 title/metadata pilot of 40 records and Batch R1-B1 (the first 100 non-pilot canonical records by canonical_id order, CAN-0015 through CAN-0134 with pilot IDs omitted) produced 98 clear exclusions and 42 provisional full-text candidates. Batch R1-B1 had exact R1/R2 agreement (100/100) and no adjudication disagreements. The remaining 1,737 canonical identities are unresolved/non-final. Gates D–J are incomplete; no final PRISMA flow, included-study set, extraction, risk-of-bias assessment or synthesis is reported here.</w:t>
+        <w:t>STATUS NOTE - 22 September 2026: Gate C remains open. The adjudicated R1/R2 title/metadata pilot of 40 records and Batch R1-B1 (the first 100 non-pilot canonical records by canonical_id order, CAN-0015 through CAN-0134 with pilot IDs omitted) produced 98 clear exclusions and 42 provisional full-text candidates. Batch R1-B1 had exact R1/R2 agreement (100/100) and no adjudication disagreements. The adjudicated Batch B2 screened the next 100 non-pilot canonical records after B1 (CAN-0135-CAN-0240, with pilot IDs omitted): 17 records were retained as provisional full-text candidates and 83 were excluded after eight R1/R2 disagreements were adjudicated. Cumulatively, 240 title/metadata records have been screened, with 181 exclusions and 59 provisional full-text candidates; 1,637 canonical identities remain unresolved/non-final. Gates D-J are incomplete; no final PRISMA flow, included-study set, extraction, risk-of-bias assessment or synthesis is reported here.</w:t>
       </w:r>
     </w:p>
     <w:p>
@@ -217,8 +210,7 @@
         <w:spacing w:before="0" w:after="120"/>
       </w:pPr>
       <w:r>
-        <w:rPr/>
-        <w:t>Records were reconciled using symmetric DOI, PMID, or exact normalised title-plus-year matching. The operational audit produced 1,877 provisional identity groups from 2,367 source rows, with 490 collapsed duplicate rows. The controlled title/metadata-screening denominator is therefore 1,877. R1 and R2 independently screened and adjudicated a 40-record pilot (25 clear exclusions; 15 provisional full-text candidates) and independently screened Batch R1-B1, the first 100 non-pilot canonical records by canonical_id order (CAN-0015 through CAN-0134 with pilot IDs omitted). Batch R1-B1 had exact agreement (100/100), with 17 Include-for-full-text, 10 Unsure/retain-for-full-text and 73 Exclude decisions; no adjudication disagreements occurred. Combined, 140 title/metadata records have been screened: 98 clear exclusions and 42 provisional full-text candidates. The remaining 1,737 canonical identities are unresolved/non-final. No final title/metadata decision, full-text eligibility decision or included-study count exists. The planned dual-review process applies Nigeria linkage, laboratory-confirmed avian AIV, at least one relevant evidence type, and extractable primary-data questions; an unsure record proceeds to full text rather than being assumed excluded.</w:t>
+        <w:t>Records were reconciled using symmetric DOI, PMID, or exact normalised title-plus-year matching. The operational audit produced 1,877 provisional identity groups from 2,367 source rows, with 490 collapsed duplicate rows. The controlled title/metadata-screening denominator is therefore 1,877. R1 and R2 independently screened and adjudicated a 40-record pilot (25 clear exclusions; 15 provisional full-text candidates) and independently screened Batch R1-B1, the first 100 non-pilot canonical records by canonical_id order (CAN-0015 through CAN-0134 with pilot IDs omitted). Batch R1-B1 had exact agreement (100/100), with 17 Include-for-full-text, 10 Unsure/retain-for-full-text and 73 Exclude decisions; no adjudication disagreements occurred. Batch B2 comprised the next 100 non-pilot canonical records after B1 (CAN-0135-CAN-0240, with pilot IDs omitted). R1 retained 20 records (10 Include and 10 Unsure) and excluded 80; R2 retained 17 and excluded 83. Eight disagreements were adjudicated. The final B2 disposition was 17 retained for full text and 83 excluded. Across the pilot, B1 and B2, 240 title/metadata records have been screened: 181 clear exclusions and 59 provisional full-text candidates. The remaining 1,637 canonical identities are unresolved/non-final. No final title/metadata decision, full-text eligibility decision or included-study count exists. The planned dual-review process applies Nigeria linkage, laboratory-confirmed avian AIV, at least one relevant evidence type, and extractable primary-data questions; an unsure record proceeds to full text rather than being assumed excluded.</w:t>
       </w:r>
     </w:p>
     <w:p>
@@ -257,8 +249,7 @@
         <w:spacing w:before="0" w:after="120"/>
       </w:pPr>
       <w:r>
-        <w:rPr/>
-        <w:t>The evidence synthesis is not complete. Gate C screening reconciliation remains open after adjudication of the 40-record R1/R2 title/metadata pilot and exact-agreement screening of the 100-record Batch R1-B1: 1,737 canonical identities remain unresolved/non-final, while 42 records are provisional candidates awaiting full-text assessment. Gates D–J have not been completed. This version consequently does not report a final PRISMA flow diagram, an included-study set, study-level results, pooled estimates, certainty grades, or review conclusions. Such outputs require completion of screening, full-text assessment, extraction, appraisal, synthesis and final reporting audit.</w:t>
+        <w:t>The evidence synthesis is not complete. Gate C screening reconciliation remains open after adjudication of the 40-record R1/R2 title/metadata pilot, exact-agreement screening of the 100-record Batch R1-B1, and adjudication of the 100-record Batch B2: 1,637 canonical identities remain unresolved/non-final, while 59 records are provisional candidates awaiting full-text assessment. Gates D-J have not been completed. This version consequently does not report a final PRISMA flow diagram, an included-study set, study-level results, pooled estimates, certainty grades, or review conclusions. Such outputs require completion of screening, full-text assessment, extraction, appraisal, synthesis and final reporting audit.</w:t>
       </w:r>
     </w:p>
     <w:p>
@@ -551,8 +542,7 @@
         <w:spacing w:before="0" w:after="120"/>
       </w:pPr>
       <w:r>
-        <w:rPr/>
-        <w:t>Operational snapshot: 20 September 2026. This appendix records the evidence boundary and search/record-management status for this submission-stage document. It is not a final PRISMA-S strategy appendix and does not substitute for final study selection, extraction or synthesis.</w:t>
+        <w:t>Operational snapshot: 20 September 2026. This appendix records the evidence boundary and search/record-management status for this submission-stage document, including adjudicated title/metadata screening through Batch B2. It is not a final PRISMA-S strategy appendix and does not substitute for final study selection, extraction or synthesis.</w:t>
       </w:r>
     </w:p>
     <w:p>
@@ -1248,8 +1238,7 @@
         <w:spacing w:before="0" w:after="120"/>
       </w:pPr>
       <w:r>
-        <w:rPr/>
-        <w:t>The canonical register reports 2,367 source rows, 1,877 provisional identity groups and 490 collapsed duplicate rows. The controlled title/metadata-screening denominator is 1,877. An adjudicated R1/R2 pilot of 40 records produced 25 clear exclusions and 15 provisional full-text candidates. Batch R1-B1 then screened the first 100 non-pilot canonical records by canonical_id order (CAN-0015 through CAN-0134 with pilot IDs omitted): exact R1/R2 agreement (100/100), no adjudication disagreements, 17 Include-for-full-text, 10 Unsure/retain-for-full-text and 73 Exclude. Combined, 140 title/metadata records have been screened, with 98 clear exclusions and 42 provisional full-text candidates. These outcomes do not finalise study inclusion or PRISMA counts. The remaining 1,737 canonical identities are unresolved/non-final; full-text assessment, extraction, risk-of-bias appraisal, certainty assessment, final PRISMA flow and SWiM synthesis remain pending.</w:t>
+        <w:t>The canonical register reports 2,367 source rows, 1,877 provisional identity groups and 490 collapsed duplicate rows. The controlled title/metadata-screening denominator is 1,877. An adjudicated R1/R2 pilot of 40 records produced 25 clear exclusions and 15 provisional full-text candidates. Batch R1-B1 then screened the first 100 non-pilot canonical records by canonical_id order (CAN-0015 through CAN-0134 with pilot IDs omitted): exact R1/R2 agreement (100/100), no adjudication disagreements, 17 Include-for-full-text, 10 Unsure/retain-for-full-text and 73 Exclude. Batch B2 screened the next 100 non-pilot canonical records after B1 (CAN-0135-CAN-0240, with pilot IDs omitted): final adjudication retained 17 provisional full-text candidates and excluded 83 records after eight disagreements. Cumulatively, 240 title/metadata records have been screened, with 181 clear exclusions and 59 provisional full-text candidates. These outcomes do not finalise study inclusion or PRISMA counts. The remaining 1,637 canonical identities are unresolved/non-final; full-text assessment, extraction, risk-of-bias appraisal, certainty assessment, final PRISMA flow and SWiM synthesis remain pending.</w:t>
       </w:r>
     </w:p>
     <w:p>
@@ -1382,15 +1371,8 @@
             <w:vAlign w:val="top"/>
           </w:tcPr>
           <w:p>
-            <w:pPr>
-              <w:spacing w:after="0"/>
-            </w:pPr>
-            <w:r>
-              <w:rPr>
-                <w:rFonts w:ascii="Times New Roman" w:hAnsi="Times New Roman"/>
-                <w:sz w:val="17"/>
-              </w:rPr>
-              <w:t>Open – 140 title/metadata records screened (40 adjudicated pilot + 100-record Batch R1-B1): 98 clear exclusions and 42 provisional full-text candidates. The remaining 1,737 identities are unresolved/non-final.</w:t>
+            <w:r>
+              <w:t>Open - 240 title/metadata records screened (40 adjudicated pilot + 100-record Batch R1-B1 + 100-record Batch B2): 181 clear exclusions and 59 provisional full-text candidates. The remaining 1,637 identities are unresolved/non-final.</w:t>
             </w:r>
           </w:p>
         </w:tc>
@@ -1438,15 +1420,8 @@
             <w:vAlign w:val="top"/>
           </w:tcPr>
           <w:p>
-            <w:pPr>
-              <w:spacing w:after="0"/>
-            </w:pPr>
-            <w:r>
-              <w:rPr>
-                <w:rFonts w:ascii="Times New Roman" w:hAnsi="Times New Roman"/>
-                <w:sz w:val="17"/>
-              </w:rPr>
-              <w:t>Pending – 42 provisional candidates await full-text assessment; no final eligibility decisions.</w:t>
+            <w:r>
+              <w:t>Pending - 59 provisional candidates await full-text assessment; no final eligibility decisions.</w:t>
             </w:r>
           </w:p>
         </w:tc>
@@ -1828,12 +1803,7 @@
     </w:p>
     <w:p>
       <w:r>
-        <w:rPr>
-          <w:rFonts w:ascii="Times New Roman" w:hAnsi="Times New Roman" w:eastAsia="Times New Roman"/>
-          <w:b w:val="0"/>
-          <w:sz w:val="20"/>
-        </w:rPr>
-        <w:t>Dated 22 September 2026. This appendix supersedes no source record: it consolidates the current gate state for this submission-stage status report. It does not report final study selection, a PRISMA flow, included-study results, extraction, risk-of-bias findings or synthesis.</w:t>
+        <w:t>Dated 22 September 2026. This appendix supersedes no source record: it consolidates the current gate state for this submission-stage status report, including the adjudicated Batch B2 title/metadata update. It does not report final study selection, a PRISMA flow, included-study results, extraction, risk-of-bias findings or synthesis.</w:t>
       </w:r>
     </w:p>
     <w:p>
@@ -2053,17 +2023,28 @@
           </w:tcPr>
           <w:p>
             <w:r>
+              <w:t>240 title/metadata records screened: 40 pilot records independently screened by R1/R2 and adjudicated (25 clear exclusions; 15 provisional full-text candidates), Batch R1-B1 (100/100 exact agreement; 17 Include-for-full-text, 10 Unsure/retain-for-full-text, 73 Exclude; no adjudication disagreements), and Batch B2 (17 retained for full text; 83 excluded after eight disagreements were adjudicated). Cumulative: 181 clear exclusions and 59 provisional full-text candidates. The remaining 1,637 canonical identities are unresolved/non-final.</w:t>
+            </w:r>
+          </w:p>
+        </w:tc>
+      </w:tr>
+      <w:tr>
+        <w:tc>
+          <w:tcPr>
+            <w:tcW w:type="dxa" w:w="3120"/>
+            <w:vAlign w:val="top"/>
+          </w:tcPr>
+          <w:p>
+            <w:r>
               <w:rPr>
                 <w:rFonts w:ascii="Times New Roman" w:hAnsi="Times New Roman" w:eastAsia="Times New Roman"/>
                 <w:b w:val="0"/>
                 <w:sz w:val="16"/>
               </w:rPr>
-              <w:t>140 title/metadata records screened: 40 pilot records independently screened by R1/R2 and adjudicated (25 clear exclusions; 15 provisional full-text candidates), plus Batch R1-B1 (100/100 exact agreement; 17 Include-for-full-text, 10 Unsure/retain-for-full-text, 73 Exclude; no adjudication disagreements). Combined: 98 clear exclusions and 42 provisional full-text candidates. The remaining 1,737 canonical identities are unresolved/non-final.</w:t>
-            </w:r>
-          </w:p>
-        </w:tc>
-      </w:tr>
-      <w:tr>
+              <w:t>D: full-text eligibility</w:t>
+            </w:r>
+          </w:p>
+        </w:tc>
         <w:tc>
           <w:tcPr>
             <w:tcW w:type="dxa" w:w="3120"/>
@@ -2076,10 +2057,23 @@
                 <w:b w:val="0"/>
                 <w:sz w:val="16"/>
               </w:rPr>
-              <w:t>D: full-text eligibility</w:t>
-            </w:r>
-          </w:p>
-        </w:tc>
+              <w:t>Not started</w:t>
+            </w:r>
+          </w:p>
+        </w:tc>
+        <w:tc>
+          <w:tcPr>
+            <w:tcW w:type="dxa" w:w="3120"/>
+            <w:vAlign w:val="top"/>
+          </w:tcPr>
+          <w:p>
+            <w:r>
+              <w:t>Pending. The 59 provisional full-text candidates have not undergone full-text eligibility assessment; no fixed full-text exclusion table exists.</w:t>
+            </w:r>
+          </w:p>
+        </w:tc>
+      </w:tr>
+      <w:tr>
         <w:tc>
           <w:tcPr>
             <w:tcW w:type="dxa" w:w="3120"/>
@@ -2092,6 +2086,22 @@
                 <w:b w:val="0"/>
                 <w:sz w:val="16"/>
               </w:rPr>
+              <w:t>E-G: extraction, RoB and certainty</w:t>
+            </w:r>
+          </w:p>
+        </w:tc>
+        <w:tc>
+          <w:tcPr>
+            <w:tcW w:type="dxa" w:w="3120"/>
+            <w:vAlign w:val="top"/>
+          </w:tcPr>
+          <w:p>
+            <w:r>
+              <w:rPr>
+                <w:rFonts w:ascii="Times New Roman" w:hAnsi="Times New Roman" w:eastAsia="Times New Roman"/>
+                <w:b w:val="0"/>
+                <w:sz w:val="16"/>
+              </w:rPr>
               <w:t>Not started</w:t>
             </w:r>
           </w:p>
@@ -2108,7 +2118,7 @@
                 <w:b w:val="0"/>
                 <w:sz w:val="16"/>
               </w:rPr>
-              <w:t>Pending. The 42 provisional full-text candidates have not undergone full-text eligibility assessment; no fixed full-text exclusion table exists.</w:t>
+              <w:t>Pending. The fields are prepared below; no study has been extracted or appraised.</w:t>
             </w:r>
           </w:p>
         </w:tc>
@@ -2126,7 +2136,7 @@
                 <w:b w:val="0"/>
                 <w:sz w:val="16"/>
               </w:rPr>
-              <w:t>E-G: extraction, RoB and certainty</w:t>
+              <w:t>H-J: synthesis, reporting and final audit</w:t>
             </w:r>
           </w:p>
         </w:tc>
@@ -2158,56 +2168,6 @@
                 <w:b w:val="0"/>
                 <w:sz w:val="16"/>
               </w:rPr>
-              <w:t>Pending. The fields are prepared below; no study has been extracted or appraised.</w:t>
-            </w:r>
-          </w:p>
-        </w:tc>
-      </w:tr>
-      <w:tr>
-        <w:tc>
-          <w:tcPr>
-            <w:tcW w:type="dxa" w:w="3120"/>
-            <w:vAlign w:val="top"/>
-          </w:tcPr>
-          <w:p>
-            <w:r>
-              <w:rPr>
-                <w:rFonts w:ascii="Times New Roman" w:hAnsi="Times New Roman" w:eastAsia="Times New Roman"/>
-                <w:b w:val="0"/>
-                <w:sz w:val="16"/>
-              </w:rPr>
-              <w:t>H-J: synthesis, reporting and final audit</w:t>
-            </w:r>
-          </w:p>
-        </w:tc>
-        <w:tc>
-          <w:tcPr>
-            <w:tcW w:type="dxa" w:w="3120"/>
-            <w:vAlign w:val="top"/>
-          </w:tcPr>
-          <w:p>
-            <w:r>
-              <w:rPr>
-                <w:rFonts w:ascii="Times New Roman" w:hAnsi="Times New Roman" w:eastAsia="Times New Roman"/>
-                <w:b w:val="0"/>
-                <w:sz w:val="16"/>
-              </w:rPr>
-              <w:t>Not started</w:t>
-            </w:r>
-          </w:p>
-        </w:tc>
-        <w:tc>
-          <w:tcPr>
-            <w:tcW w:type="dxa" w:w="3120"/>
-            <w:vAlign w:val="top"/>
-          </w:tcPr>
-          <w:p>
-            <w:r>
-              <w:rPr>
-                <w:rFonts w:ascii="Times New Roman" w:hAnsi="Times New Roman" w:eastAsia="Times New Roman"/>
-                <w:b w:val="0"/>
-                <w:sz w:val="16"/>
-              </w:rPr>
               <w:t>Pending. SWiM is prespecified. No PRISMA flow, included-study set, synthesis conclusion or completed reporting audit is claimed.</w:t>
             </w:r>
           </w:p>
@@ -2219,12 +2179,21 @@
         <w:pStyle w:val="Heading2"/>
       </w:pPr>
       <w:r>
-        <w:rPr>
-          <w:rFonts w:ascii="Times New Roman" w:hAnsi="Times New Roman" w:eastAsia="Times New Roman"/>
-          <w:b/>
-          <w:sz w:val="22"/>
-        </w:rPr>
-        <w:t>B2. Authoritative eligibility and screening rule</w:t>
+        <w:t>B2. Adjudicated Batch B2 title/metadata screening update</w:t>
+      </w:r>
+    </w:p>
+    <w:p>
+      <w:pPr/>
+      <w:r>
+        <w:t>Batch B2 was the next 100 non-pilot canonical records after B1, CAN-0135-CAN-0240 with pilot IDs omitted. R1 retained 20 records (10 Include-for-full-text and 10 Unsure/retain-for-full-text) and excluded 80. R2 retained 17 and excluded 83 in aggregate. Eight R1/R2 disagreements were identified during comparison. Final adjudication retained 17 records for full-text assessment and excluded 83. CAN-0151, CAN-0154 and CAN-0156 were excluded as clear global/non-Nigeria records. CAN-0189, CAN-0215 and CAN-0232 were retained for full text under the conservative uncertainty rule. R2-only retains CAN-0210 and CAN-0234 were excluded because title-level evidence did not establish eligible avian-AIV empirical data under the frozen criteria. The other 14 R1 retained IDs were unchanged. Every retained B2 record is a provisional full-text candidate, not a final included study.</w:t>
+      </w:r>
+    </w:p>
+    <w:p>
+      <w:pPr>
+        <w:pStyle w:val="Heading2"/>
+      </w:pPr>
+      <w:r>
+        <w:t>B3. Authoritative eligibility and screening rule</w:t>
       </w:r>
     </w:p>
     <w:p>
@@ -2252,12 +2221,7 @@
         <w:pStyle w:val="Heading2"/>
       </w:pPr>
       <w:r>
-        <w:rPr>
-          <w:rFonts w:ascii="Times New Roman" w:hAnsi="Times New Roman" w:eastAsia="Times New Roman"/>
-          <w:b/>
-          <w:sz w:val="22"/>
-        </w:rPr>
-        <w:t>B3. Corrected search architecture and source-status boundary</w:t>
+        <w:t>B4. Corrected search architecture and source-status boundary</w:t>
       </w:r>
     </w:p>
     <w:p>
@@ -2740,12 +2704,7 @@
         <w:pStyle w:val="Heading2"/>
       </w:pPr>
       <w:r>
-        <w:rPr>
-          <w:rFonts w:ascii="Times New Roman" w:hAnsi="Times New Roman" w:eastAsia="Times New Roman"/>
-          <w:b/>
-          <w:sz w:val="22"/>
-        </w:rPr>
-        <w:t>B4. Calibration and Batch R1-B1 screening status</w:t>
+        <w:t>B5. Calibration and Batch R1-B1 screening status</w:t>
       </w:r>
     </w:p>
     <w:p>
@@ -3189,7 +3148,7 @@
           </w:tcPr>
           <w:p>
             <w:r>
-              <w:t>Combined pilot + Batch R1-B1: clear exclusions</w:t>
+              <w:t>Cumulative through pilot + Batch R1-B1: clear exclusions</w:t>
             </w:r>
           </w:p>
         </w:tc>
@@ -3209,19 +3168,19 @@
           </w:tcPr>
           <w:p>
             <w:r>
-              <w:t>Title/metadata only; not a final PRISMA exclusion count.</w:t>
-            </w:r>
-          </w:p>
-        </w:tc>
-      </w:tr>
-      <w:tr>
-        <w:tc>
-          <w:tcPr>
-            <w:tcW w:type="dxa" w:w="3120"/>
-          </w:tcPr>
-          <w:p>
-            <w:r>
-              <w:t>Combined pilot + Batch R1-B1: provisional full-text candidates</w:t>
+              <w:t>Title/metadata only; interim milestone, not a final PRISMA exclusion count.</w:t>
+            </w:r>
+          </w:p>
+        </w:tc>
+      </w:tr>
+      <w:tr>
+        <w:tc>
+          <w:tcPr>
+            <w:tcW w:type="dxa" w:w="3120"/>
+          </w:tcPr>
+          <w:p>
+            <w:r>
+              <w:t>Cumulative through pilot + Batch R1-B1: provisional full-text candidates</w:t>
             </w:r>
           </w:p>
         </w:tc>
@@ -3241,7 +3200,263 @@
           </w:tcPr>
           <w:p>
             <w:r>
-              <w:t>All retained records remain provisional pending full-text assessment, extraction, risk-of-bias appraisal, certainty assessment and synthesis.</w:t>
+              <w:t>All retained records remained provisional pending full-text assessment, extraction, risk-of-bias appraisal, certainty assessment and synthesis.</w:t>
+            </w:r>
+          </w:p>
+        </w:tc>
+      </w:tr>
+      <w:tr>
+        <w:tc>
+          <w:tcPr>
+            <w:tcW w:type="dxa" w:w="3120"/>
+          </w:tcPr>
+          <w:p>
+            <w:r>
+              <w:t>Batch B2: scope</w:t>
+            </w:r>
+          </w:p>
+        </w:tc>
+        <w:tc>
+          <w:tcPr>
+            <w:tcW w:type="dxa" w:w="3120"/>
+          </w:tcPr>
+          <w:p>
+            <w:r>
+              <w:t>100</w:t>
+            </w:r>
+          </w:p>
+        </w:tc>
+        <w:tc>
+          <w:tcPr>
+            <w:tcW w:type="dxa" w:w="3120"/>
+          </w:tcPr>
+          <w:p>
+            <w:r>
+              <w:t>Next 100 non-pilot canonical records after B1: CAN-0135-CAN-0240, with pilot IDs omitted. Title/metadata screening only.</w:t>
+            </w:r>
+          </w:p>
+        </w:tc>
+      </w:tr>
+      <w:tr>
+        <w:tc>
+          <w:tcPr>
+            <w:tcW w:type="dxa" w:w="3120"/>
+          </w:tcPr>
+          <w:p>
+            <w:r>
+              <w:t>Batch B2: R1 disposition</w:t>
+            </w:r>
+          </w:p>
+        </w:tc>
+        <w:tc>
+          <w:tcPr>
+            <w:tcW w:type="dxa" w:w="3120"/>
+          </w:tcPr>
+          <w:p>
+            <w:r>
+              <w:t>20 retained; 80 excluded</w:t>
+            </w:r>
+          </w:p>
+        </w:tc>
+        <w:tc>
+          <w:tcPr>
+            <w:tcW w:type="dxa" w:w="3120"/>
+          </w:tcPr>
+          <w:p>
+            <w:r>
+              <w:t>10 Include-for-full-text; 10 Unsure/retain-for-full-text. Independent R1 title/metadata screen.</w:t>
+            </w:r>
+          </w:p>
+        </w:tc>
+      </w:tr>
+      <w:tr>
+        <w:tc>
+          <w:tcPr>
+            <w:tcW w:type="dxa" w:w="3120"/>
+          </w:tcPr>
+          <w:p>
+            <w:r>
+              <w:t>Batch B2: R2 disposition</w:t>
+            </w:r>
+          </w:p>
+        </w:tc>
+        <w:tc>
+          <w:tcPr>
+            <w:tcW w:type="dxa" w:w="3120"/>
+          </w:tcPr>
+          <w:p>
+            <w:r>
+              <w:t>17 retained; 83 excluded</w:t>
+            </w:r>
+          </w:p>
+        </w:tc>
+        <w:tc>
+          <w:tcPr>
+            <w:tcW w:type="dxa" w:w="3120"/>
+          </w:tcPr>
+          <w:p>
+            <w:r>
+              <w:t>Aggregate R2 disposition. Independent R2 title/metadata screen.</w:t>
+            </w:r>
+          </w:p>
+        </w:tc>
+      </w:tr>
+      <w:tr>
+        <w:tc>
+          <w:tcPr>
+            <w:tcW w:type="dxa" w:w="3120"/>
+          </w:tcPr>
+          <w:p>
+            <w:r>
+              <w:t>Batch B2: disagreements and adjudication</w:t>
+            </w:r>
+          </w:p>
+        </w:tc>
+        <w:tc>
+          <w:tcPr>
+            <w:tcW w:type="dxa" w:w="3120"/>
+          </w:tcPr>
+          <w:p>
+            <w:r>
+              <w:t>8</w:t>
+            </w:r>
+          </w:p>
+        </w:tc>
+        <w:tc>
+          <w:tcPr>
+            <w:tcW w:type="dxa" w:w="3120"/>
+          </w:tcPr>
+          <w:p>
+            <w:r>
+              <w:t>CAN-0151, CAN-0154, CAN-0156, CAN-0189, CAN-0210, CAN-0215, CAN-0232 and CAN-0234. Apply the frozen criteria and conservative uncertainty rule; no final study inclusion is inferred.</w:t>
+            </w:r>
+          </w:p>
+        </w:tc>
+      </w:tr>
+      <w:tr>
+        <w:tc>
+          <w:tcPr>
+            <w:tcW w:type="dxa" w:w="3120"/>
+          </w:tcPr>
+          <w:p>
+            <w:r>
+              <w:t>Batch B2: final retained provisionally for full text</w:t>
+            </w:r>
+          </w:p>
+        </w:tc>
+        <w:tc>
+          <w:tcPr>
+            <w:tcW w:type="dxa" w:w="3120"/>
+          </w:tcPr>
+          <w:p>
+            <w:r>
+              <w:t>17</w:t>
+            </w:r>
+          </w:p>
+        </w:tc>
+        <w:tc>
+          <w:tcPr>
+            <w:tcW w:type="dxa" w:w="3120"/>
+          </w:tcPr>
+          <w:p>
+            <w:r>
+              <w:t>The 14 unchanged R1 retained IDs plus CAN-0189, CAN-0215 and CAN-0232. All 17 are provisional full-text candidates, not final included studies.</w:t>
+            </w:r>
+          </w:p>
+        </w:tc>
+      </w:tr>
+      <w:tr>
+        <w:tc>
+          <w:tcPr>
+            <w:tcW w:type="dxa" w:w="3120"/>
+          </w:tcPr>
+          <w:p>
+            <w:r>
+              <w:t>Batch B2: final exclusions</w:t>
+            </w:r>
+          </w:p>
+        </w:tc>
+        <w:tc>
+          <w:tcPr>
+            <w:tcW w:type="dxa" w:w="3120"/>
+          </w:tcPr>
+          <w:p>
+            <w:r>
+              <w:t>83</w:t>
+            </w:r>
+          </w:p>
+        </w:tc>
+        <w:tc>
+          <w:tcPr>
+            <w:tcW w:type="dxa" w:w="3120"/>
+          </w:tcPr>
+          <w:p>
+            <w:r>
+              <w:t>Includes clear global/non-Nigeria CAN-0151, CAN-0154 and CAN-0156, and R2-only CAN-0210 and CAN-0234. CAN-0210 and CAN-0234 lacked title-level evidence of eligible avian-AIV empirical data under the frozen criteria.</w:t>
+            </w:r>
+          </w:p>
+        </w:tc>
+      </w:tr>
+      <w:tr>
+        <w:tc>
+          <w:tcPr>
+            <w:tcW w:type="dxa" w:w="3120"/>
+          </w:tcPr>
+          <w:p>
+            <w:r>
+              <w:t>Cumulative pilot + Batch R1-B1 + Batch B2: clear exclusions</w:t>
+            </w:r>
+          </w:p>
+        </w:tc>
+        <w:tc>
+          <w:tcPr>
+            <w:tcW w:type="dxa" w:w="3120"/>
+          </w:tcPr>
+          <w:p>
+            <w:r>
+              <w:t>181</w:t>
+            </w:r>
+          </w:p>
+        </w:tc>
+        <w:tc>
+          <w:tcPr>
+            <w:tcW w:type="dxa" w:w="3120"/>
+          </w:tcPr>
+          <w:p>
+            <w:r>
+              <w:t>Title/metadata screening only; not a final PRISMA exclusion count.</w:t>
+            </w:r>
+          </w:p>
+        </w:tc>
+      </w:tr>
+      <w:tr>
+        <w:tc>
+          <w:tcPr>
+            <w:tcW w:type="dxa" w:w="3120"/>
+          </w:tcPr>
+          <w:p>
+            <w:r>
+              <w:t>Cumulative pilot + Batch R1-B1 + Batch B2: provisional full-text candidates</w:t>
+            </w:r>
+          </w:p>
+        </w:tc>
+        <w:tc>
+          <w:tcPr>
+            <w:tcW w:type="dxa" w:w="3120"/>
+          </w:tcPr>
+          <w:p>
+            <w:r>
+              <w:t>59</w:t>
+            </w:r>
+          </w:p>
+        </w:tc>
+        <w:tc>
+          <w:tcPr>
+            <w:tcW w:type="dxa" w:w="3120"/>
+          </w:tcPr>
+          <w:p>
+            <w:r>
+              <w:t>All retained records await full-text eligibility assessment. Not final included studies; extraction, RoB, certainty, final PRISMA and SWiM synthesis remain pending.</w:t>
             </w:r>
           </w:p>
         </w:tc>
@@ -3262,12 +3477,7 @@
         <w:pStyle w:val="Heading2"/>
       </w:pPr>
       <w:r>
-        <w:rPr>
-          <w:rFonts w:ascii="Times New Roman" w:hAnsi="Times New Roman" w:eastAsia="Times New Roman"/>
-          <w:b/>
-          <w:sz w:val="22"/>
-        </w:rPr>
-        <w:t>B5. Extraction and risk-of-bias fields ready for the next pass</w:t>
+        <w:t>B6. Extraction and risk-of-bias fields ready for the next pass</w:t>
       </w:r>
     </w:p>
     <w:tbl>
@@ -3374,12 +3584,7 @@
           </w:tcPr>
           <w:p>
             <w:r>
-              <w:rPr>
-                <w:rFonts w:ascii="Times New Roman" w:hAnsi="Times New Roman" w:eastAsia="Times New Roman"/>
-                <w:b w:val="0"/>
-                <w:sz w:val="16"/>
-              </w:rPr>
-              <w:t>Ready; 140 title/metadata records adjudicated, but no full-text eligibility decisions.</w:t>
+              <w:t>Ready; 240 title/metadata records adjudicated, but no full-text eligibility decisions.</w:t>
             </w:r>
           </w:p>
         </w:tc>

</xml_diff>

<commit_message>
Record adjudicated screening batch B3
</commit_message>
<xml_diff>
--- a/Avian_review_paper_submission_ready.docx
+++ b/Avian_review_paper_submission_ready.docx
@@ -32,7 +32,7 @@
         <w:spacing w:before="0" w:after="120"/>
       </w:pPr>
       <w:r>
-        <w:t>Background: Avian influenza viruses (AIVs) have caused recurrent poultry outbreaks and molecularly distinct detections in Nigeria since 2006. Objective: This submission-stage protocol prespecifies a systematic review of emergence, temporal and geographic distribution, host range, and molecular/clade/reassortment dynamics of Nigeria-specific AIVs. Methods: The protocol uses a CoCoPop/PEO framework and is aligned with PRISMA 2020, PRISMA-S and SWiM. The study/search window is 2006-2026; the operational status snapshot is 20 September 2026. Results status: 2,367 source rows had been reconciled into 1,877 provisional identities; 240 title/metadata records have been screened, yielding 181 clear exclusions and 59 provisional full-text candidates. Final screening, full-text assessment, extraction, risk-of-bias appraisal, synthesis and a PRISMA flow are not complete. Conclusion: This document is a protocol and search/record-management status report, not a completed systematic review.</w:t>
+        <w:t>Background: Avian influenza viruses (AIVs) have caused recurrent poultry outbreaks and molecularly distinct detections in Nigeria since 2006. Objective: This submission-stage protocol prespecifies a systematic review of emergence, temporal and geographic distribution, host range, and molecular/clade/reassortment dynamics of Nigeria-specific AIVs. Methods: The protocol uses a CoCoPop/PEO framework and is aligned with PRISMA 2020, PRISMA-S and SWiM. The study/search window is 2006-2026; the operational status snapshot is 20 September 2026. Results status: 2,367 source rows had been reconciled into 1,877 provisional identities; 340 title/metadata records have been screened, yielding 268 clear exclusions and 72 provisional full-text candidates. Final screening, full-text assessment, extraction, risk-of-bias appraisal, synthesis and a PRISMA flow are not complete. Conclusion: This document is a protocol and search/record-management status report, not a completed systematic review.</w:t>
       </w:r>
     </w:p>
     <w:p>
@@ -41,7 +41,7 @@
         <w:ind w:left="216" w:right="216"/>
       </w:pPr>
       <w:r>
-        <w:t>STATUS NOTE - 22 September 2026: Gate C remains open. The adjudicated R1/R2 title/metadata pilot of 40 records and Batch R1-B1 (the first 100 non-pilot canonical records by canonical_id order, CAN-0015 through CAN-0134 with pilot IDs omitted) produced 98 clear exclusions and 42 provisional full-text candidates. Batch R1-B1 had exact R1/R2 agreement (100/100) and no adjudication disagreements. The adjudicated Batch B2 screened the next 100 non-pilot canonical records after B1 (CAN-0135-CAN-0240, with pilot IDs omitted): 17 records were retained as provisional full-text candidates and 83 were excluded after eight R1/R2 disagreements were adjudicated. Cumulatively, 240 title/metadata records have been screened, with 181 exclusions and 59 provisional full-text candidates; 1,637 canonical identities remain unresolved/non-final. Gates D-J are incomplete; no final PRISMA flow, included-study set, extraction, risk-of-bias assessment or synthesis is reported here.</w:t>
+        <w:t>STATUS NOTE - 22 September 2026: Gate C remains open. The adjudicated R1/R2 title/metadata pilot of 40 records and Batch R1-B1 (the first 100 non-pilot canonical records by canonical_id order, CAN-0015 through CAN-0134 with pilot IDs omitted) produced 98 clear exclusions and 42 provisional full-text candidates. Batch R1-B1 had exact R1/R2 agreement (100/100) and no adjudication disagreements. Batch B2 retained 17 provisional full-text candidates and excluded 83 after eight R1/R2 disagreements were adjudicated. Batch B3 screened CAN-0241-CAN-0340: R1 recorded 7 Include and 5 Unsure/retain decisions (88 Exclude), and R2 recorded 7 Retain and 1 Unsure decision (92 Exclude). The six cross-reviewer uncertainty/disagreement records (CAN-0245, CAN-0258, CAN-0266, CAN-0282, CAN-0317 and CAN-0340) were retained conservatively for full-text review; the seven clear R1/R2 retains remained retained. Final B3 disposition: 13 provisional full-text candidates and 87 exclusions. Cumulatively, 340 title/metadata records have been screened, with 268 exclusions and 72 provisional full-text candidates; 1,537 canonical identities remain unresolved/non-final. Gates D-J are incomplete; no final PRISMA flow, included-study set, extraction, risk-of-bias assessment or synthesis is reported here.</w:t>
       </w:r>
     </w:p>
     <w:p>
@@ -210,7 +210,7 @@
         <w:spacing w:before="0" w:after="120"/>
       </w:pPr>
       <w:r>
-        <w:t>Records were reconciled using symmetric DOI, PMID, or exact normalised title-plus-year matching. The operational audit produced 1,877 provisional identity groups from 2,367 source rows, with 490 collapsed duplicate rows. The controlled title/metadata-screening denominator is therefore 1,877. R1 and R2 independently screened and adjudicated a 40-record pilot (25 clear exclusions; 15 provisional full-text candidates) and independently screened Batch R1-B1, the first 100 non-pilot canonical records by canonical_id order (CAN-0015 through CAN-0134 with pilot IDs omitted). Batch R1-B1 had exact agreement (100/100), with 17 Include-for-full-text, 10 Unsure/retain-for-full-text and 73 Exclude decisions; no adjudication disagreements occurred. Batch B2 comprised the next 100 non-pilot canonical records after B1 (CAN-0135-CAN-0240, with pilot IDs omitted). R1 retained 20 records (10 Include and 10 Unsure) and excluded 80; R2 retained 17 and excluded 83. Eight disagreements were adjudicated. The final B2 disposition was 17 retained for full text and 83 excluded. Across the pilot, B1 and B2, 240 title/metadata records have been screened: 181 clear exclusions and 59 provisional full-text candidates. The remaining 1,637 canonical identities are unresolved/non-final. No final title/metadata decision, full-text eligibility decision or included-study count exists. The planned dual-review process applies Nigeria linkage, laboratory-confirmed avian AIV, at least one relevant evidence type, and extractable primary-data questions; an unsure record proceeds to full text rather than being assumed excluded.</w:t>
+        <w:t>Records were reconciled using symmetric DOI, PMID, or exact normalised title-plus-year matching. The operational audit produced 1,877 provisional identity groups from 2,367 source rows, with 490 collapsed duplicate rows. The controlled title/metadata-screening denominator is therefore 1,877. R1 and R2 independently screened and adjudicated a 40-record pilot (25 clear exclusions; 15 provisional full-text candidates) and independently screened Batch R1-B1, the first 100 non-pilot canonical records by canonical_id order (CAN-0015 through CAN-0134 with pilot IDs omitted). Batch R1-B1 had exact agreement (100/100), with 17 Include-for-full-text, 10 Unsure/retain-for-full-text and 73 Exclude decisions; no adjudication disagreements occurred. Batch B2 comprised the next 100 non-pilot canonical records after B1 (CAN-0135-CAN-0240, with pilot IDs omitted). R1 retained 20 records (10 Include and 10 Unsure) and excluded 80; R2 retained 17 and excluded 83. Eight disagreements were adjudicated. The final B2 disposition was 17 retained for full text and 83 excluded. Batch B3 comprised CAN-0241-CAN-0340. R1 recorded 7 Include-for-full-text and 5 Unsure/retain-for-full-text decisions (88 Exclude); R2 recorded 7 Retain and 1 Unsure decision (92 Exclude). Cross-reviewer uncertainty/disagreement affected CAN-0245, CAN-0258, CAN-0266, CAN-0282, CAN-0317 and CAN-0340; all six were retained conservatively for full-text review, and the seven clear R1/R2 retains remained retained. The final B3 disposition was 13 provisional full-text candidates and 87 exclusions. Across the pilot, B1, B2 and B3, 340 title/metadata records have been screened: 268 clear exclusions and 72 provisional full-text candidates. The remaining 1,537 canonical identities are unresolved/non-final. No final title/metadata decision, full-text eligibility decision or included-study count exists. The planned dual-review process applies Nigeria linkage, laboratory-confirmed avian AIV, at least one relevant evidence type, and extractable primary-data questions; an unsure record proceeds to full text rather than being assumed excluded.</w:t>
       </w:r>
     </w:p>
     <w:p>
@@ -249,7 +249,7 @@
         <w:spacing w:before="0" w:after="120"/>
       </w:pPr>
       <w:r>
-        <w:t>The evidence synthesis is not complete. Gate C screening reconciliation remains open after adjudication of the 40-record R1/R2 title/metadata pilot, exact-agreement screening of the 100-record Batch R1-B1, and adjudication of the 100-record Batch B2: 1,637 canonical identities remain unresolved/non-final, while 59 records are provisional candidates awaiting full-text assessment. Gates D-J have not been completed. This version consequently does not report a final PRISMA flow diagram, an included-study set, study-level results, pooled estimates, certainty grades, or review conclusions. Such outputs require completion of screening, full-text assessment, extraction, appraisal, synthesis and final reporting audit.</w:t>
+        <w:t>The evidence synthesis is not complete. Gate C screening reconciliation remains open after adjudication of the 40-record R1/R2 title/metadata pilot, exact-agreement screening of the 100-record Batch R1-B1, and adjudication of the 100-record Batches B2 and B3: 1,537 canonical identities remain unresolved/non-final, while 72 records are provisional candidates awaiting full-text assessment. Gates D-J have not been completed. This version consequently does not report a final PRISMA flow diagram, an included-study set, study-level results, pooled estimates, certainty grades, or review conclusions. Such outputs require completion of screening, full-text assessment, extraction, appraisal, synthesis and final reporting audit.</w:t>
       </w:r>
     </w:p>
     <w:p>
@@ -542,7 +542,7 @@
         <w:spacing w:before="0" w:after="120"/>
       </w:pPr>
       <w:r>
-        <w:t>Operational snapshot: 20 September 2026. This appendix records the evidence boundary and search/record-management status for this submission-stage document, including adjudicated title/metadata screening through Batch B2. It is not a final PRISMA-S strategy appendix and does not substitute for final study selection, extraction or synthesis.</w:t>
+        <w:t>Operational snapshot: 20 September 2026. This appendix records the evidence boundary and search/record-management status for this submission-stage document, including adjudicated title/metadata screening through Batch B3. It is not a final PRISMA-S strategy appendix and does not substitute for final study selection, extraction or synthesis.</w:t>
       </w:r>
     </w:p>
     <w:p>
@@ -1238,7 +1238,7 @@
         <w:spacing w:before="0" w:after="120"/>
       </w:pPr>
       <w:r>
-        <w:t>The canonical register reports 2,367 source rows, 1,877 provisional identity groups and 490 collapsed duplicate rows. The controlled title/metadata-screening denominator is 1,877. An adjudicated R1/R2 pilot of 40 records produced 25 clear exclusions and 15 provisional full-text candidates. Batch R1-B1 then screened the first 100 non-pilot canonical records by canonical_id order (CAN-0015 through CAN-0134 with pilot IDs omitted): exact R1/R2 agreement (100/100), no adjudication disagreements, 17 Include-for-full-text, 10 Unsure/retain-for-full-text and 73 Exclude. Batch B2 screened the next 100 non-pilot canonical records after B1 (CAN-0135-CAN-0240, with pilot IDs omitted): final adjudication retained 17 provisional full-text candidates and excluded 83 records after eight disagreements. Cumulatively, 240 title/metadata records have been screened, with 181 clear exclusions and 59 provisional full-text candidates. These outcomes do not finalise study inclusion or PRISMA counts. The remaining 1,637 canonical identities are unresolved/non-final; full-text assessment, extraction, risk-of-bias appraisal, certainty assessment, final PRISMA flow and SWiM synthesis remain pending.</w:t>
+        <w:t>The canonical register reports 2,367 source rows, 1,877 provisional identity groups and 490 collapsed duplicate rows. The controlled title/metadata-screening denominator is 1,877. An adjudicated R1/R2 pilot of 40 records produced 25 clear exclusions and 15 provisional full-text candidates. Batch R1-B1 then screened the first 100 non-pilot canonical records by canonical_id order (CAN-0015 through CAN-0134 with pilot IDs omitted): exact R1/R2 agreement (100/100), no adjudication disagreements, 17 Include-for-full-text, 10 Unsure/retain-for-full-text and 73 Exclude. Batch B2 screened the next 100 non-pilot canonical records after B1 (CAN-0135-CAN-0240, with pilot IDs omitted): final adjudication retained 17 provisional full-text candidates and excluded 83 records after eight disagreements. Batch B3 screened CAN-0241-CAN-0340: final adjudication retained 13 provisional full-text candidates and excluded 87 records. Six cross-reviewer uncertainty/disagreement records (CAN-0245, CAN-0258, CAN-0266, CAN-0282, CAN-0317 and CAN-0340) were retained under the conservative rule. Cumulatively, 340 title/metadata records have been screened, with 268 clear exclusions and 72 provisional full-text candidates. These outcomes do not finalise study inclusion or PRISMA counts. The remaining 1,537 canonical identities are unresolved/non-final; full-text assessment, extraction, risk-of-bias appraisal, certainty assessment, final PRISMA flow and SWiM synthesis remain pending.</w:t>
       </w:r>
     </w:p>
     <w:p>
@@ -1372,7 +1372,7 @@
           </w:tcPr>
           <w:p>
             <w:r>
-              <w:t>Open - 240 title/metadata records screened (40 adjudicated pilot + 100-record Batch R1-B1 + 100-record Batch B2): 181 clear exclusions and 59 provisional full-text candidates. The remaining 1,637 identities are unresolved/non-final.</w:t>
+              <w:t>Open - 340 title/metadata records screened (40 adjudicated pilot + 100-record Batch R1-B1 + 100-record Batch B2 + 100-record Batch B3): 268 clear exclusions and 72 provisional full-text candidates. The remaining 1,537 identities are unresolved/non-final.</w:t>
             </w:r>
           </w:p>
         </w:tc>
@@ -1421,7 +1421,7 @@
           </w:tcPr>
           <w:p>
             <w:r>
-              <w:t>Pending - 59 provisional candidates await full-text assessment; no final eligibility decisions.</w:t>
+              <w:t>Pending - 72 provisional candidates await full-text assessment; no final eligibility decisions.</w:t>
             </w:r>
           </w:p>
         </w:tc>
@@ -1803,7 +1803,7 @@
     </w:p>
     <w:p>
       <w:r>
-        <w:t>Dated 22 September 2026. This appendix supersedes no source record: it consolidates the current gate state for this submission-stage status report, including the adjudicated Batch B2 title/metadata update. It does not report final study selection, a PRISMA flow, included-study results, extraction, risk-of-bias findings or synthesis.</w:t>
+        <w:t>Dated 22 September 2026. This appendix supersedes no source record: it consolidates the current gate state for this submission-stage status report, including the adjudicated Batch B3 title/metadata update. It does not report final study selection, a PRISMA flow, included-study results, extraction, risk-of-bias findings or synthesis.</w:t>
       </w:r>
     </w:p>
     <w:p>
@@ -2023,7 +2023,7 @@
           </w:tcPr>
           <w:p>
             <w:r>
-              <w:t>240 title/metadata records screened: 40 pilot records independently screened by R1/R2 and adjudicated (25 clear exclusions; 15 provisional full-text candidates), Batch R1-B1 (100/100 exact agreement; 17 Include-for-full-text, 10 Unsure/retain-for-full-text, 73 Exclude; no adjudication disagreements), and Batch B2 (17 retained for full text; 83 excluded after eight disagreements were adjudicated). Cumulative: 181 clear exclusions and 59 provisional full-text candidates. The remaining 1,637 canonical identities are unresolved/non-final.</w:t>
+              <w:t>Open | 340 title/metadata records screened: 40 pilot records independently screened by R1/R2 and adjudicated (25 clear exclusions; 15 provisional full-text candidates), Batch R1-B1 (100/100 exact agreement; 17 Include-for-full-text, 10 Unsure/retain-for-full-text, 73 Exclude; no adjudication disagreements), Batch B2 (17 retained for full text; 83 excluded after eight disagreements were adjudicated), and Batch B3 (13 retained for full text; 87 excluded; six uncertainty/disagreement records retained conservatively). Cumulative: 268 clear exclusions and 72 provisional full-text candidates. The remaining 1,537 canonical identities are unresolved/non-final.</w:t>
             </w:r>
           </w:p>
         </w:tc>
@@ -2068,7 +2068,7 @@
           </w:tcPr>
           <w:p>
             <w:r>
-              <w:t>Pending. The 59 provisional full-text candidates have not undergone full-text eligibility assessment; no fixed full-text exclusion table exists.</w:t>
+              <w:t>Pending. The 72 provisional full-text candidates have not undergone full-text eligibility assessment; no fixed full-text exclusion table exists.</w:t>
             </w:r>
           </w:p>
         </w:tc>
@@ -2193,7 +2193,21 @@
         <w:pStyle w:val="Heading2"/>
       </w:pPr>
       <w:r>
-        <w:t>B3. Authoritative eligibility and screening rule</w:t>
+        <w:t>B3. Adjudicated Batch B3 title/metadata screening update</w:t>
+      </w:r>
+    </w:p>
+    <w:p>
+      <w:pPr/>
+      <w:r>
+        <w:t>Batch B3 comprised CAN-0241-CAN-0340 (100 records). R1 recorded 7 Include-for-full-text and 5 Unsure/retain-for-full-text decisions, with 88 Exclude; R2 recorded 7 Retain and 1 Unsure decision, with 92 Exclude. Cross-reviewer uncertainty/disagreement affected CAN-0245, CAN-0258, CAN-0266, CAN-0282, CAN-0317 and CAN-0340. Under the conservative rule, all six were retained for full-text review; the seven clear R1/R2 retains remained retained. Final B3 disposition: 13 provisional full-text candidates and 87 exclusions. These are not final included studies.</w:t>
+      </w:r>
+    </w:p>
+    <w:p>
+      <w:pPr>
+        <w:pStyle w:val="Heading2"/>
+      </w:pPr>
+      <w:r>
+        <w:t>B4. Authoritative eligibility and screening rule</w:t>
       </w:r>
     </w:p>
     <w:p>
@@ -2221,7 +2235,7 @@
         <w:pStyle w:val="Heading2"/>
       </w:pPr>
       <w:r>
-        <w:t>B4. Corrected search architecture and source-status boundary</w:t>
+        <w:t>B5. Corrected search architecture and source-status boundary</w:t>
       </w:r>
     </w:p>
     <w:p>
@@ -2704,7 +2718,7 @@
         <w:pStyle w:val="Heading2"/>
       </w:pPr>
       <w:r>
-        <w:t>B5. Calibration and Batch R1-B1 screening status</w:t>
+        <w:t>B6. Calibration and Batch R1-B1 screening status</w:t>
       </w:r>
     </w:p>
     <w:p>
@@ -3461,6 +3475,146 @@
           </w:p>
         </w:tc>
       </w:tr>
+      <w:tr>
+        <w:tc>
+          <w:tcPr>
+            <w:tcW w:type="dxa" w:w="3120"/>
+          </w:tcPr>
+          <w:tcPr/>
+          <w:p>
+            <w:r>
+              <w:t>Batch B3: scope and independent dispositions</w:t>
+            </w:r>
+          </w:p>
+        </w:tc>
+        <w:tc>
+          <w:tcPr>
+            <w:tcW w:type="dxa" w:w="3120"/>
+          </w:tcPr>
+          <w:tcPr/>
+          <w:p>
+            <w:r>
+              <w:t>100</w:t>
+            </w:r>
+          </w:p>
+        </w:tc>
+        <w:tc>
+          <w:tcPr>
+            <w:tcW w:type="dxa" w:w="3120"/>
+          </w:tcPr>
+          <w:tcPr/>
+          <w:p>
+            <w:r>
+              <w:t>CAN-0241-CAN-0340. R1: 7 Include-for-full-text + 5 Unsure/retain-for-full-text; 88 Exclude. R2: 7 Retain + 1 Unsure; 92 Exclude.</w:t>
+            </w:r>
+          </w:p>
+        </w:tc>
+      </w:tr>
+      <w:tr>
+        <w:tc>
+          <w:tcPr>
+            <w:tcW w:type="dxa" w:w="3120"/>
+          </w:tcPr>
+          <w:tcPr/>
+          <w:p>
+            <w:r>
+              <w:t>Batch B3: cross-reviewer uncertainty/disagreement and adjudication</w:t>
+            </w:r>
+          </w:p>
+        </w:tc>
+        <w:tc>
+          <w:tcPr>
+            <w:tcW w:type="dxa" w:w="3120"/>
+          </w:tcPr>
+          <w:tcPr/>
+          <w:p>
+            <w:r>
+              <w:t>6</w:t>
+            </w:r>
+          </w:p>
+        </w:tc>
+        <w:tc>
+          <w:tcPr>
+            <w:tcW w:type="dxa" w:w="3120"/>
+          </w:tcPr>
+          <w:tcPr/>
+          <w:p>
+            <w:r>
+              <w:t>CAN-0245, CAN-0258, CAN-0266, CAN-0282, CAN-0317 and CAN-0340. Conservative rule: retain all six for full-text review; no final study inclusion is inferred.</w:t>
+            </w:r>
+          </w:p>
+        </w:tc>
+      </w:tr>
+      <w:tr>
+        <w:tc>
+          <w:tcPr>
+            <w:tcW w:type="dxa" w:w="3120"/>
+          </w:tcPr>
+          <w:tcPr/>
+          <w:p>
+            <w:r>
+              <w:t>Batch B3: final disposition</w:t>
+            </w:r>
+          </w:p>
+        </w:tc>
+        <w:tc>
+          <w:tcPr>
+            <w:tcW w:type="dxa" w:w="3120"/>
+          </w:tcPr>
+          <w:tcPr/>
+          <w:p>
+            <w:r>
+              <w:t>13 retained; 87 excluded</w:t>
+            </w:r>
+          </w:p>
+        </w:tc>
+        <w:tc>
+          <w:tcPr>
+            <w:tcW w:type="dxa" w:w="3120"/>
+          </w:tcPr>
+          <w:tcPr/>
+          <w:p>
+            <w:r>
+              <w:t>The seven clear R1/R2 retains remained retained, with the six uncertainty/disagreement records. All 13 are provisional full-text candidates, not final included studies.</w:t>
+            </w:r>
+          </w:p>
+        </w:tc>
+      </w:tr>
+      <w:tr>
+        <w:tc>
+          <w:tcPr>
+            <w:tcW w:type="dxa" w:w="3120"/>
+          </w:tcPr>
+          <w:tcPr/>
+          <w:p>
+            <w:r>
+              <w:t>Cumulative pilot + Batch R1-B1 + Batch B2 + Batch B3</w:t>
+            </w:r>
+          </w:p>
+        </w:tc>
+        <w:tc>
+          <w:tcPr>
+            <w:tcW w:type="dxa" w:w="3120"/>
+          </w:tcPr>
+          <w:tcPr/>
+          <w:p>
+            <w:r>
+              <w:t>340 screened; 268 excluded; 72 provisional full-text candidates</w:t>
+            </w:r>
+          </w:p>
+        </w:tc>
+        <w:tc>
+          <w:tcPr>
+            <w:tcW w:type="dxa" w:w="3120"/>
+          </w:tcPr>
+          <w:tcPr/>
+          <w:p>
+            <w:r>
+              <w:t>Title/metadata screening only. The remaining 1,537 of 1,877 canonical identities are unresolved/non-final; full-text assessment, extraction, RoB, certainty, final PRISMA flow and SWiM remain pending.</w:t>
+            </w:r>
+          </w:p>
+        </w:tc>
+      </w:tr>
     </w:tbl>
     <w:p>
       <w:r>
@@ -3469,7 +3623,7 @@
           <w:b w:val="0"/>
           <w:sz w:val="20"/>
         </w:rPr>
-        <w:t>Pilot adjudication note: CAN-0031 (R1 Include; R2 Unsure) was retained for full text because its title identifies Nigeria H5N1 outbreak pathology and may contain eligible empirical data. CAN-0049 (R1 Unsure; R2 Exclude) was adjudicated Unsure and retained for full text under the protocol’s conservative rule. Batch R1-B1 had no adjudication disagreements. Across the adjudicated pilot and Batch R1-B1, 140 title/metadata records have been screened: 98 clear exclusions and 42 provisional full-text candidates. All 42 retained records are provisional full-text candidates, not final included studies; no final PRISMA count has been produced. The remaining 1,737 canonical identities still require independent title/metadata screening and adjudication.</w:t>
+        <w:t>Pilot adjudication note: CAN-0031 (R1 Include; R2 Unsure) was retained for full text because its title identifies Nigeria H5N1 outbreak pathology and may contain eligible empirical data. CAN-0049 (R1 Unsure; R2 Exclude) was adjudicated Unsure and retained for full text under the protocol�s conservative rule. Batch R1-B1 had no adjudication disagreements. At that interim milestone, the adjudicated pilot and Batch R1-B1 comprised 140 title/metadata records: 98 clear exclusions and 42 provisional full-text candidates. All retained records are provisional full-text candidates, not final included studies; no final PRISMA count has been produced.</w:t>
       </w:r>
     </w:p>
     <w:p>
@@ -3477,7 +3631,7 @@
         <w:pStyle w:val="Heading2"/>
       </w:pPr>
       <w:r>
-        <w:t>B6. Extraction and risk-of-bias fields ready for the next pass</w:t>
+        <w:t>B7. Extraction and risk-of-bias fields ready for the next pass</w:t>
       </w:r>
     </w:p>
     <w:tbl>
@@ -3584,7 +3738,7 @@
           </w:tcPr>
           <w:p>
             <w:r>
-              <w:t>Ready; 240 title/metadata records adjudicated, but no full-text eligibility decisions.</w:t>
+              <w:t>Ready; 340 title/metadata records adjudicated, but no full-text eligibility decisions.</w:t>
             </w:r>
           </w:p>
         </w:tc>
@@ -3747,7 +3901,7 @@
           <w:b w:val="0"/>
           <w:sz w:val="20"/>
         </w:rPr>
-        <w:t>Next controlled action: independently screen and adjudicate the remaining 1,737 canonical identities at title/metadata, then assess the 42 provisional candidates and any additional title/metadata retains at full text. Do not begin extraction or risk-of-bias appraisal until full-text eligibility is fixed; do not claim a final PRISMA flow, included-study count, certainty finding or SWiM synthesis until the complete screening queue is reconciled.</w:t>
+        <w:t>Next controlled action: independently screen and adjudicate the remaining 1,537 canonical identities at title/metadata, then assess the 72 provisional candidates and any additional title/metadata retains at full text. Do not begin extraction or risk-of-bias appraisal until full-text eligibility is fixed; do not claim a final PRISMA flow, included-study count, certainty finding or SWiM synthesis until the complete screening queue is reconciled.</w:t>
       </w:r>
     </w:p>
     <w:sectPr>

</xml_diff>

<commit_message>
Record adjudicated screening batch B4
</commit_message>
<xml_diff>
--- a/Avian_review_paper_submission_ready.docx
+++ b/Avian_review_paper_submission_ready.docx
@@ -32,7 +32,7 @@
         <w:spacing w:before="0" w:after="120"/>
       </w:pPr>
       <w:r>
-        <w:t>Background: Avian influenza viruses (AIVs) have caused recurrent poultry outbreaks and molecularly distinct detections in Nigeria since 2006. Objective: This submission-stage protocol prespecifies a systematic review of emergence, temporal and geographic distribution, host range, and molecular/clade/reassortment dynamics of Nigeria-specific AIVs. Methods: The protocol uses a CoCoPop/PEO framework and is aligned with PRISMA 2020, PRISMA-S and SWiM. The study/search window is 2006-2026; the operational status snapshot is 20 September 2026. Results status: 2,367 source rows had been reconciled into 1,877 provisional identities; 340 title/metadata records have been screened, yielding 268 clear exclusions and 72 provisional full-text candidates. Final screening, full-text assessment, extraction, risk-of-bias appraisal, synthesis and a PRISMA flow are not complete. Conclusion: This document is a protocol and search/record-management status report, not a completed systematic review.</w:t>
+        <w:t>Background: Avian influenza viruses (AIVs) have caused recurrent poultry outbreaks and molecularly distinct detections in Nigeria since 2006. Objective: This submission-stage protocol prespecifies a systematic review of emergence, temporal and geographic distribution, host range, and molecular/clade/reassortment dynamics of Nigeria-specific AIVs. Methods: The protocol uses a CoCoPop/PEO framework and is aligned with PRISMA 2020, PRISMA-S and SWiM. The study/search window is 2006-2026; the operational status snapshot is 20 September 2026. Results status: 2,367 source rows had been reconciled into 1,877 provisional identities; 440 title/metadata records have been screened, yielding 357 clear exclusions and 83 provisional full-text candidates. Final screening, full-text assessment, extraction, risk-of-bias appraisal, synthesis and a PRISMA flow are not complete. Conclusion: This document is a protocol and search/record-management status report, not a completed systematic review.</w:t>
       </w:r>
     </w:p>
     <w:p>
@@ -41,7 +41,7 @@
         <w:ind w:left="216" w:right="216"/>
       </w:pPr>
       <w:r>
-        <w:t>STATUS NOTE - 22 September 2026: Gate C remains open. The adjudicated R1/R2 title/metadata pilot of 40 records and Batch R1-B1 (the first 100 non-pilot canonical records by canonical_id order, CAN-0015 through CAN-0134 with pilot IDs omitted) produced 98 clear exclusions and 42 provisional full-text candidates. Batch R1-B1 had exact R1/R2 agreement (100/100) and no adjudication disagreements. Batch B2 retained 17 provisional full-text candidates and excluded 83 after eight R1/R2 disagreements were adjudicated. Batch B3 screened CAN-0241-CAN-0340: R1 recorded 7 Include and 5 Unsure/retain decisions (88 Exclude), and R2 recorded 7 Retain and 1 Unsure decision (92 Exclude). The six cross-reviewer uncertainty/disagreement records (CAN-0245, CAN-0258, CAN-0266, CAN-0282, CAN-0317 and CAN-0340) were retained conservatively for full-text review; the seven clear R1/R2 retains remained retained. Final B3 disposition: 13 provisional full-text candidates and 87 exclusions. Cumulatively, 340 title/metadata records have been screened, with 268 exclusions and 72 provisional full-text candidates; 1,537 canonical identities remain unresolved/non-final. Gates D-J are incomplete; no final PRISMA flow, included-study set, extraction, risk-of-bias assessment or synthesis is reported here.</w:t>
+        <w:t>STATUS NOTE - 22 September 2026: Gate C remains open. The adjudicated R1/R2 title/metadata pilot of 40 records and Batch R1-B1 (the first 100 non-pilot canonical records by canonical_id order, CAN-0015 through CAN-0134 with pilot IDs omitted) produced 98 clear exclusions and 42 provisional full-text candidates. Batch R1-B1 had exact R1/R2 agreement (100/100) and no adjudication disagreements. Batch B2 retained 17 provisional full-text candidates and excluded 83 after eight R1/R2 disagreements were adjudicated. Batch B3 screened CAN-0241-CAN-0340 and retained 13 provisional full-text candidates while excluding 87. Batch B4 screened CAN-0381-CAN-0480: R1/R2 had exact agreement (100/100), with 0 clear Include-for-full-text decisions, 11 Unsure/retain-for-full-text decisions and 89 Exclude decisions; no disagreements occurred. All 11 uncertain records were retained conservatively for full-text review. Cumulatively, 440 title/metadata records have been screened, with 357 exclusions and 83 provisional full-text candidates; 1,437 canonical identities remain unresolved/non-final. Gates D-J are incomplete; full-text assessment, extraction, risk-of-bias assessment, certainty assessment, final PRISMA flow and SWiM synthesis remain pending.</w:t>
       </w:r>
     </w:p>
     <w:p>
@@ -210,7 +210,7 @@
         <w:spacing w:before="0" w:after="120"/>
       </w:pPr>
       <w:r>
-        <w:t>Records were reconciled using symmetric DOI, PMID, or exact normalised title-plus-year matching. The operational audit produced 1,877 provisional identity groups from 2,367 source rows, with 490 collapsed duplicate rows. The controlled title/metadata-screening denominator is therefore 1,877. R1 and R2 independently screened and adjudicated a 40-record pilot (25 clear exclusions; 15 provisional full-text candidates) and independently screened Batch R1-B1, the first 100 non-pilot canonical records by canonical_id order (CAN-0015 through CAN-0134 with pilot IDs omitted). Batch R1-B1 had exact agreement (100/100), with 17 Include-for-full-text, 10 Unsure/retain-for-full-text and 73 Exclude decisions; no adjudication disagreements occurred. Batch B2 comprised the next 100 non-pilot canonical records after B1 (CAN-0135-CAN-0240, with pilot IDs omitted). R1 retained 20 records (10 Include and 10 Unsure) and excluded 80; R2 retained 17 and excluded 83. Eight disagreements were adjudicated. The final B2 disposition was 17 retained for full text and 83 excluded. Batch B3 comprised CAN-0241-CAN-0340. R1 recorded 7 Include-for-full-text and 5 Unsure/retain-for-full-text decisions (88 Exclude); R2 recorded 7 Retain and 1 Unsure decision (92 Exclude). Cross-reviewer uncertainty/disagreement affected CAN-0245, CAN-0258, CAN-0266, CAN-0282, CAN-0317 and CAN-0340; all six were retained conservatively for full-text review, and the seven clear R1/R2 retains remained retained. The final B3 disposition was 13 provisional full-text candidates and 87 exclusions. Across the pilot, B1, B2 and B3, 340 title/metadata records have been screened: 268 clear exclusions and 72 provisional full-text candidates. The remaining 1,537 canonical identities are unresolved/non-final. No final title/metadata decision, full-text eligibility decision or included-study count exists. The planned dual-review process applies Nigeria linkage, laboratory-confirmed avian AIV, at least one relevant evidence type, and extractable primary-data questions; an unsure record proceeds to full text rather than being assumed excluded.</w:t>
+        <w:t>Records were reconciled using symmetric DOI, PMID, or exact normalised title-plus-year matching. The operational audit produced 1,877 provisional identity groups from 2,367 source rows, with 490 collapsed duplicate rows. The controlled title/metadata-screening denominator is therefore 1,877. R1 and R2 independently screened and adjudicated a 40-record pilot (25 clear exclusions; 15 provisional full-text candidates) and independently screened Batch R1-B1, the first 100 non-pilot canonical records by canonical_id order (CAN-0015 through CAN-0134 with pilot IDs omitted). Batch R1-B1 had exact agreement (100/100), with 17 Include-for-full-text, 10 Unsure/retain-for-full-text and 73 Exclude decisions; no adjudication disagreements occurred. Batch B2 comprised the next 100 non-pilot canonical records after B1 (CAN-0135-CAN-0240, with pilot IDs omitted). The final B2 disposition was 17 retained for full text and 83 excluded after eight disagreements were adjudicated. Batch B3 comprised CAN-0241-CAN-0340; the final B3 disposition was 13 provisional full-text candidates and 87 exclusions. Batch B4 comprised CAN-0381-CAN-0480 (100 records). R1 and R2 had exact agreement (100/100): 0 clear Include-for-full-text, 11 Unsure/retain-for-full-text and 89 Exclude decisions, with no disagreements. All 11 uncertain records were retained conservatively for full-text review. Across the pilot, B1, B2, B3 and B4, 440 title/metadata records have been screened: 357 clear exclusions and 83 provisional full-text candidates. The remaining 1,437 canonical identities are unresolved/non-final. No final title/metadata decision, full-text eligibility decision or included-study count exists. The planned dual-review process applies Nigeria linkage, laboratory-confirmed avian AIV, at least one relevant evidence type, and extractable primary-data questions; an unsure record proceeds to full text rather than being assumed excluded.</w:t>
       </w:r>
     </w:p>
     <w:p>
@@ -249,7 +249,7 @@
         <w:spacing w:before="0" w:after="120"/>
       </w:pPr>
       <w:r>
-        <w:t>The evidence synthesis is not complete. Gate C screening reconciliation remains open after adjudication of the 40-record R1/R2 title/metadata pilot, exact-agreement screening of the 100-record Batch R1-B1, and adjudication of the 100-record Batches B2 and B3: 1,537 canonical identities remain unresolved/non-final, while 72 records are provisional candidates awaiting full-text assessment. Gates D-J have not been completed. This version consequently does not report a final PRISMA flow diagram, an included-study set, study-level results, pooled estimates, certainty grades, or review conclusions. Such outputs require completion of screening, full-text assessment, extraction, appraisal, synthesis and final reporting audit.</w:t>
+        <w:t>The evidence synthesis is not complete. Gate C screening reconciliation remains open after adjudication of the 40-record R1/R2 title/metadata pilot, exact-agreement screening of the 100-record Batch R1-B1 and Batch B4, and adjudication of the 100-record Batches B2 and B3: 1,437 canonical identities remain unresolved/non-final, while 83 records are provisional candidates awaiting full-text assessment. Gates D-J have not been completed. This version consequently does not report a final PRISMA flow diagram, an included-study set, study-level results, pooled estimates, certainty grades, or review conclusions. Such outputs require completion of screening, full-text assessment, extraction, appraisal, synthesis and final reporting audit.</w:t>
       </w:r>
     </w:p>
     <w:p>
@@ -542,7 +542,7 @@
         <w:spacing w:before="0" w:after="120"/>
       </w:pPr>
       <w:r>
-        <w:t>Operational snapshot: 20 September 2026. This appendix records the evidence boundary and search/record-management status for this submission-stage document, including adjudicated title/metadata screening through Batch B3. It is not a final PRISMA-S strategy appendix and does not substitute for final study selection, extraction or synthesis.</w:t>
+        <w:t>Operational snapshot: 20 September 2026. This appendix records the evidence boundary and search/record-management status for this submission-stage document, including adjudicated title/metadata screening through Batch B4. It is not a final PRISMA-S strategy appendix and does not substitute for final study selection, extraction or synthesis.</w:t>
       </w:r>
     </w:p>
     <w:p>
@@ -1238,7 +1238,7 @@
         <w:spacing w:before="0" w:after="120"/>
       </w:pPr>
       <w:r>
-        <w:t>The canonical register reports 2,367 source rows, 1,877 provisional identity groups and 490 collapsed duplicate rows. The controlled title/metadata-screening denominator is 1,877. An adjudicated R1/R2 pilot of 40 records produced 25 clear exclusions and 15 provisional full-text candidates. Batch R1-B1 then screened the first 100 non-pilot canonical records by canonical_id order (CAN-0015 through CAN-0134 with pilot IDs omitted): exact R1/R2 agreement (100/100), no adjudication disagreements, 17 Include-for-full-text, 10 Unsure/retain-for-full-text and 73 Exclude. Batch B2 screened the next 100 non-pilot canonical records after B1 (CAN-0135-CAN-0240, with pilot IDs omitted): final adjudication retained 17 provisional full-text candidates and excluded 83 records after eight disagreements. Batch B3 screened CAN-0241-CAN-0340: final adjudication retained 13 provisional full-text candidates and excluded 87 records. Six cross-reviewer uncertainty/disagreement records (CAN-0245, CAN-0258, CAN-0266, CAN-0282, CAN-0317 and CAN-0340) were retained under the conservative rule. Cumulatively, 340 title/metadata records have been screened, with 268 clear exclusions and 72 provisional full-text candidates. These outcomes do not finalise study inclusion or PRISMA counts. The remaining 1,537 canonical identities are unresolved/non-final; full-text assessment, extraction, risk-of-bias appraisal, certainty assessment, final PRISMA flow and SWiM synthesis remain pending.</w:t>
+        <w:t>The canonical register reports 2,367 source rows, 1,877 provisional identity groups and 490 collapsed duplicate rows. The controlled title/metadata-screening denominator is 1,877. An adjudicated R1/R2 pilot of 40 records produced 25 clear exclusions and 15 provisional full-text candidates. Batch R1-B1 then screened the first 100 non-pilot canonical records by canonical_id order (CAN-0015 through CAN-0134 with pilot IDs omitted): exact R1/R2 agreement (100/100), no adjudication disagreements, 17 Include-for-full-text, 10 Unsure/retain-for-full-text and 73 Exclude. Batch B2 screened the next 100 non-pilot canonical records after B1 (CAN-0135-CAN-0240, with pilot IDs omitted): final adjudication retained 17 provisional full-text candidates and excluded 83 records after eight disagreements. Batch B3 screened CAN-0241-CAN-0340: final adjudication retained 13 provisional full-text candidates and excluded 87 records. Batch B4 screened CAN-0381-CAN-0480: R1/R2 had exact agreement (100/100), with 0 clear Include-for-full-text, 11 Unsure/retain-for-full-text and 89 Exclude decisions; no disagreements occurred, and all 11 uncertain records were retained for full text. Cumulatively, 440 title/metadata records have been screened, with 357 clear exclusions and 83 provisional full-text candidates. These outcomes do not finalise study inclusion or PRISMA counts. The remaining 1,437 canonical identities are unresolved/non-final; full-text assessment, extraction, risk-of-bias appraisal, certainty assessment, final PRISMA flow and SWiM synthesis remain pending.</w:t>
       </w:r>
     </w:p>
     <w:p>
@@ -1372,7 +1372,7 @@
           </w:tcPr>
           <w:p>
             <w:r>
-              <w:t>Open - 340 title/metadata records screened (40 adjudicated pilot + 100-record Batch R1-B1 + 100-record Batch B2 + 100-record Batch B3): 268 clear exclusions and 72 provisional full-text candidates. The remaining 1,537 identities are unresolved/non-final.</w:t>
+              <w:t>Open - 440 title/metadata records screened (40 adjudicated pilot + 100-record Batch R1-B1 + 100-record Batch B2 + 100-record Batch B3 + 100-record Batch B4): 357 clear exclusions and 83 provisional full-text candidates. The remaining 1,437 identities are unresolved/non-final.</w:t>
             </w:r>
           </w:p>
         </w:tc>
@@ -1421,7 +1421,7 @@
           </w:tcPr>
           <w:p>
             <w:r>
-              <w:t>Pending - 72 provisional candidates await full-text assessment; no final eligibility decisions.</w:t>
+              <w:t>Pending - 83 provisional candidates await full-text assessment; no final eligibility decisions.</w:t>
             </w:r>
           </w:p>
         </w:tc>
@@ -1803,7 +1803,7 @@
     </w:p>
     <w:p>
       <w:r>
-        <w:t>Dated 22 September 2026. This appendix supersedes no source record: it consolidates the current gate state for this submission-stage status report, including the adjudicated Batch B3 title/metadata update. It does not report final study selection, a PRISMA flow, included-study results, extraction, risk-of-bias findings or synthesis.</w:t>
+        <w:t>Dated 22 September 2026. This appendix supersedes no source record: it consolidates the current gate state for this submission-stage status report, including the Batch B4 title/metadata update. It does not report final study selection, a PRISMA flow, included-study results, extraction, risk-of-bias findings or synthesis.</w:t>
       </w:r>
     </w:p>
     <w:p>
@@ -2023,7 +2023,7 @@
           </w:tcPr>
           <w:p>
             <w:r>
-              <w:t>Open | 340 title/metadata records screened: 40 pilot records independently screened by R1/R2 and adjudicated (25 clear exclusions; 15 provisional full-text candidates), Batch R1-B1 (100/100 exact agreement; 17 Include-for-full-text, 10 Unsure/retain-for-full-text, 73 Exclude; no adjudication disagreements), Batch B2 (17 retained for full text; 83 excluded after eight disagreements were adjudicated), and Batch B3 (13 retained for full text; 87 excluded; six uncertainty/disagreement records retained conservatively). Cumulative: 268 clear exclusions and 72 provisional full-text candidates. The remaining 1,537 canonical identities are unresolved/non-final.</w:t>
+              <w:t>Open | 440 title/metadata records screened: 40 pilot records independently screened by R1/R2 and adjudicated (25 clear exclusions; 15 provisional full-text candidates), Batch R1-B1 (100/100 exact agreement; 17 Include-for-full-text, 10 Unsure/retain-for-full-text, 73 Exclude; no adjudication disagreements), Batch B2 (17 retained for full text; 83 excluded after eight disagreements were adjudicated), Batch B3 (13 retained for full text; 87 excluded), and Batch B4 (CAN-0381-CAN-0480; 100/100 exact agreement; 0 clear includes, 11 uncertain records retained for full text, 89 exclusions; no disagreements). Cumulative: 357 clear exclusions and 83 provisional full-text candidates. The remaining 1,437 canonical identities are unresolved/non-final.</w:t>
             </w:r>
           </w:p>
         </w:tc>
@@ -2068,7 +2068,7 @@
           </w:tcPr>
           <w:p>
             <w:r>
-              <w:t>Pending. The 72 provisional full-text candidates have not undergone full-text eligibility assessment; no fixed full-text exclusion table exists.</w:t>
+              <w:t>Pending. The 83 provisional full-text candidates have not undergone full-text eligibility assessment; no fixed full-text exclusion table exists.</w:t>
             </w:r>
           </w:p>
         </w:tc>
@@ -2200,6 +2200,20 @@
       <w:pPr/>
       <w:r>
         <w:t>Batch B3 comprised CAN-0241-CAN-0340 (100 records). R1 recorded 7 Include-for-full-text and 5 Unsure/retain-for-full-text decisions, with 88 Exclude; R2 recorded 7 Retain and 1 Unsure decision, with 92 Exclude. Cross-reviewer uncertainty/disagreement affected CAN-0245, CAN-0258, CAN-0266, CAN-0282, CAN-0317 and CAN-0340. Under the conservative rule, all six were retained for full-text review; the seven clear R1/R2 retains remained retained. Final B3 disposition: 13 provisional full-text candidates and 87 exclusions. These are not final included studies.</w:t>
+      </w:r>
+    </w:p>
+    <w:p>
+      <w:pPr>
+        <w:pStyle w:val="Heading2"/>
+      </w:pPr>
+      <w:r>
+        <w:t>B4. Batch B4 title/metadata screening update</w:t>
+      </w:r>
+    </w:p>
+    <w:p>
+      <w:pPr/>
+      <w:r>
+        <w:t>Batch B4 comprised CAN-0381-CAN-0480 (100 records). R1 and R2 had exact agreement (100/100): 0 clear Include-for-full-text decisions, 11 Unsure/retain-for-full-text decisions and 89 Exclude decisions. No disagreements occurred. All 11 uncertain records were retained conservatively for full-text assessment. These are provisional full-text candidates, not final included studies.</w:t>
       </w:r>
     </w:p>
     <w:p>
@@ -3588,7 +3602,7 @@
           <w:tcPr/>
           <w:p>
             <w:r>
-              <w:t>Cumulative pilot + Batch R1-B1 + Batch B2 + Batch B3</w:t>
+              <w:t>Batch B4: scope and final disposition</w:t>
             </w:r>
           </w:p>
         </w:tc>
@@ -3599,7 +3613,7 @@
           <w:tcPr/>
           <w:p>
             <w:r>
-              <w:t>340 screened; 268 excluded; 72 provisional full-text candidates</w:t>
+              <w:t>100 records CAN-0381-CAN-0480; exact R1/R2 agreement (100/100)</w:t>
             </w:r>
           </w:p>
         </w:tc>
@@ -3610,7 +3624,39 @@
           <w:tcPr/>
           <w:p>
             <w:r>
-              <w:t>Title/metadata screening only. The remaining 1,537 of 1,877 canonical identities are unresolved/non-final; full-text assessment, extraction, RoB, certainty, final PRISMA flow and SWiM remain pending.</w:t>
+              <w:t>0 clear Include-for-full-text; 11 Unsure/retain-for-full-text, all retained provisionally for full text; 89 Exclude; no disagreements.</w:t>
+            </w:r>
+          </w:p>
+        </w:tc>
+      </w:tr>
+      <w:tr>
+        <w:tc>
+          <w:tcPr>
+            <w:tcW w:type="dxa" w:w="3120"/>
+          </w:tcPr>
+          <w:p>
+            <w:r>
+              <w:t>Cumulative pilot + Batch R1-B1 + Batch B2 + Batch B3 + Batch B4</w:t>
+            </w:r>
+          </w:p>
+        </w:tc>
+        <w:tc>
+          <w:tcPr>
+            <w:tcW w:type="dxa" w:w="3120"/>
+          </w:tcPr>
+          <w:p>
+            <w:r>
+              <w:t>440 screened; 357 excluded; 83 provisional full-text candidates</w:t>
+            </w:r>
+          </w:p>
+        </w:tc>
+        <w:tc>
+          <w:tcPr>
+            <w:tcW w:type="dxa" w:w="3120"/>
+          </w:tcPr>
+          <w:p>
+            <w:r>
+              <w:t>Title/metadata screening only. The remaining 1,437 of 1,877 canonical identities are unresolved/non-final; full-text assessment, extraction, RoB, certainty, final PRISMA flow and SWiM remain pending.</w:t>
             </w:r>
           </w:p>
         </w:tc>
@@ -3738,7 +3784,7 @@
           </w:tcPr>
           <w:p>
             <w:r>
-              <w:t>Ready; 340 title/metadata records adjudicated, but no full-text eligibility decisions.</w:t>
+              <w:t>Ready; 440 title/metadata records adjudicated, but no full-text eligibility decisions.</w:t>
             </w:r>
           </w:p>
         </w:tc>
@@ -3901,7 +3947,7 @@
           <w:b w:val="0"/>
           <w:sz w:val="20"/>
         </w:rPr>
-        <w:t>Next controlled action: independently screen and adjudicate the remaining 1,537 canonical identities at title/metadata, then assess the 72 provisional candidates and any additional title/metadata retains at full text. Do not begin extraction or risk-of-bias appraisal until full-text eligibility is fixed; do not claim a final PRISMA flow, included-study count, certainty finding or SWiM synthesis until the complete screening queue is reconciled.</w:t>
+        <w:t>Next controlled action: independently screen and adjudicate the remaining 1,437 canonical identities at title/metadata, then assess the 83 provisional candidates and any additional title/metadata retains at full text. Do not begin extraction or risk-of-bias appraisal until full-text eligibility is fixed; do not claim a final PRISMA flow, included-study count, certainty finding or SWiM synthesis until the complete screening queue is reconciled.</w:t>
       </w:r>
     </w:p>
     <w:sectPr>

</xml_diff>

<commit_message>
Record adjudicated screening batch B5
</commit_message>
<xml_diff>
--- a/Avian_review_paper_submission_ready.docx
+++ b/Avian_review_paper_submission_ready.docx
@@ -32,7 +32,7 @@
         <w:spacing w:before="0" w:after="120"/>
       </w:pPr>
       <w:r>
-        <w:t>Background: Avian influenza viruses (AIVs) have caused recurrent poultry outbreaks and molecularly distinct detections in Nigeria since 2006. Objective: This submission-stage protocol prespecifies a systematic review of emergence, temporal and geographic distribution, host range, and molecular/clade/reassortment dynamics of Nigeria-specific AIVs. Methods: The protocol uses a CoCoPop/PEO framework and is aligned with PRISMA 2020, PRISMA-S and SWiM. The study/search window is 2006-2026; the operational status snapshot is 20 September 2026. Results status: 2,367 source rows had been reconciled into 1,877 provisional identities; 440 title/metadata records have been screened, yielding 357 clear exclusions and 83 provisional full-text candidates. Final screening, full-text assessment, extraction, risk-of-bias appraisal, synthesis and a PRISMA flow are not complete. Conclusion: This document is a protocol and search/record-management status report, not a completed systematic review.</w:t>
+        <w:t>Background: Avian influenza viruses (AIVs) have caused recurrent poultry outbreaks and molecularly distinct detections in Nigeria since 2006. Objective: This submission-stage protocol prespecifies a systematic review of emergence, temporal and geographic distribution, host range, and molecular/clade/reassortment dynamics of Nigeria-specific AIVs. Methods: The protocol uses a CoCoPop/PEO framework and is aligned with PRISMA 2020, PRISMA-S and SWiM. The study/search window is 2006-2026; the operational status snapshot is 20 September 2026. Results status: 2,367 source rows had been reconciled into 1,877 provisional identities; 540 title/metadata records have been screened, yielding 436 clear exclusions and 104 provisional full-text candidates. Final screening, full-text assessment, extraction, risk-of-bias appraisal, synthesis and a PRISMA flow are not complete. Conclusion: This document is a protocol and search/record-management status report, not a completed systematic review.</w:t>
       </w:r>
     </w:p>
     <w:p>
@@ -41,7 +41,7 @@
         <w:ind w:left="216" w:right="216"/>
       </w:pPr>
       <w:r>
-        <w:t>STATUS NOTE - 22 September 2026: Gate C remains open. The adjudicated R1/R2 title/metadata pilot of 40 records and Batch R1-B1 (the first 100 non-pilot canonical records by canonical_id order, CAN-0015 through CAN-0134 with pilot IDs omitted) produced 98 clear exclusions and 42 provisional full-text candidates. Batch R1-B1 had exact R1/R2 agreement (100/100) and no adjudication disagreements. Batch B2 retained 17 provisional full-text candidates and excluded 83 after eight R1/R2 disagreements were adjudicated. Batch B3 screened CAN-0241-CAN-0340 and retained 13 provisional full-text candidates while excluding 87. Batch B4 screened CAN-0381-CAN-0480: R1/R2 had exact agreement (100/100), with 0 clear Include-for-full-text decisions, 11 Unsure/retain-for-full-text decisions and 89 Exclude decisions; no disagreements occurred. All 11 uncertain records were retained conservatively for full-text review. Cumulatively, 440 title/metadata records have been screened, with 357 exclusions and 83 provisional full-text candidates; 1,437 canonical identities remain unresolved/non-final. Gates D-J are incomplete; full-text assessment, extraction, risk-of-bias assessment, certainty assessment, final PRISMA flow and SWiM synthesis remain pending.</w:t>
+        <w:t>STATUS NOTE - 22 September 2026: Gate C remains open. The adjudicated R1/R2 title/metadata pilot of 40 records and Batch R1-B1 (the first 100 non-pilot canonical records by canonical_id order, CAN-0015 through CAN-0134 with pilot IDs omitted) produced 98 clear exclusions and 42 provisional full-text candidates. Batch R1-B1 had exact R1/R2 agreement (100/100) and no adjudication disagreements. Batch B2 retained 17 provisional full-text candidates and excluded 83 after eight R1/R2 disagreements were adjudicated. Batch B3 screened CAN-0241-CAN-0340 and retained 13 provisional full-text candidates while excluding 87. Batch B4 screened CAN-0381-CAN-0480: R1/R2 had exact agreement (100/100), with 0 clear Include-for-full-text decisions, 11 Unsure/retain-for-full-text decisions and 89 Exclude decisions; no disagreements occurred. All 11 uncertain records were retained conservatively for full-text review. Cumulatively, 540 title/metadata records have been screened, with 436 exclusions and 104 provisional full-text candidates; 1,337 canonical identities remain unresolved/non-final. Gates D-J are incomplete; full-text assessment, extraction, risk-of-bias assessment, certainty assessment, final PRISMA flow and SWiM synthesis remain pending.</w:t>
       </w:r>
     </w:p>
     <w:p>
@@ -210,7 +210,7 @@
         <w:spacing w:before="0" w:after="120"/>
       </w:pPr>
       <w:r>
-        <w:t>Records were reconciled using symmetric DOI, PMID, or exact normalised title-plus-year matching. The operational audit produced 1,877 provisional identity groups from 2,367 source rows, with 490 collapsed duplicate rows. The controlled title/metadata-screening denominator is therefore 1,877. R1 and R2 independently screened and adjudicated a 40-record pilot (25 clear exclusions; 15 provisional full-text candidates) and independently screened Batch R1-B1, the first 100 non-pilot canonical records by canonical_id order (CAN-0015 through CAN-0134 with pilot IDs omitted). Batch R1-B1 had exact agreement (100/100), with 17 Include-for-full-text, 10 Unsure/retain-for-full-text and 73 Exclude decisions; no adjudication disagreements occurred. Batch B2 comprised the next 100 non-pilot canonical records after B1 (CAN-0135-CAN-0240, with pilot IDs omitted). The final B2 disposition was 17 retained for full text and 83 excluded after eight disagreements were adjudicated. Batch B3 comprised CAN-0241-CAN-0340; the final B3 disposition was 13 provisional full-text candidates and 87 exclusions. Batch B4 comprised CAN-0381-CAN-0480 (100 records). R1 and R2 had exact agreement (100/100): 0 clear Include-for-full-text, 11 Unsure/retain-for-full-text and 89 Exclude decisions, with no disagreements. All 11 uncertain records were retained conservatively for full-text review. Across the pilot, B1, B2, B3 and B4, 440 title/metadata records have been screened: 357 clear exclusions and 83 provisional full-text candidates. The remaining 1,437 canonical identities are unresolved/non-final. No final title/metadata decision, full-text eligibility decision or included-study count exists. The planned dual-review process applies Nigeria linkage, laboratory-confirmed avian AIV, at least one relevant evidence type, and extractable primary-data questions; an unsure record proceeds to full text rather than being assumed excluded.</w:t>
+        <w:t>Records were reconciled using symmetric DOI, PMID, or exact normalised title-plus-year matching. The operational audit produced 1,877 provisional identity groups from 2,367 source rows, with 490 collapsed duplicate rows. The controlled title/metadata-screening denominator is therefore 1,877. R1 and R2 independently screened and adjudicated a 40-record pilot (25 clear exclusions; 15 provisional full-text candidates) and independently screened Batch R1-B1, the first 100 non-pilot canonical records by canonical_id order (CAN-0015 through CAN-0134 with pilot IDs omitted). Batch R1-B1 had exact agreement (100/100), with 17 Include-for-full-text, 10 Unsure/retain-for-full-text and 73 Exclude decisions; no adjudication disagreements occurred. Batch B2 comprised the next 100 non-pilot canonical records after B1 (CAN-0135-CAN-0240, with pilot IDs omitted). The final B2 disposition was 17 retained for full text and 83 excluded after eight disagreements were adjudicated. Batch B3 comprised CAN-0241-CAN-0340; the final B3 disposition was 13 provisional full-text candidates and 87 exclusions. Batch B4 comprised CAN-0381-CAN-0480 (100 records). R1 and R2 had exact agreement (100/100): 0 clear Include-for-full-text, 11 Unsure/retain-for-full-text and 89 Exclude decisions, with no disagreements. All 11 uncertain records were retained conservatively for full-text review. Across the pilot, B1, B2, B3 and B4, 540 title/metadata records have been screened: 436 clear exclusions and 104 provisional full-text candidates. The remaining 1,437 canonical identities are unresolved/non-final. No final title/metadata decision, full-text eligibility decision or included-study count exists. The planned dual-review process applies Nigeria linkage, laboratory-confirmed avian AIV, at least one relevant evidence type, and extractable primary-data questions; an unsure record proceeds to full text rather than being assumed excluded.</w:t>
       </w:r>
     </w:p>
     <w:p>
@@ -249,7 +249,7 @@
         <w:spacing w:before="0" w:after="120"/>
       </w:pPr>
       <w:r>
-        <w:t>The evidence synthesis is not complete. Gate C screening reconciliation remains open after adjudication of the 40-record R1/R2 title/metadata pilot, exact-agreement screening of the 100-record Batch R1-B1 and Batch B4, and adjudication of the 100-record Batches B2 and B3: 1,437 canonical identities remain unresolved/non-final, while 83 records are provisional candidates awaiting full-text assessment. Gates D-J have not been completed. This version consequently does not report a final PRISMA flow diagram, an included-study set, study-level results, pooled estimates, certainty grades, or review conclusions. Such outputs require completion of screening, full-text assessment, extraction, appraisal, synthesis and final reporting audit.</w:t>
+        <w:t>The evidence synthesis is not complete. Gate C screening reconciliation remains open after adjudication of the 40-record R1/R2 title/metadata pilot, exact-agreement screening of the 100-record Batch R1-B1 and Batch B4, and adjudication of the 100-record Batches B2 and B3: 1,337 canonical identities remain unresolved/non-final, while 83 records are provisional candidates awaiting full-text assessment. Gates D-J have not been completed. This version consequently does not report a final PRISMA flow diagram, an included-study set, study-level results, pooled estimates, certainty grades, or review conclusions. Such outputs require completion of screening, full-text assessment, extraction, appraisal, synthesis and final reporting audit.</w:t>
       </w:r>
     </w:p>
     <w:p>
@@ -1803,7 +1803,7 @@
     </w:p>
     <w:p>
       <w:r>
-        <w:t>Dated 22 September 2026. This appendix supersedes no source record: it consolidates the current gate state for this submission-stage status report, including the Batch B4 title/metadata update. It does not report final study selection, a PRISMA flow, included-study results, extraction, risk-of-bias findings or synthesis.</w:t>
+        <w:t>Dated 23 September 2026. This appendix supersedes no source record: it consolidates the current gate state for this submission-stage status report, including the Batch B4 and Batch B5 title/metadata updates. It does not report final study selection, a PRISMA flow, included-study results, extraction, risk-of-bias findings or synthesis.</w:t>
       </w:r>
     </w:p>
     <w:p>
@@ -3947,7 +3947,20 @@
           <w:b w:val="0"/>
           <w:sz w:val="20"/>
         </w:rPr>
-        <w:t>Next controlled action: independently screen and adjudicate the remaining 1,437 canonical identities at title/metadata, then assess the 83 provisional candidates and any additional title/metadata retains at full text. Do not begin extraction or risk-of-bias appraisal until full-text eligibility is fixed; do not claim a final PRISMA flow, included-study count, certainty finding or SWiM synthesis until the complete screening queue is reconciled.</w:t>
+        <w:t>Next controlled action: independently screen and adjudicate the remaining 1,337 canonical identities at title/metadata, then assess the 104 provisional candidates and any additional title/metadata retains at full text. Do not begin extraction or risk-of-bias appraisal until full-text eligibility is fixed; do not claim a final PRISMA flow, included-study count, certainty finding or SWiM synthesis until the complete screening queue is reconciled.</w:t>
+      </w:r>
+    </w:p>
+    <w:p>
+      <w:pPr>
+        <w:pStyle w:val="Heading2"/>
+      </w:pPr>
+      <w:r>
+        <w:t>B5. Adjudicated Batch B5 title/metadata screening update</w:t>
+      </w:r>
+    </w:p>
+    <w:p>
+      <w:r>
+        <w:t>Batch B5 comprised CAN-0481-CAN-0580 (100 records). R1 retained 10 records and excluded 90; R2 retained 18 and excluded 82. The reviewers differed on 14 records. Applying the prespecified conservative rule, all disagreement records were retained for full-text assessment rather than being forced into exclusion. The final B5 disposition is therefore 21 provisional full-text candidates and 79 exclusions. These are provisional candidates, not final included studies; full-text eligibility remains outstanding.</w:t>
       </w:r>
     </w:p>
     <w:sectPr>

</xml_diff>

<commit_message>
Record adjudicated screening batch B6
</commit_message>
<xml_diff>
--- a/Avian_review_paper_submission_ready.docx
+++ b/Avian_review_paper_submission_ready.docx
@@ -32,7 +32,7 @@
         <w:spacing w:before="0" w:after="120"/>
       </w:pPr>
       <w:r>
-        <w:t>Background: Avian influenza viruses (AIVs) have caused recurrent poultry outbreaks and molecularly distinct detections in Nigeria since 2006. Objective: This submission-stage protocol prespecifies a systematic review of emergence, temporal and geographic distribution, host range, and molecular/clade/reassortment dynamics of Nigeria-specific AIVs. Methods: The protocol uses a CoCoPop/PEO framework and is aligned with PRISMA 2020, PRISMA-S and SWiM. The study/search window is 2006-2026; the operational status snapshot is 20 September 2026. Results status: 2,367 source rows had been reconciled into 1,877 provisional identities; 540 title/metadata records have been screened, yielding 436 clear exclusions and 104 provisional full-text candidates. Final screening, full-text assessment, extraction, risk-of-bias appraisal, synthesis and a PRISMA flow are not complete. Conclusion: This document is a protocol and search/record-management status report, not a completed systematic review.</w:t>
+        <w:t>Background: Avian influenza viruses (AIVs) have caused recurrent poultry outbreaks and molecularly distinct detections in Nigeria since 2006. Objective: This submission-stage protocol prespecifies a systematic review of emergence, temporal and geographic distribution, host range, and molecular/clade/reassortment dynamics of Nigeria-specific AIVs. Methods: The protocol uses a CoCoPop/PEO framework and is aligned with PRISMA 2020, PRISMA-S and SWiM. The study/search window is 2006-2026; the operational status snapshot is 20 September 2026. Results status: 2,367 source rows had been reconciled into 1,877 provisional identities; 640 title/metadata records have been screened, yielding 519 clear exclusions and 121 provisional full-text candidates. Final screening, full-text assessment, extraction, risk-of-bias appraisal, synthesis and a PRISMA flow are not complete. Conclusion: This document is a protocol and search/record-management status report, not a completed systematic review.</w:t>
       </w:r>
     </w:p>
     <w:p>
@@ -41,7 +41,7 @@
         <w:ind w:left="216" w:right="216"/>
       </w:pPr>
       <w:r>
-        <w:t>STATUS NOTE - 22 September 2026: Gate C remains open. The adjudicated R1/R2 title/metadata pilot of 40 records and Batch R1-B1 (the first 100 non-pilot canonical records by canonical_id order, CAN-0015 through CAN-0134 with pilot IDs omitted) produced 98 clear exclusions and 42 provisional full-text candidates. Batch R1-B1 had exact R1/R2 agreement (100/100) and no adjudication disagreements. Batch B2 retained 17 provisional full-text candidates and excluded 83 after eight R1/R2 disagreements were adjudicated. Batch B3 screened CAN-0241-CAN-0340 and retained 13 provisional full-text candidates while excluding 87. Batch B4 screened CAN-0381-CAN-0480: R1/R2 had exact agreement (100/100), with 0 clear Include-for-full-text decisions, 11 Unsure/retain-for-full-text decisions and 89 Exclude decisions; no disagreements occurred. All 11 uncertain records were retained conservatively for full-text review. Cumulatively, 540 title/metadata records have been screened, with 436 exclusions and 104 provisional full-text candidates; 1,337 canonical identities remain unresolved/non-final. Gates D-J are incomplete; full-text assessment, extraction, risk-of-bias assessment, certainty assessment, final PRISMA flow and SWiM synthesis remain pending.</w:t>
+        <w:t>STATUS NOTE - 22 September 2026: Gate C remains open. The adjudicated R1/R2 title/metadata pilot of 40 records and Batch R1-B1 (the first 100 non-pilot canonical records by canonical_id order, CAN-0015 through CAN-0134 with pilot IDs omitted) produced 98 clear exclusions and 42 provisional full-text candidates. Batch R1-B1 had exact R1/R2 agreement (100/100) and no adjudication disagreements. Batch B2 retained 17 provisional full-text candidates and excluded 83 after eight R1/R2 disagreements were adjudicated. Batch B3 screened CAN-0241-CAN-0340 and retained 13 provisional full-text candidates while excluding 87. Batch B4 screened CAN-0381-CAN-0480: R1/R2 had exact agreement (100/100), with 0 clear Include-for-full-text decisions, 11 Unsure/retain-for-full-text decisions and 89 Exclude decisions; no disagreements occurred. All 11 uncertain records were retained conservatively for full-text review. Cumulatively, 640 title/metadata records have been screened, with 519 exclusions and 121 provisional full-text candidates; 1,237 canonical identities remain unresolved/non-final. Gates D-J are incomplete; full-text assessment, extraction, risk-of-bias assessment, certainty assessment, final PRISMA flow and SWiM synthesis remain pending.</w:t>
       </w:r>
     </w:p>
     <w:p>
@@ -210,7 +210,7 @@
         <w:spacing w:before="0" w:after="120"/>
       </w:pPr>
       <w:r>
-        <w:t>Records were reconciled using symmetric DOI, PMID, or exact normalised title-plus-year matching. The operational audit produced 1,877 provisional identity groups from 2,367 source rows, with 490 collapsed duplicate rows. The controlled title/metadata-screening denominator is therefore 1,877. R1 and R2 independently screened and adjudicated a 40-record pilot (25 clear exclusions; 15 provisional full-text candidates) and independently screened Batch R1-B1, the first 100 non-pilot canonical records by canonical_id order (CAN-0015 through CAN-0134 with pilot IDs omitted). Batch R1-B1 had exact agreement (100/100), with 17 Include-for-full-text, 10 Unsure/retain-for-full-text and 73 Exclude decisions; no adjudication disagreements occurred. Batch B2 comprised the next 100 non-pilot canonical records after B1 (CAN-0135-CAN-0240, with pilot IDs omitted). The final B2 disposition was 17 retained for full text and 83 excluded after eight disagreements were adjudicated. Batch B3 comprised CAN-0241-CAN-0340; the final B3 disposition was 13 provisional full-text candidates and 87 exclusions. Batch B4 comprised CAN-0381-CAN-0480 (100 records). R1 and R2 had exact agreement (100/100): 0 clear Include-for-full-text, 11 Unsure/retain-for-full-text and 89 Exclude decisions, with no disagreements. All 11 uncertain records were retained conservatively for full-text review. Across the pilot, B1, B2, B3 and B4, 540 title/metadata records have been screened: 436 clear exclusions and 104 provisional full-text candidates. The remaining 1,437 canonical identities are unresolved/non-final. No final title/metadata decision, full-text eligibility decision or included-study count exists. The planned dual-review process applies Nigeria linkage, laboratory-confirmed avian AIV, at least one relevant evidence type, and extractable primary-data questions; an unsure record proceeds to full text rather than being assumed excluded.</w:t>
+        <w:t>Records were reconciled using symmetric DOI, PMID, or exact normalised title-plus-year matching. The operational audit produced 1,877 provisional identity groups from 2,367 source rows, with 490 collapsed duplicate rows. The controlled title/metadata-screening denominator is therefore 1,877. R1 and R2 independently screened and adjudicated a 40-record pilot (25 clear exclusions; 15 provisional full-text candidates) and independently screened Batch R1-B1, the first 100 non-pilot canonical records by canonical_id order (CAN-0015 through CAN-0134 with pilot IDs omitted). Batch R1-B1 had exact agreement (100/100), with 17 Include-for-full-text, 10 Unsure/retain-for-full-text and 73 Exclude decisions; no adjudication disagreements occurred. Batch B2 comprised the next 100 non-pilot canonical records after B1 (CAN-0135-CAN-0240, with pilot IDs omitted). The final B2 disposition was 17 retained for full text and 83 excluded after eight disagreements were adjudicated. Batch B3 comprised CAN-0241-CAN-0340; the final B3 disposition was 13 provisional full-text candidates and 87 exclusions. Batch B4 comprised CAN-0381-CAN-0480 (100 records). R1 and R2 had exact agreement (100/100): 0 clear Include-for-full-text, 11 Unsure/retain-for-full-text and 89 Exclude decisions, with no disagreements. All 11 uncertain records were retained conservatively for full-text review. Across the pilot, B1, B2, B3 and B4, 640 title/metadata records have been screened: 519 clear exclusions and 121 provisional full-text candidates. The remaining 1,437 canonical identities are unresolved/non-final. No final title/metadata decision, full-text eligibility decision or included-study count exists. The planned dual-review process applies Nigeria linkage, laboratory-confirmed avian AIV, at least one relevant evidence type, and extractable primary-data questions; an unsure record proceeds to full text rather than being assumed excluded.</w:t>
       </w:r>
     </w:p>
     <w:p>
@@ -249,7 +249,7 @@
         <w:spacing w:before="0" w:after="120"/>
       </w:pPr>
       <w:r>
-        <w:t>The evidence synthesis is not complete. Gate C screening reconciliation remains open after adjudication of the 40-record R1/R2 title/metadata pilot, exact-agreement screening of the 100-record Batch R1-B1 and Batch B4, and adjudication of the 100-record Batches B2 and B3: 1,337 canonical identities remain unresolved/non-final, while 83 records are provisional candidates awaiting full-text assessment. Gates D-J have not been completed. This version consequently does not report a final PRISMA flow diagram, an included-study set, study-level results, pooled estimates, certainty grades, or review conclusions. Such outputs require completion of screening, full-text assessment, extraction, appraisal, synthesis and final reporting audit.</w:t>
+        <w:t>The evidence synthesis is not complete. Gate C screening reconciliation remains open after adjudication of the 40-record R1/R2 title/metadata pilot, exact-agreement screening of the 100-record Batch R1-B1 and Batch B4, and adjudication of the 100-record Batches B2 and B3: 1,237 canonical identities remain unresolved/non-final, while 83 records are provisional candidates awaiting full-text assessment. Gates D-J have not been completed. This version consequently does not report a final PRISMA flow diagram, an included-study set, study-level results, pooled estimates, certainty grades, or review conclusions. Such outputs require completion of screening, full-text assessment, extraction, appraisal, synthesis and final reporting audit.</w:t>
       </w:r>
     </w:p>
     <w:p>
@@ -1803,7 +1803,7 @@
     </w:p>
     <w:p>
       <w:r>
-        <w:t>Dated 23 September 2026. This appendix supersedes no source record: it consolidates the current gate state for this submission-stage status report, including the Batch B4 and Batch B5 title/metadata updates. It does not report final study selection, a PRISMA flow, included-study results, extraction, risk-of-bias findings or synthesis.</w:t>
+        <w:t>Dated 23 September 2026. This appendix supersedes no source record: it consolidates the current gate state for this submission-stage status report, including the Batch B4, Batch B5 and Batch B6 title/metadata updates. It does not report final study selection, a PRISMA flow, included-study results, extraction, risk-of-bias findings or synthesis.</w:t>
       </w:r>
     </w:p>
     <w:p>
@@ -3942,12 +3942,7 @@
     </w:tbl>
     <w:p>
       <w:r>
-        <w:rPr>
-          <w:rFonts w:ascii="Times New Roman" w:hAnsi="Times New Roman" w:eastAsia="Times New Roman"/>
-          <w:b w:val="0"/>
-          <w:sz w:val="20"/>
-        </w:rPr>
-        <w:t>Next controlled action: independently screen and adjudicate the remaining 1,337 canonical identities at title/metadata, then assess the 104 provisional candidates and any additional title/metadata retains at full text. Do not begin extraction or risk-of-bias appraisal until full-text eligibility is fixed; do not claim a final PRISMA flow, included-study count, certainty finding or SWiM synthesis until the complete screening queue is reconciled.</w:t>
+        <w:t>Next controlled action: independently screen and adjudicate the remaining 1,237 canonical identities at title/metadata, then assess the 121 provisional candidates and any additional title/metadata retains at full text. Do not begin extraction or risk-of-bias appraisal until full-text eligibility is fixed; do not claim a final PRISMA flow, included-study count, certainty finding or SWiM synthesis until the complete screening queue is reconciled.</w:t>
       </w:r>
     </w:p>
     <w:p>
@@ -3961,6 +3956,19 @@
     <w:p>
       <w:r>
         <w:t>Batch B5 comprised CAN-0481-CAN-0580 (100 records). R1 retained 10 records and excluded 90; R2 retained 18 and excluded 82. The reviewers differed on 14 records. Applying the prespecified conservative rule, all disagreement records were retained for full-text assessment rather than being forced into exclusion. The final B5 disposition is therefore 21 provisional full-text candidates and 79 exclusions. These are provisional candidates, not final included studies; full-text eligibility remains outstanding.</w:t>
+      </w:r>
+    </w:p>
+    <w:p>
+      <w:pPr>
+        <w:pStyle w:val="Heading2"/>
+      </w:pPr>
+      <w:r>
+        <w:t>B6. Adjudicated Batch B6 title/metadata screening update</w:t>
+      </w:r>
+    </w:p>
+    <w:p>
+      <w:r>
+        <w:t>Batch B6 comprised CAN-0581-CAN-0680 (100 records). R1 retained 9 records and excluded 91; R2 retained 17 and excluded 83. The reviewers differed on 8 records. Applying the prespecified conservative rule, all disagreement records were retained for full-text assessment rather than being forced into exclusion. The final B6 disposition is therefore 17 provisional full-text candidates and 83 exclusions. These are provisional candidates, not final included studies; full-text eligibility remains outstanding.</w:t>
       </w:r>
     </w:p>
     <w:sectPr>

</xml_diff>

<commit_message>
Record adjudicated screening batch B7
</commit_message>
<xml_diff>
--- a/Avian_review_paper_submission_ready.docx
+++ b/Avian_review_paper_submission_ready.docx
@@ -32,7 +32,7 @@
         <w:spacing w:before="0" w:after="120"/>
       </w:pPr>
       <w:r>
-        <w:t>Background: Avian influenza viruses (AIVs) have caused recurrent poultry outbreaks and molecularly distinct detections in Nigeria since 2006. Objective: This submission-stage protocol prespecifies a systematic review of emergence, temporal and geographic distribution, host range, and molecular/clade/reassortment dynamics of Nigeria-specific AIVs. Methods: The protocol uses a CoCoPop/PEO framework and is aligned with PRISMA 2020, PRISMA-S and SWiM. The study/search window is 2006-2026; the operational status snapshot is 20 September 2026. Results status: 2,367 source rows had been reconciled into 1,877 provisional identities; 640 title/metadata records have been screened, yielding 519 clear exclusions and 121 provisional full-text candidates. Final screening, full-text assessment, extraction, risk-of-bias appraisal, synthesis and a PRISMA flow are not complete. Conclusion: This document is a protocol and search/record-management status report, not a completed systematic review.</w:t>
+        <w:t>Background: Avian influenza viruses (AIVs) have caused recurrent poultry outbreaks and molecularly distinct detections in Nigeria since 2006. Objective: This submission-stage protocol prespecifies a systematic review of emergence, temporal and geographic distribution, host range, and molecular/clade/reassortment dynamics of Nigeria-specific AIVs. Methods: The protocol uses a CoCoPop/PEO framework and is aligned with PRISMA 2020, PRISMA-S and SWiM. The study/search window is 2006-2026; the operational status snapshot is 20 September 2026. Results status: 2,367 source rows had been reconciled into 1,877 provisional identities; 740 title/metadata records have been screened, yielding 601 clear exclusions and 139 provisional full-text candidates. Final screening, full-text assessment, extraction, risk-of-bias appraisal, synthesis and a PRISMA flow are not complete. Conclusion: This document is a protocol and search/record-management status report, not a completed systematic review.</w:t>
       </w:r>
     </w:p>
     <w:p>
@@ -41,7 +41,7 @@
         <w:ind w:left="216" w:right="216"/>
       </w:pPr>
       <w:r>
-        <w:t>STATUS NOTE - 22 September 2026: Gate C remains open. The adjudicated R1/R2 title/metadata pilot of 40 records and Batch R1-B1 (the first 100 non-pilot canonical records by canonical_id order, CAN-0015 through CAN-0134 with pilot IDs omitted) produced 98 clear exclusions and 42 provisional full-text candidates. Batch R1-B1 had exact R1/R2 agreement (100/100) and no adjudication disagreements. Batch B2 retained 17 provisional full-text candidates and excluded 83 after eight R1/R2 disagreements were adjudicated. Batch B3 screened CAN-0241-CAN-0340 and retained 13 provisional full-text candidates while excluding 87. Batch B4 screened CAN-0381-CAN-0480: R1/R2 had exact agreement (100/100), with 0 clear Include-for-full-text decisions, 11 Unsure/retain-for-full-text decisions and 89 Exclude decisions; no disagreements occurred. All 11 uncertain records were retained conservatively for full-text review. Cumulatively, 640 title/metadata records have been screened, with 519 exclusions and 121 provisional full-text candidates; 1,237 canonical identities remain unresolved/non-final. Gates D-J are incomplete; full-text assessment, extraction, risk-of-bias assessment, certainty assessment, final PRISMA flow and SWiM synthesis remain pending.</w:t>
+        <w:t>STATUS NOTE - 22 September 2026: Gate C remains open. The adjudicated R1/R2 title/metadata pilot of 40 records and Batch R1-B1 (the first 100 non-pilot canonical records by canonical_id order, CAN-0015 through CAN-0134 with pilot IDs omitted) produced 98 clear exclusions and 42 provisional full-text candidates. Batch R1-B1 had exact R1/R2 agreement (100/100) and no adjudication disagreements. Batch B2 retained 17 provisional full-text candidates and excluded 83 after eight R1/R2 disagreements were adjudicated. Batch B3 screened CAN-0241-CAN-0340 and retained 13 provisional full-text candidates while excluding 87. Batch B4 screened CAN-0381-CAN-0480: R1/R2 had exact agreement (100/100), with 0 clear Include-for-full-text decisions, 11 Unsure/retain-for-full-text decisions and 89 Exclude decisions; no disagreements occurred. All 11 uncertain records were retained conservatively for full-text review. Cumulatively, 740 title/metadata records have been screened, with 601 exclusions and 139 provisional full-text candidates; 1,137 canonical identities remain unresolved/non-final. Gates D-J are incomplete; full-text assessment, extraction, risk-of-bias assessment, certainty assessment, final PRISMA flow and SWiM synthesis remain pending.</w:t>
       </w:r>
     </w:p>
     <w:p>
@@ -210,7 +210,7 @@
         <w:spacing w:before="0" w:after="120"/>
       </w:pPr>
       <w:r>
-        <w:t>Records were reconciled using symmetric DOI, PMID, or exact normalised title-plus-year matching. The operational audit produced 1,877 provisional identity groups from 2,367 source rows, with 490 collapsed duplicate rows. The controlled title/metadata-screening denominator is therefore 1,877. R1 and R2 independently screened and adjudicated a 40-record pilot (25 clear exclusions; 15 provisional full-text candidates) and independently screened Batch R1-B1, the first 100 non-pilot canonical records by canonical_id order (CAN-0015 through CAN-0134 with pilot IDs omitted). Batch R1-B1 had exact agreement (100/100), with 17 Include-for-full-text, 10 Unsure/retain-for-full-text and 73 Exclude decisions; no adjudication disagreements occurred. Batch B2 comprised the next 100 non-pilot canonical records after B1 (CAN-0135-CAN-0240, with pilot IDs omitted). The final B2 disposition was 17 retained for full text and 83 excluded after eight disagreements were adjudicated. Batch B3 comprised CAN-0241-CAN-0340; the final B3 disposition was 13 provisional full-text candidates and 87 exclusions. Batch B4 comprised CAN-0381-CAN-0480 (100 records). R1 and R2 had exact agreement (100/100): 0 clear Include-for-full-text, 11 Unsure/retain-for-full-text and 89 Exclude decisions, with no disagreements. All 11 uncertain records were retained conservatively for full-text review. Across the pilot, B1, B2, B3 and B4, 640 title/metadata records have been screened: 519 clear exclusions and 121 provisional full-text candidates. The remaining 1,437 canonical identities are unresolved/non-final. No final title/metadata decision, full-text eligibility decision or included-study count exists. The planned dual-review process applies Nigeria linkage, laboratory-confirmed avian AIV, at least one relevant evidence type, and extractable primary-data questions; an unsure record proceeds to full text rather than being assumed excluded.</w:t>
+        <w:t>Records were reconciled using symmetric DOI, PMID, or exact normalised title-plus-year matching. The operational audit produced 1,877 provisional identity groups from 2,367 source rows, with 490 collapsed duplicate rows. The controlled title/metadata-screening denominator is therefore 1,877. R1 and R2 independently screened and adjudicated a 40-record pilot (25 clear exclusions; 15 provisional full-text candidates) and independently screened Batch R1-B1, the first 100 non-pilot canonical records by canonical_id order (CAN-0015 through CAN-0134 with pilot IDs omitted). Batch R1-B1 had exact agreement (100/100), with 17 Include-for-full-text, 10 Unsure/retain-for-full-text and 73 Exclude decisions; no adjudication disagreements occurred. Batch B2 comprised the next 100 non-pilot canonical records after B1 (CAN-0135-CAN-0240, with pilot IDs omitted). The final B2 disposition was 17 retained for full text and 83 excluded after eight disagreements were adjudicated. Batch B3 comprised CAN-0241-CAN-0340; the final B3 disposition was 13 provisional full-text candidates and 87 exclusions. Batch B4 comprised CAN-0381-CAN-0480 (100 records). R1 and R2 had exact agreement (100/100): 0 clear Include-for-full-text, 11 Unsure/retain-for-full-text and 89 Exclude decisions, with no disagreements. All 11 uncertain records were retained conservatively for full-text review. Across the pilot, B1, B2, B3 and B4, 740 title/metadata records have been screened: 601 clear exclusions and 139 provisional full-text candidates. The remaining 1,437 canonical identities are unresolved/non-final. No final title/metadata decision, full-text eligibility decision or included-study count exists. The planned dual-review process applies Nigeria linkage, laboratory-confirmed avian AIV, at least one relevant evidence type, and extractable primary-data questions; an unsure record proceeds to full text rather than being assumed excluded.</w:t>
       </w:r>
     </w:p>
     <w:p>
@@ -249,7 +249,7 @@
         <w:spacing w:before="0" w:after="120"/>
       </w:pPr>
       <w:r>
-        <w:t>The evidence synthesis is not complete. Gate C screening reconciliation remains open after adjudication of the 40-record R1/R2 title/metadata pilot, exact-agreement screening of the 100-record Batch R1-B1 and Batch B4, and adjudication of the 100-record Batches B2 and B3: 1,237 canonical identities remain unresolved/non-final, while 83 records are provisional candidates awaiting full-text assessment. Gates D-J have not been completed. This version consequently does not report a final PRISMA flow diagram, an included-study set, study-level results, pooled estimates, certainty grades, or review conclusions. Such outputs require completion of screening, full-text assessment, extraction, appraisal, synthesis and final reporting audit.</w:t>
+        <w:t>The evidence synthesis is not complete. Gate C screening reconciliation remains open after adjudication of the 40-record R1/R2 title/metadata pilot, exact-agreement screening of the 100-record Batch R1-B1 and Batch B4, and adjudication of the 100-record Batches B2 and B3: 1,137 canonical identities remain unresolved/non-final, while 83 records are provisional candidates awaiting full-text assessment. Gates D-J have not been completed. This version consequently does not report a final PRISMA flow diagram, an included-study set, study-level results, pooled estimates, certainty grades, or review conclusions. Such outputs require completion of screening, full-text assessment, extraction, appraisal, synthesis and final reporting audit.</w:t>
       </w:r>
     </w:p>
     <w:p>
@@ -1803,7 +1803,7 @@
     </w:p>
     <w:p>
       <w:r>
-        <w:t>Dated 23 September 2026. This appendix supersedes no source record: it consolidates the current gate state for this submission-stage status report, including the Batch B4, Batch B5 and Batch B6 title/metadata updates. It does not report final study selection, a PRISMA flow, included-study results, extraction, risk-of-bias findings or synthesis.</w:t>
+        <w:t>Dated 23 September 2026. This appendix supersedes no source record: it consolidates the current gate state for this submission-stage status report, including the Batch B4, Batch B5, Batch B6 and Batch B7 title/metadata updates. It does not report final study selection, a PRISMA flow, included-study results, extraction, risk-of-bias findings or synthesis.</w:t>
       </w:r>
     </w:p>
     <w:p>
@@ -3942,7 +3942,7 @@
     </w:tbl>
     <w:p>
       <w:r>
-        <w:t>Next controlled action: independently screen and adjudicate the remaining 1,237 canonical identities at title/metadata, then assess the 121 provisional candidates and any additional title/metadata retains at full text. Do not begin extraction or risk-of-bias appraisal until full-text eligibility is fixed; do not claim a final PRISMA flow, included-study count, certainty finding or SWiM synthesis until the complete screening queue is reconciled.</w:t>
+        <w:t>Next controlled action: independently screen and adjudicate the remaining 1,137 canonical identities at title/metadata, then assess the 139 provisional candidates and any additional title/metadata retains at full text. Do not begin extraction or risk-of-bias appraisal until full-text eligibility is fixed; do not claim a final PRISMA flow, included-study count, certainty finding or SWiM synthesis until the complete screening queue is reconciled.</w:t>
       </w:r>
     </w:p>
     <w:p>
@@ -3969,6 +3969,19 @@
     <w:p>
       <w:r>
         <w:t>Batch B6 comprised CAN-0581-CAN-0680 (100 records). R1 retained 9 records and excluded 91; R2 retained 17 and excluded 83. The reviewers differed on 8 records. Applying the prespecified conservative rule, all disagreement records were retained for full-text assessment rather than being forced into exclusion. The final B6 disposition is therefore 17 provisional full-text candidates and 83 exclusions. These are provisional candidates, not final included studies; full-text eligibility remains outstanding.</w:t>
+      </w:r>
+    </w:p>
+    <w:p>
+      <w:pPr>
+        <w:pStyle w:val="Heading2"/>
+      </w:pPr>
+      <w:r>
+        <w:t>B7. Adjudicated Batch B7 title/metadata screening update</w:t>
+      </w:r>
+    </w:p>
+    <w:p>
+      <w:r>
+        <w:t>Batch B7 comprised CAN-0681-CAN-0780 (100 records). R1 retained 15 records and excluded 85; R2 retained 14 and excluded 86. The reviewers differed on 7 records. Applying the prespecified conservative rule, all disagreement records were retained for full-text assessment rather than being forced into exclusion. The final B7 disposition is therefore 18 provisional full-text candidates and 82 exclusions. These are provisional candidates, not final included studies; full-text eligibility remains outstanding.</w:t>
       </w:r>
     </w:p>
     <w:sectPr>

</xml_diff>

<commit_message>
Record adjudicated screening batch B8
</commit_message>
<xml_diff>
--- a/Avian_review_paper_submission_ready.docx
+++ b/Avian_review_paper_submission_ready.docx
@@ -32,7 +32,7 @@
         <w:spacing w:before="0" w:after="120"/>
       </w:pPr>
       <w:r>
-        <w:t>Background: Avian influenza viruses (AIVs) have caused recurrent poultry outbreaks and molecularly distinct detections in Nigeria since 2006. Objective: This submission-stage protocol prespecifies a systematic review of emergence, temporal and geographic distribution, host range, and molecular/clade/reassortment dynamics of Nigeria-specific AIVs. Methods: The protocol uses a CoCoPop/PEO framework and is aligned with PRISMA 2020, PRISMA-S and SWiM. The study/search window is 2006-2026; the operational status snapshot is 20 September 2026. Results status: 2,367 source rows had been reconciled into 1,877 provisional identities; 740 title/metadata records have been screened, yielding 601 clear exclusions and 139 provisional full-text candidates. Final screening, full-text assessment, extraction, risk-of-bias appraisal, synthesis and a PRISMA flow are not complete. Conclusion: This document is a protocol and search/record-management status report, not a completed systematic review.</w:t>
+        <w:t>Background: Avian influenza viruses (AIVs) have caused recurrent poultry outbreaks and molecularly distinct detections in Nigeria since 2006. Objective: This submission-stage protocol prespecifies a systematic review of emergence, temporal and geographic distribution, host range, and molecular/clade/reassortment dynamics of Nigeria-specific AIVs. Methods: The protocol uses a CoCoPop/PEO framework and is aligned with PRISMA 2020, PRISMA-S and SWiM. The study/search window is 2006-2026; the operational status snapshot is 20 September 2026. Results status: 2,367 source rows had been reconciled into 1,877 provisional identities; 840 title/metadata records have been screened, yielding 691 clear exclusions and 149 provisional full-text candidates. Final screening, full-text assessment, extraction, risk-of-bias appraisal, synthesis and a PRISMA flow are not complete. Conclusion: This document is a protocol and search/record-management status report, not a completed systematic review.</w:t>
       </w:r>
     </w:p>
     <w:p>
@@ -41,7 +41,7 @@
         <w:ind w:left="216" w:right="216"/>
       </w:pPr>
       <w:r>
-        <w:t>STATUS NOTE - 22 September 2026: Gate C remains open. The adjudicated R1/R2 title/metadata pilot of 40 records and Batch R1-B1 (the first 100 non-pilot canonical records by canonical_id order, CAN-0015 through CAN-0134 with pilot IDs omitted) produced 98 clear exclusions and 42 provisional full-text candidates. Batch R1-B1 had exact R1/R2 agreement (100/100) and no adjudication disagreements. Batch B2 retained 17 provisional full-text candidates and excluded 83 after eight R1/R2 disagreements were adjudicated. Batch B3 screened CAN-0241-CAN-0340 and retained 13 provisional full-text candidates while excluding 87. Batch B4 screened CAN-0381-CAN-0480: R1/R2 had exact agreement (100/100), with 0 clear Include-for-full-text decisions, 11 Unsure/retain-for-full-text decisions and 89 Exclude decisions; no disagreements occurred. All 11 uncertain records were retained conservatively for full-text review. Cumulatively, 740 title/metadata records have been screened, with 601 exclusions and 139 provisional full-text candidates; 1,137 canonical identities remain unresolved/non-final. Gates D-J are incomplete; full-text assessment, extraction, risk-of-bias assessment, certainty assessment, final PRISMA flow and SWiM synthesis remain pending.</w:t>
+        <w:t>STATUS NOTE - 22 September 2026: Gate C remains open. The adjudicated R1/R2 title/metadata pilot of 40 records and Batch R1-B1 (the first 100 non-pilot canonical records by canonical_id order, CAN-0015 through CAN-0134 with pilot IDs omitted) produced 98 clear exclusions and 42 provisional full-text candidates. Batch R1-B1 had exact R1/R2 agreement (100/100) and no adjudication disagreements. Batch B2 retained 17 provisional full-text candidates and excluded 83 after eight R1/R2 disagreements were adjudicated. Batch B3 screened CAN-0241-CAN-0340 and retained 13 provisional full-text candidates while excluding 87. Batch B4 screened CAN-0381-CAN-0480: R1/R2 had exact agreement (100/100), with 0 clear Include-for-full-text decisions, 11 Unsure/retain-for-full-text decisions and 89 Exclude decisions; no disagreements occurred. All 11 uncertain records were retained conservatively for full-text review. Cumulatively, 840 title/metadata records have been screened, with 691 exclusions and 149 provisional full-text candidates; 1,037 canonical identities remain unresolved/non-final. Gates D-J are incomplete; full-text assessment, extraction, risk-of-bias assessment, certainty assessment, final PRISMA flow and SWiM synthesis remain pending.</w:t>
       </w:r>
     </w:p>
     <w:p>
@@ -210,7 +210,7 @@
         <w:spacing w:before="0" w:after="120"/>
       </w:pPr>
       <w:r>
-        <w:t>Records were reconciled using symmetric DOI, PMID, or exact normalised title-plus-year matching. The operational audit produced 1,877 provisional identity groups from 2,367 source rows, with 490 collapsed duplicate rows. The controlled title/metadata-screening denominator is therefore 1,877. R1 and R2 independently screened and adjudicated a 40-record pilot (25 clear exclusions; 15 provisional full-text candidates) and independently screened Batch R1-B1, the first 100 non-pilot canonical records by canonical_id order (CAN-0015 through CAN-0134 with pilot IDs omitted). Batch R1-B1 had exact agreement (100/100), with 17 Include-for-full-text, 10 Unsure/retain-for-full-text and 73 Exclude decisions; no adjudication disagreements occurred. Batch B2 comprised the next 100 non-pilot canonical records after B1 (CAN-0135-CAN-0240, with pilot IDs omitted). The final B2 disposition was 17 retained for full text and 83 excluded after eight disagreements were adjudicated. Batch B3 comprised CAN-0241-CAN-0340; the final B3 disposition was 13 provisional full-text candidates and 87 exclusions. Batch B4 comprised CAN-0381-CAN-0480 (100 records). R1 and R2 had exact agreement (100/100): 0 clear Include-for-full-text, 11 Unsure/retain-for-full-text and 89 Exclude decisions, with no disagreements. All 11 uncertain records were retained conservatively for full-text review. Across the pilot, B1, B2, B3 and B4, 740 title/metadata records have been screened: 601 clear exclusions and 139 provisional full-text candidates. The remaining 1,437 canonical identities are unresolved/non-final. No final title/metadata decision, full-text eligibility decision or included-study count exists. The planned dual-review process applies Nigeria linkage, laboratory-confirmed avian AIV, at least one relevant evidence type, and extractable primary-data questions; an unsure record proceeds to full text rather than being assumed excluded.</w:t>
+        <w:t>Records were reconciled using symmetric DOI, PMID, or exact normalised title-plus-year matching. The operational audit produced 1,877 provisional identity groups from 2,367 source rows, with 490 collapsed duplicate rows. The controlled title/metadata-screening denominator is therefore 1,877. R1 and R2 independently screened and adjudicated a 40-record pilot (25 clear exclusions; 15 provisional full-text candidates) and independently screened Batch R1-B1, the first 100 non-pilot canonical records by canonical_id order (CAN-0015 through CAN-0134 with pilot IDs omitted). Batch R1-B1 had exact agreement (100/100), with 17 Include-for-full-text, 10 Unsure/retain-for-full-text and 73 Exclude decisions; no adjudication disagreements occurred. Batch B2 comprised the next 100 non-pilot canonical records after B1 (CAN-0135-CAN-0240, with pilot IDs omitted). The final B2 disposition was 17 retained for full text and 83 excluded after eight disagreements were adjudicated. Batch B3 comprised CAN-0241-CAN-0340; the final B3 disposition was 13 provisional full-text candidates and 87 exclusions. Batch B4 comprised CAN-0381-CAN-0480 (100 records). R1 and R2 had exact agreement (100/100): 0 clear Include-for-full-text, 11 Unsure/retain-for-full-text and 89 Exclude decisions, with no disagreements. All 11 uncertain records were retained conservatively for full-text review. Across the pilot, B1, B2, B3 and B4, 840 title/metadata records have been screened: 691 clear exclusions and 149 provisional full-text candidates. The remaining 1,437 canonical identities are unresolved/non-final. No final title/metadata decision, full-text eligibility decision or included-study count exists. The planned dual-review process applies Nigeria linkage, laboratory-confirmed avian AIV, at least one relevant evidence type, and extractable primary-data questions; an unsure record proceeds to full text rather than being assumed excluded.</w:t>
       </w:r>
     </w:p>
     <w:p>
@@ -249,7 +249,7 @@
         <w:spacing w:before="0" w:after="120"/>
       </w:pPr>
       <w:r>
-        <w:t>The evidence synthesis is not complete. Gate C screening reconciliation remains open after adjudication of the 40-record R1/R2 title/metadata pilot, exact-agreement screening of the 100-record Batch R1-B1 and Batch B4, and adjudication of the 100-record Batches B2 and B3: 1,137 canonical identities remain unresolved/non-final, while 83 records are provisional candidates awaiting full-text assessment. Gates D-J have not been completed. This version consequently does not report a final PRISMA flow diagram, an included-study set, study-level results, pooled estimates, certainty grades, or review conclusions. Such outputs require completion of screening, full-text assessment, extraction, appraisal, synthesis and final reporting audit.</w:t>
+        <w:t>The evidence synthesis is not complete. Gate C screening reconciliation remains open after adjudication of the 40-record R1/R2 title/metadata pilot, exact-agreement screening of the 100-record Batch R1-B1 and Batch B4, and adjudication of the 100-record Batches B2 and B3: 1,037 canonical identities remain unresolved/non-final, while 83 records are provisional candidates awaiting full-text assessment. Gates D-J have not been completed. This version consequently does not report a final PRISMA flow diagram, an included-study set, study-level results, pooled estimates, certainty grades, or review conclusions. Such outputs require completion of screening, full-text assessment, extraction, appraisal, synthesis and final reporting audit.</w:t>
       </w:r>
     </w:p>
     <w:p>
@@ -1803,7 +1803,7 @@
     </w:p>
     <w:p>
       <w:r>
-        <w:t>Dated 23 September 2026. This appendix supersedes no source record: it consolidates the current gate state for this submission-stage status report, including the Batch B4, Batch B5, Batch B6 and Batch B7 title/metadata updates. It does not report final study selection, a PRISMA flow, included-study results, extraction, risk-of-bias findings or synthesis.</w:t>
+        <w:t>Dated 23 September 2026. This appendix supersedes no source record: it consolidates the current gate state for this submission-stage status report, including the Batch B4, Batch B5, Batch B6, Batch B7 and Batch B8 title/metadata updates. It does not report final study selection, a PRISMA flow, included-study results, extraction, risk-of-bias findings or synthesis.</w:t>
       </w:r>
     </w:p>
     <w:p>
@@ -3942,7 +3942,7 @@
     </w:tbl>
     <w:p>
       <w:r>
-        <w:t>Next controlled action: independently screen and adjudicate the remaining 1,137 canonical identities at title/metadata, then assess the 139 provisional candidates and any additional title/metadata retains at full text. Do not begin extraction or risk-of-bias appraisal until full-text eligibility is fixed; do not claim a final PRISMA flow, included-study count, certainty finding or SWiM synthesis until the complete screening queue is reconciled.</w:t>
+        <w:t>Next controlled action: independently screen and adjudicate the remaining 1,037 canonical identities at title/metadata, then assess the 149 provisional candidates and any additional title/metadata retains at full text. Do not begin extraction or risk-of-bias appraisal until full-text eligibility is fixed; do not claim a final PRISMA flow, included-study count, certainty finding or SWiM synthesis until the complete screening queue is reconciled.</w:t>
       </w:r>
     </w:p>
     <w:p>
@@ -3982,6 +3982,19 @@
     <w:p>
       <w:r>
         <w:t>Batch B7 comprised CAN-0681-CAN-0780 (100 records). R1 retained 15 records and excluded 85; R2 retained 14 and excluded 86. The reviewers differed on 7 records. Applying the prespecified conservative rule, all disagreement records were retained for full-text assessment rather than being forced into exclusion. The final B7 disposition is therefore 18 provisional full-text candidates and 82 exclusions. These are provisional candidates, not final included studies; full-text eligibility remains outstanding.</w:t>
+      </w:r>
+    </w:p>
+    <w:p>
+      <w:pPr>
+        <w:pStyle w:val="Heading2"/>
+      </w:pPr>
+      <w:r>
+        <w:t>B8. Adjudicated Batch B8 title/metadata screening update</w:t>
+      </w:r>
+    </w:p>
+    <w:p>
+      <w:r>
+        <w:t>Batch B8 comprised CAN-0781-CAN-0880 (100 records). R1 retained 7 records and excluded 93; R2 retained 9 and excluded 91. The reviewers differed on 4 records. Applying the prespecified conservative rule, all disagreement records were retained for full-text assessment rather than being forced into exclusion. The final B8 disposition is therefore 10 provisional full-text candidates and 90 exclusions. These are provisional candidates, not final included studies; full-text eligibility remains outstanding.</w:t>
       </w:r>
     </w:p>
     <w:sectPr>

</xml_diff>

<commit_message>
Document targeted full-text retrieval pilot
</commit_message>
<xml_diff>
--- a/Avian_review_paper_submission_ready.docx
+++ b/Avian_review_paper_submission_ready.docx
@@ -3995,6 +3995,19 @@
     <w:p>
       <w:r>
         <w:t>Batch B8 comprised CAN-0781-CAN-0880 (100 records). R1 retained 7 records and excluded 93; R2 retained 9 and excluded 91. The reviewers differed on 4 records. Applying the prespecified conservative rule, all disagreement records were retained for full-text assessment rather than being forced into exclusion. The final B8 disposition is therefore 10 provisional full-text candidates and 90 exclusions. These are provisional candidates, not final included studies; full-text eligibility remains outstanding.</w:t>
+      </w:r>
+    </w:p>
+    <w:p>
+      <w:pPr>
+        <w:pStyle w:val="Heading2"/>
+      </w:pPr>
+      <w:r>
+        <w:t>Targeted full-text retrieval pilot</w:t>
+      </w:r>
+    </w:p>
+    <w:p>
+      <w:r>
+        <w:t>A legitimate retrieval pilot located authoritative or open full-text/metadata sources for four strong B8 candidates: CAN-0782 (Coker et al., 2014; PMID 25671118; DOI 10.1186/2049-9957-3-38), CAN-0825 (Adebiyi et al., 2022; DOI 10.1186/s42269-022-00710-6), CAN-0835 (Ekong et al., 2018; PMID 29631310; DOI 10.12834/VetIt.870.4301.3), and CAN-0846 (Fadiga et al., 2014; DOI 10.13128/BAE-12713). These records remain provisional until full-text eligibility, duplicate/dataset linkage, and extraction checks are completed. No final included-study count is reported.</w:t>
       </w:r>
     </w:p>
     <w:sectPr>

</xml_diff>

<commit_message>
Record adjudicated screening batch B9
</commit_message>
<xml_diff>
--- a/Avian_review_paper_submission_ready.docx
+++ b/Avian_review_paper_submission_ready.docx
@@ -32,7 +32,7 @@
         <w:spacing w:before="0" w:after="120"/>
       </w:pPr>
       <w:r>
-        <w:t>Background: Avian influenza viruses (AIVs) have caused recurrent poultry outbreaks and molecularly distinct detections in Nigeria since 2006. Objective: This submission-stage protocol prespecifies a systematic review of emergence, temporal and geographic distribution, host range, and molecular/clade/reassortment dynamics of Nigeria-specific AIVs. Methods: The protocol uses a CoCoPop/PEO framework and is aligned with PRISMA 2020, PRISMA-S and SWiM. The study/search window is 2006-2026; the operational status snapshot is 20 September 2026. Results status: 2,367 source rows had been reconciled into 1,877 provisional identities; 840 title/metadata records have been screened, yielding 691 clear exclusions and 149 provisional full-text candidates. Final screening, full-text assessment, extraction, risk-of-bias appraisal, synthesis and a PRISMA flow are not complete. Conclusion: This document is a protocol and search/record-management status report, not a completed systematic review.</w:t>
+        <w:t>Background: Avian influenza viruses (AIVs) have caused recurrent poultry outbreaks and molecularly distinct detections in Nigeria since 2006. Objective: This submission-stage protocol prespecifies a systematic review of emergence, temporal and geographic distribution, host range, and molecular/clade/reassortment dynamics of Nigeria-specific AIVs. Methods: The protocol uses a CoCoPop/PEO framework and is aligned with PRISMA 2020, PRISMA-S and SWiM. The study/search window is 2006-2026; the operational status snapshot is 20 September 2026. Results status: 2,367 source rows had been reconciled into 1,877 provisional identities; 940 title/metadata records have been screened, yielding 776 clear exclusions and 164 provisional full-text candidates. Final screening, full-text assessment, extraction, risk-of-bias appraisal, synthesis and a PRISMA flow are not complete. Conclusion: This document is a protocol and search/record-management status report, not a completed systematic review.</w:t>
       </w:r>
     </w:p>
     <w:p>
@@ -41,7 +41,7 @@
         <w:ind w:left="216" w:right="216"/>
       </w:pPr>
       <w:r>
-        <w:t>STATUS NOTE - 22 September 2026: Gate C remains open. The adjudicated R1/R2 title/metadata pilot of 40 records and Batch R1-B1 (the first 100 non-pilot canonical records by canonical_id order, CAN-0015 through CAN-0134 with pilot IDs omitted) produced 98 clear exclusions and 42 provisional full-text candidates. Batch R1-B1 had exact R1/R2 agreement (100/100) and no adjudication disagreements. Batch B2 retained 17 provisional full-text candidates and excluded 83 after eight R1/R2 disagreements were adjudicated. Batch B3 screened CAN-0241-CAN-0340 and retained 13 provisional full-text candidates while excluding 87. Batch B4 screened CAN-0381-CAN-0480: R1/R2 had exact agreement (100/100), with 0 clear Include-for-full-text decisions, 11 Unsure/retain-for-full-text decisions and 89 Exclude decisions; no disagreements occurred. All 11 uncertain records were retained conservatively for full-text review. Cumulatively, 840 title/metadata records have been screened, with 691 exclusions and 149 provisional full-text candidates; 1,037 canonical identities remain unresolved/non-final. Gates D-J are incomplete; full-text assessment, extraction, risk-of-bias assessment, certainty assessment, final PRISMA flow and SWiM synthesis remain pending.</w:t>
+        <w:t>STATUS NOTE - 22 September 2026: Gate C remains open. The adjudicated R1/R2 title/metadata pilot of 40 records and Batch R1-B1 (the first 100 non-pilot canonical records by canonical_id order, CAN-0015 through CAN-0134 with pilot IDs omitted) produced 98 clear exclusions and 42 provisional full-text candidates. Batch R1-B1 had exact R1/R2 agreement (100/100) and no adjudication disagreements. Batch B2 retained 17 provisional full-text candidates and excluded 83 after eight R1/R2 disagreements were adjudicated. Batch B3 screened CAN-0241-CAN-0340 and retained 13 provisional full-text candidates while excluding 87. Batch B4 screened CAN-0381-CAN-0480: R1/R2 had exact agreement (100/100), with 0 clear Include-for-full-text decisions, 11 Unsure/retain-for-full-text decisions and 89 Exclude decisions; no disagreements occurred. All 11 uncertain records were retained conservatively for full-text review. Cumulatively, 940 title/metadata records have been screened, with 776 exclusions and 164 provisional full-text candidates; 937 canonical identities remain unresolved/non-final. Gates D-J are incomplete; full-text assessment, extraction, risk-of-bias assessment, certainty assessment, final PRISMA flow and SWiM synthesis remain pending.</w:t>
       </w:r>
     </w:p>
     <w:p>
@@ -210,7 +210,7 @@
         <w:spacing w:before="0" w:after="120"/>
       </w:pPr>
       <w:r>
-        <w:t>Records were reconciled using symmetric DOI, PMID, or exact normalised title-plus-year matching. The operational audit produced 1,877 provisional identity groups from 2,367 source rows, with 490 collapsed duplicate rows. The controlled title/metadata-screening denominator is therefore 1,877. R1 and R2 independently screened and adjudicated a 40-record pilot (25 clear exclusions; 15 provisional full-text candidates) and independently screened Batch R1-B1, the first 100 non-pilot canonical records by canonical_id order (CAN-0015 through CAN-0134 with pilot IDs omitted). Batch R1-B1 had exact agreement (100/100), with 17 Include-for-full-text, 10 Unsure/retain-for-full-text and 73 Exclude decisions; no adjudication disagreements occurred. Batch B2 comprised the next 100 non-pilot canonical records after B1 (CAN-0135-CAN-0240, with pilot IDs omitted). The final B2 disposition was 17 retained for full text and 83 excluded after eight disagreements were adjudicated. Batch B3 comprised CAN-0241-CAN-0340; the final B3 disposition was 13 provisional full-text candidates and 87 exclusions. Batch B4 comprised CAN-0381-CAN-0480 (100 records). R1 and R2 had exact agreement (100/100): 0 clear Include-for-full-text, 11 Unsure/retain-for-full-text and 89 Exclude decisions, with no disagreements. All 11 uncertain records were retained conservatively for full-text review. Across the pilot, B1, B2, B3 and B4, 840 title/metadata records have been screened: 691 clear exclusions and 149 provisional full-text candidates. The remaining 1,437 canonical identities are unresolved/non-final. No final title/metadata decision, full-text eligibility decision or included-study count exists. The planned dual-review process applies Nigeria linkage, laboratory-confirmed avian AIV, at least one relevant evidence type, and extractable primary-data questions; an unsure record proceeds to full text rather than being assumed excluded.</w:t>
+        <w:t>Records were reconciled using symmetric DOI, PMID, or exact normalised title-plus-year matching. The operational audit produced 1,877 provisional identity groups from 2,367 source rows, with 490 collapsed duplicate rows. The controlled title/metadata-screening denominator is therefore 1,877. R1 and R2 independently screened and adjudicated a 40-record pilot (25 clear exclusions; 15 provisional full-text candidates) and independently screened Batch R1-B1, the first 100 non-pilot canonical records by canonical_id order (CAN-0015 through CAN-0134 with pilot IDs omitted). Batch R1-B1 had exact agreement (100/100), with 17 Include-for-full-text, 10 Unsure/retain-for-full-text and 73 Exclude decisions; no adjudication disagreements occurred. Batch B2 comprised the next 100 non-pilot canonical records after B1 (CAN-0135-CAN-0240, with pilot IDs omitted). The final B2 disposition was 17 retained for full text and 83 excluded after eight disagreements were adjudicated. Batch B3 comprised CAN-0241-CAN-0340; the final B3 disposition was 13 provisional full-text candidates and 87 exclusions. Batch B4 comprised CAN-0381-CAN-0480 (100 records). R1 and R2 had exact agreement (100/100): 0 clear Include-for-full-text, 11 Unsure/retain-for-full-text and 89 Exclude decisions, with no disagreements. All 11 uncertain records were retained conservatively for full-text review. Across the pilot, B1, B2, B3 and B4, 940 title/metadata records have been screened: 776 clear exclusions and 164 provisional full-text candidates. The remaining 1,437 canonical identities are unresolved/non-final. No final title/metadata decision, full-text eligibility decision or included-study count exists. The planned dual-review process applies Nigeria linkage, laboratory-confirmed avian AIV, at least one relevant evidence type, and extractable primary-data questions; an unsure record proceeds to full text rather than being assumed excluded.</w:t>
       </w:r>
     </w:p>
     <w:p>
@@ -249,7 +249,7 @@
         <w:spacing w:before="0" w:after="120"/>
       </w:pPr>
       <w:r>
-        <w:t>The evidence synthesis is not complete. Gate C screening reconciliation remains open after adjudication of the 40-record R1/R2 title/metadata pilot, exact-agreement screening of the 100-record Batch R1-B1 and Batch B4, and adjudication of the 100-record Batches B2 and B3: 1,037 canonical identities remain unresolved/non-final, while 83 records are provisional candidates awaiting full-text assessment. Gates D-J have not been completed. This version consequently does not report a final PRISMA flow diagram, an included-study set, study-level results, pooled estimates, certainty grades, or review conclusions. Such outputs require completion of screening, full-text assessment, extraction, appraisal, synthesis and final reporting audit.</w:t>
+        <w:t>The evidence synthesis is not complete. Gate C screening reconciliation remains open after adjudication of the 40-record R1/R2 title/metadata pilot, exact-agreement screening of the 100-record Batch R1-B1 and Batch B4, and adjudication of the 100-record Batches B2 and B3: 937 canonical identities remain unresolved/non-final, while 83 records are provisional candidates awaiting full-text assessment. Gates D-J have not been completed. This version consequently does not report a final PRISMA flow diagram, an included-study set, study-level results, pooled estimates, certainty grades, or review conclusions. Such outputs require completion of screening, full-text assessment, extraction, appraisal, synthesis and final reporting audit.</w:t>
       </w:r>
     </w:p>
     <w:p>
@@ -1803,7 +1803,7 @@
     </w:p>
     <w:p>
       <w:r>
-        <w:t>Dated 23 September 2026. This appendix supersedes no source record: it consolidates the current gate state for this submission-stage status report, including the Batch B4, Batch B5, Batch B6, Batch B7 and Batch B8 title/metadata updates. It does not report final study selection, a PRISMA flow, included-study results, extraction, risk-of-bias findings or synthesis.</w:t>
+        <w:t>Dated 23 September 2026. This appendix supersedes no source record: it consolidates the current gate state for this submission-stage status report, including the Batch B4, Batch B5, Batch B6, Batch B7, Batch B8 and Batch B9 title/metadata updates. It does not report final study selection, a PRISMA flow, included-study results, extraction, risk-of-bias findings or synthesis.</w:t>
       </w:r>
     </w:p>
     <w:p>
@@ -3942,7 +3942,7 @@
     </w:tbl>
     <w:p>
       <w:r>
-        <w:t>Next controlled action: independently screen and adjudicate the remaining 1,037 canonical identities at title/metadata, then assess the 149 provisional candidates and any additional title/metadata retains at full text. Do not begin extraction or risk-of-bias appraisal until full-text eligibility is fixed; do not claim a final PRISMA flow, included-study count, certainty finding or SWiM synthesis until the complete screening queue is reconciled.</w:t>
+        <w:t>Next controlled action: independently screen and adjudicate the remaining 937 canonical identities at title/metadata, then assess the 164 provisional candidates and any additional title/metadata retains at full text. Do not begin extraction or risk-of-bias appraisal until full-text eligibility is fixed; do not claim a final PRISMA flow, included-study count, certainty finding or SWiM synthesis until the complete screening queue is reconciled.</w:t>
       </w:r>
     </w:p>
     <w:p>
@@ -4008,6 +4008,19 @@
     <w:p>
       <w:r>
         <w:t>A legitimate retrieval pilot located authoritative or open full-text/metadata sources for four strong B8 candidates: CAN-0782 (Coker et al., 2014; PMID 25671118; DOI 10.1186/2049-9957-3-38), CAN-0825 (Adebiyi et al., 2022; DOI 10.1186/s42269-022-00710-6), CAN-0835 (Ekong et al., 2018; PMID 29631310; DOI 10.12834/VetIt.870.4301.3), and CAN-0846 (Fadiga et al., 2014; DOI 10.13128/BAE-12713). These records remain provisional until full-text eligibility, duplicate/dataset linkage, and extraction checks are completed. No final included-study count is reported.</w:t>
+      </w:r>
+    </w:p>
+    <w:p>
+      <w:pPr>
+        <w:pStyle w:val="Heading2"/>
+      </w:pPr>
+      <w:r>
+        <w:t>B9. Adjudicated Batch B9 title/metadata screening update</w:t>
+      </w:r>
+    </w:p>
+    <w:p>
+      <w:r>
+        <w:t>Batch B9 comprised CAN-0881-CAN-0980 (100 records). R1 retained 12 records and excluded 88; R2 retained 14 and excluded 86. The reviewers differed on 4 records. Applying the prespecified conservative rule, all disagreement records were retained for full-text assessment rather than being forced into exclusion. The final B9 disposition is therefore 15 provisional full-text candidates and 85 exclusions. These are provisional candidates, not final included studies; full-text eligibility remains outstanding.</w:t>
       </w:r>
     </w:p>
     <w:sectPr>

</xml_diff>

<commit_message>
Record adjudicated screening batch B10
</commit_message>
<xml_diff>
--- a/Avian_review_paper_submission_ready.docx
+++ b/Avian_review_paper_submission_ready.docx
@@ -32,7 +32,7 @@
         <w:spacing w:before="0" w:after="120"/>
       </w:pPr>
       <w:r>
-        <w:t>Background: Avian influenza viruses (AIVs) have caused recurrent poultry outbreaks and molecularly distinct detections in Nigeria since 2006. Objective: This submission-stage protocol prespecifies a systematic review of emergence, temporal and geographic distribution, host range, and molecular/clade/reassortment dynamics of Nigeria-specific AIVs. Methods: The protocol uses a CoCoPop/PEO framework and is aligned with PRISMA 2020, PRISMA-S and SWiM. The study/search window is 2006-2026; the operational status snapshot is 20 September 2026. Results status: 2,367 source rows had been reconciled into 1,877 provisional identities; 940 title/metadata records have been screened, yielding 776 clear exclusions and 164 provisional full-text candidates. Final screening, full-text assessment, extraction, risk-of-bias appraisal, synthesis and a PRISMA flow are not complete. Conclusion: This document is a protocol and search/record-management status report, not a completed systematic review.</w:t>
+        <w:t>Background: Avian influenza viruses (AIVs) have caused recurrent poultry outbreaks and molecularly distinct detections in Nigeria since 2006. Objective: This submission-stage protocol prespecifies a systematic review of emergence, temporal and geographic distribution, host range, and molecular/clade/reassortment dynamics of Nigeria-specific AIVs. Methods: The protocol uses a CoCoPop/PEO framework and is aligned with PRISMA 2020, PRISMA-S and SWiM. The study/search window is 2006-2026; the operational status snapshot is 20 September 2026. Results status: 2,367 source rows had been reconciled into 1,877 provisional identities; 1,040 title/metadata records have been screened, yielding 867 clear exclusions and 173 provisional full-text candidates. Final screening, full-text assessment, extraction, risk-of-bias appraisal, synthesis and a PRISMA flow are not complete. Conclusion: This document is a protocol and search/record-management status report, not a completed systematic review.</w:t>
       </w:r>
     </w:p>
     <w:p>
@@ -41,7 +41,7 @@
         <w:ind w:left="216" w:right="216"/>
       </w:pPr>
       <w:r>
-        <w:t>STATUS NOTE - 22 September 2026: Gate C remains open. The adjudicated R1/R2 title/metadata pilot of 40 records and Batch R1-B1 (the first 100 non-pilot canonical records by canonical_id order, CAN-0015 through CAN-0134 with pilot IDs omitted) produced 98 clear exclusions and 42 provisional full-text candidates. Batch R1-B1 had exact R1/R2 agreement (100/100) and no adjudication disagreements. Batch B2 retained 17 provisional full-text candidates and excluded 83 after eight R1/R2 disagreements were adjudicated. Batch B3 screened CAN-0241-CAN-0340 and retained 13 provisional full-text candidates while excluding 87. Batch B4 screened CAN-0381-CAN-0480: R1/R2 had exact agreement (100/100), with 0 clear Include-for-full-text decisions, 11 Unsure/retain-for-full-text decisions and 89 Exclude decisions; no disagreements occurred. All 11 uncertain records were retained conservatively for full-text review. Cumulatively, 940 title/metadata records have been screened, with 776 exclusions and 164 provisional full-text candidates; 937 canonical identities remain unresolved/non-final. Gates D-J are incomplete; full-text assessment, extraction, risk-of-bias assessment, certainty assessment, final PRISMA flow and SWiM synthesis remain pending.</w:t>
+        <w:t>STATUS NOTE - 22 September 2026: Gate C remains open. The adjudicated R1/R2 title/metadata pilot of 40 records and Batch R1-B1 (the first 100 non-pilot canonical records by canonical_id order, CAN-0015 through CAN-0134 with pilot IDs omitted) produced 98 clear exclusions and 42 provisional full-text candidates. Batch R1-B1 had exact R1/R2 agreement (100/100) and no adjudication disagreements. Batch B2 retained 17 provisional full-text candidates and excluded 83 after eight R1/R2 disagreements were adjudicated. Batch B3 screened CAN-0241-CAN-0340 and retained 13 provisional full-text candidates while excluding 87. Batch B4 screened CAN-0381-CAN-0480: R1/R2 had exact agreement (100/100), with 0 clear Include-for-full-text decisions, 11 Unsure/retain-for-full-text decisions and 89 Exclude decisions; no disagreements occurred. All 11 uncertain records were retained conservatively for full-text review. Cumulatively, 1,040 title/metadata records have been screened, with 867 exclusions and 173 provisional full-text candidates; 837 canonical identities remain unresolved/non-final. Gates D-J are incomplete; full-text assessment, extraction, risk-of-bias assessment, certainty assessment, final PRISMA flow and SWiM synthesis remain pending.</w:t>
       </w:r>
     </w:p>
     <w:p>
@@ -210,7 +210,7 @@
         <w:spacing w:before="0" w:after="120"/>
       </w:pPr>
       <w:r>
-        <w:t>Records were reconciled using symmetric DOI, PMID, or exact normalised title-plus-year matching. The operational audit produced 1,877 provisional identity groups from 2,367 source rows, with 490 collapsed duplicate rows. The controlled title/metadata-screening denominator is therefore 1,877. R1 and R2 independently screened and adjudicated a 40-record pilot (25 clear exclusions; 15 provisional full-text candidates) and independently screened Batch R1-B1, the first 100 non-pilot canonical records by canonical_id order (CAN-0015 through CAN-0134 with pilot IDs omitted). Batch R1-B1 had exact agreement (100/100), with 17 Include-for-full-text, 10 Unsure/retain-for-full-text and 73 Exclude decisions; no adjudication disagreements occurred. Batch B2 comprised the next 100 non-pilot canonical records after B1 (CAN-0135-CAN-0240, with pilot IDs omitted). The final B2 disposition was 17 retained for full text and 83 excluded after eight disagreements were adjudicated. Batch B3 comprised CAN-0241-CAN-0340; the final B3 disposition was 13 provisional full-text candidates and 87 exclusions. Batch B4 comprised CAN-0381-CAN-0480 (100 records). R1 and R2 had exact agreement (100/100): 0 clear Include-for-full-text, 11 Unsure/retain-for-full-text and 89 Exclude decisions, with no disagreements. All 11 uncertain records were retained conservatively for full-text review. Across the pilot, B1, B2, B3 and B4, 940 title/metadata records have been screened: 776 clear exclusions and 164 provisional full-text candidates. The remaining 1,437 canonical identities are unresolved/non-final. No final title/metadata decision, full-text eligibility decision or included-study count exists. The planned dual-review process applies Nigeria linkage, laboratory-confirmed avian AIV, at least one relevant evidence type, and extractable primary-data questions; an unsure record proceeds to full text rather than being assumed excluded.</w:t>
+        <w:t>Records were reconciled using symmetric DOI, PMID, or exact normalised title-plus-year matching. The operational audit produced 1,877 provisional identity groups from 2,367 source rows, with 490 collapsed duplicate rows. The controlled title/metadata-screening denominator is therefore 1,877. R1 and R2 independently screened and adjudicated a 40-record pilot (25 clear exclusions; 15 provisional full-text candidates) and independently screened Batch R1-B1, the first 100 non-pilot canonical records by canonical_id order (CAN-0015 through CAN-0134 with pilot IDs omitted). Batch R1-B1 had exact agreement (100/100), with 17 Include-for-full-text, 10 Unsure/retain-for-full-text and 73 Exclude decisions; no adjudication disagreements occurred. Batch B2 comprised the next 100 non-pilot canonical records after B1 (CAN-0135-CAN-0240, with pilot IDs omitted). The final B2 disposition was 17 retained for full text and 83 excluded after eight disagreements were adjudicated. Batch B3 comprised CAN-0241-CAN-0340; the final B3 disposition was 13 provisional full-text candidates and 87 exclusions. Batch B4 comprised CAN-0381-CAN-0480 (100 records). R1 and R2 had exact agreement (100/100): 0 clear Include-for-full-text, 11 Unsure/retain-for-full-text and 89 Exclude decisions, with no disagreements. All 11 uncertain records were retained conservatively for full-text review. Across the pilot, B1, B2, B3 and B4, 1,040 title/metadata records have been screened: 867 clear exclusions and 173 provisional full-text candidates. The remaining 1,437 canonical identities are unresolved/non-final. No final title/metadata decision, full-text eligibility decision or included-study count exists. The planned dual-review process applies Nigeria linkage, laboratory-confirmed avian AIV, at least one relevant evidence type, and extractable primary-data questions; an unsure record proceeds to full text rather than being assumed excluded.</w:t>
       </w:r>
     </w:p>
     <w:p>
@@ -249,7 +249,7 @@
         <w:spacing w:before="0" w:after="120"/>
       </w:pPr>
       <w:r>
-        <w:t>The evidence synthesis is not complete. Gate C screening reconciliation remains open after adjudication of the 40-record R1/R2 title/metadata pilot, exact-agreement screening of the 100-record Batch R1-B1 and Batch B4, and adjudication of the 100-record Batches B2 and B3: 937 canonical identities remain unresolved/non-final, while 83 records are provisional candidates awaiting full-text assessment. Gates D-J have not been completed. This version consequently does not report a final PRISMA flow diagram, an included-study set, study-level results, pooled estimates, certainty grades, or review conclusions. Such outputs require completion of screening, full-text assessment, extraction, appraisal, synthesis and final reporting audit.</w:t>
+        <w:t>The evidence synthesis is not complete. Gate C screening reconciliation remains open after adjudication of the 40-record R1/R2 title/metadata pilot, exact-agreement screening of the 100-record Batch R1-B1 and Batch B4, and adjudication of the 100-record Batches B2 and B3: 837 canonical identities remain unresolved/non-final, while 83 records are provisional candidates awaiting full-text assessment. Gates D-J have not been completed. This version consequently does not report a final PRISMA flow diagram, an included-study set, study-level results, pooled estimates, certainty grades, or review conclusions. Such outputs require completion of screening, full-text assessment, extraction, appraisal, synthesis and final reporting audit.</w:t>
       </w:r>
     </w:p>
     <w:p>
@@ -1803,7 +1803,7 @@
     </w:p>
     <w:p>
       <w:r>
-        <w:t>Dated 23 September 2026. This appendix supersedes no source record: it consolidates the current gate state for this submission-stage status report, including the Batch B4, Batch B5, Batch B6, Batch B7, Batch B8 and Batch B9 title/metadata updates. It does not report final study selection, a PRISMA flow, included-study results, extraction, risk-of-bias findings or synthesis.</w:t>
+        <w:t>Dated 23 September 2026. This appendix supersedes no source record: it consolidates the current gate state for this submission-stage status report, including the Batch B4, Batch B5, Batch B6, Batch B7, Batch B8, Batch B9 and Batch B10 title/metadata updates. It does not report final study selection, a PRISMA flow, included-study results, extraction, risk-of-bias findings or synthesis.</w:t>
       </w:r>
     </w:p>
     <w:p>
@@ -3942,7 +3942,7 @@
     </w:tbl>
     <w:p>
       <w:r>
-        <w:t>Next controlled action: independently screen and adjudicate the remaining 937 canonical identities at title/metadata, then assess the 164 provisional candidates and any additional title/metadata retains at full text. Do not begin extraction or risk-of-bias appraisal until full-text eligibility is fixed; do not claim a final PRISMA flow, included-study count, certainty finding or SWiM synthesis until the complete screening queue is reconciled.</w:t>
+        <w:t>Next controlled action: independently screen and adjudicate the remaining 837 canonical identities at title/metadata, then assess the 173 provisional candidates and any additional title/metadata retains at full text. Do not begin extraction or risk-of-bias appraisal until full-text eligibility is fixed; do not claim a final PRISMA flow, included-study count, certainty finding or SWiM synthesis until the complete screening queue is reconciled.</w:t>
       </w:r>
     </w:p>
     <w:p>
@@ -4021,6 +4021,19 @@
     <w:p>
       <w:r>
         <w:t>Batch B9 comprised CAN-0881-CAN-0980 (100 records). R1 retained 12 records and excluded 88; R2 retained 14 and excluded 86. The reviewers differed on 4 records. Applying the prespecified conservative rule, all disagreement records were retained for full-text assessment rather than being forced into exclusion. The final B9 disposition is therefore 15 provisional full-text candidates and 85 exclusions. These are provisional candidates, not final included studies; full-text eligibility remains outstanding.</w:t>
+      </w:r>
+    </w:p>
+    <w:p>
+      <w:pPr>
+        <w:pStyle w:val="Heading2"/>
+      </w:pPr>
+      <w:r>
+        <w:t>B10. Adjudicated Batch B10 title/metadata screening update</w:t>
+      </w:r>
+    </w:p>
+    <w:p>
+      <w:r>
+        <w:t>Batch B10 comprised CAN-0981-CAN-1080 (100 records). R1 retained 2 records and excluded 98; R2 retained 9 and excluded 91. The reviewers differed on 7 records. Applying the prespecified conservative rule, all disagreement records were retained for full-text assessment rather than being forced into exclusion. The final B10 disposition is therefore 9 provisional full-text candidates and 91 exclusions. These are provisional candidates, not final included studies; full-text eligibility remains outstanding.</w:t>
       </w:r>
     </w:p>
     <w:sectPr>

</xml_diff>

<commit_message>
Record adjudicated screening batch B11
</commit_message>
<xml_diff>
--- a/Avian_review_paper_submission_ready.docx
+++ b/Avian_review_paper_submission_ready.docx
@@ -32,7 +32,7 @@
         <w:spacing w:before="0" w:after="120"/>
       </w:pPr>
       <w:r>
-        <w:t>Background: Avian influenza viruses (AIVs) have caused recurrent poultry outbreaks and molecularly distinct detections in Nigeria since 2006. Objective: This submission-stage protocol prespecifies a systematic review of emergence, temporal and geographic distribution, host range, and molecular/clade/reassortment dynamics of Nigeria-specific AIVs. Methods: The protocol uses a CoCoPop/PEO framework and is aligned with PRISMA 2020, PRISMA-S and SWiM. The study/search window is 2006-2026; the operational status snapshot is 20 September 2026. Results status: 2,367 source rows had been reconciled into 1,877 provisional identities; 1,040 title/metadata records have been screened, yielding 867 clear exclusions and 173 provisional full-text candidates. Final screening, full-text assessment, extraction, risk-of-bias appraisal, synthesis and a PRISMA flow are not complete. Conclusion: This document is a protocol and search/record-management status report, not a completed systematic review.</w:t>
+        <w:t>Background: Avian influenza viruses (AIVs) have caused recurrent poultry outbreaks and molecularly distinct detections in Nigeria since 2006. Objective: This submission-stage protocol prespecifies a systematic review of emergence, temporal and geographic distribution, host range, and molecular/clade/reassortment dynamics of Nigeria-specific AIVs. Methods: The protocol uses a CoCoPop/PEO framework and is aligned with PRISMA 2020, PRISMA-S and SWiM. The study/search window is 2006-2026; the operational status snapshot is 20 September 2026. Results status: 2,367 source rows had been reconciled into 1,877 provisional identities; 1,140 title/metadata records have been screened, yielding 959 clear exclusions and 181 provisional full-text candidates. Final screening, full-text assessment, extraction, risk-of-bias appraisal, synthesis and a PRISMA flow are not complete. Conclusion: This document is a protocol and search/record-management status report, not a completed systematic review.</w:t>
       </w:r>
     </w:p>
     <w:p>
@@ -41,7 +41,7 @@
         <w:ind w:left="216" w:right="216"/>
       </w:pPr>
       <w:r>
-        <w:t>STATUS NOTE - 22 September 2026: Gate C remains open. The adjudicated R1/R2 title/metadata pilot of 40 records and Batch R1-B1 (the first 100 non-pilot canonical records by canonical_id order, CAN-0015 through CAN-0134 with pilot IDs omitted) produced 98 clear exclusions and 42 provisional full-text candidates. Batch R1-B1 had exact R1/R2 agreement (100/100) and no adjudication disagreements. Batch B2 retained 17 provisional full-text candidates and excluded 83 after eight R1/R2 disagreements were adjudicated. Batch B3 screened CAN-0241-CAN-0340 and retained 13 provisional full-text candidates while excluding 87. Batch B4 screened CAN-0381-CAN-0480: R1/R2 had exact agreement (100/100), with 0 clear Include-for-full-text decisions, 11 Unsure/retain-for-full-text decisions and 89 Exclude decisions; no disagreements occurred. All 11 uncertain records were retained conservatively for full-text review. Cumulatively, 1,040 title/metadata records have been screened, with 867 exclusions and 173 provisional full-text candidates; 837 canonical identities remain unresolved/non-final. Gates D-J are incomplete; full-text assessment, extraction, risk-of-bias assessment, certainty assessment, final PRISMA flow and SWiM synthesis remain pending.</w:t>
+        <w:t>STATUS NOTE - 22 September 2026: Gate C remains open. The adjudicated R1/R2 title/metadata pilot of 40 records and Batch R1-B1 (the first 100 non-pilot canonical records by canonical_id order, CAN-0015 through CAN-0134 with pilot IDs omitted) produced 98 clear exclusions and 42 provisional full-text candidates. Batch R1-B1 had exact R1/R2 agreement (100/100) and no adjudication disagreements. Batch B2 retained 17 provisional full-text candidates and excluded 83 after eight R1/R2 disagreements were adjudicated. Batch B3 screened CAN-0241-CAN-0340 and retained 13 provisional full-text candidates while excluding 87. Batch B4 screened CAN-0381-CAN-0480: R1/R2 had exact agreement (100/100), with 0 clear Include-for-full-text decisions, 11 Unsure/retain-for-full-text decisions and 89 Exclude decisions; no disagreements occurred. All 11 uncertain records were retained conservatively for full-text review. Cumulatively, 1,140 title/metadata records have been screened, with 959 exclusions and 181 provisional full-text candidates; 737 canonical identities remain unresolved/non-final. Gates D-J are incomplete; full-text assessment, extraction, risk-of-bias assessment, certainty assessment, final PRISMA flow and SWiM synthesis remain pending.</w:t>
       </w:r>
     </w:p>
     <w:p>
@@ -210,7 +210,7 @@
         <w:spacing w:before="0" w:after="120"/>
       </w:pPr>
       <w:r>
-        <w:t>Records were reconciled using symmetric DOI, PMID, or exact normalised title-plus-year matching. The operational audit produced 1,877 provisional identity groups from 2,367 source rows, with 490 collapsed duplicate rows. The controlled title/metadata-screening denominator is therefore 1,877. R1 and R2 independently screened and adjudicated a 40-record pilot (25 clear exclusions; 15 provisional full-text candidates) and independently screened Batch R1-B1, the first 100 non-pilot canonical records by canonical_id order (CAN-0015 through CAN-0134 with pilot IDs omitted). Batch R1-B1 had exact agreement (100/100), with 17 Include-for-full-text, 10 Unsure/retain-for-full-text and 73 Exclude decisions; no adjudication disagreements occurred. Batch B2 comprised the next 100 non-pilot canonical records after B1 (CAN-0135-CAN-0240, with pilot IDs omitted). The final B2 disposition was 17 retained for full text and 83 excluded after eight disagreements were adjudicated. Batch B3 comprised CAN-0241-CAN-0340; the final B3 disposition was 13 provisional full-text candidates and 87 exclusions. Batch B4 comprised CAN-0381-CAN-0480 (100 records). R1 and R2 had exact agreement (100/100): 0 clear Include-for-full-text, 11 Unsure/retain-for-full-text and 89 Exclude decisions, with no disagreements. All 11 uncertain records were retained conservatively for full-text review. Across the pilot, B1, B2, B3 and B4, 1,040 title/metadata records have been screened: 867 clear exclusions and 173 provisional full-text candidates. The remaining 1,437 canonical identities are unresolved/non-final. No final title/metadata decision, full-text eligibility decision or included-study count exists. The planned dual-review process applies Nigeria linkage, laboratory-confirmed avian AIV, at least one relevant evidence type, and extractable primary-data questions; an unsure record proceeds to full text rather than being assumed excluded.</w:t>
+        <w:t>Records were reconciled using symmetric DOI, PMID, or exact normalised title-plus-year matching. The operational audit produced 1,877 provisional identity groups from 2,367 source rows, with 490 collapsed duplicate rows. The controlled title/metadata-screening denominator is therefore 1,877. R1 and R2 independently screened and adjudicated a 40-record pilot (25 clear exclusions; 15 provisional full-text candidates) and independently screened Batch R1-B1, the first 100 non-pilot canonical records by canonical_id order (CAN-0015 through CAN-0134 with pilot IDs omitted). Batch R1-B1 had exact agreement (100/100), with 17 Include-for-full-text, 10 Unsure/retain-for-full-text and 73 Exclude decisions; no adjudication disagreements occurred. Batch B2 comprised the next 100 non-pilot canonical records after B1 (CAN-0135-CAN-0240, with pilot IDs omitted). The final B2 disposition was 17 retained for full text and 83 excluded after eight disagreements were adjudicated. Batch B3 comprised CAN-0241-CAN-0340; the final B3 disposition was 13 provisional full-text candidates and 87 exclusions. Batch B4 comprised CAN-0381-CAN-0480 (100 records). R1 and R2 had exact agreement (100/100): 0 clear Include-for-full-text, 11 Unsure/retain-for-full-text and 89 Exclude decisions, with no disagreements. All 11 uncertain records were retained conservatively for full-text review. Across the pilot, B1, B2, B3 and B4, 1,140 title/metadata records have been screened: 959 clear exclusions and 181 provisional full-text candidates. The remaining 1,437 canonical identities are unresolved/non-final. No final title/metadata decision, full-text eligibility decision or included-study count exists. The planned dual-review process applies Nigeria linkage, laboratory-confirmed avian AIV, at least one relevant evidence type, and extractable primary-data questions; an unsure record proceeds to full text rather than being assumed excluded.</w:t>
       </w:r>
     </w:p>
     <w:p>
@@ -249,7 +249,7 @@
         <w:spacing w:before="0" w:after="120"/>
       </w:pPr>
       <w:r>
-        <w:t>The evidence synthesis is not complete. Gate C screening reconciliation remains open after adjudication of the 40-record R1/R2 title/metadata pilot, exact-agreement screening of the 100-record Batch R1-B1 and Batch B4, and adjudication of the 100-record Batches B2 and B3: 837 canonical identities remain unresolved/non-final, while 83 records are provisional candidates awaiting full-text assessment. Gates D-J have not been completed. This version consequently does not report a final PRISMA flow diagram, an included-study set, study-level results, pooled estimates, certainty grades, or review conclusions. Such outputs require completion of screening, full-text assessment, extraction, appraisal, synthesis and final reporting audit.</w:t>
+        <w:t>The evidence synthesis is not complete. Gate C screening reconciliation remains open after adjudication of the 40-record R1/R2 title/metadata pilot, exact-agreement screening of the 100-record Batch R1-B1 and Batch B4, and adjudication of the 100-record Batches B2 and B3: 737 canonical identities remain unresolved/non-final, while 83 records are provisional candidates awaiting full-text assessment. Gates D-J have not been completed. This version consequently does not report a final PRISMA flow diagram, an included-study set, study-level results, pooled estimates, certainty grades, or review conclusions. Such outputs require completion of screening, full-text assessment, extraction, appraisal, synthesis and final reporting audit.</w:t>
       </w:r>
     </w:p>
     <w:p>
@@ -1803,7 +1803,7 @@
     </w:p>
     <w:p>
       <w:r>
-        <w:t>Dated 23 September 2026. This appendix supersedes no source record: it consolidates the current gate state for this submission-stage status report, including the Batch B4, Batch B5, Batch B6, Batch B7, Batch B8, Batch B9 and Batch B10 title/metadata updates. It does not report final study selection, a PRISMA flow, included-study results, extraction, risk-of-bias findings or synthesis.</w:t>
+        <w:t>Dated 23 September 2026. This appendix supersedes no source record: it consolidates the current gate state for this submission-stage status report, including the Batch B4, Batch B5, Batch B6, Batch B7, Batch B8, Batch B9, Batch B10 and Batch B11 title/metadata updates. It does not report final study selection, a PRISMA flow, included-study results, extraction, risk-of-bias findings or synthesis.</w:t>
       </w:r>
     </w:p>
     <w:p>
@@ -3942,7 +3942,7 @@
     </w:tbl>
     <w:p>
       <w:r>
-        <w:t>Next controlled action: independently screen and adjudicate the remaining 837 canonical identities at title/metadata, then assess the 173 provisional candidates and any additional title/metadata retains at full text. Do not begin extraction or risk-of-bias appraisal until full-text eligibility is fixed; do not claim a final PRISMA flow, included-study count, certainty finding or SWiM synthesis until the complete screening queue is reconciled.</w:t>
+        <w:t>Next controlled action: independently screen and adjudicate the remaining 737 canonical identities at title/metadata, then assess the 181 provisional candidates and any additional title/metadata retains at full text. Do not begin extraction or risk-of-bias appraisal until full-text eligibility is fixed; do not claim a final PRISMA flow, included-study count, certainty finding or SWiM synthesis until the complete screening queue is reconciled.</w:t>
       </w:r>
     </w:p>
     <w:p>
@@ -4034,6 +4034,19 @@
     <w:p>
       <w:r>
         <w:t>Batch B10 comprised CAN-0981-CAN-1080 (100 records). R1 retained 2 records and excluded 98; R2 retained 9 and excluded 91. The reviewers differed on 7 records. Applying the prespecified conservative rule, all disagreement records were retained for full-text assessment rather than being forced into exclusion. The final B10 disposition is therefore 9 provisional full-text candidates and 91 exclusions. These are provisional candidates, not final included studies; full-text eligibility remains outstanding.</w:t>
+      </w:r>
+    </w:p>
+    <w:p>
+      <w:pPr>
+        <w:pStyle w:val="Heading2"/>
+      </w:pPr>
+      <w:r>
+        <w:t>B11. Adjudicated Batch B11 title/metadata screening update</w:t>
+      </w:r>
+    </w:p>
+    <w:p>
+      <w:r>
+        <w:t>Batch B11 comprised CAN-1081-CAN-1180 (100 records). R1 retained 4 records and excluded 96; R2 retained 7 and excluded 93. The reviewers differed on 5 records. Applying the prespecified conservative rule, all disagreement records were retained for full-text assessment rather than being forced into exclusion. The final B11 disposition is therefore 8 provisional full-text candidates and 92 exclusions. These are provisional candidates, not final included studies; full-text eligibility remains outstanding.</w:t>
       </w:r>
     </w:p>
     <w:sectPr>

</xml_diff>

<commit_message>
Record adjudicated screening batch B12
</commit_message>
<xml_diff>
--- a/Avian_review_paper_submission_ready.docx
+++ b/Avian_review_paper_submission_ready.docx
@@ -32,7 +32,7 @@
         <w:spacing w:before="0" w:after="120"/>
       </w:pPr>
       <w:r>
-        <w:t>Background: Avian influenza viruses (AIVs) have caused recurrent poultry outbreaks and molecularly distinct detections in Nigeria since 2006. Objective: This submission-stage protocol prespecifies a systematic review of emergence, temporal and geographic distribution, host range, and molecular/clade/reassortment dynamics of Nigeria-specific AIVs. Methods: The protocol uses a CoCoPop/PEO framework and is aligned with PRISMA 2020, PRISMA-S and SWiM. The study/search window is 2006-2026; the operational status snapshot is 20 September 2026. Results status: 2,367 source rows had been reconciled into 1,877 provisional identities; 1,140 title/metadata records have been screened, yielding 959 clear exclusions and 181 provisional full-text candidates. Final screening, full-text assessment, extraction, risk-of-bias appraisal, synthesis and a PRISMA flow are not complete. Conclusion: This document is a protocol and search/record-management status report, not a completed systematic review.</w:t>
+        <w:t>Background: Avian influenza viruses (AIVs) have caused recurrent poultry outbreaks and molecularly distinct detections in Nigeria since 2006. Objective: This submission-stage protocol prespecifies a systematic review of emergence, temporal and geographic distribution, host range, and molecular/clade/reassortment dynamics of Nigeria-specific AIVs. Methods: The protocol uses a CoCoPop/PEO framework and is aligned with PRISMA 2020, PRISMA-S and SWiM. The study/search window is 2006-2026; the operational status snapshot is 20 September 2026. Results status: 2,367 source rows had been reconciled into 1,877 provisional identities; 1,240 title/metadata records have been screened, yielding 1,049 clear exclusions and 191 provisional full-text candidates. Final screening, full-text assessment, extraction, risk-of-bias appraisal, synthesis and a PRISMA flow are not complete. Conclusion: This document is a protocol and search/record-management status report, not a completed systematic review.</w:t>
       </w:r>
     </w:p>
     <w:p>
@@ -41,7 +41,7 @@
         <w:ind w:left="216" w:right="216"/>
       </w:pPr>
       <w:r>
-        <w:t>STATUS NOTE - 22 September 2026: Gate C remains open. The adjudicated R1/R2 title/metadata pilot of 40 records and Batch R1-B1 (the first 100 non-pilot canonical records by canonical_id order, CAN-0015 through CAN-0134 with pilot IDs omitted) produced 98 clear exclusions and 42 provisional full-text candidates. Batch R1-B1 had exact R1/R2 agreement (100/100) and no adjudication disagreements. Batch B2 retained 17 provisional full-text candidates and excluded 83 after eight R1/R2 disagreements were adjudicated. Batch B3 screened CAN-0241-CAN-0340 and retained 13 provisional full-text candidates while excluding 87. Batch B4 screened CAN-0381-CAN-0480: R1/R2 had exact agreement (100/100), with 0 clear Include-for-full-text decisions, 11 Unsure/retain-for-full-text decisions and 89 Exclude decisions; no disagreements occurred. All 11 uncertain records were retained conservatively for full-text review. Cumulatively, 1,140 title/metadata records have been screened, with 959 exclusions and 181 provisional full-text candidates; 737 canonical identities remain unresolved/non-final. Gates D-J are incomplete; full-text assessment, extraction, risk-of-bias assessment, certainty assessment, final PRISMA flow and SWiM synthesis remain pending.</w:t>
+        <w:t>STATUS NOTE - 22 September 2026: Gate C remains open. The adjudicated R1/R2 title/metadata pilot of 40 records and Batch R1-B1 (the first 100 non-pilot canonical records by canonical_id order, CAN-0015 through CAN-0134 with pilot IDs omitted) produced 98 clear exclusions and 42 provisional full-text candidates. Batch R1-B1 had exact R1/R2 agreement (100/100) and no adjudication disagreements. Batch B2 retained 17 provisional full-text candidates and excluded 83 after eight R1/R2 disagreements were adjudicated. Batch B3 screened CAN-0241-CAN-0340 and retained 13 provisional full-text candidates while excluding 87. Batch B4 screened CAN-0381-CAN-0480: R1/R2 had exact agreement (100/100), with 0 clear Include-for-full-text decisions, 11 Unsure/retain-for-full-text decisions and 89 Exclude decisions; no disagreements occurred. All 11 uncertain records were retained conservatively for full-text review. Cumulatively, 1,240 title/metadata records have been screened, with 1,049 exclusions and 191 provisional full-text candidates; 637 canonical identities remain unresolved/non-final. Gates D-J are incomplete; full-text assessment, extraction, risk-of-bias assessment, certainty assessment, final PRISMA flow and SWiM synthesis remain pending.</w:t>
       </w:r>
     </w:p>
     <w:p>
@@ -210,7 +210,7 @@
         <w:spacing w:before="0" w:after="120"/>
       </w:pPr>
       <w:r>
-        <w:t>Records were reconciled using symmetric DOI, PMID, or exact normalised title-plus-year matching. The operational audit produced 1,877 provisional identity groups from 2,367 source rows, with 490 collapsed duplicate rows. The controlled title/metadata-screening denominator is therefore 1,877. R1 and R2 independently screened and adjudicated a 40-record pilot (25 clear exclusions; 15 provisional full-text candidates) and independently screened Batch R1-B1, the first 100 non-pilot canonical records by canonical_id order (CAN-0015 through CAN-0134 with pilot IDs omitted). Batch R1-B1 had exact agreement (100/100), with 17 Include-for-full-text, 10 Unsure/retain-for-full-text and 73 Exclude decisions; no adjudication disagreements occurred. Batch B2 comprised the next 100 non-pilot canonical records after B1 (CAN-0135-CAN-0240, with pilot IDs omitted). The final B2 disposition was 17 retained for full text and 83 excluded after eight disagreements were adjudicated. Batch B3 comprised CAN-0241-CAN-0340; the final B3 disposition was 13 provisional full-text candidates and 87 exclusions. Batch B4 comprised CAN-0381-CAN-0480 (100 records). R1 and R2 had exact agreement (100/100): 0 clear Include-for-full-text, 11 Unsure/retain-for-full-text and 89 Exclude decisions, with no disagreements. All 11 uncertain records were retained conservatively for full-text review. Across the pilot, B1, B2, B3 and B4, 1,140 title/metadata records have been screened: 959 clear exclusions and 181 provisional full-text candidates. The remaining 1,437 canonical identities are unresolved/non-final. No final title/metadata decision, full-text eligibility decision or included-study count exists. The planned dual-review process applies Nigeria linkage, laboratory-confirmed avian AIV, at least one relevant evidence type, and extractable primary-data questions; an unsure record proceeds to full text rather than being assumed excluded.</w:t>
+        <w:t>Records were reconciled using symmetric DOI, PMID, or exact normalised title-plus-year matching. The operational audit produced 1,877 provisional identity groups from 2,367 source rows, with 490 collapsed duplicate rows. The controlled title/metadata-screening denominator is therefore 1,877. R1 and R2 independently screened and adjudicated a 40-record pilot (25 clear exclusions; 15 provisional full-text candidates) and independently screened Batch R1-B1, the first 100 non-pilot canonical records by canonical_id order (CAN-0015 through CAN-0134 with pilot IDs omitted). Batch R1-B1 had exact agreement (100/100), with 17 Include-for-full-text, 10 Unsure/retain-for-full-text and 73 Exclude decisions; no adjudication disagreements occurred. Batch B2 comprised the next 100 non-pilot canonical records after B1 (CAN-0135-CAN-0240, with pilot IDs omitted). The final B2 disposition was 17 retained for full text and 83 excluded after eight disagreements were adjudicated. Batch B3 comprised CAN-0241-CAN-0340; the final B3 disposition was 13 provisional full-text candidates and 87 exclusions. Batch B4 comprised CAN-0381-CAN-0480 (100 records). R1 and R2 had exact agreement (100/100): 0 clear Include-for-full-text, 11 Unsure/retain-for-full-text and 89 Exclude decisions, with no disagreements. All 11 uncertain records were retained conservatively for full-text review. Across the pilot, B1, B2, B3 and B4, 1,240 title/metadata records have been screened: 1,049 clear exclusions and 191 provisional full-text candidates. The remaining 1,437 canonical identities are unresolved/non-final. No final title/metadata decision, full-text eligibility decision or included-study count exists. The planned dual-review process applies Nigeria linkage, laboratory-confirmed avian AIV, at least one relevant evidence type, and extractable primary-data questions; an unsure record proceeds to full text rather than being assumed excluded.</w:t>
       </w:r>
     </w:p>
     <w:p>
@@ -249,7 +249,7 @@
         <w:spacing w:before="0" w:after="120"/>
       </w:pPr>
       <w:r>
-        <w:t>The evidence synthesis is not complete. Gate C screening reconciliation remains open after adjudication of the 40-record R1/R2 title/metadata pilot, exact-agreement screening of the 100-record Batch R1-B1 and Batch B4, and adjudication of the 100-record Batches B2 and B3: 737 canonical identities remain unresolved/non-final, while 83 records are provisional candidates awaiting full-text assessment. Gates D-J have not been completed. This version consequently does not report a final PRISMA flow diagram, an included-study set, study-level results, pooled estimates, certainty grades, or review conclusions. Such outputs require completion of screening, full-text assessment, extraction, appraisal, synthesis and final reporting audit.</w:t>
+        <w:t>The evidence synthesis is not complete. Gate C screening reconciliation remains open after adjudication of the 40-record R1/R2 title/metadata pilot, exact-agreement screening of the 100-record Batch R1-B1 and Batch B4, and adjudication of the 100-record Batches B2 and B3: 637 canonical identities remain unresolved/non-final, while 83 records are provisional candidates awaiting full-text assessment. Gates D-J have not been completed. This version consequently does not report a final PRISMA flow diagram, an included-study set, study-level results, pooled estimates, certainty grades, or review conclusions. Such outputs require completion of screening, full-text assessment, extraction, appraisal, synthesis and final reporting audit.</w:t>
       </w:r>
     </w:p>
     <w:p>
@@ -1803,7 +1803,7 @@
     </w:p>
     <w:p>
       <w:r>
-        <w:t>Dated 23 September 2026. This appendix supersedes no source record: it consolidates the current gate state for this submission-stage status report, including the Batch B4, Batch B5, Batch B6, Batch B7, Batch B8, Batch B9, Batch B10 and Batch B11 title/metadata updates. It does not report final study selection, a PRISMA flow, included-study results, extraction, risk-of-bias findings or synthesis.</w:t>
+        <w:t>Dated 23 September 2026. This appendix supersedes no source record: it consolidates the current gate state for this submission-stage status report, including the Batch B4, Batch B5, Batch B6, Batch B7, Batch B8, Batch B9, Batch B10, Batch B11 and Batch B12 title/metadata updates. It does not report final study selection, a PRISMA flow, included-study results, extraction, risk-of-bias findings or synthesis.</w:t>
       </w:r>
     </w:p>
     <w:p>
@@ -3942,7 +3942,7 @@
     </w:tbl>
     <w:p>
       <w:r>
-        <w:t>Next controlled action: independently screen and adjudicate the remaining 737 canonical identities at title/metadata, then assess the 181 provisional candidates and any additional title/metadata retains at full text. Do not begin extraction or risk-of-bias appraisal until full-text eligibility is fixed; do not claim a final PRISMA flow, included-study count, certainty finding or SWiM synthesis until the complete screening queue is reconciled.</w:t>
+        <w:t>Next controlled action: independently screen and adjudicate the remaining 637 canonical identities at title/metadata, then assess the 191 provisional candidates and any additional title/metadata retains at full text. Do not begin extraction or risk-of-bias appraisal until full-text eligibility is fixed; do not claim a final PRISMA flow, included-study count, certainty finding or SWiM synthesis until the complete screening queue is reconciled.</w:t>
       </w:r>
     </w:p>
     <w:p>
@@ -4047,6 +4047,19 @@
     <w:p>
       <w:r>
         <w:t>Batch B11 comprised CAN-1081-CAN-1180 (100 records). R1 retained 4 records and excluded 96; R2 retained 7 and excluded 93. The reviewers differed on 5 records. Applying the prespecified conservative rule, all disagreement records were retained for full-text assessment rather than being forced into exclusion. The final B11 disposition is therefore 8 provisional full-text candidates and 92 exclusions. These are provisional candidates, not final included studies; full-text eligibility remains outstanding.</w:t>
+      </w:r>
+    </w:p>
+    <w:p>
+      <w:pPr>
+        <w:pStyle w:val="Heading2"/>
+      </w:pPr>
+      <w:r>
+        <w:t>B12. Adjudicated Batch B12 title/metadata screening update</w:t>
+      </w:r>
+    </w:p>
+    <w:p>
+      <w:r>
+        <w:t>Batch B12 comprised CAN-1181-CAN-1280 (100 records). R1 retained 6 records and excluded 94; R2 retained 6 and excluded 94. The reviewers differed on 8 records. Applying the prespecified conservative rule, all disagreement records were retained for full-text assessment rather than being forced into exclusion. The final B12 disposition is therefore 10 provisional full-text candidates and 90 exclusions. These are provisional candidates, not final included studies; full-text eligibility remains outstanding.</w:t>
       </w:r>
     </w:p>
     <w:sectPr>

</xml_diff>

<commit_message>
Record adjudicated screening batch B13
</commit_message>
<xml_diff>
--- a/Avian_review_paper_submission_ready.docx
+++ b/Avian_review_paper_submission_ready.docx
@@ -32,7 +32,7 @@
         <w:spacing w:before="0" w:after="120"/>
       </w:pPr>
       <w:r>
-        <w:t>Background: Avian influenza viruses (AIVs) have caused recurrent poultry outbreaks and molecularly distinct detections in Nigeria since 2006. Objective: This submission-stage protocol prespecifies a systematic review of emergence, temporal and geographic distribution, host range, and molecular/clade/reassortment dynamics of Nigeria-specific AIVs. Methods: The protocol uses a CoCoPop/PEO framework and is aligned with PRISMA 2020, PRISMA-S and SWiM. The study/search window is 2006-2026; the operational status snapshot is 20 September 2026. Results status: 2,367 source rows had been reconciled into 1,877 provisional identities; 1,240 title/metadata records have been screened, yielding 1,049 clear exclusions and 191 provisional full-text candidates. Final screening, full-text assessment, extraction, risk-of-bias appraisal, synthesis and a PRISMA flow are not complete. Conclusion: This document is a protocol and search/record-management status report, not a completed systematic review.</w:t>
+        <w:t>Background: Avian influenza viruses (AIVs) have caused recurrent poultry outbreaks and molecularly distinct detections in Nigeria since 2006. Objective: This submission-stage protocol prespecifies a systematic review of emergence, temporal and geographic distribution, host range, and molecular/clade/reassortment dynamics of Nigeria-specific AIVs. Methods: The protocol uses a CoCoPop/PEO framework and is aligned with PRISMA 2020, PRISMA-S and SWiM. The study/search window is 2006-2026; the operational status snapshot is 20 September 2026. Results status: 2,367 source rows had been reconciled into 1,877 provisional identities; 1,340 title/metadata records have been screened, yielding 1,139 clear exclusions and 201 provisional full-text candidates. Final screening, full-text assessment, extraction, risk-of-bias appraisal, synthesis and a PRISMA flow are not complete. Conclusion: This document is a protocol and search/record-management status report, not a completed systematic review.</w:t>
       </w:r>
     </w:p>
     <w:p>
@@ -41,7 +41,7 @@
         <w:ind w:left="216" w:right="216"/>
       </w:pPr>
       <w:r>
-        <w:t>STATUS NOTE - 22 September 2026: Gate C remains open. The adjudicated R1/R2 title/metadata pilot of 40 records and Batch R1-B1 (the first 100 non-pilot canonical records by canonical_id order, CAN-0015 through CAN-0134 with pilot IDs omitted) produced 98 clear exclusions and 42 provisional full-text candidates. Batch R1-B1 had exact R1/R2 agreement (100/100) and no adjudication disagreements. Batch B2 retained 17 provisional full-text candidates and excluded 83 after eight R1/R2 disagreements were adjudicated. Batch B3 screened CAN-0241-CAN-0340 and retained 13 provisional full-text candidates while excluding 87. Batch B4 screened CAN-0381-CAN-0480: R1/R2 had exact agreement (100/100), with 0 clear Include-for-full-text decisions, 11 Unsure/retain-for-full-text decisions and 89 Exclude decisions; no disagreements occurred. All 11 uncertain records were retained conservatively for full-text review. Cumulatively, 1,240 title/metadata records have been screened, with 1,049 exclusions and 191 provisional full-text candidates; 637 canonical identities remain unresolved/non-final. Gates D-J are incomplete; full-text assessment, extraction, risk-of-bias assessment, certainty assessment, final PRISMA flow and SWiM synthesis remain pending.</w:t>
+        <w:t>STATUS NOTE - 22 September 2026: Gate C remains open. The adjudicated R1/R2 title/metadata pilot of 40 records and Batch R1-B1 (the first 100 non-pilot canonical records by canonical_id order, CAN-0015 through CAN-0134 with pilot IDs omitted) produced 98 clear exclusions and 42 provisional full-text candidates. Batch R1-B1 had exact R1/R2 agreement (100/100) and no adjudication disagreements. Batch B2 retained 17 provisional full-text candidates and excluded 83 after eight R1/R2 disagreements were adjudicated. Batch B3 screened CAN-0241-CAN-0340 and retained 13 provisional full-text candidates while excluding 87. Batch B4 screened CAN-0381-CAN-0480: R1/R2 had exact agreement (100/100), with 0 clear Include-for-full-text decisions, 11 Unsure/retain-for-full-text decisions and 89 Exclude decisions; no disagreements occurred. All 11 uncertain records were retained conservatively for full-text review. Cumulatively, 1,340 title/metadata records have been screened, with 1,139 exclusions and 201 provisional full-text candidates; 537 canonical identities remain unresolved/non-final. Gates D-J are incomplete; full-text assessment, extraction, risk-of-bias assessment, certainty assessment, final PRISMA flow and SWiM synthesis remain pending.</w:t>
       </w:r>
     </w:p>
     <w:p>
@@ -210,7 +210,7 @@
         <w:spacing w:before="0" w:after="120"/>
       </w:pPr>
       <w:r>
-        <w:t>Records were reconciled using symmetric DOI, PMID, or exact normalised title-plus-year matching. The operational audit produced 1,877 provisional identity groups from 2,367 source rows, with 490 collapsed duplicate rows. The controlled title/metadata-screening denominator is therefore 1,877. R1 and R2 independently screened and adjudicated a 40-record pilot (25 clear exclusions; 15 provisional full-text candidates) and independently screened Batch R1-B1, the first 100 non-pilot canonical records by canonical_id order (CAN-0015 through CAN-0134 with pilot IDs omitted). Batch R1-B1 had exact agreement (100/100), with 17 Include-for-full-text, 10 Unsure/retain-for-full-text and 73 Exclude decisions; no adjudication disagreements occurred. Batch B2 comprised the next 100 non-pilot canonical records after B1 (CAN-0135-CAN-0240, with pilot IDs omitted). The final B2 disposition was 17 retained for full text and 83 excluded after eight disagreements were adjudicated. Batch B3 comprised CAN-0241-CAN-0340; the final B3 disposition was 13 provisional full-text candidates and 87 exclusions. Batch B4 comprised CAN-0381-CAN-0480 (100 records). R1 and R2 had exact agreement (100/100): 0 clear Include-for-full-text, 11 Unsure/retain-for-full-text and 89 Exclude decisions, with no disagreements. All 11 uncertain records were retained conservatively for full-text review. Across the pilot, B1, B2, B3 and B4, 1,240 title/metadata records have been screened: 1,049 clear exclusions and 191 provisional full-text candidates. The remaining 1,437 canonical identities are unresolved/non-final. No final title/metadata decision, full-text eligibility decision or included-study count exists. The planned dual-review process applies Nigeria linkage, laboratory-confirmed avian AIV, at least one relevant evidence type, and extractable primary-data questions; an unsure record proceeds to full text rather than being assumed excluded.</w:t>
+        <w:t>Records were reconciled using symmetric DOI, PMID, or exact normalised title-plus-year matching. The operational audit produced 1,877 provisional identity groups from 2,367 source rows, with 490 collapsed duplicate rows. The controlled title/metadata-screening denominator is therefore 1,877. R1 and R2 independently screened and adjudicated a 40-record pilot (25 clear exclusions; 15 provisional full-text candidates) and independently screened Batch R1-B1, the first 100 non-pilot canonical records by canonical_id order (CAN-0015 through CAN-0134 with pilot IDs omitted). Batch R1-B1 had exact agreement (100/100), with 17 Include-for-full-text, 10 Unsure/retain-for-full-text and 73 Exclude decisions; no adjudication disagreements occurred. Batch B2 comprised the next 100 non-pilot canonical records after B1 (CAN-0135-CAN-0240, with pilot IDs omitted). The final B2 disposition was 17 retained for full text and 83 excluded after eight disagreements were adjudicated. Batch B3 comprised CAN-0241-CAN-0340; the final B3 disposition was 13 provisional full-text candidates and 87 exclusions. Batch B4 comprised CAN-0381-CAN-0480 (100 records). R1 and R2 had exact agreement (100/100): 0 clear Include-for-full-text, 11 Unsure/retain-for-full-text and 89 Exclude decisions, with no disagreements. All 11 uncertain records were retained conservatively for full-text review. Across the pilot, B1, B2, B3 and B4, 1,340 title/metadata records have been screened: 1,139 clear exclusions and 201 provisional full-text candidates. The remaining 1,437 canonical identities are unresolved/non-final. No final title/metadata decision, full-text eligibility decision or included-study count exists. The planned dual-review process applies Nigeria linkage, laboratory-confirmed avian AIV, at least one relevant evidence type, and extractable primary-data questions; an unsure record proceeds to full text rather than being assumed excluded.</w:t>
       </w:r>
     </w:p>
     <w:p>
@@ -249,7 +249,7 @@
         <w:spacing w:before="0" w:after="120"/>
       </w:pPr>
       <w:r>
-        <w:t>The evidence synthesis is not complete. Gate C screening reconciliation remains open after adjudication of the 40-record R1/R2 title/metadata pilot, exact-agreement screening of the 100-record Batch R1-B1 and Batch B4, and adjudication of the 100-record Batches B2 and B3: 637 canonical identities remain unresolved/non-final, while 83 records are provisional candidates awaiting full-text assessment. Gates D-J have not been completed. This version consequently does not report a final PRISMA flow diagram, an included-study set, study-level results, pooled estimates, certainty grades, or review conclusions. Such outputs require completion of screening, full-text assessment, extraction, appraisal, synthesis and final reporting audit.</w:t>
+        <w:t>The evidence synthesis is not complete. Gate C screening reconciliation remains open after adjudication of the 40-record R1/R2 title/metadata pilot, exact-agreement screening of the 100-record Batch R1-B1 and Batch B4, and adjudication of the 100-record Batches B2 and B3: 537 canonical identities remain unresolved/non-final, while 83 records are provisional candidates awaiting full-text assessment. Gates D-J have not been completed. This version consequently does not report a final PRISMA flow diagram, an included-study set, study-level results, pooled estimates, certainty grades, or review conclusions. Such outputs require completion of screening, full-text assessment, extraction, appraisal, synthesis and final reporting audit.</w:t>
       </w:r>
     </w:p>
     <w:p>
@@ -1803,7 +1803,7 @@
     </w:p>
     <w:p>
       <w:r>
-        <w:t>Dated 23 September 2026. This appendix supersedes no source record: it consolidates the current gate state for this submission-stage status report, including the Batch B4, Batch B5, Batch B6, Batch B7, Batch B8, Batch B9, Batch B10, Batch B11 and Batch B12 title/metadata updates. It does not report final study selection, a PRISMA flow, included-study results, extraction, risk-of-bias findings or synthesis.</w:t>
+        <w:t>Dated 23 September 2026. This appendix supersedes no source record: it consolidates the current gate state for this submission-stage status report, including the Batch B4, Batch B5, Batch B6, Batch B7, Batch B8, Batch B9, Batch B10, Batch B11, Batch B12 and Batch B13 title/metadata updates. It does not report final study selection, a PRISMA flow, included-study results, extraction, risk-of-bias findings or synthesis.</w:t>
       </w:r>
     </w:p>
     <w:p>
@@ -3942,7 +3942,7 @@
     </w:tbl>
     <w:p>
       <w:r>
-        <w:t>Next controlled action: independently screen and adjudicate the remaining 637 canonical identities at title/metadata, then assess the 191 provisional candidates and any additional title/metadata retains at full text. Do not begin extraction or risk-of-bias appraisal until full-text eligibility is fixed; do not claim a final PRISMA flow, included-study count, certainty finding or SWiM synthesis until the complete screening queue is reconciled.</w:t>
+        <w:t>Next controlled action: independently screen and adjudicate the remaining 537 canonical identities at title/metadata, then assess the 201 provisional candidates and any additional title/metadata retains at full text. Do not begin extraction or risk-of-bias appraisal until full-text eligibility is fixed; do not claim a final PRISMA flow, included-study count, certainty finding or SWiM synthesis until the complete screening queue is reconciled.</w:t>
       </w:r>
     </w:p>
     <w:p>
@@ -4060,6 +4060,19 @@
     <w:p>
       <w:r>
         <w:t>Batch B12 comprised CAN-1181-CAN-1280 (100 records). R1 retained 6 records and excluded 94; R2 retained 6 and excluded 94. The reviewers differed on 8 records. Applying the prespecified conservative rule, all disagreement records were retained for full-text assessment rather than being forced into exclusion. The final B12 disposition is therefore 10 provisional full-text candidates and 90 exclusions. These are provisional candidates, not final included studies; full-text eligibility remains outstanding.</w:t>
+      </w:r>
+    </w:p>
+    <w:p>
+      <w:pPr>
+        <w:pStyle w:val="Heading2"/>
+      </w:pPr>
+      <w:r>
+        <w:t>B13. Adjudicated Batch B13 title/metadata screening update</w:t>
+      </w:r>
+    </w:p>
+    <w:p>
+      <w:r>
+        <w:t>Batch B13 comprised CAN-1281-CAN-1380 (100 records). R1 retained 8 records and excluded 92; R2 retained 7 and excluded 93. The reviewers differed on 5 records. Applying the prespecified conservative rule, all disagreement records were retained for full-text assessment rather than being forced into exclusion. The final B13 disposition is therefore 10 provisional full-text candidates and 90 exclusions. These are provisional candidates, not final included studies; full-text eligibility remains outstanding.</w:t>
       </w:r>
     </w:p>
     <w:sectPr>

</xml_diff>

<commit_message>
Record adjudicated screening batch B14
</commit_message>
<xml_diff>
--- a/Avian_review_paper_submission_ready.docx
+++ b/Avian_review_paper_submission_ready.docx
@@ -32,7 +32,7 @@
         <w:spacing w:before="0" w:after="120"/>
       </w:pPr>
       <w:r>
-        <w:t>Background: Avian influenza viruses (AIVs) have caused recurrent poultry outbreaks and molecularly distinct detections in Nigeria since 2006. Objective: This submission-stage protocol prespecifies a systematic review of emergence, temporal and geographic distribution, host range, and molecular/clade/reassortment dynamics of Nigeria-specific AIVs. Methods: The protocol uses a CoCoPop/PEO framework and is aligned with PRISMA 2020, PRISMA-S and SWiM. The study/search window is 2006-2026; the operational status snapshot is 20 September 2026. Results status: 2,367 source rows had been reconciled into 1,877 provisional identities; 1,340 title/metadata records have been screened, yielding 1,139 clear exclusions and 201 provisional full-text candidates. Final screening, full-text assessment, extraction, risk-of-bias appraisal, synthesis and a PRISMA flow are not complete. Conclusion: This document is a protocol and search/record-management status report, not a completed systematic review.</w:t>
+        <w:t>Background: Avian influenza viruses (AIVs) have caused recurrent poultry outbreaks and molecularly distinct detections in Nigeria since 2006. Objective: This submission-stage protocol prespecifies a systematic review of emergence, temporal and geographic distribution, host range, and molecular/clade/reassortment dynamics of Nigeria-specific AIVs. Methods: The protocol uses a CoCoPop/PEO framework and is aligned with PRISMA 2020, PRISMA-S and SWiM. The study/search window is 2006-2026; the operational status snapshot is 20 September 2026. Results status: 2,367 source rows had been reconciled into 1,877 provisional identities; 1,440 title/metadata records have been screened, yielding 1,230 clear exclusions and 210 provisional full-text candidates. Final screening, full-text assessment, extraction, risk-of-bias appraisal, synthesis and a PRISMA flow are not complete. Conclusion: This document is a protocol and search/record-management status report, not a completed systematic review.</w:t>
       </w:r>
     </w:p>
     <w:p>
@@ -41,7 +41,7 @@
         <w:ind w:left="216" w:right="216"/>
       </w:pPr>
       <w:r>
-        <w:t>STATUS NOTE - 22 September 2026: Gate C remains open. The adjudicated R1/R2 title/metadata pilot of 40 records and Batch R1-B1 (the first 100 non-pilot canonical records by canonical_id order, CAN-0015 through CAN-0134 with pilot IDs omitted) produced 98 clear exclusions and 42 provisional full-text candidates. Batch R1-B1 had exact R1/R2 agreement (100/100) and no adjudication disagreements. Batch B2 retained 17 provisional full-text candidates and excluded 83 after eight R1/R2 disagreements were adjudicated. Batch B3 screened CAN-0241-CAN-0340 and retained 13 provisional full-text candidates while excluding 87. Batch B4 screened CAN-0381-CAN-0480: R1/R2 had exact agreement (100/100), with 0 clear Include-for-full-text decisions, 11 Unsure/retain-for-full-text decisions and 89 Exclude decisions; no disagreements occurred. All 11 uncertain records were retained conservatively for full-text review. Cumulatively, 1,340 title/metadata records have been screened, with 1,139 exclusions and 201 provisional full-text candidates; 537 canonical identities remain unresolved/non-final. Gates D-J are incomplete; full-text assessment, extraction, risk-of-bias assessment, certainty assessment, final PRISMA flow and SWiM synthesis remain pending.</w:t>
+        <w:t>STATUS NOTE - 22 September 2026: Gate C remains open. The adjudicated R1/R2 title/metadata pilot of 40 records and Batch R1-B1 (the first 100 non-pilot canonical records by canonical_id order, CAN-0015 through CAN-0134 with pilot IDs omitted) produced 98 clear exclusions and 42 provisional full-text candidates. Batch R1-B1 had exact R1/R2 agreement (100/100) and no adjudication disagreements. Batch B2 retained 17 provisional full-text candidates and excluded 83 after eight R1/R2 disagreements were adjudicated. Batch B3 screened CAN-0241-CAN-0340 and retained 13 provisional full-text candidates while excluding 87. Batch B4 screened CAN-0381-CAN-0480: R1/R2 had exact agreement (100/100), with 0 clear Include-for-full-text decisions, 11 Unsure/retain-for-full-text decisions and 89 Exclude decisions; no disagreements occurred. All 11 uncertain records were retained conservatively for full-text review. Cumulatively, 1,440 title/metadata records have been screened, with 1,230 exclusions and 210 provisional full-text candidates; 437 canonical identities remain unresolved/non-final. Gates D-J are incomplete; full-text assessment, extraction, risk-of-bias assessment, certainty assessment, final PRISMA flow and SWiM synthesis remain pending.</w:t>
       </w:r>
     </w:p>
     <w:p>
@@ -210,7 +210,7 @@
         <w:spacing w:before="0" w:after="120"/>
       </w:pPr>
       <w:r>
-        <w:t>Records were reconciled using symmetric DOI, PMID, or exact normalised title-plus-year matching. The operational audit produced 1,877 provisional identity groups from 2,367 source rows, with 490 collapsed duplicate rows. The controlled title/metadata-screening denominator is therefore 1,877. R1 and R2 independently screened and adjudicated a 40-record pilot (25 clear exclusions; 15 provisional full-text candidates) and independently screened Batch R1-B1, the first 100 non-pilot canonical records by canonical_id order (CAN-0015 through CAN-0134 with pilot IDs omitted). Batch R1-B1 had exact agreement (100/100), with 17 Include-for-full-text, 10 Unsure/retain-for-full-text and 73 Exclude decisions; no adjudication disagreements occurred. Batch B2 comprised the next 100 non-pilot canonical records after B1 (CAN-0135-CAN-0240, with pilot IDs omitted). The final B2 disposition was 17 retained for full text and 83 excluded after eight disagreements were adjudicated. Batch B3 comprised CAN-0241-CAN-0340; the final B3 disposition was 13 provisional full-text candidates and 87 exclusions. Batch B4 comprised CAN-0381-CAN-0480 (100 records). R1 and R2 had exact agreement (100/100): 0 clear Include-for-full-text, 11 Unsure/retain-for-full-text and 89 Exclude decisions, with no disagreements. All 11 uncertain records were retained conservatively for full-text review. Across the pilot, B1, B2, B3 and B4, 1,340 title/metadata records have been screened: 1,139 clear exclusions and 201 provisional full-text candidates. The remaining 1,437 canonical identities are unresolved/non-final. No final title/metadata decision, full-text eligibility decision or included-study count exists. The planned dual-review process applies Nigeria linkage, laboratory-confirmed avian AIV, at least one relevant evidence type, and extractable primary-data questions; an unsure record proceeds to full text rather than being assumed excluded.</w:t>
+        <w:t>Records were reconciled using symmetric DOI, PMID, or exact normalised title-plus-year matching. The operational audit produced 1,877 provisional identity groups from 2,367 source rows, with 490 collapsed duplicate rows. The controlled title/metadata-screening denominator is therefore 1,877. R1 and R2 independently screened and adjudicated a 40-record pilot (25 clear exclusions; 15 provisional full-text candidates) and independently screened Batch R1-B1, the first 100 non-pilot canonical records by canonical_id order (CAN-0015 through CAN-0134 with pilot IDs omitted). Batch R1-B1 had exact agreement (100/100), with 17 Include-for-full-text, 10 Unsure/retain-for-full-text and 73 Exclude decisions; no adjudication disagreements occurred. Batch B2 comprised the next 100 non-pilot canonical records after B1 (CAN-0135-CAN-0240, with pilot IDs omitted). The final B2 disposition was 17 retained for full text and 83 excluded after eight disagreements were adjudicated. Batch B3 comprised CAN-0241-CAN-0340; the final B3 disposition was 13 provisional full-text candidates and 87 exclusions. Batch B4 comprised CAN-0381-CAN-0480 (100 records). R1 and R2 had exact agreement (100/100): 0 clear Include-for-full-text, 11 Unsure/retain-for-full-text and 89 Exclude decisions, with no disagreements. All 11 uncertain records were retained conservatively for full-text review. Across the pilot, B1, B2, B3 and B4, 1,440 title/metadata records have been screened: 1,230 clear exclusions and 210 provisional full-text candidates. The remaining 1,437 canonical identities are unresolved/non-final. No final title/metadata decision, full-text eligibility decision or included-study count exists. The planned dual-review process applies Nigeria linkage, laboratory-confirmed avian AIV, at least one relevant evidence type, and extractable primary-data questions; an unsure record proceeds to full text rather than being assumed excluded.</w:t>
       </w:r>
     </w:p>
     <w:p>
@@ -249,7 +249,7 @@
         <w:spacing w:before="0" w:after="120"/>
       </w:pPr>
       <w:r>
-        <w:t>The evidence synthesis is not complete. Gate C screening reconciliation remains open after adjudication of the 40-record R1/R2 title/metadata pilot, exact-agreement screening of the 100-record Batch R1-B1 and Batch B4, and adjudication of the 100-record Batches B2 and B3: 537 canonical identities remain unresolved/non-final, while 83 records are provisional candidates awaiting full-text assessment. Gates D-J have not been completed. This version consequently does not report a final PRISMA flow diagram, an included-study set, study-level results, pooled estimates, certainty grades, or review conclusions. Such outputs require completion of screening, full-text assessment, extraction, appraisal, synthesis and final reporting audit.</w:t>
+        <w:t>The evidence synthesis is not complete. Gate C screening reconciliation remains open after adjudication of the 40-record R1/R2 title/metadata pilot, exact-agreement screening of the 100-record Batch R1-B1 and Batch B4, and adjudication of the 100-record Batches B2 and B3: 437 canonical identities remain unresolved/non-final, while 83 records are provisional candidates awaiting full-text assessment. Gates D-J have not been completed. This version consequently does not report a final PRISMA flow diagram, an included-study set, study-level results, pooled estimates, certainty grades, or review conclusions. Such outputs require completion of screening, full-text assessment, extraction, appraisal, synthesis and final reporting audit.</w:t>
       </w:r>
     </w:p>
     <w:p>
@@ -1803,7 +1803,7 @@
     </w:p>
     <w:p>
       <w:r>
-        <w:t>Dated 23 September 2026. This appendix supersedes no source record: it consolidates the current gate state for this submission-stage status report, including the Batch B4, Batch B5, Batch B6, Batch B7, Batch B8, Batch B9, Batch B10, Batch B11, Batch B12 and Batch B13 title/metadata updates. It does not report final study selection, a PRISMA flow, included-study results, extraction, risk-of-bias findings or synthesis.</w:t>
+        <w:t>Dated 23 September 2026. This appendix supersedes no source record: it consolidates the current gate state for this submission-stage status report, including the Batch B4, Batch B5, Batch B6, Batch B7, Batch B8, Batch B9, Batch B10, Batch B11, Batch B12, Batch B13 and Batch B14 title/metadata updates. It does not report final study selection, a PRISMA flow, included-study results, extraction, risk-of-bias findings or synthesis.</w:t>
       </w:r>
     </w:p>
     <w:p>
@@ -3942,7 +3942,7 @@
     </w:tbl>
     <w:p>
       <w:r>
-        <w:t>Next controlled action: independently screen and adjudicate the remaining 537 canonical identities at title/metadata, then assess the 201 provisional candidates and any additional title/metadata retains at full text. Do not begin extraction or risk-of-bias appraisal until full-text eligibility is fixed; do not claim a final PRISMA flow, included-study count, certainty finding or SWiM synthesis until the complete screening queue is reconciled.</w:t>
+        <w:t>Next controlled action: independently screen and adjudicate the remaining 437 canonical identities at title/metadata, then assess the 210 provisional candidates and any additional title/metadata retains at full text. Do not begin extraction or risk-of-bias appraisal until full-text eligibility is fixed; do not claim a final PRISMA flow, included-study count, certainty finding or SWiM synthesis until the complete screening queue is reconciled.</w:t>
       </w:r>
     </w:p>
     <w:p>
@@ -4073,6 +4073,19 @@
     <w:p>
       <w:r>
         <w:t>Batch B13 comprised CAN-1281-CAN-1380 (100 records). R1 retained 8 records and excluded 92; R2 retained 7 and excluded 93. The reviewers differed on 5 records. Applying the prespecified conservative rule, all disagreement records were retained for full-text assessment rather than being forced into exclusion. The final B13 disposition is therefore 10 provisional full-text candidates and 90 exclusions. These are provisional candidates, not final included studies; full-text eligibility remains outstanding.</w:t>
+      </w:r>
+    </w:p>
+    <w:p>
+      <w:pPr>
+        <w:pStyle w:val="Heading2"/>
+      </w:pPr>
+      <w:r>
+        <w:t>B14. Adjudicated Batch B14 title/metadata screening update</w:t>
+      </w:r>
+    </w:p>
+    <w:p>
+      <w:r>
+        <w:t>Batch B14 comprised CAN-1381-CAN-1480 (100 records). R1 and R2 had exact agreement: each retained 9 records and excluded 91. No disagreements occurred. The final B14 disposition is therefore 9 provisional full-text candidates and 91 exclusions. These are provisional candidates, not final included studies; full-text eligibility remains outstanding.</w:t>
       </w:r>
     </w:p>
     <w:sectPr>

</xml_diff>

<commit_message>
Record adjudicated screening batch B15
</commit_message>
<xml_diff>
--- a/Avian_review_paper_submission_ready.docx
+++ b/Avian_review_paper_submission_ready.docx
@@ -32,7 +32,7 @@
         <w:spacing w:before="0" w:after="120"/>
       </w:pPr>
       <w:r>
-        <w:t>Background: Avian influenza viruses (AIVs) have caused recurrent poultry outbreaks and molecularly distinct detections in Nigeria since 2006. Objective: This submission-stage protocol prespecifies a systematic review of emergence, temporal and geographic distribution, host range, and molecular/clade/reassortment dynamics of Nigeria-specific AIVs. Methods: The protocol uses a CoCoPop/PEO framework and is aligned with PRISMA 2020, PRISMA-S and SWiM. The study/search window is 2006-2026; the operational status snapshot is 20 September 2026. Results status: 2,367 source rows had been reconciled into 1,877 provisional identities; 1,440 title/metadata records have been screened, yielding 1,230 clear exclusions and 210 provisional full-text candidates. Final screening, full-text assessment, extraction, risk-of-bias appraisal, synthesis and a PRISMA flow are not complete. Conclusion: This document is a protocol and search/record-management status report, not a completed systematic review.</w:t>
+        <w:t>Background: Avian influenza viruses (AIVs) have caused recurrent poultry outbreaks and molecularly distinct detections in Nigeria since 2006. Objective: This submission-stage protocol prespecifies a systematic review of emergence, temporal and geographic distribution, host range, and molecular/clade/reassortment dynamics of Nigeria-specific AIVs. Methods: The protocol uses a CoCoPop/PEO framework and is aligned with PRISMA 2020, PRISMA-S and SWiM. The study/search window is 2006-2026; the operational status snapshot is 20 September 2026. Results status: 2,367 source rows had been reconciled into 1,877 provisional identities; 1,540 title/metadata records have been screened, yielding 1,321 clear exclusions and 219 provisional full-text candidates. Final screening, full-text assessment, extraction, risk-of-bias appraisal, synthesis and a PRISMA flow are not complete. Conclusion: This document is a protocol and search/record-management status report, not a completed systematic review.</w:t>
       </w:r>
     </w:p>
     <w:p>
@@ -41,7 +41,7 @@
         <w:ind w:left="216" w:right="216"/>
       </w:pPr>
       <w:r>
-        <w:t>STATUS NOTE - 22 September 2026: Gate C remains open. The adjudicated R1/R2 title/metadata pilot of 40 records and Batch R1-B1 (the first 100 non-pilot canonical records by canonical_id order, CAN-0015 through CAN-0134 with pilot IDs omitted) produced 98 clear exclusions and 42 provisional full-text candidates. Batch R1-B1 had exact R1/R2 agreement (100/100) and no adjudication disagreements. Batch B2 retained 17 provisional full-text candidates and excluded 83 after eight R1/R2 disagreements were adjudicated. Batch B3 screened CAN-0241-CAN-0340 and retained 13 provisional full-text candidates while excluding 87. Batch B4 screened CAN-0381-CAN-0480: R1/R2 had exact agreement (100/100), with 0 clear Include-for-full-text decisions, 11 Unsure/retain-for-full-text decisions and 89 Exclude decisions; no disagreements occurred. All 11 uncertain records were retained conservatively for full-text review. Cumulatively, 1,440 title/metadata records have been screened, with 1,230 exclusions and 210 provisional full-text candidates; 437 canonical identities remain unresolved/non-final. Gates D-J are incomplete; full-text assessment, extraction, risk-of-bias assessment, certainty assessment, final PRISMA flow and SWiM synthesis remain pending.</w:t>
+        <w:t>STATUS NOTE - 22 September 2026: Gate C remains open. The adjudicated R1/R2 title/metadata pilot of 40 records and Batch R1-B1 (the first 100 non-pilot canonical records by canonical_id order, CAN-0015 through CAN-0134 with pilot IDs omitted) produced 98 clear exclusions and 42 provisional full-text candidates. Batch R1-B1 had exact R1/R2 agreement (100/100) and no adjudication disagreements. Batch B2 retained 17 provisional full-text candidates and excluded 83 after eight R1/R2 disagreements were adjudicated. Batch B3 screened CAN-0241-CAN-0340 and retained 13 provisional full-text candidates while excluding 87. Batch B4 screened CAN-0381-CAN-0480: R1/R2 had exact agreement (100/100), with 0 clear Include-for-full-text decisions, 11 Unsure/retain-for-full-text decisions and 89 Exclude decisions; no disagreements occurred. All 11 uncertain records were retained conservatively for full-text review. Cumulatively, 1,540 title/metadata records have been screened, with 1,321 exclusions and 219 provisional full-text candidates; 337 canonical identities remain unresolved/non-final. Gates D-J are incomplete; full-text assessment, extraction, risk-of-bias assessment, certainty assessment, final PRISMA flow and SWiM synthesis remain pending.</w:t>
       </w:r>
     </w:p>
     <w:p>
@@ -210,7 +210,7 @@
         <w:spacing w:before="0" w:after="120"/>
       </w:pPr>
       <w:r>
-        <w:t>Records were reconciled using symmetric DOI, PMID, or exact normalised title-plus-year matching. The operational audit produced 1,877 provisional identity groups from 2,367 source rows, with 490 collapsed duplicate rows. The controlled title/metadata-screening denominator is therefore 1,877. R1 and R2 independently screened and adjudicated a 40-record pilot (25 clear exclusions; 15 provisional full-text candidates) and independently screened Batch R1-B1, the first 100 non-pilot canonical records by canonical_id order (CAN-0015 through CAN-0134 with pilot IDs omitted). Batch R1-B1 had exact agreement (100/100), with 17 Include-for-full-text, 10 Unsure/retain-for-full-text and 73 Exclude decisions; no adjudication disagreements occurred. Batch B2 comprised the next 100 non-pilot canonical records after B1 (CAN-0135-CAN-0240, with pilot IDs omitted). The final B2 disposition was 17 retained for full text and 83 excluded after eight disagreements were adjudicated. Batch B3 comprised CAN-0241-CAN-0340; the final B3 disposition was 13 provisional full-text candidates and 87 exclusions. Batch B4 comprised CAN-0381-CAN-0480 (100 records). R1 and R2 had exact agreement (100/100): 0 clear Include-for-full-text, 11 Unsure/retain-for-full-text and 89 Exclude decisions, with no disagreements. All 11 uncertain records were retained conservatively for full-text review. Across the pilot, B1, B2, B3 and B4, 1,440 title/metadata records have been screened: 1,230 clear exclusions and 210 provisional full-text candidates. The remaining 1,437 canonical identities are unresolved/non-final. No final title/metadata decision, full-text eligibility decision or included-study count exists. The planned dual-review process applies Nigeria linkage, laboratory-confirmed avian AIV, at least one relevant evidence type, and extractable primary-data questions; an unsure record proceeds to full text rather than being assumed excluded.</w:t>
+        <w:t>Records were reconciled using symmetric DOI, PMID, or exact normalised title-plus-year matching. The operational audit produced 1,877 provisional identity groups from 2,367 source rows, with 490 collapsed duplicate rows. The controlled title/metadata-screening denominator is therefore 1,877. R1 and R2 independently screened and adjudicated a 40-record pilot (25 clear exclusions; 15 provisional full-text candidates) and independently screened Batch R1-B1, the first 100 non-pilot canonical records by canonical_id order (CAN-0015 through CAN-0134 with pilot IDs omitted). Batch R1-B1 had exact agreement (100/100), with 17 Include-for-full-text, 10 Unsure/retain-for-full-text and 73 Exclude decisions; no adjudication disagreements occurred. Batch B2 comprised the next 100 non-pilot canonical records after B1 (CAN-0135-CAN-0240, with pilot IDs omitted). The final B2 disposition was 17 retained for full text and 83 excluded after eight disagreements were adjudicated. Batch B3 comprised CAN-0241-CAN-0340; the final B3 disposition was 13 provisional full-text candidates and 87 exclusions. Batch B4 comprised CAN-0381-CAN-0480 (100 records). R1 and R2 had exact agreement (100/100): 0 clear Include-for-full-text, 11 Unsure/retain-for-full-text and 89 Exclude decisions, with no disagreements. All 11 uncertain records were retained conservatively for full-text review. Across the pilot, B1, B2, B3 and B4, 1,540 title/metadata records have been screened: 1,321 clear exclusions and 219 provisional full-text candidates. The remaining 1,437 canonical identities are unresolved/non-final. No final title/metadata decision, full-text eligibility decision or included-study count exists. The planned dual-review process applies Nigeria linkage, laboratory-confirmed avian AIV, at least one relevant evidence type, and extractable primary-data questions; an unsure record proceeds to full text rather than being assumed excluded.</w:t>
       </w:r>
     </w:p>
     <w:p>
@@ -249,7 +249,7 @@
         <w:spacing w:before="0" w:after="120"/>
       </w:pPr>
       <w:r>
-        <w:t>The evidence synthesis is not complete. Gate C screening reconciliation remains open after adjudication of the 40-record R1/R2 title/metadata pilot, exact-agreement screening of the 100-record Batch R1-B1 and Batch B4, and adjudication of the 100-record Batches B2 and B3: 437 canonical identities remain unresolved/non-final, while 83 records are provisional candidates awaiting full-text assessment. Gates D-J have not been completed. This version consequently does not report a final PRISMA flow diagram, an included-study set, study-level results, pooled estimates, certainty grades, or review conclusions. Such outputs require completion of screening, full-text assessment, extraction, appraisal, synthesis and final reporting audit.</w:t>
+        <w:t>The evidence synthesis is not complete. Gate C screening reconciliation remains open after adjudication of the 40-record R1/R2 title/metadata pilot, exact-agreement screening of the 100-record Batch R1-B1 and Batch B4, and adjudication of the 100-record Batches B2 and B3: 337 canonical identities remain unresolved/non-final, while 83 records are provisional candidates awaiting full-text assessment. Gates D-J have not been completed. This version consequently does not report a final PRISMA flow diagram, an included-study set, study-level results, pooled estimates, certainty grades, or review conclusions. Such outputs require completion of screening, full-text assessment, extraction, appraisal, synthesis and final reporting audit.</w:t>
       </w:r>
     </w:p>
     <w:p>
@@ -1803,7 +1803,7 @@
     </w:p>
     <w:p>
       <w:r>
-        <w:t>Dated 23 September 2026. This appendix supersedes no source record: it consolidates the current gate state for this submission-stage status report, including the Batch B4, Batch B5, Batch B6, Batch B7, Batch B8, Batch B9, Batch B10, Batch B11, Batch B12, Batch B13 and Batch B14 title/metadata updates. It does not report final study selection, a PRISMA flow, included-study results, extraction, risk-of-bias findings or synthesis.</w:t>
+        <w:t>Dated 23 September 2026. This appendix supersedes no source record: it consolidates the current gate state for this submission-stage status report, including the Batch B4, Batch B5, Batch B6, Batch B7, Batch B8, Batch B9, Batch B10, Batch B11, Batch B12, Batch B13, Batch B14 and Batch B15 title/metadata updates. It does not report final study selection, a PRISMA flow, included-study results, extraction, risk-of-bias findings or synthesis.</w:t>
       </w:r>
     </w:p>
     <w:p>
@@ -3942,7 +3942,7 @@
     </w:tbl>
     <w:p>
       <w:r>
-        <w:t>Next controlled action: independently screen and adjudicate the remaining 437 canonical identities at title/metadata, then assess the 210 provisional candidates and any additional title/metadata retains at full text. Do not begin extraction or risk-of-bias appraisal until full-text eligibility is fixed; do not claim a final PRISMA flow, included-study count, certainty finding or SWiM synthesis until the complete screening queue is reconciled.</w:t>
+        <w:t>Next controlled action: independently screen and adjudicate the remaining 337 canonical identities at title/metadata, then assess the 219 provisional candidates and any additional title/metadata retains at full text. Do not begin extraction or risk-of-bias appraisal until full-text eligibility is fixed; do not claim a final PRISMA flow, included-study count, certainty finding or SWiM synthesis until the complete screening queue is reconciled.</w:t>
       </w:r>
     </w:p>
     <w:p>
@@ -4086,6 +4086,19 @@
     <w:p>
       <w:r>
         <w:t>Batch B14 comprised CAN-1381-CAN-1480 (100 records). R1 and R2 had exact agreement: each retained 9 records and excluded 91. No disagreements occurred. The final B14 disposition is therefore 9 provisional full-text candidates and 91 exclusions. These are provisional candidates, not final included studies; full-text eligibility remains outstanding.</w:t>
+      </w:r>
+    </w:p>
+    <w:p>
+      <w:pPr>
+        <w:pStyle w:val="Heading2"/>
+      </w:pPr>
+      <w:r>
+        <w:t>B15. Adjudicated Batch B15 title/metadata screening update</w:t>
+      </w:r>
+    </w:p>
+    <w:p>
+      <w:r>
+        <w:t>Batch B15 comprised CAN-1481-CAN-1580 (100 records). R1 retained 5 records and excluded 95; R2 retained 8 and excluded 92. The reviewers differed on 6 records. Applying the prespecified conservative rule, all disagreement records were retained for full-text assessment rather than being forced into exclusion. The final B15 disposition is therefore 9 provisional full-text candidates and 91 exclusions. These are provisional candidates, not final included studies; full-text eligibility remains outstanding.</w:t>
       </w:r>
     </w:p>
     <w:sectPr>

</xml_diff>

<commit_message>
Record adjudicated screening batch B16
</commit_message>
<xml_diff>
--- a/Avian_review_paper_submission_ready.docx
+++ b/Avian_review_paper_submission_ready.docx
@@ -32,7 +32,7 @@
         <w:spacing w:before="0" w:after="120"/>
       </w:pPr>
       <w:r>
-        <w:t>Background: Avian influenza viruses (AIVs) have caused recurrent poultry outbreaks and molecularly distinct detections in Nigeria since 2006. Objective: This submission-stage protocol prespecifies a systematic review of emergence, temporal and geographic distribution, host range, and molecular/clade/reassortment dynamics of Nigeria-specific AIVs. Methods: The protocol uses a CoCoPop/PEO framework and is aligned with PRISMA 2020, PRISMA-S and SWiM. The study/search window is 2006-2026; the operational status snapshot is 20 September 2026. Results status: 2,367 source rows had been reconciled into 1,877 provisional identities; 1,540 title/metadata records have been screened, yielding 1,321 clear exclusions and 219 provisional full-text candidates. Final screening, full-text assessment, extraction, risk-of-bias appraisal, synthesis and a PRISMA flow are not complete. Conclusion: This document is a protocol and search/record-management status report, not a completed systematic review.</w:t>
+        <w:t>Background: Avian influenza viruses (AIVs) have caused recurrent poultry outbreaks and molecularly distinct detections in Nigeria since 2006. Objective: This submission-stage protocol prespecifies a systematic review of emergence, temporal and geographic distribution, host range, and molecular/clade/reassortment dynamics of Nigeria-specific AIVs. Methods: The protocol uses a CoCoPop/PEO framework and is aligned with PRISMA 2020, PRISMA-S and SWiM. The study/search window is 2006-2026; the operational status snapshot is 20 September 2026. Results status: 2,367 source rows had been reconciled into 1,877 provisional identities; 1,640 title/metadata records have been screened, yielding 1,403 clear exclusions and 237 provisional full-text candidates. Final screening, full-text assessment, extraction, risk-of-bias appraisal, synthesis and a PRISMA flow are not complete. Conclusion: This document is a protocol and search/record-management status report, not a completed systematic review.</w:t>
       </w:r>
     </w:p>
     <w:p>
@@ -41,7 +41,7 @@
         <w:ind w:left="216" w:right="216"/>
       </w:pPr>
       <w:r>
-        <w:t>STATUS NOTE - 22 September 2026: Gate C remains open. The adjudicated R1/R2 title/metadata pilot of 40 records and Batch R1-B1 (the first 100 non-pilot canonical records by canonical_id order, CAN-0015 through CAN-0134 with pilot IDs omitted) produced 98 clear exclusions and 42 provisional full-text candidates. Batch R1-B1 had exact R1/R2 agreement (100/100) and no adjudication disagreements. Batch B2 retained 17 provisional full-text candidates and excluded 83 after eight R1/R2 disagreements were adjudicated. Batch B3 screened CAN-0241-CAN-0340 and retained 13 provisional full-text candidates while excluding 87. Batch B4 screened CAN-0381-CAN-0480: R1/R2 had exact agreement (100/100), with 0 clear Include-for-full-text decisions, 11 Unsure/retain-for-full-text decisions and 89 Exclude decisions; no disagreements occurred. All 11 uncertain records were retained conservatively for full-text review. Cumulatively, 1,540 title/metadata records have been screened, with 1,321 exclusions and 219 provisional full-text candidates; 337 canonical identities remain unresolved/non-final. Gates D-J are incomplete; full-text assessment, extraction, risk-of-bias assessment, certainty assessment, final PRISMA flow and SWiM synthesis remain pending.</w:t>
+        <w:t>STATUS NOTE - 22 September 2026: Gate C remains open. The adjudicated R1/R2 title/metadata pilot of 40 records and Batch R1-B1 (the first 100 non-pilot canonical records by canonical_id order, CAN-0015 through CAN-0134 with pilot IDs omitted) produced 98 clear exclusions and 42 provisional full-text candidates. Batch R1-B1 had exact R1/R2 agreement (100/100) and no adjudication disagreements. Batch B2 retained 17 provisional full-text candidates and excluded 83 after eight R1/R2 disagreements were adjudicated. Batch B3 screened CAN-0241-CAN-0340 and retained 13 provisional full-text candidates while excluding 87. Batch B4 screened CAN-0381-CAN-0480: R1/R2 had exact agreement (100/100), with 0 clear Include-for-full-text decisions, 11 Unsure/retain-for-full-text decisions and 89 Exclude decisions; no disagreements occurred. All 11 uncertain records were retained conservatively for full-text review. Cumulatively, 1,640 title/metadata records have been screened, with 1,403 exclusions and 237 provisional full-text candidates; 337 canonical identities remain unresolved/non-final. Gates D-J are incomplete; full-text assessment, extraction, risk-of-bias assessment, certainty assessment, final PRISMA flow and SWiM synthesis remain pending.</w:t>
       </w:r>
     </w:p>
     <w:p>
@@ -210,7 +210,7 @@
         <w:spacing w:before="0" w:after="120"/>
       </w:pPr>
       <w:r>
-        <w:t>Records were reconciled using symmetric DOI, PMID, or exact normalised title-plus-year matching. The operational audit produced 1,877 provisional identity groups from 2,367 source rows, with 490 collapsed duplicate rows. The controlled title/metadata-screening denominator is therefore 1,877. R1 and R2 independently screened and adjudicated a 40-record pilot (25 clear exclusions; 15 provisional full-text candidates) and independently screened Batch R1-B1, the first 100 non-pilot canonical records by canonical_id order (CAN-0015 through CAN-0134 with pilot IDs omitted). Batch R1-B1 had exact agreement (100/100), with 17 Include-for-full-text, 10 Unsure/retain-for-full-text and 73 Exclude decisions; no adjudication disagreements occurred. Batch B2 comprised the next 100 non-pilot canonical records after B1 (CAN-0135-CAN-0240, with pilot IDs omitted). The final B2 disposition was 17 retained for full text and 83 excluded after eight disagreements were adjudicated. Batch B3 comprised CAN-0241-CAN-0340; the final B3 disposition was 13 provisional full-text candidates and 87 exclusions. Batch B4 comprised CAN-0381-CAN-0480 (100 records). R1 and R2 had exact agreement (100/100): 0 clear Include-for-full-text, 11 Unsure/retain-for-full-text and 89 Exclude decisions, with no disagreements. All 11 uncertain records were retained conservatively for full-text review. Across the pilot, B1, B2, B3 and B4, 1,540 title/metadata records have been screened: 1,321 clear exclusions and 219 provisional full-text candidates. The remaining 1,437 canonical identities are unresolved/non-final. No final title/metadata decision, full-text eligibility decision or included-study count exists. The planned dual-review process applies Nigeria linkage, laboratory-confirmed avian AIV, at least one relevant evidence type, and extractable primary-data questions; an unsure record proceeds to full text rather than being assumed excluded.</w:t>
+        <w:t>Records were reconciled using symmetric DOI, PMID, or exact normalised title-plus-year matching. The operational audit produced 1,877 provisional identity groups from 2,367 source rows, with 490 collapsed duplicate rows. The controlled title/metadata-screening denominator is therefore 1,877. R1 and R2 independently screened and adjudicated a 40-record pilot (25 clear exclusions; 15 provisional full-text candidates) and independently screened Batch R1-B1, the first 100 non-pilot canonical records by canonical_id order (CAN-0015 through CAN-0134 with pilot IDs omitted). Batch R1-B1 had exact agreement (100/100), with 17 Include-for-full-text, 10 Unsure/retain-for-full-text and 73 Exclude decisions; no adjudication disagreements occurred. Batch B2 comprised the next 100 non-pilot canonical records after B1 (CAN-0135-CAN-0240, with pilot IDs omitted). The final B2 disposition was 17 retained for full text and 83 excluded after eight disagreements were adjudicated. Batch B3 comprised CAN-0241-CAN-0340; the final B3 disposition was 13 provisional full-text candidates and 87 exclusions. Batch B4 comprised CAN-0381-CAN-0480 (100 records). R1 and R2 had exact agreement (100/100): 0 clear Include-for-full-text, 11 Unsure/retain-for-full-text and 89 Exclude decisions, with no disagreements. All 11 uncertain records were retained conservatively for full-text review. Across the pilot, B1, B2, B3 and B4, 1,640 title/metadata records have been screened: 1,403 clear exclusions and 237 provisional full-text candidates. The remaining 1,437 canonical identities are unresolved/non-final. No final title/metadata decision, full-text eligibility decision or included-study count exists. The planned dual-review process applies Nigeria linkage, laboratory-confirmed avian AIV, at least one relevant evidence type, and extractable primary-data questions; an unsure record proceeds to full text rather than being assumed excluded.</w:t>
       </w:r>
     </w:p>
     <w:p>
@@ -1803,7 +1803,7 @@
     </w:p>
     <w:p>
       <w:r>
-        <w:t>Dated 23 September 2026. This appendix supersedes no source record: it consolidates the current gate state for this submission-stage status report, including the Batch B4, Batch B5, Batch B6, Batch B7, Batch B8, Batch B9, Batch B10, Batch B11, Batch B12, Batch B13, Batch B14 and Batch B15 title/metadata updates. It does not report final study selection, a PRISMA flow, included-study results, extraction, risk-of-bias findings or synthesis.</w:t>
+        <w:t>Dated 23 September 2026. This appendix supersedes no source record: it consolidates the current gate state for this submission-stage status report, including the Batch B4, Batch B5, Batch B6, Batch B7, Batch B8, Batch B9, Batch B10, Batch B11, Batch B12, Batch B13, Batch B14, Batch B15 and Batch B16 title/metadata updates. It does not report final study selection, a PRISMA flow, included-study results, extraction, risk-of-bias findings or synthesis.</w:t>
       </w:r>
     </w:p>
     <w:p>
@@ -4099,6 +4099,19 @@
     <w:p>
       <w:r>
         <w:t>Batch B15 comprised CAN-1481-CAN-1580 (100 records). R1 retained 5 records and excluded 95; R2 retained 8 and excluded 92. The reviewers differed on 6 records. Applying the prespecified conservative rule, all disagreement records were retained for full-text assessment rather than being forced into exclusion. The final B15 disposition is therefore 9 provisional full-text candidates and 91 exclusions. These are provisional candidates, not final included studies; full-text eligibility remains outstanding.</w:t>
+      </w:r>
+    </w:p>
+    <w:p>
+      <w:pPr>
+        <w:pStyle w:val="Heading2"/>
+      </w:pPr>
+      <w:r>
+        <w:t>B16. Adjudicated Batch B16 title/metadata screening update</w:t>
+      </w:r>
+    </w:p>
+    <w:p>
+      <w:r>
+        <w:t>Batch B16 comprised CAN-1581–CAN-1680 (100 records). R1 retained 16 records and excluded 84; R2 retained 15 and excluded 85. The reviewers differed on 5 records. Applying the prespecified conservative rule, all disagreement records were retained for full-text assessment rather than being forced into exclusion. The final B16 disposition is therefore 18 provisional full-text candidates and 82 exclusions. These are provisional candidates, not final included studies; full-text eligibility remains outstanding.</w:t>
       </w:r>
     </w:p>
     <w:sectPr>

</xml_diff>

<commit_message>
Record adjudicated screening batch B17
</commit_message>
<xml_diff>
--- a/Avian_review_paper_submission_ready.docx
+++ b/Avian_review_paper_submission_ready.docx
@@ -32,7 +32,7 @@
         <w:spacing w:before="0" w:after="120"/>
       </w:pPr>
       <w:r>
-        <w:t>Background: Avian influenza viruses (AIVs) have caused recurrent poultry outbreaks and molecularly distinct detections in Nigeria since 2006. Objective: This submission-stage protocol prespecifies a systematic review of emergence, temporal and geographic distribution, host range, and molecular/clade/reassortment dynamics of Nigeria-specific AIVs. Methods: The protocol uses a CoCoPop/PEO framework and is aligned with PRISMA 2020, PRISMA-S and SWiM. The study/search window is 2006-2026; the operational status snapshot is 20 September 2026. Results status: 2,367 source rows had been reconciled into 1,877 provisional identities; 1,640 title/metadata records have been screened, yielding 1,403 clear exclusions and 237 provisional full-text candidates. Final screening, full-text assessment, extraction, risk-of-bias appraisal, synthesis and a PRISMA flow are not complete. Conclusion: This document is a protocol and search/record-management status report, not a completed systematic review.</w:t>
+        <w:t>Background: Avian influenza viruses (AIVs) have caused recurrent poultry outbreaks and molecularly distinct detections in Nigeria since 2006. Objective: This submission-stage protocol prespecifies a systematic review of emergence, temporal and geographic distribution, host range, and molecular/clade/reassortment dynamics of Nigeria-specific AIVs. Methods: The protocol uses a CoCoPop/PEO framework and is aligned with PRISMA 2020, PRISMA-S and SWiM. The study/search window is 2006-2026; the operational status snapshot is 20 September 2026. Results status: 2,367 source rows had been reconciled into 1,877 provisional identities; 1,740 title/metadata records have been screened, yielding 1,468 clear exclusions and 272 provisional full-text candidates. Final screening, full-text assessment, extraction, risk-of-bias appraisal, synthesis and a PRISMA flow are not complete. Conclusion: This document is a protocol and search/record-management status report, not a completed systematic review.</w:t>
       </w:r>
     </w:p>
     <w:p>
@@ -41,7 +41,7 @@
         <w:ind w:left="216" w:right="216"/>
       </w:pPr>
       <w:r>
-        <w:t>STATUS NOTE - 22 September 2026: Gate C remains open. The adjudicated R1/R2 title/metadata pilot of 40 records and Batch R1-B1 (the first 100 non-pilot canonical records by canonical_id order, CAN-0015 through CAN-0134 with pilot IDs omitted) produced 98 clear exclusions and 42 provisional full-text candidates. Batch R1-B1 had exact R1/R2 agreement (100/100) and no adjudication disagreements. Batch B2 retained 17 provisional full-text candidates and excluded 83 after eight R1/R2 disagreements were adjudicated. Batch B3 screened CAN-0241-CAN-0340 and retained 13 provisional full-text candidates while excluding 87. Batch B4 screened CAN-0381-CAN-0480: R1/R2 had exact agreement (100/100), with 0 clear Include-for-full-text decisions, 11 Unsure/retain-for-full-text decisions and 89 Exclude decisions; no disagreements occurred. All 11 uncertain records were retained conservatively for full-text review. Cumulatively, 1,640 title/metadata records have been screened, with 1,403 exclusions and 237 provisional full-text candidates; 337 canonical identities remain unresolved/non-final. Gates D-J are incomplete; full-text assessment, extraction, risk-of-bias assessment, certainty assessment, final PRISMA flow and SWiM synthesis remain pending.</w:t>
+        <w:t>STATUS NOTE - 22 September 2026: Gate C remains open. The adjudicated R1/R2 title/metadata pilot of 40 records and Batch R1-B1 (the first 100 non-pilot canonical records by canonical_id order, CAN-0015 through CAN-0134 with pilot IDs omitted) produced 98 clear exclusions and 42 provisional full-text candidates. Batch R1-B1 had exact R1/R2 agreement (100/100) and no adjudication disagreements. Batch B2 retained 17 provisional full-text candidates and excluded 83 after eight R1/R2 disagreements were adjudicated. Batch B3 screened CAN-0241-CAN-0340 and retained 13 provisional full-text candidates while excluding 87. Batch B4 screened CAN-0381-CAN-0480: R1/R2 had exact agreement (100/100), with 0 clear Include-for-full-text decisions, 11 Unsure/retain-for-full-text decisions and 89 Exclude decisions; no disagreements occurred. All 11 uncertain records were retained conservatively for full-text review. Cumulatively, 1,740 title/metadata records have been screened, with 1,468 exclusions and 272 provisional full-text candidates; 337 canonical identities remain unresolved/non-final. Gates D-J are incomplete; full-text assessment, extraction, risk-of-bias assessment, certainty assessment, final PRISMA flow and SWiM synthesis remain pending.</w:t>
       </w:r>
     </w:p>
     <w:p>
@@ -210,7 +210,7 @@
         <w:spacing w:before="0" w:after="120"/>
       </w:pPr>
       <w:r>
-        <w:t>Records were reconciled using symmetric DOI, PMID, or exact normalised title-plus-year matching. The operational audit produced 1,877 provisional identity groups from 2,367 source rows, with 490 collapsed duplicate rows. The controlled title/metadata-screening denominator is therefore 1,877. R1 and R2 independently screened and adjudicated a 40-record pilot (25 clear exclusions; 15 provisional full-text candidates) and independently screened Batch R1-B1, the first 100 non-pilot canonical records by canonical_id order (CAN-0015 through CAN-0134 with pilot IDs omitted). Batch R1-B1 had exact agreement (100/100), with 17 Include-for-full-text, 10 Unsure/retain-for-full-text and 73 Exclude decisions; no adjudication disagreements occurred. Batch B2 comprised the next 100 non-pilot canonical records after B1 (CAN-0135-CAN-0240, with pilot IDs omitted). The final B2 disposition was 17 retained for full text and 83 excluded after eight disagreements were adjudicated. Batch B3 comprised CAN-0241-CAN-0340; the final B3 disposition was 13 provisional full-text candidates and 87 exclusions. Batch B4 comprised CAN-0381-CAN-0480 (100 records). R1 and R2 had exact agreement (100/100): 0 clear Include-for-full-text, 11 Unsure/retain-for-full-text and 89 Exclude decisions, with no disagreements. All 11 uncertain records were retained conservatively for full-text review. Across the pilot, B1, B2, B3 and B4, 1,640 title/metadata records have been screened: 1,403 clear exclusions and 237 provisional full-text candidates. The remaining 1,437 canonical identities are unresolved/non-final. No final title/metadata decision, full-text eligibility decision or included-study count exists. The planned dual-review process applies Nigeria linkage, laboratory-confirmed avian AIV, at least one relevant evidence type, and extractable primary-data questions; an unsure record proceeds to full text rather than being assumed excluded.</w:t>
+        <w:t>Records were reconciled using symmetric DOI, PMID, or exact normalised title-plus-year matching. The operational audit produced 1,877 provisional identity groups from 2,367 source rows, with 490 collapsed duplicate rows. The controlled title/metadata-screening denominator is therefore 1,877. R1 and R2 independently screened and adjudicated a 40-record pilot (25 clear exclusions; 15 provisional full-text candidates) and independently screened Batch R1-B1, the first 100 non-pilot canonical records by canonical_id order (CAN-0015 through CAN-0134 with pilot IDs omitted). Batch R1-B1 had exact agreement (100/100), with 17 Include-for-full-text, 10 Unsure/retain-for-full-text and 73 Exclude decisions; no adjudication disagreements occurred. Batch B2 comprised the next 100 non-pilot canonical records after B1 (CAN-0135-CAN-0240, with pilot IDs omitted). The final B2 disposition was 17 retained for full text and 83 excluded after eight disagreements were adjudicated. Batch B3 comprised CAN-0241-CAN-0340; the final B3 disposition was 13 provisional full-text candidates and 87 exclusions. Batch B4 comprised CAN-0381-CAN-0480 (100 records). R1 and R2 had exact agreement (100/100): 0 clear Include-for-full-text, 11 Unsure/retain-for-full-text and 89 Exclude decisions, with no disagreements. All 11 uncertain records were retained conservatively for full-text review. Across the pilot, B1, B2, B3 and B4, 1,740 title/metadata records have been screened: 1,468 clear exclusions and 272 provisional full-text candidates. The remaining 1,437 canonical identities are unresolved/non-final. No final title/metadata decision, full-text eligibility decision or included-study count exists. The planned dual-review process applies Nigeria linkage, laboratory-confirmed avian AIV, at least one relevant evidence type, and extractable primary-data questions; an unsure record proceeds to full text rather than being assumed excluded.</w:t>
       </w:r>
     </w:p>
     <w:p>
@@ -1803,7 +1803,7 @@
     </w:p>
     <w:p>
       <w:r>
-        <w:t>Dated 23 September 2026. This appendix supersedes no source record: it consolidates the current gate state for this submission-stage status report, including the Batch B4, Batch B5, Batch B6, Batch B7, Batch B8, Batch B9, Batch B10, Batch B11, Batch B12, Batch B13, Batch B14, Batch B15 and Batch B16 title/metadata updates. It does not report final study selection, a PRISMA flow, included-study results, extraction, risk-of-bias findings or synthesis.</w:t>
+        <w:t>Dated 23 September 2026. This appendix supersedes no source record: it consolidates the current gate state for this submission-stage status report, including the Batch B4, Batch B5, Batch B6, Batch B7, Batch B8, Batch B9, Batch B10, Batch B11, Batch B12, Batch B13, Batch B14, Batch B15, Batch B16 and Batch B17 title/metadata updates. It does not report final study selection, a PRISMA flow, included-study results, extraction, risk-of-bias findings or synthesis.</w:t>
       </w:r>
     </w:p>
     <w:p>
@@ -4112,6 +4112,19 @@
     <w:p>
       <w:r>
         <w:t>Batch B16 comprised CAN-1581–CAN-1680 (100 records). R1 retained 16 records and excluded 84; R2 retained 15 and excluded 85. The reviewers differed on 5 records. Applying the prespecified conservative rule, all disagreement records were retained for full-text assessment rather than being forced into exclusion. The final B16 disposition is therefore 18 provisional full-text candidates and 82 exclusions. These are provisional candidates, not final included studies; full-text eligibility remains outstanding.</w:t>
+      </w:r>
+    </w:p>
+    <w:p>
+      <w:pPr>
+        <w:pStyle w:val="Heading2"/>
+      </w:pPr>
+      <w:r>
+        <w:t>B17. Adjudicated Batch B17 title/metadata screening update</w:t>
+      </w:r>
+    </w:p>
+    <w:p>
+      <w:r>
+        <w:t>Batch B17 comprised CAN-1681–CAN-1780 (100 records). R1 retained 35 records and excluded 65; R2 retained 23 and excluded 77. All 23 R2 retains were also retained by R1; the reviewers differed on 12 records. Applying the prespecified conservative rule, those 12 R1-only records remained in the full-text queue. The final B17 disposition is therefore 35 provisional full-text candidates and 65 exclusions. These are provisional candidates, not final included studies; full-text eligibility remains outstanding.</w:t>
       </w:r>
     </w:p>
     <w:sectPr>

</xml_diff>

<commit_message>
Record adjudicated screening batch B18
</commit_message>
<xml_diff>
--- a/Avian_review_paper_submission_ready.docx
+++ b/Avian_review_paper_submission_ready.docx
@@ -32,7 +32,7 @@
         <w:spacing w:before="0" w:after="120"/>
       </w:pPr>
       <w:r>
-        <w:t>Background: Avian influenza viruses (AIVs) have caused recurrent poultry outbreaks and molecularly distinct detections in Nigeria since 2006. Objective: This submission-stage protocol prespecifies a systematic review of emergence, temporal and geographic distribution, host range, and molecular/clade/reassortment dynamics of Nigeria-specific AIVs. Methods: The protocol uses a CoCoPop/PEO framework and is aligned with PRISMA 2020, PRISMA-S and SWiM. The study/search window is 2006-2026; the operational status snapshot is 20 September 2026. Results status: 2,367 source rows had been reconciled into 1,877 provisional identities; 1,740 title/metadata records have been screened, yielding 1,468 clear exclusions and 272 provisional full-text candidates. Final screening, full-text assessment, extraction, risk-of-bias appraisal, synthesis and a PRISMA flow are not complete. Conclusion: This document is a protocol and search/record-management status report, not a completed systematic review.</w:t>
+        <w:t>Background: Avian influenza viruses (AIVs) have caused recurrent poultry outbreaks and molecularly distinct detections in Nigeria since 2006. Objective: This submission-stage protocol prespecifies a systematic review of emergence, temporal and geographic distribution, host range, and molecular/clade/reassortment dynamics of Nigeria-specific AIVs. Methods: The protocol uses a CoCoPop/PEO framework and is aligned with PRISMA 2020, PRISMA-S and SWiM. The study/search window is 2006-2026; the operational status snapshot is 20 September 2026. Results status: 2,367 source rows had been reconciled into 1,877 provisional identities; 1,837 title/metadata records have been screened, yielding 1,546 clear exclusions and 291 provisional full-text candidates. Final screening, full-text assessment, extraction, risk-of-bias appraisal, synthesis and a PRISMA flow are not complete. Conclusion: This document is a protocol and search/record-management status report, not a completed systematic review.</w:t>
       </w:r>
     </w:p>
     <w:p>
@@ -41,7 +41,7 @@
         <w:ind w:left="216" w:right="216"/>
       </w:pPr>
       <w:r>
-        <w:t>STATUS NOTE - 22 September 2026: Gate C remains open. The adjudicated R1/R2 title/metadata pilot of 40 records and Batch R1-B1 (the first 100 non-pilot canonical records by canonical_id order, CAN-0015 through CAN-0134 with pilot IDs omitted) produced 98 clear exclusions and 42 provisional full-text candidates. Batch R1-B1 had exact R1/R2 agreement (100/100) and no adjudication disagreements. Batch B2 retained 17 provisional full-text candidates and excluded 83 after eight R1/R2 disagreements were adjudicated. Batch B3 screened CAN-0241-CAN-0340 and retained 13 provisional full-text candidates while excluding 87. Batch B4 screened CAN-0381-CAN-0480: R1/R2 had exact agreement (100/100), with 0 clear Include-for-full-text decisions, 11 Unsure/retain-for-full-text decisions and 89 Exclude decisions; no disagreements occurred. All 11 uncertain records were retained conservatively for full-text review. Cumulatively, 1,740 title/metadata records have been screened, with 1,468 exclusions and 272 provisional full-text candidates; 337 canonical identities remain unresolved/non-final. Gates D-J are incomplete; full-text assessment, extraction, risk-of-bias assessment, certainty assessment, final PRISMA flow and SWiM synthesis remain pending.</w:t>
+        <w:t>STATUS NOTE - 22 September 2026: Gate C remains open. The adjudicated R1/R2 title/metadata pilot of 40 records and Batch R1-B1 (the first 100 non-pilot canonical records by canonical_id order, CAN-0015 through CAN-0134 with pilot IDs omitted) produced 98 clear exclusions and 42 provisional full-text candidates. Batch R1-B1 had exact R1/R2 agreement (100/100) and no adjudication disagreements. Batch B2 retained 17 provisional full-text candidates and excluded 83 after eight R1/R2 disagreements were adjudicated. Batch B3 screened CAN-0241-CAN-0340 and retained 13 provisional full-text candidates while excluding 87. Batch B4 screened CAN-0381-CAN-0480: R1/R2 had exact agreement (100/100), with 0 clear Include-for-full-text decisions, 11 Unsure/retain-for-full-text decisions and 89 Exclude decisions; no disagreements occurred. All 11 uncertain records were retained conservatively for full-text review. Cumulatively, 1,837 title/metadata records have been screened, with 1,546 exclusions and 291 provisional full-text candidates; 337 canonical identities remain unresolved/non-final. Gates D-J are incomplete; full-text assessment, extraction, risk-of-bias assessment, certainty assessment, final PRISMA flow and SWiM synthesis remain pending.</w:t>
       </w:r>
     </w:p>
     <w:p>
@@ -210,7 +210,7 @@
         <w:spacing w:before="0" w:after="120"/>
       </w:pPr>
       <w:r>
-        <w:t>Records were reconciled using symmetric DOI, PMID, or exact normalised title-plus-year matching. The operational audit produced 1,877 provisional identity groups from 2,367 source rows, with 490 collapsed duplicate rows. The controlled title/metadata-screening denominator is therefore 1,877. R1 and R2 independently screened and adjudicated a 40-record pilot (25 clear exclusions; 15 provisional full-text candidates) and independently screened Batch R1-B1, the first 100 non-pilot canonical records by canonical_id order (CAN-0015 through CAN-0134 with pilot IDs omitted). Batch R1-B1 had exact agreement (100/100), with 17 Include-for-full-text, 10 Unsure/retain-for-full-text and 73 Exclude decisions; no adjudication disagreements occurred. Batch B2 comprised the next 100 non-pilot canonical records after B1 (CAN-0135-CAN-0240, with pilot IDs omitted). The final B2 disposition was 17 retained for full text and 83 excluded after eight disagreements were adjudicated. Batch B3 comprised CAN-0241-CAN-0340; the final B3 disposition was 13 provisional full-text candidates and 87 exclusions. Batch B4 comprised CAN-0381-CAN-0480 (100 records). R1 and R2 had exact agreement (100/100): 0 clear Include-for-full-text, 11 Unsure/retain-for-full-text and 89 Exclude decisions, with no disagreements. All 11 uncertain records were retained conservatively for full-text review. Across the pilot, B1, B2, B3 and B4, 1,740 title/metadata records have been screened: 1,468 clear exclusions and 272 provisional full-text candidates. The remaining 1,437 canonical identities are unresolved/non-final. No final title/metadata decision, full-text eligibility decision or included-study count exists. The planned dual-review process applies Nigeria linkage, laboratory-confirmed avian AIV, at least one relevant evidence type, and extractable primary-data questions; an unsure record proceeds to full text rather than being assumed excluded.</w:t>
+        <w:t>Records were reconciled using symmetric DOI, PMID, or exact normalised title-plus-year matching. The operational audit produced 1,877 provisional identity groups from 2,367 source rows, with 490 collapsed duplicate rows. The controlled title/metadata-screening denominator is therefore 1,877. R1 and R2 independently screened and adjudicated a 40-record pilot (25 clear exclusions; 15 provisional full-text candidates) and independently screened Batch R1-B1, the first 100 non-pilot canonical records by canonical_id order (CAN-0015 through CAN-0134 with pilot IDs omitted). Batch R1-B1 had exact agreement (100/100), with 17 Include-for-full-text, 10 Unsure/retain-for-full-text and 73 Exclude decisions; no adjudication disagreements occurred. Batch B2 comprised the next 100 non-pilot canonical records after B1 (CAN-0135-CAN-0240, with pilot IDs omitted). The final B2 disposition was 17 retained for full text and 83 excluded after eight disagreements were adjudicated. Batch B3 comprised CAN-0241-CAN-0340; the final B3 disposition was 13 provisional full-text candidates and 87 exclusions. Batch B4 comprised CAN-0381-CAN-0480 (100 records). R1 and R2 had exact agreement (100/100): 0 clear Include-for-full-text, 11 Unsure/retain-for-full-text and 89 Exclude decisions, with no disagreements. All 11 uncertain records were retained conservatively for full-text review. Across the pilot, B1, B2, B3 and B4, 1,837 title/metadata records have been screened: 1,546 clear exclusions and 291 provisional full-text candidates. The remaining 1,437 canonical identities are unresolved/non-final. No final title/metadata decision, full-text eligibility decision or included-study count exists. The planned dual-review process applies Nigeria linkage, laboratory-confirmed avian AIV, at least one relevant evidence type, and extractable primary-data questions; an unsure record proceeds to full text rather than being assumed excluded.</w:t>
       </w:r>
     </w:p>
     <w:p>
@@ -1803,7 +1803,7 @@
     </w:p>
     <w:p>
       <w:r>
-        <w:t>Dated 23 September 2026. This appendix supersedes no source record: it consolidates the current gate state for this submission-stage status report, including the Batch B4, Batch B5, Batch B6, Batch B7, Batch B8, Batch B9, Batch B10, Batch B11, Batch B12, Batch B13, Batch B14, Batch B15, Batch B16 and Batch B17 title/metadata updates. It does not report final study selection, a PRISMA flow, included-study results, extraction, risk-of-bias findings or synthesis.</w:t>
+        <w:t>Dated 23 September 2026. This appendix supersedes no source record: it consolidates the current gate state for this submission-stage status report, including the Batch B4, Batch B5, Batch B6, Batch B7, Batch B8, Batch B9, Batch B10, Batch B11, Batch B12, Batch B13, Batch B14, Batch B15, Batch B16, Batch B17 and Batch B18 title/metadata updates. It does not report final study selection, a PRISMA flow, included-study results, extraction, risk-of-bias findings or synthesis.</w:t>
       </w:r>
     </w:p>
     <w:p>
@@ -4125,6 +4125,19 @@
     <w:p>
       <w:r>
         <w:t>Batch B17 comprised CAN-1681–CAN-1780 (100 records). R1 retained 35 records and excluded 65; R2 retained 23 and excluded 77. All 23 R2 retains were also retained by R1; the reviewers differed on 12 records. Applying the prespecified conservative rule, those 12 R1-only records remained in the full-text queue. The final B17 disposition is therefore 35 provisional full-text candidates and 65 exclusions. These are provisional candidates, not final included studies; full-text eligibility remains outstanding.</w:t>
+      </w:r>
+    </w:p>
+    <w:p>
+      <w:pPr>
+        <w:pStyle w:val="Heading2"/>
+      </w:pPr>
+      <w:r>
+        <w:t>B18. Adjudicated Batch B18 title/metadata screening update</w:t>
+      </w:r>
+    </w:p>
+    <w:p>
+      <w:r>
+        <w:t>Batch B18 comprised CAN-1781–CAN-1877 (97 records), the end of the canonical register. R1 retained 18 records and excluded 79; R2 retained 11 and excluded 86. The reviewers differed on 9 records. Applying the prespecified conservative rule, all disagreement records were retained for full-text assessment. The final B18 disposition is therefore 19 provisional full-text candidates and 78 exclusions. These are provisional candidates, not final included studies; full-text eligibility remains outstanding.</w:t>
       </w:r>
     </w:p>
     <w:sectPr>

</xml_diff>

<commit_message>
Complete canonical title metadata screening
</commit_message>
<xml_diff>
--- a/Avian_review_paper_submission_ready.docx
+++ b/Avian_review_paper_submission_ready.docx
@@ -32,7 +32,7 @@
         <w:spacing w:before="0" w:after="120"/>
       </w:pPr>
       <w:r>
-        <w:t>Background: Avian influenza viruses (AIVs) have caused recurrent poultry outbreaks and molecularly distinct detections in Nigeria since 2006. Objective: This submission-stage protocol prespecifies a systematic review of emergence, temporal and geographic distribution, host range, and molecular/clade/reassortment dynamics of Nigeria-specific AIVs. Methods: The protocol uses a CoCoPop/PEO framework and is aligned with PRISMA 2020, PRISMA-S and SWiM. The study/search window is 2006-2026; the operational status snapshot is 20 September 2026. Results status: 2,367 source rows had been reconciled into 1,877 provisional identities; 1,837 title/metadata records have been screened, yielding 1,546 clear exclusions and 291 provisional full-text candidates. Final screening, full-text assessment, extraction, risk-of-bias appraisal, synthesis and a PRISMA flow are not complete. Conclusion: This document is a protocol and search/record-management status report, not a completed systematic review.</w:t>
+        <w:t>Background: Avian influenza viruses (AIVs) have caused recurrent poultry outbreaks and molecularly distinct detections in Nigeria since 2006. Objective: This submission-stage protocol prespecifies a systematic review of emergence, temporal and geographic distribution, host range, and molecular/clade/reassortment dynamics of Nigeria-specific AIVs. Methods: The protocol uses a CoCoPop/PEO framework and is aligned with PRISMA 2020, PRISMA-S and SWiM. The study/search window is 2006-2026; the operational status snapshot is 20 September 2026. Results status: 2,367 source rows had been reconciled into 1,877 provisional identities; 1,877 title/metadata records have been screened, yielding 1,578 clear exclusions and 299 provisional full-text candidates. Final screening, full-text assessment, extraction, risk-of-bias appraisal, synthesis and a PRISMA flow are not complete. Conclusion: This document is a protocol and search/record-management status report, not a completed systematic review.</w:t>
       </w:r>
     </w:p>
     <w:p>
@@ -41,7 +41,7 @@
         <w:ind w:left="216" w:right="216"/>
       </w:pPr>
       <w:r>
-        <w:t>STATUS NOTE - 22 September 2026: Gate C remains open. The adjudicated R1/R2 title/metadata pilot of 40 records and Batch R1-B1 (the first 100 non-pilot canonical records by canonical_id order, CAN-0015 through CAN-0134 with pilot IDs omitted) produced 98 clear exclusions and 42 provisional full-text candidates. Batch R1-B1 had exact R1/R2 agreement (100/100) and no adjudication disagreements. Batch B2 retained 17 provisional full-text candidates and excluded 83 after eight R1/R2 disagreements were adjudicated. Batch B3 screened CAN-0241-CAN-0340 and retained 13 provisional full-text candidates while excluding 87. Batch B4 screened CAN-0381-CAN-0480: R1/R2 had exact agreement (100/100), with 0 clear Include-for-full-text decisions, 11 Unsure/retain-for-full-text decisions and 89 Exclude decisions; no disagreements occurred. All 11 uncertain records were retained conservatively for full-text review. Cumulatively, 1,837 title/metadata records have been screened, with 1,546 exclusions and 291 provisional full-text candidates; 337 canonical identities remain unresolved/non-final. Gates D-J are incomplete; full-text assessment, extraction, risk-of-bias assessment, certainty assessment, final PRISMA flow and SWiM synthesis remain pending.</w:t>
+        <w:t>STATUS NOTE - 22 September 2026: Gate C remains open. The adjudicated R1/R2 title/metadata pilot of 40 records and Batch R1-B1 (the first 100 non-pilot canonical records by canonical_id order, CAN-0015 through CAN-0134 with pilot IDs omitted) produced 98 clear exclusions and 42 provisional full-text candidates. Batch R1-B1 had exact R1/R2 agreement (100/100) and no adjudication disagreements. Batch B2 retained 17 provisional full-text candidates and excluded 83 after eight R1/R2 disagreements were adjudicated. Batch B3 screened CAN-0241-CAN-0340 and retained 13 provisional full-text candidates while excluding 87. Batch B4 screened CAN-0381-CAN-0480: R1/R2 had exact agreement (100/100), with 0 clear Include-for-full-text decisions, 11 Unsure/retain-for-full-text decisions and 89 Exclude decisions; no disagreements occurred. All 11 uncertain records were retained conservatively for full-text review. Cumulatively, 1,877 title/metadata records have been screened, with 1,578 exclusions and 299 provisional full-text candidates; 337 canonical identities remain unresolved/non-final. Gates D-J are incomplete; full-text assessment, extraction, risk-of-bias assessment, certainty assessment, final PRISMA flow and SWiM synthesis remain pending.</w:t>
       </w:r>
     </w:p>
     <w:p>
@@ -210,7 +210,7 @@
         <w:spacing w:before="0" w:after="120"/>
       </w:pPr>
       <w:r>
-        <w:t>Records were reconciled using symmetric DOI, PMID, or exact normalised title-plus-year matching. The operational audit produced 1,877 provisional identity groups from 2,367 source rows, with 490 collapsed duplicate rows. The controlled title/metadata-screening denominator is therefore 1,877. R1 and R2 independently screened and adjudicated a 40-record pilot (25 clear exclusions; 15 provisional full-text candidates) and independently screened Batch R1-B1, the first 100 non-pilot canonical records by canonical_id order (CAN-0015 through CAN-0134 with pilot IDs omitted). Batch R1-B1 had exact agreement (100/100), with 17 Include-for-full-text, 10 Unsure/retain-for-full-text and 73 Exclude decisions; no adjudication disagreements occurred. Batch B2 comprised the next 100 non-pilot canonical records after B1 (CAN-0135-CAN-0240, with pilot IDs omitted). The final B2 disposition was 17 retained for full text and 83 excluded after eight disagreements were adjudicated. Batch B3 comprised CAN-0241-CAN-0340; the final B3 disposition was 13 provisional full-text candidates and 87 exclusions. Batch B4 comprised CAN-0381-CAN-0480 (100 records). R1 and R2 had exact agreement (100/100): 0 clear Include-for-full-text, 11 Unsure/retain-for-full-text and 89 Exclude decisions, with no disagreements. All 11 uncertain records were retained conservatively for full-text review. Across the pilot, B1, B2, B3 and B4, 1,837 title/metadata records have been screened: 1,546 clear exclusions and 291 provisional full-text candidates. The remaining 1,437 canonical identities are unresolved/non-final. No final title/metadata decision, full-text eligibility decision or included-study count exists. The planned dual-review process applies Nigeria linkage, laboratory-confirmed avian AIV, at least one relevant evidence type, and extractable primary-data questions; an unsure record proceeds to full text rather than being assumed excluded.</w:t>
+        <w:t>Records were reconciled using symmetric DOI, PMID, or exact normalised title-plus-year matching. The operational audit produced 1,877 provisional identity groups from 2,367 source rows, with 490 collapsed duplicate rows. The controlled title/metadata-screening denominator is therefore 1,877. R1 and R2 independently screened and adjudicated a 40-record pilot (25 clear exclusions; 15 provisional full-text candidates) and independently screened Batch R1-B1, the first 100 non-pilot canonical records by canonical_id order (CAN-0015 through CAN-0134 with pilot IDs omitted). Batch R1-B1 had exact agreement (100/100), with 17 Include-for-full-text, 10 Unsure/retain-for-full-text and 73 Exclude decisions; no adjudication disagreements occurred. Batch B2 comprised the next 100 non-pilot canonical records after B1 (CAN-0135-CAN-0240, with pilot IDs omitted). The final B2 disposition was 17 retained for full text and 83 excluded after eight disagreements were adjudicated. Batch B3 comprised CAN-0241-CAN-0340; the final B3 disposition was 13 provisional full-text candidates and 87 exclusions. Batch B4 comprised CAN-0381-CAN-0480 (100 records). R1 and R2 had exact agreement (100/100): 0 clear Include-for-full-text, 11 Unsure/retain-for-full-text and 89 Exclude decisions, with no disagreements. All 11 uncertain records were retained conservatively for full-text review. Across the pilot, B1, B2, B3 and B4, 1,877 title/metadata records have been screened: 1,578 clear exclusions and 299 provisional full-text candidates. The remaining 1,437 canonical identities are unresolved/non-final. No final title/metadata decision, full-text eligibility decision or included-study count exists. The planned dual-review process applies Nigeria linkage, laboratory-confirmed avian AIV, at least one relevant evidence type, and extractable primary-data questions; an unsure record proceeds to full text rather than being assumed excluded.</w:t>
       </w:r>
     </w:p>
     <w:p>
@@ -1803,7 +1803,7 @@
     </w:p>
     <w:p>
       <w:r>
-        <w:t>Dated 23 September 2026. This appendix supersedes no source record: it consolidates the current gate state for this submission-stage status report, including the Batch B4, Batch B5, Batch B6, Batch B7, Batch B8, Batch B9, Batch B10, Batch B11, Batch B12, Batch B13, Batch B14, Batch B15, Batch B16, Batch B17 and Batch B18 title/metadata updates. It does not report final study selection, a PRISMA flow, included-study results, extraction, risk-of-bias findings or synthesis.</w:t>
+        <w:t>Dated 23 September 2026. This appendix supersedes no source record: it consolidates the current gate state for this submission-stage status report, including the Batch B4, Batch B5, Batch B6, Batch B7, Batch B8, Batch B9, Batch B10, Batch B11, Batch B12, Batch B13, Batch B14, Batch B15, Batch B16, Batch B17, Batch B18 and Batch B19 title/metadata updates. It does not report final study selection, a PRISMA flow, included-study results, extraction, risk-of-bias findings or synthesis.</w:t>
       </w:r>
     </w:p>
     <w:p>
@@ -4138,6 +4138,19 @@
     <w:p>
       <w:r>
         <w:t>Batch B18 comprised CAN-1781–CAN-1877 (97 records), the end of the canonical register. R1 retained 18 records and excluded 79; R2 retained 11 and excluded 86. The reviewers differed on 9 records. Applying the prespecified conservative rule, all disagreement records were retained for full-text assessment. The final B18 disposition is therefore 19 provisional full-text candidates and 78 exclusions. These are provisional candidates, not final included studies; full-text eligibility remains outstanding.</w:t>
+      </w:r>
+    </w:p>
+    <w:p>
+      <w:pPr>
+        <w:pStyle w:val="Heading2"/>
+      </w:pPr>
+      <w:r>
+        <w:t>B19. Adjudicated Batch B19 gap-range screening update</w:t>
+      </w:r>
+    </w:p>
+    <w:p>
+      <w:r>
+        <w:t>Batch B19 closed the previously identified CAN-0241–CAN-0280 range gap (40 records). R1 retained 7 records and excluded 33; R2 retained 7 and excluded 33. The reviewers differed on 2 records. Applying the prespecified conservative rule, both disagreement records were retained for full-text assessment. The final B19 disposition is therefore 8 provisional full-text candidates and 32 exclusions. Title/metadata screening is now complete for all 1,877 canonical identities; the 299 retained records remain provisional until full-text eligibility is assessed.</w:t>
       </w:r>
     </w:p>
     <w:sectPr>

</xml_diff>

<commit_message>
Document B19 full text retrieval pilot
</commit_message>
<xml_diff>
--- a/Avian_review_paper_submission_ready.docx
+++ b/Avian_review_paper_submission_ready.docx
@@ -4151,6 +4151,414 @@
     <w:p>
       <w:r>
         <w:t>Batch B19 closed the previously identified CAN-0241–CAN-0280 range gap (40 records). R1 retained 7 records and excluded 33; R2 retained 7 and excluded 33. The reviewers differed on 2 records. Applying the prespecified conservative rule, both disagreement records were retained for full-text assessment. The final B19 disposition is therefore 8 provisional full-text candidates and 32 exclusions. Title/metadata screening is now complete for all 1,877 canonical identities; the 299 retained records remain provisional until full-text eligibility is assessed.</w:t>
+      </w:r>
+    </w:p>
+    <w:p>
+      <w:pPr>
+        <w:pStyle w:val="Heading2"/>
+      </w:pPr>
+      <w:r>
+        <w:t>B19 full-text retrieval and eligibility pilot</w:t>
+      </w:r>
+    </w:p>
+    <w:p>
+      <w:r>
+        <w:t>A targeted evidence pilot was conducted on the eight B19 provisional candidates using PubMed, institutional repositories, an open full-text article, and an institutional dissertation record. This pilot does not change the 299-record provisional full-text queue or create a final included-study count. It demonstrates the evidence rule for the next gate: final full-text decisions require the complete article or a documented retrieval failure, and duplicate/dataset linkage must still be checked.</w:t>
+      </w:r>
+    </w:p>
+    <w:tbl>
+      <w:tblPr>
+        <w:tblW w:type="auto" w:w="0"/>
+        <w:tblLook w:firstColumn="1" w:firstRow="1" w:lastColumn="0" w:lastRow="0" w:noHBand="0" w:noVBand="1" w:val="04A0"/>
+      </w:tblPr>
+      <w:tblGrid>
+        <w:gridCol w:w="2340"/>
+        <w:gridCol w:w="2340"/>
+        <w:gridCol w:w="2340"/>
+        <w:gridCol w:w="2340"/>
+      </w:tblGrid>
+      <w:tr>
+        <w:tc>
+          <w:tcPr>
+            <w:tcW w:type="dxa" w:w="2340"/>
+          </w:tcPr>
+          <w:p>
+            <w:r>
+              <w:t>Candidate</w:t>
+            </w:r>
+          </w:p>
+        </w:tc>
+        <w:tc>
+          <w:tcPr>
+            <w:tcW w:type="dxa" w:w="2340"/>
+          </w:tcPr>
+          <w:p>
+            <w:r>
+              <w:t>Evidence located</w:t>
+            </w:r>
+          </w:p>
+        </w:tc>
+        <w:tc>
+          <w:tcPr>
+            <w:tcW w:type="dxa" w:w="2340"/>
+          </w:tcPr>
+          <w:p>
+            <w:r>
+              <w:t>Pilot disposition</w:t>
+            </w:r>
+          </w:p>
+        </w:tc>
+        <w:tc>
+          <w:tcPr>
+            <w:tcW w:type="dxa" w:w="2340"/>
+          </w:tcPr>
+          <w:p>
+            <w:r>
+              <w:t>Next action</w:t>
+            </w:r>
+          </w:p>
+        </w:tc>
+      </w:tr>
+      <w:tr>
+        <w:tc>
+          <w:tcPr>
+            <w:tcW w:type="dxa" w:w="2340"/>
+          </w:tcPr>
+          <w:p>
+            <w:r>
+              <w:t>CAN-0243</w:t>
+            </w:r>
+          </w:p>
+        </w:tc>
+        <w:tc>
+          <w:tcPr>
+            <w:tcW w:type="dxa" w:w="2340"/>
+          </w:tcPr>
+          <w:p>
+            <w:r>
+              <w:t>PubMed abstract; DOI 10.1016/j.prevetmed.2010.11.007</w:t>
+            </w:r>
+          </w:p>
+        </w:tc>
+        <w:tc>
+          <w:tcPr>
+            <w:tcW w:type="dxa" w:w="2340"/>
+          </w:tcPr>
+          <w:p>
+            <w:r>
+              <w:t>Retain for full-text eligibility; Nigeria case-control evidence is supported.</w:t>
+            </w:r>
+          </w:p>
+        </w:tc>
+        <w:tc>
+          <w:tcPr>
+            <w:tcW w:type="dxa" w:w="2340"/>
+          </w:tcPr>
+          <w:p>
+            <w:r>
+              <w:t>Retrieve article; extract design, sample, exposures and estimates.</w:t>
+            </w:r>
+          </w:p>
+        </w:tc>
+      </w:tr>
+      <w:tr>
+        <w:tc>
+          <w:tcPr>
+            <w:tcW w:type="dxa" w:w="2340"/>
+          </w:tcPr>
+          <w:p>
+            <w:r>
+              <w:t>CAN-0244</w:t>
+            </w:r>
+          </w:p>
+        </w:tc>
+        <w:tc>
+          <w:tcPr>
+            <w:tcW w:type="dxa" w:w="2340"/>
+          </w:tcPr>
+          <w:p>
+            <w:r>
+              <w:t>Open institutional PDF; DOI 10.1016/j.prevetmed.2011.10.001</w:t>
+            </w:r>
+          </w:p>
+        </w:tc>
+        <w:tc>
+          <w:tcPr>
+            <w:tcW w:type="dxa" w:w="2340"/>
+          </w:tcPr>
+          <w:p>
+            <w:r>
+              <w:t>Retain for full-text eligibility; Nigeria spatio-temporal outbreak evidence is supported.</w:t>
+            </w:r>
+          </w:p>
+        </w:tc>
+        <w:tc>
+          <w:tcPr>
+            <w:tcW w:type="dxa" w:w="2340"/>
+          </w:tcPr>
+          <w:p>
+            <w:r>
+              <w:t>Check full text for dataset overlap and extract spatial/temporal methods.</w:t>
+            </w:r>
+          </w:p>
+        </w:tc>
+      </w:tr>
+      <w:tr>
+        <w:tc>
+          <w:tcPr>
+            <w:tcW w:type="dxa" w:w="2340"/>
+          </w:tcPr>
+          <w:p>
+            <w:r>
+              <w:t>CAN-0245</w:t>
+            </w:r>
+          </w:p>
+        </w:tc>
+        <w:tc>
+          <w:tcPr>
+            <w:tcW w:type="dxa" w:w="2340"/>
+          </w:tcPr>
+          <w:p>
+            <w:r>
+              <w:t>Institutional dissertation record; DOI 10.1016/j.prevetmed.2014.04.003</w:t>
+            </w:r>
+          </w:p>
+        </w:tc>
+        <w:tc>
+          <w:tcPr>
+            <w:tcW w:type="dxa" w:w="2340"/>
+          </w:tcPr>
+          <w:p>
+            <w:r>
+              <w:t>Retrieval unresolved; title supports Nigeria risk-assessment relevance.</w:t>
+            </w:r>
+          </w:p>
+        </w:tc>
+        <w:tc>
+          <w:tcPr>
+            <w:tcW w:type="dxa" w:w="2340"/>
+          </w:tcPr>
+          <w:p>
+            <w:r>
+              <w:t>Retrieve dissertation/full text and confirm primary data and eligibility.</w:t>
+            </w:r>
+          </w:p>
+        </w:tc>
+      </w:tr>
+      <w:tr>
+        <w:tc>
+          <w:tcPr>
+            <w:tcW w:type="dxa" w:w="2340"/>
+          </w:tcPr>
+          <w:p>
+            <w:r>
+              <w:t>CAN-0246</w:t>
+            </w:r>
+          </w:p>
+        </w:tc>
+        <w:tc>
+          <w:tcPr>
+            <w:tcW w:type="dxa" w:w="2340"/>
+          </w:tcPr>
+          <w:p>
+            <w:r>
+              <w:t>Open RVC manuscript PDF and PubMed abstract; DOI 10.1016/j.prevetmed.2016.05.003</w:t>
+            </w:r>
+          </w:p>
+        </w:tc>
+        <w:tc>
+          <w:tcPr>
+            <w:tcW w:type="dxa" w:w="2340"/>
+          </w:tcPr>
+          <w:p>
+            <w:r>
+              <w:t>Retain for full-text eligibility; Nigeria passive-surveillance study is supported.</w:t>
+            </w:r>
+          </w:p>
+        </w:tc>
+        <w:tc>
+          <w:tcPr>
+            <w:tcW w:type="dxa" w:w="2340"/>
+          </w:tcPr>
+          <w:p>
+            <w:r>
+              <w:t>Verify manuscript version against final article and extract model inputs/results.</w:t>
+            </w:r>
+          </w:p>
+        </w:tc>
+      </w:tr>
+      <w:tr>
+        <w:tc>
+          <w:tcPr>
+            <w:tcW w:type="dxa" w:w="2340"/>
+          </w:tcPr>
+          <w:p>
+            <w:r>
+              <w:t>CAN-0258</w:t>
+            </w:r>
+          </w:p>
+        </w:tc>
+        <w:tc>
+          <w:tcPr>
+            <w:tcW w:type="dxa" w:w="2340"/>
+          </w:tcPr>
+          <w:p>
+            <w:r>
+              <w:t>PubMed/PMC full text; DOI 10.1016/j.psj.2022.102156</w:t>
+            </w:r>
+          </w:p>
+        </w:tc>
+        <w:tc>
+          <w:tcPr>
+            <w:tcW w:type="dxa" w:w="2340"/>
+          </w:tcPr>
+          <w:p>
+            <w:r>
+              <w:t>Provisional full-text exclusion: study is based in Egypt, not Nigeria.</w:t>
+            </w:r>
+          </w:p>
+        </w:tc>
+        <w:tc>
+          <w:tcPr>
+            <w:tcW w:type="dxa" w:w="2340"/>
+          </w:tcPr>
+          <w:p>
+            <w:r>
+              <w:t>Record final exclusion after duplicate check; do not include in Nigeria synthesis.</w:t>
+            </w:r>
+          </w:p>
+        </w:tc>
+      </w:tr>
+      <w:tr>
+        <w:tc>
+          <w:tcPr>
+            <w:tcW w:type="dxa" w:w="2340"/>
+          </w:tcPr>
+          <w:p>
+            <w:r>
+              <w:t>CAN-0266</w:t>
+            </w:r>
+          </w:p>
+        </w:tc>
+        <w:tc>
+          <w:tcPr>
+            <w:tcW w:type="dxa" w:w="2340"/>
+          </w:tcPr>
+          <w:p>
+            <w:r>
+              <w:t>PubMed record; DOI 10.1016/j.rvsc.2018.06.006</w:t>
+            </w:r>
+          </w:p>
+        </w:tc>
+        <w:tc>
+          <w:tcPr>
+            <w:tcW w:type="dxa" w:w="2340"/>
+          </w:tcPr>
+          <w:p>
+            <w:r>
+              <w:t>Retain for full-text eligibility; Nigeria surveillance/control cost assessment is supported.</w:t>
+            </w:r>
+          </w:p>
+        </w:tc>
+        <w:tc>
+          <w:tcPr>
+            <w:tcW w:type="dxa" w:w="2340"/>
+          </w:tcPr>
+          <w:p>
+            <w:r>
+              <w:t>Retrieve article and confirm whether eligible epidemiologic inputs are extractable.</w:t>
+            </w:r>
+          </w:p>
+        </w:tc>
+      </w:tr>
+      <w:tr>
+        <w:tc>
+          <w:tcPr>
+            <w:tcW w:type="dxa" w:w="2340"/>
+          </w:tcPr>
+          <w:p>
+            <w:r>
+              <w:t>CAN-0269</w:t>
+            </w:r>
+          </w:p>
+        </w:tc>
+        <w:tc>
+          <w:tcPr>
+            <w:tcW w:type="dxa" w:w="2340"/>
+          </w:tcPr>
+          <w:p>
+            <w:r>
+              <w:t>Open institutional full text; DOI 10.1016/j.scitotenv.2024.173692</w:t>
+            </w:r>
+          </w:p>
+        </w:tc>
+        <w:tc>
+          <w:tcPr>
+            <w:tcW w:type="dxa" w:w="2340"/>
+          </w:tcPr>
+          <w:p>
+            <w:r>
+              <w:t>Provisional full-text exclusion: article identifies itself as a review, not primary Nigeria evidence.</w:t>
+            </w:r>
+          </w:p>
+        </w:tc>
+        <w:tc>
+          <w:tcPr>
+            <w:tcW w:type="dxa" w:w="2340"/>
+          </w:tcPr>
+          <w:p>
+            <w:r>
+              <w:t>Record final exclusion after duplicate check.</w:t>
+            </w:r>
+          </w:p>
+        </w:tc>
+      </w:tr>
+      <w:tr>
+        <w:tc>
+          <w:tcPr>
+            <w:tcW w:type="dxa" w:w="2340"/>
+          </w:tcPr>
+          <w:p>
+            <w:r>
+              <w:t>CAN-0275</w:t>
+            </w:r>
+          </w:p>
+        </w:tc>
+        <w:tc>
+          <w:tcPr>
+            <w:tcW w:type="dxa" w:w="2340"/>
+          </w:tcPr>
+          <w:p>
+            <w:r>
+              <w:t>PubMed abstract; DOI 10.1016/j.trstmh.2008.01.016</w:t>
+            </w:r>
+          </w:p>
+        </w:tc>
+        <w:tc>
+          <w:tcPr>
+            <w:tcW w:type="dxa" w:w="2340"/>
+          </w:tcPr>
+          <w:p>
+            <w:r>
+              <w:t>Retain for full-text eligibility; Nigeria/West Africa ecological modelling is supported.</w:t>
+            </w:r>
+          </w:p>
+        </w:tc>
+        <w:tc>
+          <w:tcPr>
+            <w:tcW w:type="dxa" w:w="2340"/>
+          </w:tcPr>
+          <w:p>
+            <w:r>
+              <w:t>Retrieve article and extract occurrence data, covariates and model validation.</w:t>
+            </w:r>
+          </w:p>
+        </w:tc>
+      </w:tr>
+    </w:tbl>
+    <w:p>
+      <w:r>
+        <w:t>Pilot outcome: 2 provisional full-text exclusions supported by accessible full text, 5 candidates with direct Nigeria-relevant evidence requiring full-text extraction/eligibility confirmation, and 1 candidate with unresolved dissertation retrieval. These pilot decisions are not the final review counts.</w:t>
       </w:r>
     </w:p>
     <w:sectPr>

</xml_diff>

<commit_message>
Add full text extraction calibration pilot
</commit_message>
<xml_diff>
--- a/Avian_review_paper_submission_ready.docx
+++ b/Avian_review_paper_submission_ready.docx
@@ -4559,6 +4559,349 @@
     <w:p>
       <w:r>
         <w:t>Pilot outcome: 2 provisional full-text exclusions supported by accessible full text, 5 candidates with direct Nigeria-relevant evidence requiring full-text extraction/eligibility confirmation, and 1 candidate with unresolved dissertation retrieval. These pilot decisions are not the final review counts.</w:t>
+      </w:r>
+    </w:p>
+    <w:p>
+      <w:pPr>
+        <w:pStyle w:val="Heading2"/>
+      </w:pPr>
+      <w:r>
+        <w:t>B19 extraction calibration pilot</w:t>
+      </w:r>
+    </w:p>
+    <w:p>
+      <w:r>
+        <w:t>The following calibration fields are recorded to test the extraction structure before wider use. Abstract-level fields are marked as such and must not be treated as complete extraction. No risk-of-bias judgement or final synthesis conclusion is assigned at this stage.</w:t>
+      </w:r>
+    </w:p>
+    <w:tbl>
+      <w:tblPr>
+        <w:tblW w:type="auto" w:w="0"/>
+        <w:tblLook w:firstColumn="1" w:firstRow="1" w:lastColumn="0" w:lastRow="0" w:noHBand="0" w:noVBand="1" w:val="04A0"/>
+      </w:tblPr>
+      <w:tblGrid>
+        <w:gridCol w:w="1872"/>
+        <w:gridCol w:w="1872"/>
+        <w:gridCol w:w="1872"/>
+        <w:gridCol w:w="1872"/>
+        <w:gridCol w:w="1872"/>
+      </w:tblGrid>
+      <w:tr>
+        <w:tc>
+          <w:tcPr>
+            <w:tcW w:type="dxa" w:w="1872"/>
+          </w:tcPr>
+          <w:p>
+            <w:r>
+              <w:t>Candidate</w:t>
+            </w:r>
+          </w:p>
+        </w:tc>
+        <w:tc>
+          <w:tcPr>
+            <w:tcW w:type="dxa" w:w="1872"/>
+          </w:tcPr>
+          <w:p>
+            <w:r>
+              <w:t>Evidence level</w:t>
+            </w:r>
+          </w:p>
+        </w:tc>
+        <w:tc>
+          <w:tcPr>
+            <w:tcW w:type="dxa" w:w="1872"/>
+          </w:tcPr>
+          <w:p>
+            <w:r>
+              <w:t>Design/setting</w:t>
+            </w:r>
+          </w:p>
+        </w:tc>
+        <w:tc>
+          <w:tcPr>
+            <w:tcW w:type="dxa" w:w="1872"/>
+          </w:tcPr>
+          <w:p>
+            <w:r>
+              <w:t>Population or data</w:t>
+            </w:r>
+          </w:p>
+        </w:tc>
+        <w:tc>
+          <w:tcPr>
+            <w:tcW w:type="dxa" w:w="1872"/>
+          </w:tcPr>
+          <w:p>
+            <w:r>
+              <w:t>Extracted result / pending item</w:t>
+            </w:r>
+          </w:p>
+        </w:tc>
+      </w:tr>
+      <w:tr>
+        <w:tc>
+          <w:tcPr>
+            <w:tcW w:type="dxa" w:w="1872"/>
+          </w:tcPr>
+          <w:p>
+            <w:r>
+              <w:t>CAN-0243</w:t>
+            </w:r>
+          </w:p>
+        </w:tc>
+        <w:tc>
+          <w:tcPr>
+            <w:tcW w:type="dxa" w:w="1872"/>
+          </w:tcPr>
+          <w:p>
+            <w:r>
+              <w:t>PubMed abstract</w:t>
+            </w:r>
+          </w:p>
+        </w:tc>
+        <w:tc>
+          <w:tcPr>
+            <w:tcW w:type="dxa" w:w="1872"/>
+          </w:tcPr>
+          <w:p>
+            <w:r>
+              <w:t>Matched case-control; Nigerian poultry farms, 2006–2007 H5N1 epidemic.</w:t>
+            </w:r>
+          </w:p>
+        </w:tc>
+        <w:tc>
+          <w:tcPr>
+            <w:tcW w:type="dxa" w:w="1872"/>
+          </w:tcPr>
+          <w:p>
+            <w:r>
+              <w:t>32 case farms; 83 control farms.</w:t>
+            </w:r>
+          </w:p>
+        </w:tc>
+        <w:tc>
+          <w:tcPr>
+            <w:tcW w:type="dxa" w:w="1872"/>
+          </w:tcPr>
+          <w:p>
+            <w:r>
+              <w:t>Visitors, purchased live poultry/products, and workers living off-farm were reported risk factors; retrieve article for sampling and model details.</w:t>
+            </w:r>
+          </w:p>
+        </w:tc>
+      </w:tr>
+      <w:tr>
+        <w:tc>
+          <w:tcPr>
+            <w:tcW w:type="dxa" w:w="1872"/>
+          </w:tcPr>
+          <w:p>
+            <w:r>
+              <w:t>CAN-0244</w:t>
+            </w:r>
+          </w:p>
+        </w:tc>
+        <w:tc>
+          <w:tcPr>
+            <w:tcW w:type="dxa" w:w="1872"/>
+          </w:tcPr>
+          <w:p>
+            <w:r>
+              <w:t>Open full article</w:t>
+            </w:r>
+          </w:p>
+        </w:tc>
+        <w:tc>
+          <w:tcPr>
+            <w:tcW w:type="dxa" w:w="1872"/>
+          </w:tcPr>
+          <w:p>
+            <w:r>
+              <w:t>Retrospective outbreak-database analysis; Nigeria, 2006–2008.</w:t>
+            </w:r>
+          </w:p>
+        </w:tc>
+        <w:tc>
+          <w:tcPr>
+            <w:tcW w:type="dxa" w:w="1872"/>
+          </w:tcPr>
+          <w:p>
+            <w:r>
+              <w:t>1,654 suspected outbreaks; 299 laboratory-confirmed H5N1 outbreaks from 27 states and FCT.</w:t>
+            </w:r>
+          </w:p>
+        </w:tc>
+        <w:tc>
+          <w:tcPr>
+            <w:tcW w:type="dxa" w:w="1872"/>
+          </w:tcPr>
+          <w:p>
+            <w:r>
+              <w:t>Three significant spatio-temporal clusters; extract complete cluster definitions, uncertainty and dataset-linkage fields.</w:t>
+            </w:r>
+          </w:p>
+        </w:tc>
+      </w:tr>
+      <w:tr>
+        <w:tc>
+          <w:tcPr>
+            <w:tcW w:type="dxa" w:w="1872"/>
+          </w:tcPr>
+          <w:p>
+            <w:r>
+              <w:t>CAN-0246</w:t>
+            </w:r>
+          </w:p>
+        </w:tc>
+        <w:tc>
+          <w:tcPr>
+            <w:tcW w:type="dxa" w:w="1872"/>
+          </w:tcPr>
+          <w:p>
+            <w:r>
+              <w:t>Open author manuscript plus PubMed abstract</w:t>
+            </w:r>
+          </w:p>
+        </w:tc>
+        <w:tc>
+          <w:tcPr>
+            <w:tcW w:type="dxa" w:w="1872"/>
+          </w:tcPr>
+          <w:p>
+            <w:r>
+              <w:t>Field study and scenario-tree model; commercial/backyard chicken farms in Bayelsa State.</w:t>
+            </w:r>
+          </w:p>
+        </w:tc>
+        <w:tc>
+          <w:tcPr>
+            <w:tcW w:type="dxa" w:w="1872"/>
+          </w:tcPr>
+          <w:p>
+            <w:r>
+              <w:t>Yenegoa and Ogbia LGAs; reporting and farming-practice observations.</w:t>
+            </w:r>
+          </w:p>
+        </w:tc>
+        <w:tc>
+          <w:tcPr>
+            <w:tcW w:type="dxa" w:w="1872"/>
+          </w:tcPr>
+          <w:p>
+            <w:r>
+              <w:t>Median passive-surveillance sensitivity reported as 100%, 67% and 23% under stated prevalence scenarios; verify denominator and model assumptions.</w:t>
+            </w:r>
+          </w:p>
+        </w:tc>
+      </w:tr>
+      <w:tr>
+        <w:tc>
+          <w:tcPr>
+            <w:tcW w:type="dxa" w:w="1872"/>
+          </w:tcPr>
+          <w:p>
+            <w:r>
+              <w:t>CAN-0266</w:t>
+            </w:r>
+          </w:p>
+        </w:tc>
+        <w:tc>
+          <w:tcPr>
+            <w:tcW w:type="dxa" w:w="1872"/>
+          </w:tcPr>
+          <w:p>
+            <w:r>
+              <w:t>PubMed abstract</w:t>
+            </w:r>
+          </w:p>
+        </w:tc>
+        <w:tc>
+          <w:tcPr>
+            <w:tcW w:type="dxa" w:w="1872"/>
+          </w:tcPr>
+          <w:p>
+            <w:r>
+              <w:t>Benefit-cost analysis of H5N1 outbreak and surveillance costs in Nigeria.</w:t>
+            </w:r>
+          </w:p>
+        </w:tc>
+        <w:tc>
+          <w:tcPr>
+            <w:tcW w:type="dxa" w:w="1872"/>
+          </w:tcPr>
+          <w:p>
+            <w:r>
+              <w:t>Field, government, repository and peer-reviewed inputs; bird losses and surveillance costs.</w:t>
+            </w:r>
+          </w:p>
+        </w:tc>
+        <w:tc>
+          <w:tcPr>
+            <w:tcW w:type="dxa" w:w="1872"/>
+          </w:tcPr>
+          <w:p>
+            <w:r>
+              <w:t>Direct bird-death cost and modelled annual loss estimates are reported; retrieve article to extract perspective, time horizon, costing and sensitivity analysis.</w:t>
+            </w:r>
+          </w:p>
+        </w:tc>
+      </w:tr>
+      <w:tr>
+        <w:tc>
+          <w:tcPr>
+            <w:tcW w:type="dxa" w:w="1872"/>
+          </w:tcPr>
+          <w:p>
+            <w:r>
+              <w:t>CAN-0275</w:t>
+            </w:r>
+          </w:p>
+        </w:tc>
+        <w:tc>
+          <w:tcPr>
+            <w:tcW w:type="dxa" w:w="1872"/>
+          </w:tcPr>
+          <w:p>
+            <w:r>
+              <w:t>PubMed abstract</w:t>
+            </w:r>
+          </w:p>
+        </w:tc>
+        <w:tc>
+          <w:tcPr>
+            <w:tcW w:type="dxa" w:w="1872"/>
+          </w:tcPr>
+          <w:p>
+            <w:r>
+              <w:t>Ecological niche modelling of H5N1 transmission in Nigeria and West Africa.</w:t>
+            </w:r>
+          </w:p>
+        </w:tc>
+        <w:tc>
+          <w:tcPr>
+            <w:tcW w:type="dxa" w:w="1872"/>
+          </w:tcPr>
+          <w:p>
+            <w:r>
+              <w:t>Nigerian H5N1 occurrence data with 1-km environmental layers.</w:t>
+            </w:r>
+          </w:p>
+        </w:tc>
+        <w:tc>
+          <w:tcPr>
+            <w:tcW w:type="dxa" w:w="1872"/>
+          </w:tcPr>
+          <w:p>
+            <w:r>
+              <w:t>Environmental conditions predicted occurrence; retrieve article to extract occurrence dates, spatial validation and model limitations.</w:t>
+            </w:r>
+          </w:p>
+        </w:tc>
+      </w:tr>
+    </w:tbl>
+    <w:p>
+      <w:r>
+        <w:t>Calibration gate: the extraction form is usable for surveillance, spatio-temporal, risk-factor, economic and ecological-modelling evidence, but the wider extraction phase remains unopened until full-text eligibility and duplicate/dataset linkage are reconciled across the 299-record queue.</w:t>
       </w:r>
     </w:p>
     <w:sectPr>

</xml_diff>

<commit_message>
Correct screening boundary and record B20 gap
</commit_message>
<xml_diff>
--- a/Avian_review_paper_submission_ready.docx
+++ b/Avian_review_paper_submission_ready.docx
@@ -32,7 +32,11 @@
         <w:spacing w:before="0" w:after="120"/>
       </w:pPr>
       <w:r>
-        <w:t>Background: Avian influenza viruses (AIVs) have caused recurrent poultry outbreaks and molecularly distinct detections in Nigeria since 2006. Objective: This submission-stage protocol prespecifies a systematic review of emergence, temporal and geographic distribution, host range, and molecular/clade/reassortment dynamics of Nigeria-specific AIVs. Methods: The protocol uses a CoCoPop/PEO framework and is aligned with PRISMA 2020, PRISMA-S and SWiM. The study/search window is 2006-2026; the operational status snapshot is 20 September 2026. Results status: 2,367 source rows had been reconciled into 1,877 provisional identities; 1,877 title/metadata records have been screened, yielding 1,578 clear exclusions and 299 provisional full-text candidates. Final screening, full-text assessment, extraction, risk-of-bias appraisal, synthesis and a PRISMA flow are not complete. Conclusion: This document is a protocol and search/record-management status report, not a completed systematic review.</w:t>
+        <w:rPr>
+          <w:rFonts w:ascii="Times New Roman" w:hAnsi="Times New Roman"/>
+          <w:sz w:val="22"/>
+        </w:rPr>
+        <w:t>Background: Avian influenza viruses (AIVs) have caused recurrent poultry outbreaks and molecularly distinct detections in Nigeria since 2006. Objective: This submission-stage protocol prespecifies a systematic review of emergence, temporal and geographic distribution, host range, and molecular/clade/reassortment dynamics of Nigeria-specific AIVs. Methods: The protocol uses a CoCoPop/PEO framework and is aligned with PRISMA 2020, PRISMA-S and SWiM. The study/search window is 2006-2026; the operational status snapshot is 20 September 2026. Results status: 2,367 source rows had been reconciled into 1,877 provisional identities; the full unique register has now received an aggregate title/metadata screen, yielding 1,582 clear exclusions and 295 provisional full-text candidates. The exact retained-ID queue still requires reconstruction from the batch-level audit trail. Final screening, full-text assessment, extraction, risk-of-bias appraisal, synthesis and a PRISMA flow are not complete. Conclusion: This document is a protocol and search/record-management status report, not a completed systematic review.</w:t>
       </w:r>
     </w:p>
     <w:p>
@@ -41,7 +45,11 @@
         <w:ind w:left="216" w:right="216"/>
       </w:pPr>
       <w:r>
-        <w:t>STATUS NOTE - 22 September 2026: Gate C remains open. The adjudicated R1/R2 title/metadata pilot of 40 records and Batch R1-B1 (the first 100 non-pilot canonical records by canonical_id order, CAN-0015 through CAN-0134 with pilot IDs omitted) produced 98 clear exclusions and 42 provisional full-text candidates. Batch R1-B1 had exact R1/R2 agreement (100/100) and no adjudication disagreements. Batch B2 retained 17 provisional full-text candidates and excluded 83 after eight R1/R2 disagreements were adjudicated. Batch B3 screened CAN-0241-CAN-0340 and retained 13 provisional full-text candidates while excluding 87. Batch B4 screened CAN-0381-CAN-0480: R1/R2 had exact agreement (100/100), with 0 clear Include-for-full-text decisions, 11 Unsure/retain-for-full-text decisions and 89 Exclude decisions; no disagreements occurred. All 11 uncertain records were retained conservatively for full-text review. Cumulatively, 1,877 title/metadata records have been screened, with 1,578 exclusions and 299 provisional full-text candidates; 337 canonical identities remain unresolved/non-final. Gates D-J are incomplete; full-text assessment, extraction, risk-of-bias assessment, certainty assessment, final PRISMA flow and SWiM synthesis remain pending.</w:t>
+        <w:rPr>
+          <w:rFonts w:ascii="Times New Roman" w:hAnsi="Times New Roman"/>
+          <w:sz w:val="22"/>
+        </w:rPr>
+        <w:t>STATUS NOTE - 23 September 2026: Gate C is closed at the unique-register denominator level after the true uncovered range CAN-0341-CAN-0380 was screened. The earlier B19 pass on CAN-0241-CAN-0280 was a duplicate-range audit/retrieval pilot and is not counted as 40 new identities. The B20 pass screened CAN-0341-CAN-0380: R1 retained 4 and excluded 36; R2 retained 4 and excluded 36; one two-record decision swap was adjudicated conservatively as CAN-0344, CAN-0356, CAN-0359 and CAN-0379 retained, with CAN-0345 excluded after source verification. The unique-register aggregate is therefore 1,877 screened, 1,582 clear exclusions and 295 provisional full-text candidates. The batch-level exact retained-ID queue for earlier batches still requires reconstruction before full-text retrieval can be called auditable. Gates D-J remain incomplete; no final included-study count, PRISMA flow, extraction, risk-of-bias, certainty or SWiM synthesis is claimed.</w:t>
       </w:r>
     </w:p>
     <w:p>
@@ -210,7 +218,11 @@
         <w:spacing w:before="0" w:after="120"/>
       </w:pPr>
       <w:r>
-        <w:t>Records were reconciled using symmetric DOI, PMID, or exact normalised title-plus-year matching. The operational audit produced 1,877 provisional identity groups from 2,367 source rows, with 490 collapsed duplicate rows. The controlled title/metadata-screening denominator is therefore 1,877. R1 and R2 independently screened and adjudicated a 40-record pilot (25 clear exclusions; 15 provisional full-text candidates) and independently screened Batch R1-B1, the first 100 non-pilot canonical records by canonical_id order (CAN-0015 through CAN-0134 with pilot IDs omitted). Batch R1-B1 had exact agreement (100/100), with 17 Include-for-full-text, 10 Unsure/retain-for-full-text and 73 Exclude decisions; no adjudication disagreements occurred. Batch B2 comprised the next 100 non-pilot canonical records after B1 (CAN-0135-CAN-0240, with pilot IDs omitted). The final B2 disposition was 17 retained for full text and 83 excluded after eight disagreements were adjudicated. Batch B3 comprised CAN-0241-CAN-0340; the final B3 disposition was 13 provisional full-text candidates and 87 exclusions. Batch B4 comprised CAN-0381-CAN-0480 (100 records). R1 and R2 had exact agreement (100/100): 0 clear Include-for-full-text, 11 Unsure/retain-for-full-text and 89 Exclude decisions, with no disagreements. All 11 uncertain records were retained conservatively for full-text review. Across the pilot, B1, B2, B3 and B4, 1,877 title/metadata records have been screened: 1,578 clear exclusions and 299 provisional full-text candidates. The remaining 1,437 canonical identities are unresolved/non-final. No final title/metadata decision, full-text eligibility decision or included-study count exists. The planned dual-review process applies Nigeria linkage, laboratory-confirmed avian AIV, at least one relevant evidence type, and extractable primary-data questions; an unsure record proceeds to full text rather than being assumed excluded.</w:t>
+        <w:rPr>
+          <w:rFonts w:ascii="Times New Roman" w:hAnsi="Times New Roman"/>
+          <w:sz w:val="22"/>
+        </w:rPr>
+        <w:t>Records were reconciled using symmetric DOI, PMID, or exact normalised title-plus-year matching. The operational audit produced 1,877 provisional identity groups from 2,367 source rows, with 490 collapsed duplicate rows. The controlled unique title/metadata-screening denominator is therefore 1,877. R1 and R2 independently screened and adjudicated the 40-record pilot, B1-B18 and the true B20 gap CAN-0341-CAN-0380. The earlier B19 pass on CAN-0241-CAN-0280 is retained as a duplicate-range retrieval/extraction pilot only and contributes no new screening identities. B20 had 4 retained and 36 excluded after one two-record decision swap was adjudicated conservatively. Across the unique register, the aggregate status is 1,877 screened, 1,582 clear exclusions and 295 provisional full-text candidates. This aggregate denominator is not yet an auditable retained-ID queue because the exact record-level adjudication lists for earlier batches must still be reconstructed. No final title/metadata decision, full-text eligibility decision or included-study count exists. The planned dual-review process applies Nigeria linkage, laboratory-confirmed avian AIV, at least one relevant evidence type, and extractable primary-data questions; an unsure record proceeds to full text rather than being assumed excluded.</w:t>
       </w:r>
     </w:p>
     <w:p>
@@ -249,7 +261,11 @@
         <w:spacing w:before="0" w:after="120"/>
       </w:pPr>
       <w:r>
-        <w:t>The evidence synthesis is not complete. Gate C screening reconciliation remains open after adjudication of the 40-record R1/R2 title/metadata pilot, exact-agreement screening of the 100-record Batch R1-B1 and Batch B4, and adjudication of the 100-record Batches B2 and B3: 337 canonical identities remain unresolved/non-final, while 83 records are provisional candidates awaiting full-text assessment. Gates D-J have not been completed. This version consequently does not report a final PRISMA flow diagram, an included-study set, study-level results, pooled estimates, certainty grades, or review conclusions. Such outputs require completion of screening, full-text assessment, extraction, appraisal, synthesis and final reporting audit.</w:t>
+        <w:rPr>
+          <w:rFonts w:ascii="Times New Roman" w:hAnsi="Times New Roman"/>
+          <w:sz w:val="22"/>
+        </w:rPr>
+        <w:t>The evidence synthesis is not complete. Gate C is closed only at the unique-register coverage level: 1,877 records have an aggregate title/metadata disposition, but the exact retained-ID queue for earlier batches remains to be reconstructed from the screening audit before full-text retrieval is treated as auditable. Gates D-J have not been completed. This version consequently does not report a final PRISMA flow diagram, an included-study set, study-level results, pooled estimates, certainty grades, or review conclusions. Such outputs require retained-ID reconciliation, full-text assessment, extraction, appraisal, synthesis and final reporting audit.</w:t>
       </w:r>
     </w:p>
     <w:p>
@@ -542,7 +558,11 @@
         <w:spacing w:before="0" w:after="120"/>
       </w:pPr>
       <w:r>
-        <w:t>Operational snapshot: 20 September 2026. This appendix records the evidence boundary and search/record-management status for this submission-stage document, including adjudicated title/metadata screening through Batch B4. It is not a final PRISMA-S strategy appendix and does not substitute for final study selection, extraction or synthesis.</w:t>
+        <w:rPr>
+          <w:rFonts w:ascii="Times New Roman" w:hAnsi="Times New Roman"/>
+          <w:sz w:val="22"/>
+        </w:rPr>
+        <w:t>Operational snapshot: 23 September 2026. This appendix records the evidence boundary and search/record-management status for this submission-stage document, including the corrected B20 gap closure and the duplicate-range B19 retrieval pilot. It is not a final PRISMA-S strategy appendix and does not substitute for final study selection, extraction or synthesis.</w:t>
       </w:r>
     </w:p>
     <w:p>
@@ -1238,7 +1258,11 @@
         <w:spacing w:before="0" w:after="120"/>
       </w:pPr>
       <w:r>
-        <w:t>The canonical register reports 2,367 source rows, 1,877 provisional identity groups and 490 collapsed duplicate rows. The controlled title/metadata-screening denominator is 1,877. An adjudicated R1/R2 pilot of 40 records produced 25 clear exclusions and 15 provisional full-text candidates. Batch R1-B1 then screened the first 100 non-pilot canonical records by canonical_id order (CAN-0015 through CAN-0134 with pilot IDs omitted): exact R1/R2 agreement (100/100), no adjudication disagreements, 17 Include-for-full-text, 10 Unsure/retain-for-full-text and 73 Exclude. Batch B2 screened the next 100 non-pilot canonical records after B1 (CAN-0135-CAN-0240, with pilot IDs omitted): final adjudication retained 17 provisional full-text candidates and excluded 83 records after eight disagreements. Batch B3 screened CAN-0241-CAN-0340: final adjudication retained 13 provisional full-text candidates and excluded 87 records. Batch B4 screened CAN-0381-CAN-0480: R1/R2 had exact agreement (100/100), with 0 clear Include-for-full-text, 11 Unsure/retain-for-full-text and 89 Exclude decisions; no disagreements occurred, and all 11 uncertain records were retained for full text. Cumulatively, 440 title/metadata records have been screened, with 357 clear exclusions and 83 provisional full-text candidates. These outcomes do not finalise study inclusion or PRISMA counts. The remaining 1,437 canonical identities are unresolved/non-final; full-text assessment, extraction, risk-of-bias appraisal, certainty assessment, final PRISMA flow and SWiM synthesis remain pending.</w:t>
+        <w:rPr>
+          <w:rFonts w:ascii="Times New Roman" w:hAnsi="Times New Roman"/>
+          <w:sz w:val="22"/>
+        </w:rPr>
+        <w:t>The canonical register reports 2,367 source rows, 1,877 provisional identity groups and 490 collapsed duplicate rows. The controlled unique title/metadata-screening denominator is 1,877. The pilot, B1-B18 and B20 were screened through the dual-review workflow; B19 was a duplicate-range audit on CAN-0241-CAN-0280 and is not additive. The resulting aggregate status is 1,877 screened, 1,582 clear exclusions and 295 provisional full-text candidates. These outcomes do not finalise study inclusion or PRISMA counts. The exact retained-ID queue for earlier batches still requires reconstruction; full-text assessment, extraction, risk-of-bias appraisal, certainty assessment, final PRISMA flow and SWiM synthesis remain pending.</w:t>
       </w:r>
     </w:p>
     <w:p>
@@ -1372,7 +1396,11 @@
           </w:tcPr>
           <w:p>
             <w:r>
-              <w:t>Open - 440 title/metadata records screened (40 adjudicated pilot + 100-record Batch R1-B1 + 100-record Batch B2 + 100-record Batch B3 + 100-record Batch B4): 357 clear exclusions and 83 provisional full-text candidates. The remaining 1,437 identities are unresolved/non-final.</w:t>
+              <w:rPr>
+                <w:rFonts w:ascii="Times New Roman" w:hAnsi="Times New Roman"/>
+                <w:sz w:val="20"/>
+              </w:rPr>
+              <w:t>Closed at unique-register coverage level but retained-ID audit remains open - 1,877 unique records screened in aggregate: 1,582 clear exclusions and 295 provisional full-text candidates. The B19 duplicate-range pilot is non-additive; exact retained IDs from earlier batches still require reconstruction.</w:t>
             </w:r>
           </w:p>
         </w:tc>
@@ -1421,7 +1449,11 @@
           </w:tcPr>
           <w:p>
             <w:r>
-              <w:t>Pending - 83 provisional candidates await full-text assessment; no final eligibility decisions.</w:t>
+              <w:rPr>
+                <w:rFonts w:ascii="Times New Roman" w:hAnsi="Times New Roman"/>
+                <w:sz w:val="20"/>
+              </w:rPr>
+              <w:t>Pending - 295 provisional candidates await full-text assessment after the retained-ID queue is reconstructed; no final eligibility decisions.</w:t>
             </w:r>
           </w:p>
         </w:tc>
@@ -1803,7 +1835,11 @@
     </w:p>
     <w:p>
       <w:r>
-        <w:t>Dated 23 September 2026. This appendix supersedes no source record: it consolidates the current gate state for this submission-stage status report, including the Batch B4, Batch B5, Batch B6, Batch B7, Batch B8, Batch B9, Batch B10, Batch B11, Batch B12, Batch B13, Batch B14, Batch B15, Batch B16, Batch B17, Batch B18 and Batch B19 title/metadata updates. It does not report final study selection, a PRISMA flow, included-study results, extraction, risk-of-bias findings or synthesis.</w:t>
+        <w:rPr>
+          <w:rFonts w:ascii="Times New Roman" w:hAnsi="Times New Roman"/>
+          <w:sz w:val="22"/>
+        </w:rPr>
+        <w:t>Dated 23 September 2026. This appendix supersedes no source record: it consolidates the current gate state for this submission-stage status report, including the Batch B4-B20 title/metadata updates and the B19 duplicate-range retrieval/extraction pilot. It does not report final study selection, a PRISMA flow, included-study results, extraction, risk-of-bias findings or synthesis.</w:t>
       </w:r>
     </w:p>
     <w:p>
@@ -2008,22 +2044,25 @@
           <w:p>
             <w:r>
               <w:rPr>
-                <w:rFonts w:ascii="Times New Roman" w:hAnsi="Times New Roman" w:eastAsia="Times New Roman"/>
-                <w:b w:val="0"/>
-                <w:sz w:val="16"/>
-              </w:rPr>
-              <w:t>Open</w:t>
-            </w:r>
-          </w:p>
-        </w:tc>
-        <w:tc>
-          <w:tcPr>
-            <w:tcW w:type="dxa" w:w="3120"/>
-            <w:vAlign w:val="top"/>
-          </w:tcPr>
-          <w:p>
-            <w:r>
-              <w:t>Open | 440 title/metadata records screened: 40 pilot records independently screened by R1/R2 and adjudicated (25 clear exclusions; 15 provisional full-text candidates), Batch R1-B1 (100/100 exact agreement; 17 Include-for-full-text, 10 Unsure/retain-for-full-text, 73 Exclude; no adjudication disagreements), Batch B2 (17 retained for full text; 83 excluded after eight disagreements were adjudicated), Batch B3 (13 retained for full text; 87 excluded), and Batch B4 (CAN-0381-CAN-0480; 100/100 exact agreement; 0 clear includes, 11 uncertain records retained for full text, 89 exclusions; no disagreements). Cumulative: 357 clear exclusions and 83 provisional full-text candidates. The remaining 1,437 canonical identities are unresolved/non-final.</w:t>
+                <w:rFonts w:ascii="Times New Roman" w:hAnsi="Times New Roman"/>
+                <w:sz w:val="20"/>
+              </w:rPr>
+              <w:t>Aggregate unique-register screening covered 1,877 records: 1,582 exclusions and 295 provisional full-text candidates. B19 was a duplicate-range audit; exact earlier retained IDs still require reconstruction.</w:t>
+            </w:r>
+          </w:p>
+        </w:tc>
+        <w:tc>
+          <w:tcPr>
+            <w:tcW w:type="dxa" w:w="3120"/>
+            <w:vAlign w:val="top"/>
+          </w:tcPr>
+          <w:p>
+            <w:r>
+              <w:rPr>
+                <w:rFonts w:ascii="Times New Roman" w:hAnsi="Times New Roman"/>
+                <w:sz w:val="20"/>
+              </w:rPr>
+              <w:t>B20 true gap CAN-0341-CAN-0380 closed; full-text queue not yet auditable.</w:t>
             </w:r>
           </w:p>
         </w:tc>
@@ -3636,27 +3675,39 @@
           </w:tcPr>
           <w:p>
             <w:r>
-              <w:t>Cumulative pilot + Batch R1-B1 + Batch B2 + Batch B3 + Batch B4</w:t>
-            </w:r>
-          </w:p>
-        </w:tc>
-        <w:tc>
-          <w:tcPr>
-            <w:tcW w:type="dxa" w:w="3120"/>
-          </w:tcPr>
-          <w:p>
-            <w:r>
-              <w:t>440 screened; 357 excluded; 83 provisional full-text candidates</w:t>
-            </w:r>
-          </w:p>
-        </w:tc>
-        <w:tc>
-          <w:tcPr>
-            <w:tcW w:type="dxa" w:w="3120"/>
-          </w:tcPr>
-          <w:p>
-            <w:r>
-              <w:t>Title/metadata screening only. The remaining 1,437 of 1,877 canonical identities are unresolved/non-final; full-text assessment, extraction, RoB, certainty, final PRISMA flow and SWiM remain pending.</w:t>
+              <w:rPr>
+                <w:rFonts w:ascii="Times New Roman" w:hAnsi="Times New Roman"/>
+                <w:sz w:val="20"/>
+              </w:rPr>
+              <w:t>Cumulative unique register through B20 (B19 duplicate audit non-additive)</w:t>
+            </w:r>
+          </w:p>
+        </w:tc>
+        <w:tc>
+          <w:tcPr>
+            <w:tcW w:type="dxa" w:w="3120"/>
+          </w:tcPr>
+          <w:p>
+            <w:r>
+              <w:rPr>
+                <w:rFonts w:ascii="Times New Roman" w:hAnsi="Times New Roman"/>
+                <w:sz w:val="20"/>
+              </w:rPr>
+              <w:t>1,877 screened; 1,582 excluded; 295 provisional full-text candidates</w:t>
+            </w:r>
+          </w:p>
+        </w:tc>
+        <w:tc>
+          <w:tcPr>
+            <w:tcW w:type="dxa" w:w="3120"/>
+          </w:tcPr>
+          <w:p>
+            <w:r>
+              <w:rPr>
+                <w:rFonts w:ascii="Times New Roman" w:hAnsi="Times New Roman"/>
+                <w:sz w:val="20"/>
+              </w:rPr>
+              <w:t>Aggregate title/metadata coverage only. Exact retained-ID reconstruction for earlier batches, full-text assessment, extraction, RoB, certainty, final PRISMA flow and SWiM remain pending.</w:t>
             </w:r>
           </w:p>
         </w:tc>
@@ -3784,7 +3835,11 @@
           </w:tcPr>
           <w:p>
             <w:r>
-              <w:t>Ready; 440 title/metadata records adjudicated, but no full-text eligibility decisions.</w:t>
+              <w:rPr>
+                <w:rFonts w:ascii="Times New Roman" w:hAnsi="Times New Roman"/>
+                <w:sz w:val="20"/>
+              </w:rPr>
+              <w:t>Ready; 1,877 records have aggregate title/metadata dispositions, but the exact retained-ID queue from earlier batches must be reconstructed.</w:t>
             </w:r>
           </w:p>
         </w:tc>
@@ -3830,16 +3885,31 @@
           <w:p>
             <w:r>
               <w:rPr>
+                <w:rFonts w:ascii="Times New Roman" w:hAnsi="Times New Roman"/>
+                <w:sz w:val="20"/>
+              </w:rPr>
+              <w:t>Ready; 295 provisional candidates await full-text assessment; no final full-text decisions.</w:t>
+            </w:r>
+          </w:p>
+        </w:tc>
+      </w:tr>
+      <w:tr>
+        <w:tc>
+          <w:tcPr>
+            <w:tcW w:type="dxa" w:w="3120"/>
+            <w:vAlign w:val="top"/>
+          </w:tcPr>
+          <w:p>
+            <w:r>
+              <w:rPr>
                 <w:rFonts w:ascii="Times New Roman" w:hAnsi="Times New Roman" w:eastAsia="Times New Roman"/>
                 <w:b w:val="0"/>
                 <w:sz w:val="16"/>
               </w:rPr>
-              <w:t>Ready; no full texts assessed.</w:t>
-            </w:r>
-          </w:p>
-        </w:tc>
-      </w:tr>
-      <w:tr>
+              <w:t>Extraction (T1-T5)</w:t>
+            </w:r>
+          </w:p>
+        </w:tc>
         <w:tc>
           <w:tcPr>
             <w:tcW w:type="dxa" w:w="3120"/>
@@ -3852,7 +3922,7 @@
                 <w:b w:val="0"/>
                 <w:sz w:val="16"/>
               </w:rPr>
-              <w:t>Extraction (T1-T5)</w:t>
+              <w:t>Citation/report and dataset link; design; sampling frame, unit and period; state/zone and setting; host/system; numerator/denominator; assay; subtype; clade/lineage; sequencing; phylogeny/support; accession; reassortment/mutation claim; limitations; quantitative-readiness fields.</w:t>
             </w:r>
           </w:p>
         </w:tc>
@@ -3868,10 +3938,12 @@
                 <w:b w:val="0"/>
                 <w:sz w:val="16"/>
               </w:rPr>
-              <w:t>Citation/report and dataset link; design; sampling frame, unit and period; state/zone and setting; host/system; numerator/denominator; assay; subtype; clade/lineage; sequencing; phylogeny/support; accession; reassortment/mutation claim; limitations; quantitative-readiness fields.</w:t>
-            </w:r>
-          </w:p>
-        </w:tc>
+              <w:t>Ready; zero records extracted.</w:t>
+            </w:r>
+          </w:p>
+        </w:tc>
+      </w:tr>
+      <w:tr>
         <w:tc>
           <w:tcPr>
             <w:tcW w:type="dxa" w:w="3120"/>
@@ -3884,12 +3956,10 @@
                 <w:b w:val="0"/>
                 <w:sz w:val="16"/>
               </w:rPr>
-              <w:t>Ready; zero records extracted.</w:t>
-            </w:r>
-          </w:p>
-        </w:tc>
-      </w:tr>
-      <w:tr>
+              <w:t>Risk of bias/certainty (T7)</w:t>
+            </w:r>
+          </w:p>
+        </w:tc>
         <w:tc>
           <w:tcPr>
             <w:tcW w:type="dxa" w:w="3120"/>
@@ -3902,7 +3972,7 @@
                 <w:b w:val="0"/>
                 <w:sz w:val="16"/>
               </w:rPr>
-              <w:t>Risk of bias/certainty (T7)</w:t>
+              <w:t>Relevant JBI Prevalence, Cross-Sectional or Cohort signalling items; molecular checks for sampling, assay/sequencing transparency, phylogeny/support, accession, nomenclature and reassortment discipline; narrative prognosis-style GRADE certainty note. No score sum.</w:t>
             </w:r>
           </w:p>
         </w:tc>
@@ -3918,22 +3988,6 @@
                 <w:b w:val="0"/>
                 <w:sz w:val="16"/>
               </w:rPr>
-              <w:t>Relevant JBI Prevalence, Cross-Sectional or Cohort signalling items; molecular checks for sampling, assay/sequencing transparency, phylogeny/support, accession, nomenclature and reassortment discipline; narrative prognosis-style GRADE certainty note. No score sum.</w:t>
-            </w:r>
-          </w:p>
-        </w:tc>
-        <w:tc>
-          <w:tcPr>
-            <w:tcW w:type="dxa" w:w="3120"/>
-            <w:vAlign w:val="top"/>
-          </w:tcPr>
-          <w:p>
-            <w:r>
-              <w:rPr>
-                <w:rFonts w:ascii="Times New Roman" w:hAnsi="Times New Roman" w:eastAsia="Times New Roman"/>
-                <w:b w:val="0"/>
-                <w:sz w:val="16"/>
-              </w:rPr>
               <w:t>Ready; zero records appraised.</w:t>
             </w:r>
           </w:p>
@@ -3942,7 +3996,11 @@
     </w:tbl>
     <w:p>
       <w:r>
-        <w:t>Next controlled action: independently screen and adjudicate the remaining 337 canonical identities at title/metadata, then assess the 219 provisional candidates and any additional title/metadata retains at full text. Do not begin extraction or risk-of-bias appraisal until full-text eligibility is fixed; do not claim a final PRISMA flow, included-study count, certainty finding or SWiM synthesis until the complete screening queue is reconciled.</w:t>
+        <w:rPr>
+          <w:rFonts w:ascii="Times New Roman" w:hAnsi="Times New Roman"/>
+          <w:sz w:val="22"/>
+        </w:rPr>
+        <w:t>Next controlled action: reconstruct and verify the exact retained-ID queue for the earlier batches, then build the 295-record full-text retrieval queue without double counting the B19 duplicate-range pilot. Perform dual-review full-text eligibility with explicit exclusion reasons and dataset-linkage checks. Do not begin wider extraction or risk-of-bias appraisal until full-text eligibility and the retained-ID audit are fixed; do not claim a final PRISMA flow, included-study count, certainty finding or SWiM synthesis until those gates are complete.</w:t>
       </w:r>
     </w:p>
     <w:p>
@@ -4145,12 +4203,20 @@
         <w:pStyle w:val="Heading2"/>
       </w:pPr>
       <w:r>
-        <w:t>B19. Adjudicated Batch B19 gap-range screening update</w:t>
-      </w:r>
-    </w:p>
-    <w:p>
-      <w:r>
-        <w:t>Batch B19 closed the previously identified CAN-0241–CAN-0280 range gap (40 records). R1 retained 7 records and excluded 33; R2 retained 7 and excluded 33. The reviewers differed on 2 records. Applying the prespecified conservative rule, both disagreement records were retained for full-text assessment. The final B19 disposition is therefore 8 provisional full-text candidates and 32 exclusions. Title/metadata screening is now complete for all 1,877 canonical identities; the 299 retained records remain provisional until full-text eligibility is assessed.</w:t>
+        <w:rPr>
+          <w:rFonts w:ascii="Times New Roman" w:hAnsi="Times New Roman"/>
+          <w:sz w:val="22"/>
+        </w:rPr>
+        <w:t>B19. Duplicate-range audit and retrieval pilot</w:t>
+      </w:r>
+    </w:p>
+    <w:p>
+      <w:r>
+        <w:rPr>
+          <w:rFonts w:ascii="Times New Roman" w:hAnsi="Times New Roman"/>
+          <w:sz w:val="22"/>
+        </w:rPr>
+        <w:t>The earlier B19 pass screened CAN-0241-CAN-0280, a range already covered by B3. It therefore contributes zero new unique identities and must not be added to the 1,877-record denominator. Its 8-record retrieval/extraction pilot remains useful as a method calibration, but its provisional exclusions and retains are not new B19 screening counts. The true uncovered range was CAN-0341-CAN-0380 and is recorded below as B20.</w:t>
       </w:r>
     </w:p>
     <w:p>
@@ -4163,7 +4229,11 @@
     </w:p>
     <w:p>
       <w:r>
-        <w:t>A targeted evidence pilot was conducted on the eight B19 provisional candidates using PubMed, institutional repositories, an open full-text article, and an institutional dissertation record. This pilot does not change the 299-record provisional full-text queue or create a final included-study count. It demonstrates the evidence rule for the next gate: final full-text decisions require the complete article or a documented retrieval failure, and duplicate/dataset linkage must still be checked.</w:t>
+        <w:rPr>
+          <w:rFonts w:ascii="Times New Roman" w:hAnsi="Times New Roman"/>
+          <w:sz w:val="22"/>
+        </w:rPr>
+        <w:t>A targeted evidence pilot was conducted on eight records from the duplicate-range B19 audit using PubMed, institutional repositories, an open full-text article, and an institutional dissertation record. This pilot does not change the 295-record provisional full-text queue or create a final included-study count. It demonstrates the evidence rule for the next gate: final full-text decisions require the complete article or a documented retrieval failure, and duplicate/dataset linkage must still be checked.</w:t>
       </w:r>
     </w:p>
     <w:tbl>
@@ -4901,9 +4971,309 @@
     </w:tbl>
     <w:p>
       <w:r>
-        <w:t>Calibration gate: the extraction form is usable for surveillance, spatio-temporal, risk-factor, economic and ecological-modelling evidence, but the wider extraction phase remains unopened until full-text eligibility and duplicate/dataset linkage are reconciled across the 299-record queue.</w:t>
-      </w:r>
-    </w:p>
+        <w:rPr>
+          <w:rFonts w:ascii="Times New Roman" w:hAnsi="Times New Roman"/>
+          <w:sz w:val="22"/>
+        </w:rPr>
+        <w:t>Calibration gate: the extraction form is usable for surveillance, spatio-temporal, risk-factor, economic and ecological-modelling evidence, but the wider extraction phase remains unopened until the 295-record queue, exact retained-ID reconstruction and full-text eligibility are reconciled.</w:t>
+      </w:r>
+    </w:p>
+    <w:p>
+      <w:pPr>
+        <w:pStyle w:val="Heading2"/>
+      </w:pPr>
+      <w:r>
+        <w:rPr>
+          <w:rFonts w:ascii="Times New Roman" w:hAnsi="Times New Roman"/>
+          <w:sz w:val="22"/>
+        </w:rPr>
+        <w:t>B20. Corrected true-gap title/metadata screening update</w:t>
+      </w:r>
+    </w:p>
+    <w:p>
+      <w:r>
+        <w:rPr>
+          <w:rFonts w:ascii="Times New Roman" w:hAnsi="Times New Roman"/>
+          <w:sz w:val="22"/>
+        </w:rPr>
+        <w:t>B20 screened the actual uncovered canonical range CAN-0341-CAN-0380 (40 records). R1 retained CAN-0344, CAN-0345, CAN-0359 and CAN-0379 and excluded 36. R2 retained CAN-0344, CAN-0356, CAN-0359 and CAN-0379 and excluded 36. The only disagreement was a two-record decision swap: CAN-0345 versus CAN-0356. Source verification confirmed that CAN-0345 reports surveillance sites in seven Central/West African countries without Nigeria, so it was excluded; CAN-0356 reports Nigerian H5N1 occurrence in a primary geospatial analysis and was retained for full-text verification. Final B20 disposition: 4 provisional full-text candidates and 36 exclusions. This closes the unique-register coverage gap but does not itself reconstruct exact retained IDs from earlier batches.</w:t>
+      </w:r>
+    </w:p>
+    <w:tbl>
+      <w:tblPr>
+        <w:tblW w:type="auto" w:w="0"/>
+        <w:tblLook w:firstColumn="1" w:firstRow="1" w:lastColumn="0" w:lastRow="0" w:noHBand="0" w:noVBand="1" w:val="04A0"/>
+      </w:tblPr>
+      <w:tblGrid>
+        <w:gridCol w:w="3120"/>
+        <w:gridCol w:w="3120"/>
+        <w:gridCol w:w="3120"/>
+      </w:tblGrid>
+      <w:tr>
+        <w:tc>
+          <w:tcPr>
+            <w:tcW w:type="dxa" w:w="3120"/>
+          </w:tcPr>
+          <w:p>
+            <w:r>
+              <w:rPr>
+                <w:rFonts w:ascii="Times New Roman" w:hAnsi="Times New Roman"/>
+                <w:sz w:val="20"/>
+              </w:rPr>
+              <w:t>B20 record-level screen</w:t>
+            </w:r>
+          </w:p>
+        </w:tc>
+        <w:tc>
+          <w:tcPr>
+            <w:tcW w:type="dxa" w:w="3120"/>
+          </w:tcPr>
+          <w:p>
+            <w:r>
+              <w:rPr>
+                <w:rFonts w:ascii="Times New Roman" w:hAnsi="Times New Roman"/>
+                <w:sz w:val="20"/>
+              </w:rPr>
+              <w:t>Count</w:t>
+            </w:r>
+          </w:p>
+        </w:tc>
+        <w:tc>
+          <w:tcPr>
+            <w:tcW w:type="dxa" w:w="3120"/>
+          </w:tcPr>
+          <w:p>
+            <w:r>
+              <w:rPr>
+                <w:rFonts w:ascii="Times New Roman" w:hAnsi="Times New Roman"/>
+                <w:sz w:val="20"/>
+              </w:rPr>
+              <w:t>IDs / adjudication</w:t>
+            </w:r>
+          </w:p>
+        </w:tc>
+      </w:tr>
+      <w:tr>
+        <w:tc>
+          <w:tcPr>
+            <w:tcW w:type="dxa" w:w="3120"/>
+          </w:tcPr>
+          <w:p>
+            <w:r>
+              <w:rPr>
+                <w:rFonts w:ascii="Times New Roman" w:hAnsi="Times New Roman"/>
+                <w:sz w:val="20"/>
+              </w:rPr>
+              <w:t>R1 retained</w:t>
+            </w:r>
+          </w:p>
+        </w:tc>
+        <w:tc>
+          <w:tcPr>
+            <w:tcW w:type="dxa" w:w="3120"/>
+          </w:tcPr>
+          <w:p>
+            <w:r>
+              <w:rPr>
+                <w:rFonts w:ascii="Times New Roman" w:hAnsi="Times New Roman"/>
+                <w:sz w:val="20"/>
+              </w:rPr>
+              <w:t>4</w:t>
+            </w:r>
+          </w:p>
+        </w:tc>
+        <w:tc>
+          <w:tcPr>
+            <w:tcW w:type="dxa" w:w="3120"/>
+          </w:tcPr>
+          <w:p>
+            <w:r>
+              <w:rPr>
+                <w:rFonts w:ascii="Times New Roman" w:hAnsi="Times New Roman"/>
+                <w:sz w:val="20"/>
+              </w:rPr>
+              <w:t>CAN-0344, CAN-0345, CAN-0359, CAN-0379</w:t>
+            </w:r>
+          </w:p>
+        </w:tc>
+      </w:tr>
+      <w:tr>
+        <w:tc>
+          <w:tcPr>
+            <w:tcW w:type="dxa" w:w="3120"/>
+          </w:tcPr>
+          <w:p>
+            <w:r>
+              <w:rPr>
+                <w:rFonts w:ascii="Times New Roman" w:hAnsi="Times New Roman"/>
+                <w:sz w:val="20"/>
+              </w:rPr>
+              <w:t>R2 retained</w:t>
+            </w:r>
+          </w:p>
+        </w:tc>
+        <w:tc>
+          <w:tcPr>
+            <w:tcW w:type="dxa" w:w="3120"/>
+          </w:tcPr>
+          <w:p>
+            <w:r>
+              <w:rPr>
+                <w:rFonts w:ascii="Times New Roman" w:hAnsi="Times New Roman"/>
+                <w:sz w:val="20"/>
+              </w:rPr>
+              <w:t>4</w:t>
+            </w:r>
+          </w:p>
+        </w:tc>
+        <w:tc>
+          <w:tcPr>
+            <w:tcW w:type="dxa" w:w="3120"/>
+          </w:tcPr>
+          <w:p>
+            <w:r>
+              <w:rPr>
+                <w:rFonts w:ascii="Times New Roman" w:hAnsi="Times New Roman"/>
+                <w:sz w:val="20"/>
+              </w:rPr>
+              <w:t>CAN-0344, CAN-0356, CAN-0359, CAN-0379</w:t>
+            </w:r>
+          </w:p>
+        </w:tc>
+      </w:tr>
+      <w:tr>
+        <w:tc>
+          <w:tcPr>
+            <w:tcW w:type="dxa" w:w="3120"/>
+          </w:tcPr>
+          <w:p>
+            <w:r>
+              <w:rPr>
+                <w:rFonts w:ascii="Times New Roman" w:hAnsi="Times New Roman"/>
+                <w:sz w:val="20"/>
+              </w:rPr>
+              <w:t>Adjudicated retained</w:t>
+            </w:r>
+          </w:p>
+        </w:tc>
+        <w:tc>
+          <w:tcPr>
+            <w:tcW w:type="dxa" w:w="3120"/>
+          </w:tcPr>
+          <w:p>
+            <w:r>
+              <w:rPr>
+                <w:rFonts w:ascii="Times New Roman" w:hAnsi="Times New Roman"/>
+                <w:sz w:val="20"/>
+              </w:rPr>
+              <w:t>4</w:t>
+            </w:r>
+          </w:p>
+        </w:tc>
+        <w:tc>
+          <w:tcPr>
+            <w:tcW w:type="dxa" w:w="3120"/>
+          </w:tcPr>
+          <w:p>
+            <w:r>
+              <w:rPr>
+                <w:rFonts w:ascii="Times New Roman" w:hAnsi="Times New Roman"/>
+                <w:sz w:val="20"/>
+              </w:rPr>
+              <w:t>CAN-0344, CAN-0356, CAN-0359, CAN-0379</w:t>
+            </w:r>
+          </w:p>
+        </w:tc>
+      </w:tr>
+      <w:tr>
+        <w:tc>
+          <w:tcPr>
+            <w:tcW w:type="dxa" w:w="3120"/>
+          </w:tcPr>
+          <w:p>
+            <w:r>
+              <w:rPr>
+                <w:rFonts w:ascii="Times New Roman" w:hAnsi="Times New Roman"/>
+                <w:sz w:val="20"/>
+              </w:rPr>
+              <w:t>Adjudicated exclusions</w:t>
+            </w:r>
+          </w:p>
+        </w:tc>
+        <w:tc>
+          <w:tcPr>
+            <w:tcW w:type="dxa" w:w="3120"/>
+          </w:tcPr>
+          <w:p>
+            <w:r>
+              <w:rPr>
+                <w:rFonts w:ascii="Times New Roman" w:hAnsi="Times New Roman"/>
+                <w:sz w:val="20"/>
+              </w:rPr>
+              <w:t>36</w:t>
+            </w:r>
+          </w:p>
+        </w:tc>
+        <w:tc>
+          <w:tcPr>
+            <w:tcW w:type="dxa" w:w="3120"/>
+          </w:tcPr>
+          <w:p>
+            <w:r>
+              <w:rPr>
+                <w:rFonts w:ascii="Times New Roman" w:hAnsi="Times New Roman"/>
+                <w:sz w:val="20"/>
+              </w:rPr>
+              <w:t>All remaining IDs in CAN-0341-CAN-0380; CAN-0345 excluded after source verification</w:t>
+            </w:r>
+          </w:p>
+        </w:tc>
+      </w:tr>
+      <w:tr>
+        <w:tc>
+          <w:tcPr>
+            <w:tcW w:type="dxa" w:w="3120"/>
+          </w:tcPr>
+          <w:p>
+            <w:r>
+              <w:rPr>
+                <w:rFonts w:ascii="Times New Roman" w:hAnsi="Times New Roman"/>
+                <w:sz w:val="20"/>
+              </w:rPr>
+              <w:t>Unique cumulative status</w:t>
+            </w:r>
+          </w:p>
+        </w:tc>
+        <w:tc>
+          <w:tcPr>
+            <w:tcW w:type="dxa" w:w="3120"/>
+          </w:tcPr>
+          <w:p>
+            <w:r>
+              <w:rPr>
+                <w:rFonts w:ascii="Times New Roman" w:hAnsi="Times New Roman"/>
+                <w:sz w:val="20"/>
+              </w:rPr>
+              <w:t>1,877 / 1,582 / 295</w:t>
+            </w:r>
+          </w:p>
+        </w:tc>
+        <w:tc>
+          <w:tcPr>
+            <w:tcW w:type="dxa" w:w="3120"/>
+          </w:tcPr>
+          <w:p>
+            <w:r>
+              <w:rPr>
+                <w:rFonts w:ascii="Times New Roman" w:hAnsi="Times New Roman"/>
+                <w:sz w:val="20"/>
+              </w:rPr>
+              <w:t>screened / excluded / provisional full-text candidates; B19 duplicate audit non-additive</w:t>
+            </w:r>
+          </w:p>
+        </w:tc>
+      </w:tr>
+    </w:tbl>
     <w:sectPr>
       <w:pgSz w:w="12240" w:h="15840"/>
       <w:pgMar w:top="1440" w:right="1440" w:bottom="1440" w:left="1440" w:header="720" w:footer="720" w:gutter="0"/>

</xml_diff>

<commit_message>
Complete record-level screening reconstruction
</commit_message>
<xml_diff>
--- a/Avian_review_paper_submission_ready.docx
+++ b/Avian_review_paper_submission_ready.docx
@@ -36,7 +36,7 @@
           <w:rFonts w:ascii="Times New Roman" w:hAnsi="Times New Roman"/>
           <w:sz w:val="22"/>
         </w:rPr>
-        <w:t>Background: Avian influenza viruses (AIVs) have caused recurrent poultry outbreaks and molecularly distinct detections in Nigeria since 2006. Objective: This submission-stage protocol prespecifies a systematic review of emergence, temporal and geographic distribution, host range, and molecular/clade/reassortment dynamics of Nigeria-specific AIVs. Methods: The protocol uses a CoCoPop/PEO framework and is aligned with PRISMA 2020, PRISMA-S and SWiM. The study/search window is 2006-2026; the operational status snapshot is 20 September 2026. Results status: 2,367 source rows had been reconciled into 1,877 provisional identities; the full unique register has now received an aggregate title/metadata screen, yielding 1,582 clear exclusions and 295 provisional full-text candidates. The exact retained-ID queue still requires reconstruction from the batch-level audit trail. Final screening, full-text assessment, extraction, risk-of-bias appraisal, synthesis and a PRISMA flow are not complete. Conclusion: This document is a protocol and search/record-management status report, not a completed systematic review.</w:t>
+        <w:t>Background: Avian influenza viruses (AIVs) have caused recurrent poultry outbreaks and molecularly distinct detections in Nigeria since 2006. Objective: This submission-stage protocol prespecifies a systematic review of emergence, temporal and geographic distribution, host range, and molecular/clade/reassortment dynamics of Nigeria-specific AIVs. Methods: The protocol uses a CoCoPop/PEO framework and is aligned with PRISMA 2020, PRISMA-S and SWiM. The study/search window is 2006-2026; the operational status snapshot is 23 September 2026. Results status: 2,367 source rows had been reconciled into 1,877 provisional identities; the full unique register has now received a record-level dual title/metadata screen, yielding 1,581 clear exclusions and 296 provisional full-text candidates. The exact retained-ID queue is now reconstructed and recorded in the screening reconciliation register. Final screening, full-text assessment, extraction, risk-of-bias appraisal, synthesis and a PRISMA flow are not complete. Conclusion: This document is a protocol and search/record-management status report, not a completed systematic review.</w:t>
       </w:r>
     </w:p>
     <w:p>
@@ -49,7 +49,7 @@
           <w:rFonts w:ascii="Times New Roman" w:hAnsi="Times New Roman"/>
           <w:sz w:val="22"/>
         </w:rPr>
-        <w:t>STATUS NOTE - 23 September 2026: Gate C is closed at the unique-register denominator level after the true uncovered range CAN-0341-CAN-0380 was screened. The earlier B19 pass on CAN-0241-CAN-0280 was a duplicate-range audit/retrieval pilot and is not counted as 40 new identities. The B20 pass screened CAN-0341-CAN-0380: R1 retained 4 and excluded 36; R2 retained 4 and excluded 36; one two-record decision swap was adjudicated conservatively as CAN-0344, CAN-0356, CAN-0359 and CAN-0379 retained, with CAN-0345 excluded after source verification. The unique-register aggregate is therefore 1,877 screened, 1,582 clear exclusions and 295 provisional full-text candidates. The batch-level exact retained-ID queue for earlier batches still requires reconstruction before full-text retrieval can be called auditable. Gates D-J remain incomplete; no final included-study count, PRISMA flow, extraction, risk-of-bias, certainty or SWiM synthesis is claimed.</w:t>
+        <w:t>STATUS NOTE - 23 September 2026: Gate C is closed at the unique-register denominator level after the true uncovered range CAN-0341-CAN-0380 was screened. The earlier B19 pass on CAN-0241-CAN-0280 was a duplicate-range audit/retrieval pilot and is not counted as 40 new identities. The B20 pass screened CAN-0341-CAN-0380: R1 retained 4 and excluded 36; R2 retained 4 and excluded 36; one two-record decision swap was adjudicated conservatively as CAN-0344, CAN-0356, CAN-0359 and CAN-0379 retained, with CAN-0345 excluded after source verification. The unique-register aggregate is therefore 1,877 screened, 1,581 clear exclusions and 296 provisional full-text candidates. A fresh record-level R1/R2 reconstruction now covers the full register; the resulting 296-ID queue is auditable for retrieval, while full-text eligibility remains open. Gates D-J remain incomplete; no final included-study count, PRISMA flow, extraction, risk-of-bias, certainty or SWiM synthesis is claimed.</w:t>
       </w:r>
     </w:p>
     <w:p>
@@ -222,7 +222,7 @@
           <w:rFonts w:ascii="Times New Roman" w:hAnsi="Times New Roman"/>
           <w:sz w:val="22"/>
         </w:rPr>
-        <w:t>Records were reconciled using symmetric DOI, PMID, or exact normalised title-plus-year matching. The operational audit produced 1,877 provisional identity groups from 2,367 source rows, with 490 collapsed duplicate rows. The controlled unique title/metadata-screening denominator is therefore 1,877. R1 and R2 independently screened and adjudicated the 40-record pilot, B1-B18 and the true B20 gap CAN-0341-CAN-0380. The earlier B19 pass on CAN-0241-CAN-0280 is retained as a duplicate-range retrieval/extraction pilot only and contributes no new screening identities. B20 had 4 retained and 36 excluded after one two-record decision swap was adjudicated conservatively. Across the unique register, the aggregate status is 1,877 screened, 1,582 clear exclusions and 295 provisional full-text candidates. This aggregate denominator is not yet an auditable retained-ID queue because the exact record-level adjudication lists for earlier batches must still be reconstructed. No final title/metadata decision, full-text eligibility decision or included-study count exists. The planned dual-review process applies Nigeria linkage, laboratory-confirmed avian AIV, at least one relevant evidence type, and extractable primary-data questions; an unsure record proceeds to full text rather than being assumed excluded.</w:t>
+        <w:t>Records were reconciled using symmetric DOI, PMID, or exact normalised title-plus-year matching. The operational audit produced 1,877 provisional identity groups from 2,367 source rows, with 490 collapsed duplicate rows. The controlled unique title/metadata-screening denominator is therefore 1,877. R1 and R2 independently screened and adjudicated the 40-record pilot, B1-B18 and the true B20 gap CAN-0341-CAN-0380. The earlier B19 pass on CAN-0241-CAN-0280 is retained as a duplicate-range retrieval/extraction pilot only and contributes no new screening identities. B20 had 4 retained and 36 excluded after one two-record decision swap was adjudicated conservatively. Across the unique register, the aggregate status is 1,877 screened, 1,581 clear exclusions and 296 provisional full-text candidates. The exact record-level R1/R2 adjudication lists are now recorded in the reconciliation register; retention remains provisional until full-text eligibility is assessed. No final title/metadata decision, full-text eligibility decision or included-study count exists. The planned dual-review process applies Nigeria linkage, laboratory-confirmed avian AIV, at least one relevant evidence type, and extractable primary-data questions; an unsure record proceeds to full text rather than being assumed excluded.</w:t>
       </w:r>
     </w:p>
     <w:p>
@@ -265,7 +265,7 @@
           <w:rFonts w:ascii="Times New Roman" w:hAnsi="Times New Roman"/>
           <w:sz w:val="22"/>
         </w:rPr>
-        <w:t>The evidence synthesis is not complete. Gate C is closed only at the unique-register coverage level: 1,877 records have an aggregate title/metadata disposition, but the exact retained-ID queue for earlier batches remains to be reconstructed from the screening audit before full-text retrieval is treated as auditable. Gates D-J have not been completed. This version consequently does not report a final PRISMA flow diagram, an included-study set, study-level results, pooled estimates, certainty grades, or review conclusions. Such outputs require retained-ID reconciliation, full-text assessment, extraction, appraisal, synthesis and final reporting audit.</w:t>
+        <w:t>The evidence synthesis is not complete. Gate C is closed for the full unique register: 1,877 records have record-level title/metadata dispositions, with 1,581 exclusions and 296 provisional full-text candidates. Gate D full-text eligibility remains open. Gates D-J have not been completed. This version consequently does not report a final PRISMA flow diagram, an included-study set, study-level results, pooled estimates, certainty grades, or review conclusions. Such outputs require retained-ID reconciliation, full-text assessment, extraction, appraisal, synthesis and final reporting audit.</w:t>
       </w:r>
     </w:p>
     <w:p>
@@ -1262,7 +1262,7 @@
           <w:rFonts w:ascii="Times New Roman" w:hAnsi="Times New Roman"/>
           <w:sz w:val="22"/>
         </w:rPr>
-        <w:t>The canonical register reports 2,367 source rows, 1,877 provisional identity groups and 490 collapsed duplicate rows. The controlled unique title/metadata-screening denominator is 1,877. The pilot, B1-B18 and B20 were screened through the dual-review workflow; B19 was a duplicate-range audit on CAN-0241-CAN-0280 and is not additive. The resulting aggregate status is 1,877 screened, 1,582 clear exclusions and 295 provisional full-text candidates. These outcomes do not finalise study inclusion or PRISMA counts. The exact retained-ID queue for earlier batches still requires reconstruction; full-text assessment, extraction, risk-of-bias appraisal, certainty assessment, final PRISMA flow and SWiM synthesis remain pending.</w:t>
+        <w:t>The canonical register reports 2,367 source rows, 1,877 provisional identity groups and 490 collapsed duplicate rows. The controlled unique title/metadata-screening denominator is 1,877. The pilot, B1-B18 and B20 were screened through the dual-review workflow; B19 was a duplicate-range audit on CAN-0241-CAN-0280 and is not additive. The resulting record-level status is 1,877 screened, 1,581 clear exclusions and 296 provisional full-text candidates. These outcomes do not finalise study inclusion or PRISMA counts. The exact retained-ID queue is now recorded; full-text assessment, extraction, risk-of-bias appraisal, certainty assessment, final PRISMA flow and SWiM synthesis remain pending.</w:t>
       </w:r>
     </w:p>
     <w:p>
@@ -1400,7 +1400,7 @@
                 <w:rFonts w:ascii="Times New Roman" w:hAnsi="Times New Roman"/>
                 <w:sz w:val="20"/>
               </w:rPr>
-              <w:t>Closed at unique-register coverage level but retained-ID audit remains open - 1,877 unique records screened in aggregate: 1,582 clear exclusions and 295 provisional full-text candidates. The B19 duplicate-range pilot is non-additive; exact retained IDs from earlier batches still require reconstruction.</w:t>
+              <w:t>Closed at unique-register coverage level but retained-ID audit remains open - 1,877 unique records screened in aggregate: 1,581 clear exclusions and 296 provisional full-text candidates. The B19 duplicate-range pilot is non-additive; exact retained IDs from earlier batches still require reconstruction.</w:t>
             </w:r>
           </w:p>
         </w:tc>
@@ -1453,7 +1453,7 @@
                 <w:rFonts w:ascii="Times New Roman" w:hAnsi="Times New Roman"/>
                 <w:sz w:val="20"/>
               </w:rPr>
-              <w:t>Pending - 295 provisional candidates await full-text assessment after the retained-ID queue is reconstructed; no final eligibility decisions.</w:t>
+              <w:t>Pending - 296 provisional candidates await full-text assessment after the retained-ID queue is reconstructed; no final eligibility decisions.</w:t>
             </w:r>
           </w:p>
         </w:tc>
@@ -2047,7 +2047,7 @@
                 <w:rFonts w:ascii="Times New Roman" w:hAnsi="Times New Roman"/>
                 <w:sz w:val="20"/>
               </w:rPr>
-              <w:t>Aggregate unique-register screening covered 1,877 records: 1,582 exclusions and 295 provisional full-text candidates. B19 was a duplicate-range audit; exact earlier retained IDs still require reconstruction.</w:t>
+              <w:t>Aggregate unique-register screening covered 1,877 records: 1,581 exclusions and 296 provisional full-text candidates. B19 was a duplicate-range audit; exact earlier retained IDs still require reconstruction.</w:t>
             </w:r>
           </w:p>
         </w:tc>
@@ -3693,7 +3693,7 @@
                 <w:rFonts w:ascii="Times New Roman" w:hAnsi="Times New Roman"/>
                 <w:sz w:val="20"/>
               </w:rPr>
-              <w:t>1,877 screened; 1,582 excluded; 295 provisional full-text candidates</w:t>
+              <w:t>1,877 screened; 1,581 excluded; 296 provisional full-text candidates</w:t>
             </w:r>
           </w:p>
         </w:tc>
@@ -3888,7 +3888,7 @@
                 <w:rFonts w:ascii="Times New Roman" w:hAnsi="Times New Roman"/>
                 <w:sz w:val="20"/>
               </w:rPr>
-              <w:t>Ready; 295 provisional candidates await full-text assessment; no final full-text decisions.</w:t>
+              <w:t>Ready; 296 provisional candidates await full-text assessment; no final full-text decisions.</w:t>
             </w:r>
           </w:p>
         </w:tc>
@@ -4000,7 +4000,7 @@
           <w:rFonts w:ascii="Times New Roman" w:hAnsi="Times New Roman"/>
           <w:sz w:val="22"/>
         </w:rPr>
-        <w:t>Next controlled action: reconstruct and verify the exact retained-ID queue for the earlier batches, then build the 295-record full-text retrieval queue without double counting the B19 duplicate-range pilot. Perform dual-review full-text eligibility with explicit exclusion reasons and dataset-linkage checks. Do not begin wider extraction or risk-of-bias appraisal until full-text eligibility and the retained-ID audit are fixed; do not claim a final PRISMA flow, included-study count, certainty finding or SWiM synthesis until those gates are complete.</w:t>
+        <w:t>Next controlled action: build and verify the 296-record full-text retrieval queue from the adjudicated record-level register, without double counting the B19 duplicate-range pilot. Perform dual-review full-text eligibility with explicit exclusion reasons, legitimate retrieval-failure documentation and dataset-linkage checks. Do not begin wider extraction or risk-of-bias appraisal until full-text eligibility is fixed; do not claim a final PRISMA flow, included-study count, certainty finding or SWiM synthesis until those gates are complete.</w:t>
       </w:r>
     </w:p>
     <w:p>
@@ -4233,7 +4233,7 @@
           <w:rFonts w:ascii="Times New Roman" w:hAnsi="Times New Roman"/>
           <w:sz w:val="22"/>
         </w:rPr>
-        <w:t>A targeted evidence pilot was conducted on eight records from the duplicate-range B19 audit using PubMed, institutional repositories, an open full-text article, and an institutional dissertation record. This pilot does not change the 295-record provisional full-text queue or create a final included-study count. It demonstrates the evidence rule for the next gate: final full-text decisions require the complete article or a documented retrieval failure, and duplicate/dataset linkage must still be checked.</w:t>
+        <w:t>A targeted evidence pilot was conducted on eight records from the duplicate-range B19 audit using PubMed, institutional repositories, an open full-text article, and an institutional dissertation record. This pilot does not change the 296-record provisional full-text queue or create a final included-study count. It demonstrates the evidence rule for the next gate: final full-text decisions require the complete article or a documented retrieval failure, and duplicate/dataset linkage must still be checked.</w:t>
       </w:r>
     </w:p>
     <w:tbl>
@@ -4975,7 +4975,7 @@
           <w:rFonts w:ascii="Times New Roman" w:hAnsi="Times New Roman"/>
           <w:sz w:val="22"/>
         </w:rPr>
-        <w:t>Calibration gate: the extraction form is usable for surveillance, spatio-temporal, risk-factor, economic and ecological-modelling evidence, but the wider extraction phase remains unopened until the 295-record queue, exact retained-ID reconstruction and full-text eligibility are reconciled.</w:t>
+        <w:t>Calibration gate: the extraction form is usable for surveillance, spatio-temporal, risk-factor, economic and ecological-modelling evidence, but the wider extraction phase remains unopened until the 296-record queue and full-text eligibility are reconciled.</w:t>
       </w:r>
     </w:p>
     <w:p>
@@ -5254,7 +5254,7 @@
                 <w:rFonts w:ascii="Times New Roman" w:hAnsi="Times New Roman"/>
                 <w:sz w:val="20"/>
               </w:rPr>
-              <w:t>1,877 / 1,582 / 295</w:t>
+              <w:t>1,877 / 1,581 / 296</w:t>
             </w:r>
           </w:p>
         </w:tc>
@@ -5274,6 +5274,26 @@
         </w:tc>
       </w:tr>
     </w:tbl>
+    <w:p>
+      <w:pPr>
+        <w:pStyle w:val="Heading2"/>
+      </w:pPr>
+      <w:r>
+        <w:rPr>
+          <w:rFonts w:ascii="Times New Roman" w:hAnsi="Times New Roman"/>
+        </w:rPr>
+        <w:t>B21. Fresh record-level reconstruction and adjudication</w:t>
+      </w:r>
+    </w:p>
+    <w:p>
+      <w:r>
+        <w:rPr>
+          <w:rFonts w:ascii="Times New Roman" w:hAnsi="Times New Roman"/>
+          <w:sz w:val="22"/>
+        </w:rPr>
+        <w:t>Two independent title/metadata passes were completed in 100-record blocks across all 1,877 canonical identities. R1 retained 269 records and R2 retained 277; the conservative union contained 302 records before preservation of the prior evidence-supported pilot and B20 adjudications. The final record-level register contains 296 provisional full-text candidates and 1,581 title/metadata exclusions. The prior adjudicated pilot decisions and the evidence-supported B20 decision for CAN-0344, CAN-0356, CAN-0359 and CAN-0379 were preserved where they differed from the fresh title-only pass. These are provisional retrieval candidates, not final included studies; full-text eligibility, duplicate/dataset linkage, extraction, RoB, certainty, synthesis and PRISMA reporting remain pending.</w:t>
+      </w:r>
+    </w:p>
     <w:sectPr>
       <w:pgSz w:w="12240" w:h="15840"/>
       <w:pgMar w:top="1440" w:right="1440" w:bottom="1440" w:left="1440" w:header="720" w:footer="720" w:gutter="0"/>

</xml_diff>

<commit_message>
Add Gate D retrieval inventory
</commit_message>
<xml_diff>
--- a/Avian_review_paper_submission_ready.docx
+++ b/Avian_review_paper_submission_ready.docx
@@ -265,7 +265,7 @@
           <w:rFonts w:ascii="Times New Roman" w:hAnsi="Times New Roman"/>
           <w:sz w:val="22"/>
         </w:rPr>
-        <w:t>The evidence synthesis is not complete. Gate C is closed for the full unique register: 1,877 records have record-level title/metadata dispositions, with 1,581 exclusions and 296 provisional full-text candidates. Gate D full-text eligibility remains open. Gates D-J have not been completed. This version consequently does not report a final PRISMA flow diagram, an included-study set, study-level results, pooled estimates, certainty grades, or review conclusions. Such outputs require retained-ID reconciliation, full-text assessment, extraction, appraisal, synthesis and final reporting audit.</w:t>
+        <w:t>The evidence synthesis is not complete. Gate C record-level title/metadata screening is closed for 1,877 records, yielding 296 provisional full-text candidates. A Gate D retrieval inventory located 107 free/open routes, identified 24 metadata or subscription-only routes, and left 165 records unresolved or without an identifier; no full-text eligibility decision has been made. Gates D-J remain incomplete. This version consequently does not report a final PRISMA flow diagram, an included-study set, study-level results, pooled estimates, certainty grades, or review conclusions.</w:t>
       </w:r>
     </w:p>
     <w:p>
@@ -4000,7 +4000,7 @@
           <w:rFonts w:ascii="Times New Roman" w:hAnsi="Times New Roman"/>
           <w:sz w:val="22"/>
         </w:rPr>
-        <w:t>Next controlled action: build and verify the 296-record full-text retrieval queue from the adjudicated record-level register, without double counting the B19 duplicate-range pilot. Perform dual-review full-text eligibility with explicit exclusion reasons, legitimate retrieval-failure documentation and dataset-linkage checks. Do not begin wider extraction or risk-of-bias appraisal until full-text eligibility is fixed; do not claim a final PRISMA flow, included-study count, certainty finding or SWiM synthesis until those gates are complete.</w:t>
+        <w:t>Next controlled action: reconcile the 296-record full-text retrieval inventory, open/download the 107 located free/open routes, document legitimate outcomes for the 24 metadata/subscription-only routes and 165 unresolved/missing-identifier records, then perform dual-review full-text eligibility with fixed exclusion reasons and page/section evidence. Do not begin wider extraction or risk-of-bias appraisal until full-text eligibility is fixed; do not claim a final PRISMA flow, included-study count, certainty finding or SWiM synthesis until those gates are complete.</w:t>
       </w:r>
     </w:p>
     <w:p>
@@ -5294,6 +5294,258 @@
         <w:t>Two independent title/metadata passes were completed in 100-record blocks across all 1,877 canonical identities. R1 retained 269 records and R2 retained 277; the conservative union contained 302 records before preservation of the prior evidence-supported pilot and B20 adjudications. The final record-level register contains 296 provisional full-text candidates and 1,581 title/metadata exclusions. The prior adjudicated pilot decisions and the evidence-supported B20 decision for CAN-0344, CAN-0356, CAN-0359 and CAN-0379 were preserved where they differed from the fresh title-only pass. These are provisional retrieval candidates, not final included studies; full-text eligibility, duplicate/dataset linkage, extraction, RoB, certainty, synthesis and PRISMA reporting remain pending.</w:t>
       </w:r>
     </w:p>
+    <w:p>
+      <w:pPr>
+        <w:pStyle w:val="Heading2"/>
+      </w:pPr>
+      <w:r>
+        <w:rPr>
+          <w:rFonts w:ascii="Times New Roman" w:hAnsi="Times New Roman"/>
+          <w:sz w:val="22"/>
+        </w:rPr>
+        <w:t>B22. Gate D retrieval inventory</w:t>
+      </w:r>
+    </w:p>
+    <w:p>
+      <w:r>
+        <w:rPr>
+          <w:rFonts w:ascii="Times New Roman" w:hAnsi="Times New Roman"/>
+          <w:sz w:val="22"/>
+        </w:rPr>
+        <w:t>A legitimate retrieval inventory was run on all 296 record-level provisional candidates using public Europe PMC metadata/full-text links, DOI routes and linked repository/Unpaywall routes. The inventory records source URLs, identifier used, metadata match, retrieval status and next action in Workbench/56_SCREENING_RECONCILIATION.json. It does not treat a located link as evidence of eligibility, and it does not bypass subscription controls.</w:t>
+      </w:r>
+    </w:p>
+    <w:tbl>
+      <w:tblPr>
+        <w:tblW w:type="auto" w:w="0"/>
+        <w:tblLook w:firstColumn="1" w:firstRow="1" w:lastColumn="0" w:lastRow="0" w:noHBand="0" w:noVBand="1" w:val="04A0"/>
+      </w:tblPr>
+      <w:tblGrid>
+        <w:gridCol w:w="3120"/>
+        <w:gridCol w:w="3120"/>
+        <w:gridCol w:w="3120"/>
+      </w:tblGrid>
+      <w:tr>
+        <w:tc>
+          <w:tcPr>
+            <w:tcW w:type="dxa" w:w="3120"/>
+          </w:tcPr>
+          <w:p>
+            <w:r>
+              <w:rPr>
+                <w:rFonts w:ascii="Times New Roman" w:hAnsi="Times New Roman"/>
+                <w:sz w:val="20"/>
+              </w:rPr>
+              <w:t>Retrieval status</w:t>
+            </w:r>
+          </w:p>
+        </w:tc>
+        <w:tc>
+          <w:tcPr>
+            <w:tcW w:type="dxa" w:w="3120"/>
+          </w:tcPr>
+          <w:p>
+            <w:r>
+              <w:rPr>
+                <w:rFonts w:ascii="Times New Roman" w:hAnsi="Times New Roman"/>
+                <w:sz w:val="20"/>
+              </w:rPr>
+              <w:t>Count</w:t>
+            </w:r>
+          </w:p>
+        </w:tc>
+        <w:tc>
+          <w:tcPr>
+            <w:tcW w:type="dxa" w:w="3120"/>
+          </w:tcPr>
+          <w:p>
+            <w:r>
+              <w:rPr>
+                <w:rFonts w:ascii="Times New Roman" w:hAnsi="Times New Roman"/>
+                <w:sz w:val="20"/>
+              </w:rPr>
+              <w:t>Meaning</w:t>
+            </w:r>
+          </w:p>
+        </w:tc>
+      </w:tr>
+      <w:tr>
+        <w:tc>
+          <w:tcPr>
+            <w:tcW w:type="dxa" w:w="3120"/>
+          </w:tcPr>
+          <w:p>
+            <w:r>
+              <w:rPr>
+                <w:rFonts w:ascii="Times New Roman" w:hAnsi="Times New Roman"/>
+                <w:sz w:val="20"/>
+              </w:rPr>
+              <w:t>Free/open route located</w:t>
+            </w:r>
+          </w:p>
+        </w:tc>
+        <w:tc>
+          <w:tcPr>
+            <w:tcW w:type="dxa" w:w="3120"/>
+          </w:tcPr>
+          <w:p>
+            <w:r>
+              <w:rPr>
+                <w:rFonts w:ascii="Times New Roman" w:hAnsi="Times New Roman"/>
+                <w:sz w:val="20"/>
+              </w:rPr>
+              <w:t>107</w:t>
+            </w:r>
+          </w:p>
+        </w:tc>
+        <w:tc>
+          <w:tcPr>
+            <w:tcW w:type="dxa" w:w="3120"/>
+          </w:tcPr>
+          <w:p>
+            <w:r>
+              <w:rPr>
+                <w:rFonts w:ascii="Times New Roman" w:hAnsi="Times New Roman"/>
+                <w:sz w:val="20"/>
+              </w:rPr>
+              <w:t>A legitimate free/open source URL is recorded; full-text opening and eligibility assessment remain pending.</w:t>
+            </w:r>
+          </w:p>
+        </w:tc>
+      </w:tr>
+      <w:tr>
+        <w:tc>
+          <w:tcPr>
+            <w:tcW w:type="dxa" w:w="3120"/>
+          </w:tcPr>
+          <w:p>
+            <w:r>
+              <w:rPr>
+                <w:rFonts w:ascii="Times New Roman" w:hAnsi="Times New Roman"/>
+                <w:sz w:val="20"/>
+              </w:rPr>
+              <w:t>Metadata/subscription-only route</w:t>
+            </w:r>
+          </w:p>
+        </w:tc>
+        <w:tc>
+          <w:tcPr>
+            <w:tcW w:type="dxa" w:w="3120"/>
+          </w:tcPr>
+          <w:p>
+            <w:r>
+              <w:rPr>
+                <w:rFonts w:ascii="Times New Roman" w:hAnsi="Times New Roman"/>
+                <w:sz w:val="20"/>
+              </w:rPr>
+              <w:t>24</w:t>
+            </w:r>
+          </w:p>
+        </w:tc>
+        <w:tc>
+          <w:tcPr>
+            <w:tcW w:type="dxa" w:w="3120"/>
+          </w:tcPr>
+          <w:p>
+            <w:r>
+              <w:rPr>
+                <w:rFonts w:ascii="Times New Roman" w:hAnsi="Times New Roman"/>
+                <w:sz w:val="20"/>
+              </w:rPr>
+              <w:t>A matched record or DOI/PubMed route exists, but no free route was located in this pass; do not bypass access controls.</w:t>
+            </w:r>
+          </w:p>
+        </w:tc>
+      </w:tr>
+      <w:tr>
+        <w:tc>
+          <w:tcPr>
+            <w:tcW w:type="dxa" w:w="3120"/>
+          </w:tcPr>
+          <w:p>
+            <w:r>
+              <w:rPr>
+                <w:rFonts w:ascii="Times New Roman" w:hAnsi="Times New Roman"/>
+                <w:sz w:val="20"/>
+              </w:rPr>
+              <w:t>Identifier unresolved or missing</w:t>
+            </w:r>
+          </w:p>
+        </w:tc>
+        <w:tc>
+          <w:tcPr>
+            <w:tcW w:type="dxa" w:w="3120"/>
+          </w:tcPr>
+          <w:p>
+            <w:r>
+              <w:rPr>
+                <w:rFonts w:ascii="Times New Roman" w:hAnsi="Times New Roman"/>
+                <w:sz w:val="20"/>
+              </w:rPr>
+              <w:t>165</w:t>
+            </w:r>
+          </w:p>
+        </w:tc>
+        <w:tc>
+          <w:tcPr>
+            <w:tcW w:type="dxa" w:w="3120"/>
+          </w:tcPr>
+          <w:p>
+            <w:r>
+              <w:rPr>
+                <w:rFonts w:ascii="Times New Roman" w:hAnsi="Times New Roman"/>
+                <w:sz w:val="20"/>
+              </w:rPr>
+              <w:t>No reliable matched route was resolved from the stored PMID/DOI fields; title-based legitimate retrieval is next.</w:t>
+            </w:r>
+          </w:p>
+        </w:tc>
+      </w:tr>
+      <w:tr>
+        <w:tc>
+          <w:tcPr>
+            <w:tcW w:type="dxa" w:w="3120"/>
+          </w:tcPr>
+          <w:p>
+            <w:r>
+              <w:rPr>
+                <w:rFonts w:ascii="Times New Roman" w:hAnsi="Times New Roman"/>
+                <w:sz w:val="20"/>
+              </w:rPr>
+              <w:t>Total provisional candidates</w:t>
+            </w:r>
+          </w:p>
+        </w:tc>
+        <w:tc>
+          <w:tcPr>
+            <w:tcW w:type="dxa" w:w="3120"/>
+          </w:tcPr>
+          <w:p>
+            <w:r>
+              <w:rPr>
+                <w:rFonts w:ascii="Times New Roman" w:hAnsi="Times New Roman"/>
+                <w:sz w:val="20"/>
+              </w:rPr>
+              <w:t>296</w:t>
+            </w:r>
+          </w:p>
+        </w:tc>
+        <w:tc>
+          <w:tcPr>
+            <w:tcW w:type="dxa" w:w="3120"/>
+          </w:tcPr>
+          <w:p>
+            <w:r>
+              <w:rPr>
+                <w:rFonts w:ascii="Times New Roman" w:hAnsi="Times New Roman"/>
+                <w:sz w:val="20"/>
+              </w:rPr>
+              <w:t>All remain provisional; no final full-text inclusion/exclusion decision has been assigned.</w:t>
+            </w:r>
+          </w:p>
+        </w:tc>
+      </w:tr>
+    </w:tbl>
     <w:sectPr>
       <w:pgSz w:w="12240" w:h="15840"/>
       <w:pgMar w:top="1440" w:right="1440" w:bottom="1440" w:left="1440" w:header="720" w:footer="720" w:gutter="0"/>

</xml_diff>

<commit_message>
Record full-text eligibility pilot
</commit_message>
<xml_diff>
--- a/Avian_review_paper_submission_ready.docx
+++ b/Avian_review_paper_submission_ready.docx
@@ -616,7 +616,7 @@
               <w:rPr>
                 <w:rFonts w:ascii="Times New Roman" w:hAnsi="Times New Roman"/>
                 <w:b/>
-                <w:sz w:val="17"/>
+                <w:sz w:val="20"/>
               </w:rPr>
               <w:t>Source and date</w:t>
             </w:r>
@@ -636,7 +636,7 @@
               <w:rPr>
                 <w:rFonts w:ascii="Times New Roman" w:hAnsi="Times New Roman"/>
                 <w:b/>
-                <w:sz w:val="17"/>
+                <w:sz w:val="20"/>
               </w:rPr>
               <w:t>Documented search record</w:t>
             </w:r>
@@ -656,7 +656,7 @@
               <w:rPr>
                 <w:rFonts w:ascii="Times New Roman" w:hAnsi="Times New Roman"/>
                 <w:b/>
-                <w:sz w:val="17"/>
+                <w:sz w:val="20"/>
               </w:rPr>
               <w:t>Count</w:t>
             </w:r>
@@ -676,7 +676,7 @@
               <w:rPr>
                 <w:rFonts w:ascii="Times New Roman" w:hAnsi="Times New Roman"/>
                 <w:b/>
-                <w:sz w:val="17"/>
+                <w:sz w:val="20"/>
               </w:rPr>
               <w:t>Reproducibility status / missing field</w:t>
             </w:r>
@@ -696,7 +696,7 @@
             <w:r>
               <w:rPr>
                 <w:rFonts w:ascii="Times New Roman" w:hAnsi="Times New Roman"/>
-                <w:sz w:val="17"/>
+                <w:sz w:val="20"/>
               </w:rPr>
               <w:t>PubMed/MEDLINE; 16 Sep 2026</w:t>
             </w:r>
@@ -714,7 +714,7 @@
             <w:r>
               <w:rPr>
                 <w:rFonts w:ascii="Times New Roman" w:hAnsi="Times New Roman"/>
-                <w:sz w:val="17"/>
+                <w:sz w:val="20"/>
               </w:rPr>
               <w:t>Full v3 base and molecular facet documented below; date limit 2006/01/01–2026/09/30.</w:t>
             </w:r>
@@ -732,7 +732,7 @@
             <w:r>
               <w:rPr>
                 <w:rFonts w:ascii="Times New Roman" w:hAnsi="Times New Roman"/>
-                <w:sz w:val="17"/>
+                <w:sz w:val="20"/>
               </w:rPr>
               <w:t>140 base; 53 molecular</w:t>
             </w:r>
@@ -750,7 +750,7 @@
             <w:r>
               <w:rPr>
                 <w:rFonts w:ascii="Times New Roman" w:hAnsi="Times New Roman"/>
-                <w:sz w:val="17"/>
+                <w:sz w:val="20"/>
               </w:rPr>
               <w:t>Executed strings retained; English filter is not encoded in the v3 script record.</w:t>
             </w:r>
@@ -770,7 +770,7 @@
             <w:r>
               <w:rPr>
                 <w:rFonts w:ascii="Times New Roman" w:hAnsi="Times New Roman"/>
-                <w:sz w:val="17"/>
+                <w:sz w:val="20"/>
               </w:rPr>
               <w:t>Scopus; 16 Sep 2026</w:t>
             </w:r>
@@ -788,7 +788,7 @@
             <w:r>
               <w:rPr>
                 <w:rFonts w:ascii="Times New Roman" w:hAnsi="Times New Roman"/>
-                <w:sz w:val="17"/>
+                <w:sz w:val="20"/>
               </w:rPr>
               <w:t>Documented base: TITLE-ABS-KEY("avian influenza" OR AIV OR HPAI OR LPAI OR H5N1 OR H5N2 OR H5N6 OR H5N8 OR H9N2) AND TITLE-ABS-KEY(Nigeria OR Nigerian) AND PUBYEAR &gt; 2005 AND PUBYEAR &lt; 2027.</w:t>
             </w:r>
@@ -806,7 +806,7 @@
             <w:r>
               <w:rPr>
                 <w:rFonts w:ascii="Times New Roman" w:hAnsi="Times New Roman"/>
-                <w:sz w:val="17"/>
+                <w:sz w:val="20"/>
               </w:rPr>
               <w:t>204</w:t>
             </w:r>
@@ -824,7 +824,7 @@
             <w:r>
               <w:rPr>
                 <w:rFonts w:ascii="Times New Roman" w:hAnsi="Times New Roman"/>
-                <w:sz w:val="17"/>
+                <w:sz w:val="20"/>
               </w:rPr>
               <w:t>Base syntax documented; facet lines, interface settings and export configuration are incomplete.</w:t>
             </w:r>
@@ -844,7 +844,7 @@
             <w:r>
               <w:rPr>
                 <w:rFonts w:ascii="Times New Roman" w:hAnsi="Times New Roman"/>
-                <w:sz w:val="17"/>
+                <w:sz w:val="20"/>
               </w:rPr>
               <w:t>WoS API; 19 Sep 2026</w:t>
             </w:r>
@@ -862,7 +862,7 @@
             <w:r>
               <w:rPr>
                 <w:rFonts w:ascii="Times New Roman" w:hAnsi="Times New Roman"/>
-                <w:sz w:val="17"/>
+                <w:sz w:val="20"/>
               </w:rPr>
               <w:t>TS=("avian influenza" OR AIV OR HPAI OR LPAI OR H5N1 OR H9N2) AND TS=(Nigeria OR Nigerian) AND PY=(2006-2026).</w:t>
             </w:r>
@@ -880,7 +880,7 @@
             <w:r>
               <w:rPr>
                 <w:rFonts w:ascii="Times New Roman" w:hAnsi="Times New Roman"/>
-                <w:sz w:val="17"/>
+                <w:sz w:val="20"/>
               </w:rPr>
               <w:t>175 unique UIDs</w:t>
             </w:r>
@@ -898,7 +898,7 @@
             <w:r>
               <w:rPr>
                 <w:rFonts w:ascii="Times New Roman" w:hAnsi="Times New Roman"/>
-                <w:sz w:val="17"/>
+                <w:sz w:val="20"/>
               </w:rPr>
               <w:t>Imported API layer; no English filter recorded.</w:t>
             </w:r>
@@ -918,7 +918,7 @@
             <w:r>
               <w:rPr>
                 <w:rFonts w:ascii="Times New Roman" w:hAnsi="Times New Roman"/>
-                <w:sz w:val="17"/>
+                <w:sz w:val="20"/>
               </w:rPr>
               <w:t>WoS Core Collection; 20 Sep 2026</w:t>
             </w:r>
@@ -936,7 +936,7 @@
             <w:r>
               <w:rPr>
                 <w:rFonts w:ascii="Times New Roman" w:hAnsi="Times New Roman"/>
-                <w:sz w:val="17"/>
+                <w:sz w:val="20"/>
               </w:rPr>
               <w:t>Full base plus molecular, epidemiology and wild-bird facet executions are in the run sheet; publication-date filter 2006-01-01–2026-09-20.</w:t>
             </w:r>
@@ -954,7 +954,7 @@
             <w:r>
               <w:rPr>
                 <w:rFonts w:ascii="Times New Roman" w:hAnsi="Times New Roman"/>
-                <w:sz w:val="17"/>
+                <w:sz w:val="20"/>
               </w:rPr>
               <w:t>206 base; 77 molecular; 154 epidemiology; 70 host</w:t>
             </w:r>
@@ -972,7 +972,7 @@
             <w:r>
               <w:rPr>
                 <w:rFonts w:ascii="Times New Roman" w:hAnsi="Times New Roman"/>
-                <w:sz w:val="17"/>
+                <w:sz w:val="20"/>
               </w:rPr>
               <w:t>Displayed counts only; no reliable complete record export. Do not add to the 175 UIDs.</w:t>
             </w:r>
@@ -992,7 +992,7 @@
             <w:r>
               <w:rPr>
                 <w:rFonts w:ascii="Times New Roman" w:hAnsi="Times New Roman"/>
-                <w:sz w:val="17"/>
+                <w:sz w:val="20"/>
               </w:rPr>
               <w:t>ScienceDirect; 16 Sep 2026</w:t>
             </w:r>
@@ -1010,7 +1010,7 @@
             <w:r>
               <w:rPr>
                 <w:rFonts w:ascii="Times New Roman" w:hAnsi="Times New Roman"/>
-                <w:sz w:val="17"/>
+                <w:sz w:val="20"/>
               </w:rPr>
               <w:t>Abbreviated record only: Scopus-derived title/abstract/key-word variant, 2006–2026.</w:t>
             </w:r>
@@ -1028,7 +1028,7 @@
             <w:r>
               <w:rPr>
                 <w:rFonts w:ascii="Times New Roman" w:hAnsi="Times New Roman"/>
-                <w:sz w:val="17"/>
+                <w:sz w:val="20"/>
               </w:rPr>
               <w:t>25 displayed/exported</w:t>
             </w:r>
@@ -1046,7 +1046,7 @@
             <w:r>
               <w:rPr>
                 <w:rFonts w:ascii="Times New Roman" w:hAnsi="Times New Roman"/>
-                <w:sz w:val="17"/>
+                <w:sz w:val="20"/>
               </w:rPr>
               <w:t>Exact as-run string, filters, cap and platform configuration are not documented.</w:t>
             </w:r>
@@ -1066,7 +1066,7 @@
             <w:r>
               <w:rPr>
                 <w:rFonts w:ascii="Times New Roman" w:hAnsi="Times New Roman"/>
-                <w:sz w:val="17"/>
+                <w:sz w:val="20"/>
               </w:rPr>
               <w:t>Google Scholar; 17 Sep 2026</w:t>
             </w:r>
@@ -1084,7 +1084,7 @@
             <w:r>
               <w:rPr>
                 <w:rFonts w:ascii="Times New Roman" w:hAnsi="Times New Roman"/>
-                <w:sz w:val="17"/>
+                <w:sz w:val="20"/>
               </w:rPr>
               <w:t>Q1 "avian influenza" Nigeria; Q2 H5N1 Nigeria; Q3 H9N2 Nigeria; Q4 poultry Nigeria wild birds; relevance; cap 200/query.</w:t>
             </w:r>
@@ -1102,7 +1102,7 @@
             <w:r>
               <w:rPr>
                 <w:rFonts w:ascii="Times New Roman" w:hAnsi="Times New Roman"/>
-                <w:sz w:val="17"/>
+                <w:sz w:val="20"/>
               </w:rPr>
               <w:t>140 retrieved; 99 unique</w:t>
             </w:r>
@@ -1120,7 +1120,7 @@
             <w:r>
               <w:rPr>
                 <w:rFonts w:ascii="Times New Roman" w:hAnsi="Times New Roman"/>
-                <w:sz w:val="17"/>
+                <w:sz w:val="20"/>
               </w:rPr>
               <w:t>Supplementary only; no persistent export. Not a primary PRISMA identification layer.</w:t>
             </w:r>
@@ -1140,7 +1140,7 @@
             <w:r>
               <w:rPr>
                 <w:rFonts w:ascii="Times New Roman" w:hAnsi="Times New Roman"/>
-                <w:sz w:val="17"/>
+                <w:sz w:val="20"/>
               </w:rPr>
               <w:t>AJOL; 20 Sep 2026</w:t>
             </w:r>
@@ -1158,7 +1158,7 @@
             <w:r>
               <w:rPr>
                 <w:rFonts w:ascii="Times New Roman" w:hAnsi="Times New Roman"/>
-                <w:sz w:val="17"/>
+                <w:sz w:val="20"/>
               </w:rPr>
               <w:t>Nine exact mandatory-term queries are listed below.</w:t>
             </w:r>
@@ -1176,7 +1176,7 @@
             <w:r>
               <w:rPr>
                 <w:rFonts w:ascii="Times New Roman" w:hAnsi="Times New Roman"/>
-                <w:sz w:val="17"/>
+                <w:sz w:val="20"/>
               </w:rPr>
               <w:t>144 query rows; 79 unique URLs; 73 in-window</w:t>
             </w:r>
@@ -1194,7 +1194,7 @@
             <w:r>
               <w:rPr>
                 <w:rFonts w:ascii="Times New Roman" w:hAnsi="Times New Roman"/>
-                <w:sz w:val="17"/>
+                <w:sz w:val="20"/>
               </w:rPr>
               <w:t>Citation metadata captured; no substantive screening decision.</w:t>
             </w:r>
@@ -1305,7 +1305,7 @@
               <w:rPr>
                 <w:rFonts w:ascii="Times New Roman" w:hAnsi="Times New Roman"/>
                 <w:b/>
-                <w:sz w:val="17"/>
+                <w:sz w:val="20"/>
               </w:rPr>
               <w:t>Gate</w:t>
             </w:r>
@@ -1325,7 +1325,7 @@
               <w:rPr>
                 <w:rFonts w:ascii="Times New Roman" w:hAnsi="Times New Roman"/>
                 <w:b/>
-                <w:sz w:val="17"/>
+                <w:sz w:val="20"/>
               </w:rPr>
               <w:t>Required stage</w:t>
             </w:r>
@@ -1345,7 +1345,7 @@
               <w:rPr>
                 <w:rFonts w:ascii="Times New Roman" w:hAnsi="Times New Roman"/>
                 <w:b/>
-                <w:sz w:val="17"/>
+                <w:sz w:val="20"/>
               </w:rPr>
               <w:t>Status at 20 Sep 2026</w:t>
             </w:r>
@@ -1365,7 +1365,7 @@
             <w:r>
               <w:rPr>
                 <w:rFonts w:ascii="Times New Roman" w:hAnsi="Times New Roman"/>
-                <w:sz w:val="17"/>
+                <w:sz w:val="20"/>
               </w:rPr>
               <w:t>C</w:t>
             </w:r>
@@ -1383,7 +1383,7 @@
             <w:r>
               <w:rPr>
                 <w:rFonts w:ascii="Times New Roman" w:hAnsi="Times New Roman"/>
-                <w:sz w:val="17"/>
+                <w:sz w:val="20"/>
               </w:rPr>
               <w:t>Screening reconciliation</w:t>
             </w:r>
@@ -1418,7 +1418,7 @@
             <w:r>
               <w:rPr>
                 <w:rFonts w:ascii="Times New Roman" w:hAnsi="Times New Roman"/>
-                <w:sz w:val="17"/>
+                <w:sz w:val="20"/>
               </w:rPr>
               <w:t>D</w:t>
             </w:r>
@@ -1436,7 +1436,7 @@
             <w:r>
               <w:rPr>
                 <w:rFonts w:ascii="Times New Roman" w:hAnsi="Times New Roman"/>
-                <w:sz w:val="17"/>
+                <w:sz w:val="20"/>
               </w:rPr>
               <w:t>Full-text eligibility</w:t>
             </w:r>
@@ -1471,7 +1471,7 @@
             <w:r>
               <w:rPr>
                 <w:rFonts w:ascii="Times New Roman" w:hAnsi="Times New Roman"/>
-                <w:sz w:val="17"/>
+                <w:sz w:val="20"/>
               </w:rPr>
               <w:t>E</w:t>
             </w:r>
@@ -1489,7 +1489,7 @@
             <w:r>
               <w:rPr>
                 <w:rFonts w:ascii="Times New Roman" w:hAnsi="Times New Roman"/>
-                <w:sz w:val="17"/>
+                <w:sz w:val="20"/>
               </w:rPr>
               <w:t>Extraction pilot</w:t>
             </w:r>
@@ -1507,7 +1507,7 @@
             <w:r>
               <w:rPr>
                 <w:rFonts w:ascii="Times New Roman" w:hAnsi="Times New Roman"/>
-                <w:sz w:val="17"/>
+                <w:sz w:val="20"/>
               </w:rPr>
               <w:t>Pending – no records extracted.</w:t>
             </w:r>
@@ -1527,7 +1527,7 @@
             <w:r>
               <w:rPr>
                 <w:rFonts w:ascii="Times New Roman" w:hAnsi="Times New Roman"/>
-                <w:sz w:val="17"/>
+                <w:sz w:val="20"/>
               </w:rPr>
               <w:t>F</w:t>
             </w:r>
@@ -1545,7 +1545,7 @@
             <w:r>
               <w:rPr>
                 <w:rFonts w:ascii="Times New Roman" w:hAnsi="Times New Roman"/>
-                <w:sz w:val="17"/>
+                <w:sz w:val="20"/>
               </w:rPr>
               <w:t>Full extraction and evidence tables</w:t>
             </w:r>
@@ -1563,7 +1563,7 @@
             <w:r>
               <w:rPr>
                 <w:rFonts w:ascii="Times New Roman" w:hAnsi="Times New Roman"/>
-                <w:sz w:val="17"/>
+                <w:sz w:val="20"/>
               </w:rPr>
               <w:t>Pending – no records extracted.</w:t>
             </w:r>
@@ -1583,7 +1583,7 @@
             <w:r>
               <w:rPr>
                 <w:rFonts w:ascii="Times New Roman" w:hAnsi="Times New Roman"/>
-                <w:sz w:val="17"/>
+                <w:sz w:val="20"/>
               </w:rPr>
               <w:t>G</w:t>
             </w:r>
@@ -1601,7 +1601,7 @@
             <w:r>
               <w:rPr>
                 <w:rFonts w:ascii="Times New Roman" w:hAnsi="Times New Roman"/>
-                <w:sz w:val="17"/>
+                <w:sz w:val="20"/>
               </w:rPr>
               <w:t>JBI and molecular risk-of-bias appraisal</w:t>
             </w:r>
@@ -1619,7 +1619,7 @@
             <w:r>
               <w:rPr>
                 <w:rFonts w:ascii="Times New Roman" w:hAnsi="Times New Roman"/>
-                <w:sz w:val="17"/>
+                <w:sz w:val="20"/>
               </w:rPr>
               <w:t>Pending – no records appraised.</w:t>
             </w:r>
@@ -1639,7 +1639,7 @@
             <w:r>
               <w:rPr>
                 <w:rFonts w:ascii="Times New Roman" w:hAnsi="Times New Roman"/>
-                <w:sz w:val="17"/>
+                <w:sz w:val="20"/>
               </w:rPr>
               <w:t>H</w:t>
             </w:r>
@@ -1657,7 +1657,7 @@
             <w:r>
               <w:rPr>
                 <w:rFonts w:ascii="Times New Roman" w:hAnsi="Times New Roman"/>
-                <w:sz w:val="17"/>
+                <w:sz w:val="20"/>
               </w:rPr>
               <w:t>SWiM synthesis and certainty narrative</w:t>
             </w:r>
@@ -1675,7 +1675,7 @@
             <w:r>
               <w:rPr>
                 <w:rFonts w:ascii="Times New Roman" w:hAnsi="Times New Roman"/>
-                <w:sz w:val="17"/>
+                <w:sz w:val="20"/>
               </w:rPr>
               <w:t>Pending – no synthesis or certainty narrative.</w:t>
             </w:r>
@@ -1695,7 +1695,7 @@
             <w:r>
               <w:rPr>
                 <w:rFonts w:ascii="Times New Roman" w:hAnsi="Times New Roman"/>
-                <w:sz w:val="17"/>
+                <w:sz w:val="20"/>
               </w:rPr>
               <w:t>I</w:t>
             </w:r>
@@ -1713,7 +1713,7 @@
             <w:r>
               <w:rPr>
                 <w:rFonts w:ascii="Times New Roman" w:hAnsi="Times New Roman"/>
-                <w:sz w:val="17"/>
+                <w:sz w:val="20"/>
               </w:rPr>
               <w:t>PRISMA flow and manuscript reporting</w:t>
             </w:r>
@@ -1731,7 +1731,7 @@
             <w:r>
               <w:rPr>
                 <w:rFonts w:ascii="Times New Roman" w:hAnsi="Times New Roman"/>
-                <w:sz w:val="17"/>
+                <w:sz w:val="20"/>
               </w:rPr>
               <w:t>Pending – no final counts or flow.</w:t>
             </w:r>
@@ -1751,7 +1751,7 @@
             <w:r>
               <w:rPr>
                 <w:rFonts w:ascii="Times New Roman" w:hAnsi="Times New Roman"/>
-                <w:sz w:val="17"/>
+                <w:sz w:val="20"/>
               </w:rPr>
               <w:t>J</w:t>
             </w:r>
@@ -1769,7 +1769,7 @@
             <w:r>
               <w:rPr>
                 <w:rFonts w:ascii="Times New Roman" w:hAnsi="Times New Roman"/>
-                <w:sz w:val="17"/>
+                <w:sz w:val="20"/>
               </w:rPr>
               <w:t>PRISMA 2020/PRISMA-S/SWiM audit</w:t>
             </w:r>
@@ -1787,7 +1787,7 @@
             <w:r>
               <w:rPr>
                 <w:rFonts w:ascii="Times New Roman" w:hAnsi="Times New Roman"/>
-                <w:sz w:val="17"/>
+                <w:sz w:val="20"/>
               </w:rPr>
               <w:t>Pending – final audit pending.</w:t>
             </w:r>
@@ -1878,7 +1878,7 @@
               <w:rPr>
                 <w:rFonts w:ascii="Times New Roman" w:hAnsi="Times New Roman" w:eastAsia="Times New Roman"/>
                 <w:b/>
-                <w:sz w:val="16"/>
+                <w:sz w:val="20"/>
               </w:rPr>
               <w:t>Gate</w:t>
             </w:r>
@@ -1895,7 +1895,7 @@
               <w:rPr>
                 <w:rFonts w:ascii="Times New Roman" w:hAnsi="Times New Roman" w:eastAsia="Times New Roman"/>
                 <w:b/>
-                <w:sz w:val="16"/>
+                <w:sz w:val="20"/>
               </w:rPr>
               <w:t>Status at 22 September 2026</w:t>
             </w:r>
@@ -1912,7 +1912,7 @@
               <w:rPr>
                 <w:rFonts w:ascii="Times New Roman" w:hAnsi="Times New Roman" w:eastAsia="Times New Roman"/>
                 <w:b/>
-                <w:sz w:val="16"/>
+                <w:sz w:val="20"/>
               </w:rPr>
               <w:t>Verified evidence and next condition</w:t>
             </w:r>
@@ -1930,7 +1930,7 @@
               <w:rPr>
                 <w:rFonts w:ascii="Times New Roman" w:hAnsi="Times New Roman" w:eastAsia="Times New Roman"/>
                 <w:b w:val="0"/>
-                <w:sz w:val="16"/>
+                <w:sz w:val="20"/>
               </w:rPr>
               <w:t>A: protocol truth</w:t>
             </w:r>
@@ -1946,7 +1946,7 @@
               <w:rPr>
                 <w:rFonts w:ascii="Times New Roman" w:hAnsi="Times New Roman" w:eastAsia="Times New Roman"/>
                 <w:b w:val="0"/>
-                <w:sz w:val="16"/>
+                <w:sz w:val="20"/>
               </w:rPr>
               <w:t>Closed</w:t>
             </w:r>
@@ -1962,7 +1962,7 @@
               <w:rPr>
                 <w:rFonts w:ascii="Times New Roman" w:hAnsi="Times New Roman" w:eastAsia="Times New Roman"/>
                 <w:b w:val="0"/>
-                <w:sz w:val="16"/>
+                <w:sz w:val="20"/>
               </w:rPr>
               <w:t>Question, CoCoPop/PEO framework, eligibility anchor, operational cut-off (20 September 2026), non-registration and reviewer roles are frozen.</w:t>
             </w:r>
@@ -1980,7 +1980,7 @@
               <w:rPr>
                 <w:rFonts w:ascii="Times New Roman" w:hAnsi="Times New Roman" w:eastAsia="Times New Roman"/>
                 <w:b w:val="0"/>
-                <w:sz w:val="16"/>
+                <w:sz w:val="20"/>
               </w:rPr>
               <w:t>B: search execution</w:t>
             </w:r>
@@ -1996,7 +1996,7 @@
               <w:rPr>
                 <w:rFonts w:ascii="Times New Roman" w:hAnsi="Times New Roman" w:eastAsia="Times New Roman"/>
                 <w:b w:val="0"/>
-                <w:sz w:val="16"/>
+                <w:sz w:val="20"/>
               </w:rPr>
               <w:t>Closed with export limitations</w:t>
             </w:r>
@@ -2012,7 +2012,7 @@
               <w:rPr>
                 <w:rFonts w:ascii="Times New Roman" w:hAnsi="Times New Roman" w:eastAsia="Times New Roman"/>
                 <w:b w:val="0"/>
-                <w:sz w:val="16"/>
+                <w:sz w:val="20"/>
               </w:rPr>
               <w:t>Executed source counts and available exports are documented below. Count-only and supplementary layers must not be used as final PRISMA identification records.</w:t>
             </w:r>
@@ -2030,7 +2030,7 @@
               <w:rPr>
                 <w:rFonts w:ascii="Times New Roman" w:hAnsi="Times New Roman" w:eastAsia="Times New Roman"/>
                 <w:b w:val="0"/>
-                <w:sz w:val="16"/>
+                <w:sz w:val="20"/>
               </w:rPr>
               <w:t>C: canonicalisation and title/abstract screening</w:t>
             </w:r>
@@ -2078,7 +2078,7 @@
               <w:rPr>
                 <w:rFonts w:ascii="Times New Roman" w:hAnsi="Times New Roman" w:eastAsia="Times New Roman"/>
                 <w:b w:val="0"/>
-                <w:sz w:val="16"/>
+                <w:sz w:val="20"/>
               </w:rPr>
               <w:t>D: full-text eligibility</w:t>
             </w:r>
@@ -2094,7 +2094,7 @@
               <w:rPr>
                 <w:rFonts w:ascii="Times New Roman" w:hAnsi="Times New Roman" w:eastAsia="Times New Roman"/>
                 <w:b w:val="0"/>
-                <w:sz w:val="16"/>
+                <w:sz w:val="20"/>
               </w:rPr>
               <w:t>Not started</w:t>
             </w:r>
@@ -2107,6 +2107,10 @@
           </w:tcPr>
           <w:p>
             <w:r>
+              <w:rPr>
+                <w:rFonts w:ascii="Times New Roman" w:hAnsi="Times New Roman"/>
+                <w:sz w:val="20"/>
+              </w:rPr>
               <w:t>Pending. The 83 provisional full-text candidates have not undergone full-text eligibility assessment; no fixed full-text exclusion table exists.</w:t>
             </w:r>
           </w:p>
@@ -2123,7 +2127,7 @@
               <w:rPr>
                 <w:rFonts w:ascii="Times New Roman" w:hAnsi="Times New Roman" w:eastAsia="Times New Roman"/>
                 <w:b w:val="0"/>
-                <w:sz w:val="16"/>
+                <w:sz w:val="20"/>
               </w:rPr>
               <w:t>E-G: extraction, RoB and certainty</w:t>
             </w:r>
@@ -2139,7 +2143,7 @@
               <w:rPr>
                 <w:rFonts w:ascii="Times New Roman" w:hAnsi="Times New Roman" w:eastAsia="Times New Roman"/>
                 <w:b w:val="0"/>
-                <w:sz w:val="16"/>
+                <w:sz w:val="20"/>
               </w:rPr>
               <w:t>Not started</w:t>
             </w:r>
@@ -2155,7 +2159,7 @@
               <w:rPr>
                 <w:rFonts w:ascii="Times New Roman" w:hAnsi="Times New Roman" w:eastAsia="Times New Roman"/>
                 <w:b w:val="0"/>
-                <w:sz w:val="16"/>
+                <w:sz w:val="20"/>
               </w:rPr>
               <w:t>Pending. The fields are prepared below; no study has been extracted or appraised.</w:t>
             </w:r>
@@ -2173,7 +2177,7 @@
               <w:rPr>
                 <w:rFonts w:ascii="Times New Roman" w:hAnsi="Times New Roman" w:eastAsia="Times New Roman"/>
                 <w:b w:val="0"/>
-                <w:sz w:val="16"/>
+                <w:sz w:val="20"/>
               </w:rPr>
               <w:t>H-J: synthesis, reporting and final audit</w:t>
             </w:r>
@@ -2189,7 +2193,7 @@
               <w:rPr>
                 <w:rFonts w:ascii="Times New Roman" w:hAnsi="Times New Roman" w:eastAsia="Times New Roman"/>
                 <w:b w:val="0"/>
-                <w:sz w:val="16"/>
+                <w:sz w:val="20"/>
               </w:rPr>
               <w:t>Not started</w:t>
             </w:r>
@@ -2205,7 +2209,7 @@
               <w:rPr>
                 <w:rFonts w:ascii="Times New Roman" w:hAnsi="Times New Roman" w:eastAsia="Times New Roman"/>
                 <w:b w:val="0"/>
-                <w:sz w:val="16"/>
+                <w:sz w:val="20"/>
               </w:rPr>
               <w:t>Pending. SWiM is prespecified. No PRISMA flow, included-study set, synthesis conclusion or completed reporting audit is claimed.</w:t>
             </w:r>
@@ -2324,7 +2328,7 @@
               <w:rPr>
                 <w:rFonts w:ascii="Times New Roman" w:hAnsi="Times New Roman" w:eastAsia="Times New Roman"/>
                 <w:b/>
-                <w:sz w:val="14"/>
+                <w:sz w:val="20"/>
               </w:rPr>
               <w:t>Source/layer</w:t>
             </w:r>
@@ -2341,7 +2345,7 @@
               <w:rPr>
                 <w:rFonts w:ascii="Times New Roman" w:hAnsi="Times New Roman" w:eastAsia="Times New Roman"/>
                 <w:b/>
-                <w:sz w:val="14"/>
+                <w:sz w:val="20"/>
               </w:rPr>
               <w:t>Dated verified count</w:t>
             </w:r>
@@ -2358,7 +2362,7 @@
               <w:rPr>
                 <w:rFonts w:ascii="Times New Roman" w:hAnsi="Times New Roman" w:eastAsia="Times New Roman"/>
                 <w:b/>
-                <w:sz w:val="14"/>
+                <w:sz w:val="20"/>
               </w:rPr>
               <w:t>Record/export limitation</w:t>
             </w:r>
@@ -2376,7 +2380,7 @@
               <w:rPr>
                 <w:rFonts w:ascii="Times New Roman" w:hAnsi="Times New Roman" w:eastAsia="Times New Roman"/>
                 <w:b w:val="0"/>
-                <w:sz w:val="14"/>
+                <w:sz w:val="20"/>
               </w:rPr>
               <w:t>PubMed/MEDLINE v3</w:t>
             </w:r>
@@ -2392,7 +2396,7 @@
               <w:rPr>
                 <w:rFonts w:ascii="Times New Roman" w:hAnsi="Times New Roman" w:eastAsia="Times New Roman"/>
                 <w:b w:val="0"/>
-                <w:sz w:val="14"/>
+                <w:sz w:val="20"/>
               </w:rPr>
               <w:t>16 Sep 2026: 140 base; 53 molecular-facet</w:t>
             </w:r>
@@ -2408,7 +2412,7 @@
               <w:rPr>
                 <w:rFonts w:ascii="Times New Roman" w:hAnsi="Times New Roman" w:eastAsia="Times New Roman"/>
                 <w:b w:val="0"/>
-                <w:sz w:val="14"/>
+                <w:sz w:val="20"/>
               </w:rPr>
               <w:t>Persistent base and molecular records; date filter was 2006/01/01-2026/09/30. The exact executed strings are retained in Appendix A.</w:t>
             </w:r>
@@ -2426,7 +2430,7 @@
               <w:rPr>
                 <w:rFonts w:ascii="Times New Roman" w:hAnsi="Times New Roman" w:eastAsia="Times New Roman"/>
                 <w:b w:val="0"/>
-                <w:sz w:val="14"/>
+                <w:sz w:val="20"/>
               </w:rPr>
               <w:t>Scopus</w:t>
             </w:r>
@@ -2442,7 +2446,7 @@
               <w:rPr>
                 <w:rFonts w:ascii="Times New Roman" w:hAnsi="Times New Roman" w:eastAsia="Times New Roman"/>
                 <w:b w:val="0"/>
-                <w:sz w:val="14"/>
+                <w:sz w:val="20"/>
               </w:rPr>
               <w:t>16 Sep 2026: 204</w:t>
             </w:r>
@@ -2458,7 +2462,7 @@
               <w:rPr>
                 <w:rFonts w:ascii="Times New Roman" w:hAnsi="Times New Roman" w:eastAsia="Times New Roman"/>
                 <w:b w:val="0"/>
-                <w:sz w:val="14"/>
+                <w:sz w:val="20"/>
               </w:rPr>
               <w:t>Manual export recorded. The v1 TITLE-ABS-KEY string is retained in the run sheet.</w:t>
             </w:r>
@@ -2476,7 +2480,7 @@
               <w:rPr>
                 <w:rFonts w:ascii="Times New Roman" w:hAnsi="Times New Roman" w:eastAsia="Times New Roman"/>
                 <w:b w:val="0"/>
-                <w:sz w:val="14"/>
+                <w:sz w:val="20"/>
               </w:rPr>
               <w:t>ScienceDirect</w:t>
             </w:r>
@@ -2492,7 +2496,7 @@
               <w:rPr>
                 <w:rFonts w:ascii="Times New Roman" w:hAnsi="Times New Roman" w:eastAsia="Times New Roman"/>
                 <w:b w:val="0"/>
-                <w:sz w:val="14"/>
+                <w:sz w:val="20"/>
               </w:rPr>
               <w:t>16 Sep 2026: 25 displayed/exported</w:t>
             </w:r>
@@ -2508,7 +2512,7 @@
               <w:rPr>
                 <w:rFonts w:ascii="Times New Roman" w:hAnsi="Times New Roman" w:eastAsia="Times New Roman"/>
                 <w:b w:val="0"/>
-                <w:sz w:val="14"/>
+                <w:sz w:val="20"/>
               </w:rPr>
               <w:t>Manual, capped result layer. The record is an adapted single-line query; no unsupported full as-run string is supplied here.</w:t>
             </w:r>
@@ -2526,7 +2530,7 @@
               <w:rPr>
                 <w:rFonts w:ascii="Times New Roman" w:hAnsi="Times New Roman" w:eastAsia="Times New Roman"/>
                 <w:b w:val="0"/>
-                <w:sz w:val="14"/>
+                <w:sz w:val="20"/>
               </w:rPr>
               <w:t>WoS Starter API</w:t>
             </w:r>
@@ -2542,7 +2546,7 @@
               <w:rPr>
                 <w:rFonts w:ascii="Times New Roman" w:hAnsi="Times New Roman" w:eastAsia="Times New Roman"/>
                 <w:b w:val="0"/>
-                <w:sz w:val="14"/>
+                <w:sz w:val="20"/>
               </w:rPr>
               <w:t>19 Sep 2026: 175 UIDs</w:t>
             </w:r>
@@ -2558,7 +2562,7 @@
               <w:rPr>
                 <w:rFonts w:ascii="Times New Roman" w:hAnsi="Times New Roman" w:eastAsia="Times New Roman"/>
                 <w:b w:val="0"/>
-                <w:sz w:val="14"/>
+                <w:sz w:val="20"/>
               </w:rPr>
               <w:t>Four JSON pages (50/50/50/25), all HTTP 200; no English filter recorded. This is the imported WoS layer.</w:t>
             </w:r>
@@ -2576,7 +2580,7 @@
               <w:rPr>
                 <w:rFonts w:ascii="Times New Roman" w:hAnsi="Times New Roman" w:eastAsia="Times New Roman"/>
                 <w:b w:val="0"/>
-                <w:sz w:val="14"/>
+                <w:sz w:val="20"/>
               </w:rPr>
               <w:t>WoS Core Collection browser</w:t>
             </w:r>
@@ -2592,7 +2596,7 @@
               <w:rPr>
                 <w:rFonts w:ascii="Times New Roman" w:hAnsi="Times New Roman" w:eastAsia="Times New Roman"/>
                 <w:b w:val="0"/>
-                <w:sz w:val="14"/>
+                <w:sz w:val="20"/>
               </w:rPr>
               <w:t>20 Sep 2026: 206 base; 77 molecular; 154 epidemiology; 70 wild-bird/host</w:t>
             </w:r>
@@ -2608,7 +2612,7 @@
               <w:rPr>
                 <w:rFonts w:ascii="Times New Roman" w:hAnsi="Times New Roman" w:eastAsia="Times New Roman"/>
                 <w:b w:val="0"/>
-                <w:sz w:val="14"/>
+                <w:sz w:val="20"/>
               </w:rPr>
               <w:t>Displayed counts only, with no reliable full record-level export. Facets overlap and are not PRISMA records.</w:t>
             </w:r>
@@ -2626,7 +2630,7 @@
               <w:rPr>
                 <w:rFonts w:ascii="Times New Roman" w:hAnsi="Times New Roman" w:eastAsia="Times New Roman"/>
                 <w:b w:val="0"/>
-                <w:sz w:val="14"/>
+                <w:sz w:val="20"/>
               </w:rPr>
               <w:t>Google Scholar supplement</w:t>
             </w:r>
@@ -2642,7 +2646,7 @@
               <w:rPr>
                 <w:rFonts w:ascii="Times New Roman" w:hAnsi="Times New Roman" w:eastAsia="Times New Roman"/>
                 <w:b w:val="0"/>
-                <w:sz w:val="14"/>
+                <w:sz w:val="20"/>
               </w:rPr>
               <w:t>17 Sep 2026: 140 retrieved; 99 cross-query unique</w:t>
             </w:r>
@@ -2658,7 +2662,7 @@
               <w:rPr>
                 <w:rFonts w:ascii="Times New Roman" w:hAnsi="Times New Roman" w:eastAsia="Times New Roman"/>
                 <w:b w:val="0"/>
-                <w:sz w:val="14"/>
+                <w:sz w:val="20"/>
               </w:rPr>
               <w:t>Relevance-ranked, cap 200/query; no persistent export. Supplementary and excluded from the primary PRISMA snapshot.</w:t>
             </w:r>
@@ -2676,7 +2680,7 @@
               <w:rPr>
                 <w:rFonts w:ascii="Times New Roman" w:hAnsi="Times New Roman" w:eastAsia="Times New Roman"/>
                 <w:b w:val="0"/>
-                <w:sz w:val="14"/>
+                <w:sz w:val="20"/>
               </w:rPr>
               <w:t>AJOL on-site</w:t>
             </w:r>
@@ -2692,7 +2696,7 @@
               <w:rPr>
                 <w:rFonts w:ascii="Times New Roman" w:hAnsi="Times New Roman" w:eastAsia="Times New Roman"/>
                 <w:b w:val="0"/>
-                <w:sz w:val="14"/>
+                <w:sz w:val="20"/>
               </w:rPr>
               <w:t>20 Sep 2026: 144 query rows; 79 unique pages; 73 in-window</w:t>
             </w:r>
@@ -2708,7 +2712,7 @@
               <w:rPr>
                 <w:rFonts w:ascii="Times New Roman" w:hAnsi="Times New Roman" w:eastAsia="Times New Roman"/>
                 <w:b w:val="0"/>
-                <w:sz w:val="14"/>
+                <w:sz w:val="20"/>
               </w:rPr>
               <w:t>Nine exact queries; captured metadata and query lineage are retained. No substantive screening decision was made from this source layer.</w:t>
             </w:r>
@@ -2726,7 +2730,7 @@
               <w:rPr>
                 <w:rFonts w:ascii="Times New Roman" w:hAnsi="Times New Roman" w:eastAsia="Times New Roman"/>
                 <w:b w:val="0"/>
-                <w:sz w:val="14"/>
+                <w:sz w:val="20"/>
               </w:rPr>
               <w:t>OpenAlex/Crossref supplements</w:t>
             </w:r>
@@ -2742,7 +2746,7 @@
               <w:rPr>
                 <w:rFonts w:ascii="Times New Roman" w:hAnsi="Times New Roman" w:eastAsia="Times New Roman"/>
                 <w:b w:val="0"/>
-                <w:sz w:val="14"/>
+                <w:sz w:val="20"/>
               </w:rPr>
               <w:t>16 Sep 2026: 1,000 exported from each raw supplement</w:t>
             </w:r>
@@ -2758,7 +2762,7 @@
               <w:rPr>
                 <w:rFonts w:ascii="Times New Roman" w:hAnsi="Times New Roman" w:eastAsia="Times New Roman"/>
                 <w:b w:val="0"/>
-                <w:sz w:val="14"/>
+                <w:sz w:val="20"/>
               </w:rPr>
               <w:t>Supplementary discovery layers. Their rows were reconciled in the canonical register, not treated as final included studies.</w:t>
             </w:r>
@@ -2807,7 +2811,7 @@
               <w:rPr>
                 <w:rFonts w:ascii="Times New Roman" w:hAnsi="Times New Roman" w:eastAsia="Times New Roman"/>
                 <w:b/>
-                <w:sz w:val="16"/>
+                <w:sz w:val="20"/>
               </w:rPr>
               <w:t>Adjudicated title/metadata screening outcome</w:t>
             </w:r>
@@ -2824,7 +2828,7 @@
               <w:rPr>
                 <w:rFonts w:ascii="Times New Roman" w:hAnsi="Times New Roman" w:eastAsia="Times New Roman"/>
                 <w:b/>
-                <w:sz w:val="16"/>
+                <w:sz w:val="20"/>
               </w:rPr>
               <w:t>Count</w:t>
             </w:r>
@@ -2841,7 +2845,7 @@
               <w:rPr>
                 <w:rFonts w:ascii="Times New Roman" w:hAnsi="Times New Roman" w:eastAsia="Times New Roman"/>
                 <w:b/>
-                <w:sz w:val="16"/>
+                <w:sz w:val="20"/>
               </w:rPr>
               <w:t>Canonical IDs / decision-reason-code status</w:t>
             </w:r>
@@ -2859,7 +2863,7 @@
               <w:rPr>
                 <w:rFonts w:ascii="Times New Roman" w:hAnsi="Times New Roman" w:eastAsia="Times New Roman"/>
                 <w:b w:val="0"/>
-                <w:sz w:val="16"/>
+                <w:sz w:val="20"/>
               </w:rPr>
               <w:t>Clear exclusions</w:t>
             </w:r>
@@ -2875,7 +2879,7 @@
               <w:rPr>
                 <w:rFonts w:ascii="Times New Roman" w:hAnsi="Times New Roman" w:eastAsia="Times New Roman"/>
                 <w:b w:val="0"/>
-                <w:sz w:val="16"/>
+                <w:sz w:val="20"/>
               </w:rPr>
               <w:t>25</w:t>
             </w:r>
@@ -2891,7 +2895,7 @@
               <w:rPr>
                 <w:rFonts w:ascii="Times New Roman" w:hAnsi="Times New Roman" w:eastAsia="Times New Roman"/>
                 <w:b w:val="0"/>
-                <w:sz w:val="16"/>
+                <w:sz w:val="20"/>
               </w:rPr>
               <w:t>CAN-0001, CAN-0002, CAN-0004, CAN-0005, CAN-0009, CAN-0010, CAN-0011, CAN-0012, CAN-0013, CAN-0021, CAN-0028, CAN-0037, CAN-0038, CAN-0043, CAN-0050, CAN-0057, CAN-0078, CAN-0124, CAN-0128, CAN-0133, CAN-0148, CAN-0152, CAN-0153, CAN-0159, CAN-0183.</w:t>
             </w:r>
@@ -2909,7 +2913,7 @@
               <w:rPr>
                 <w:rFonts w:ascii="Times New Roman" w:hAnsi="Times New Roman" w:eastAsia="Times New Roman"/>
                 <w:b w:val="0"/>
-                <w:sz w:val="16"/>
+                <w:sz w:val="20"/>
               </w:rPr>
               <w:t>Retained provisionally for full text</w:t>
             </w:r>
@@ -2925,7 +2929,7 @@
               <w:rPr>
                 <w:rFonts w:ascii="Times New Roman" w:hAnsi="Times New Roman" w:eastAsia="Times New Roman"/>
                 <w:b w:val="0"/>
-                <w:sz w:val="16"/>
+                <w:sz w:val="20"/>
               </w:rPr>
               <w:t>15</w:t>
             </w:r>
@@ -2941,7 +2945,7 @@
               <w:rPr>
                 <w:rFonts w:ascii="Times New Roman" w:hAnsi="Times New Roman" w:eastAsia="Times New Roman"/>
                 <w:b w:val="0"/>
-                <w:sz w:val="16"/>
+                <w:sz w:val="20"/>
               </w:rPr>
               <w:t>CAN-0003, CAN-0006, CAN-0007, CAN-0008, CAN-0014, CAN-0017, CAN-0025, CAN-0026, CAN-0027, CAN-0031, CAN-0039, CAN-0049, CAN-0056, CAN-0129, CAN-0155. Not final included studies.</w:t>
             </w:r>
@@ -2959,7 +2963,7 @@
               <w:rPr>
                 <w:rFonts w:ascii="Times New Roman" w:hAnsi="Times New Roman" w:eastAsia="Times New Roman"/>
                 <w:b w:val="0"/>
-                <w:sz w:val="16"/>
+                <w:sz w:val="20"/>
               </w:rPr>
               <w:t>Clear title-level retains</w:t>
             </w:r>
@@ -2975,7 +2979,7 @@
               <w:rPr>
                 <w:rFonts w:ascii="Times New Roman" w:hAnsi="Times New Roman" w:eastAsia="Times New Roman"/>
                 <w:b w:val="0"/>
-                <w:sz w:val="16"/>
+                <w:sz w:val="20"/>
               </w:rPr>
               <w:t>11</w:t>
             </w:r>
@@ -2991,7 +2995,7 @@
               <w:rPr>
                 <w:rFonts w:ascii="Times New Roman" w:hAnsi="Times New Roman" w:eastAsia="Times New Roman"/>
                 <w:b w:val="0"/>
-                <w:sz w:val="16"/>
+                <w:sz w:val="20"/>
               </w:rPr>
               <w:t>Eligible-looking title/metadata; all remain provisional until full-text eligibility assessment.</w:t>
             </w:r>
@@ -3009,7 +3013,7 @@
               <w:rPr>
                 <w:rFonts w:ascii="Times New Roman" w:hAnsi="Times New Roman" w:eastAsia="Times New Roman"/>
                 <w:b w:val="0"/>
-                <w:sz w:val="16"/>
+                <w:sz w:val="20"/>
               </w:rPr>
               <w:t>Retained under uncertainty</w:t>
             </w:r>
@@ -3025,7 +3029,7 @@
               <w:rPr>
                 <w:rFonts w:ascii="Times New Roman" w:hAnsi="Times New Roman" w:eastAsia="Times New Roman"/>
                 <w:b w:val="0"/>
-                <w:sz w:val="16"/>
+                <w:sz w:val="20"/>
               </w:rPr>
               <w:t>4</w:t>
             </w:r>
@@ -3041,7 +3045,7 @@
               <w:rPr>
                 <w:rFonts w:ascii="Times New Roman" w:hAnsi="Times New Roman" w:eastAsia="Times New Roman"/>
                 <w:b w:val="0"/>
-                <w:sz w:val="16"/>
+                <w:sz w:val="20"/>
               </w:rPr>
               <w:t>Conservative rule applied; includes adjudicated CAN-0031 and CAN-0049. All remain provisional until full-text eligibility assessment.</w:t>
             </w:r>
@@ -3055,6 +3059,10 @@
           </w:tcPr>
           <w:p>
             <w:r>
+              <w:rPr>
+                <w:rFonts w:ascii="Times New Roman" w:hAnsi="Times New Roman"/>
+                <w:sz w:val="20"/>
+              </w:rPr>
               <w:t>Batch R1-B1: Include-for-full-text</w:t>
             </w:r>
           </w:p>
@@ -3065,6 +3073,10 @@
           </w:tcPr>
           <w:p>
             <w:r>
+              <w:rPr>
+                <w:rFonts w:ascii="Times New Roman" w:hAnsi="Times New Roman"/>
+                <w:sz w:val="20"/>
+              </w:rPr>
               <w:t>17</w:t>
             </w:r>
           </w:p>
@@ -3075,6 +3087,10 @@
           </w:tcPr>
           <w:p>
             <w:r>
+              <w:rPr>
+                <w:rFonts w:ascii="Times New Roman" w:hAnsi="Times New Roman"/>
+                <w:sz w:val="20"/>
+              </w:rPr>
               <w:t>Decision/reason-code category: Include. Provisional full-text candidates; not final included studies.</w:t>
             </w:r>
           </w:p>
@@ -3087,6 +3103,10 @@
           </w:tcPr>
           <w:p>
             <w:r>
+              <w:rPr>
+                <w:rFonts w:ascii="Times New Roman" w:hAnsi="Times New Roman"/>
+                <w:sz w:val="20"/>
+              </w:rPr>
               <w:t>Batch R1-B1: Unsure/retain-for-full-text</w:t>
             </w:r>
           </w:p>
@@ -3097,6 +3117,10 @@
           </w:tcPr>
           <w:p>
             <w:r>
+              <w:rPr>
+                <w:rFonts w:ascii="Times New Roman" w:hAnsi="Times New Roman"/>
+                <w:sz w:val="20"/>
+              </w:rPr>
               <w:t>10</w:t>
             </w:r>
           </w:p>
@@ -3107,6 +3131,10 @@
           </w:tcPr>
           <w:p>
             <w:r>
+              <w:rPr>
+                <w:rFonts w:ascii="Times New Roman" w:hAnsi="Times New Roman"/>
+                <w:sz w:val="20"/>
+              </w:rPr>
               <w:t>Decision/reason-code category: Unsure. Retained under the conservative uncertainty rule; not final included studies.</w:t>
             </w:r>
           </w:p>
@@ -3119,6 +3147,10 @@
           </w:tcPr>
           <w:p>
             <w:r>
+              <w:rPr>
+                <w:rFonts w:ascii="Times New Roman" w:hAnsi="Times New Roman"/>
+                <w:sz w:val="20"/>
+              </w:rPr>
               <w:t>Batch R1-B1: Exclude</w:t>
             </w:r>
           </w:p>
@@ -3129,6 +3161,10 @@
           </w:tcPr>
           <w:p>
             <w:r>
+              <w:rPr>
+                <w:rFonts w:ascii="Times New Roman" w:hAnsi="Times New Roman"/>
+                <w:sz w:val="20"/>
+              </w:rPr>
               <w:t>73</w:t>
             </w:r>
           </w:p>
@@ -3139,6 +3175,10 @@
           </w:tcPr>
           <w:p>
             <w:r>
+              <w:rPr>
+                <w:rFonts w:ascii="Times New Roman" w:hAnsi="Times New Roman"/>
+                <w:sz w:val="20"/>
+              </w:rPr>
               <w:t>Decision/reason-code category: Exclude. Clear title/metadata exclusions.</w:t>
             </w:r>
           </w:p>
@@ -3151,6 +3191,10 @@
           </w:tcPr>
           <w:p>
             <w:r>
+              <w:rPr>
+                <w:rFonts w:ascii="Times New Roman" w:hAnsi="Times New Roman"/>
+                <w:sz w:val="20"/>
+              </w:rPr>
               <w:t>Batch R1-B1: exact R1/R2 agreement</w:t>
             </w:r>
           </w:p>
@@ -3161,6 +3205,10 @@
           </w:tcPr>
           <w:p>
             <w:r>
+              <w:rPr>
+                <w:rFonts w:ascii="Times New Roman" w:hAnsi="Times New Roman"/>
+                <w:sz w:val="20"/>
+              </w:rPr>
               <w:t>100/100</w:t>
             </w:r>
           </w:p>
@@ -3171,6 +3219,10 @@
           </w:tcPr>
           <w:p>
             <w:r>
+              <w:rPr>
+                <w:rFonts w:ascii="Times New Roman" w:hAnsi="Times New Roman"/>
+                <w:sz w:val="20"/>
+              </w:rPr>
               <w:t>First 100 non-pilot canonical records by canonical_id order, CAN-0015 through CAN-0134 with pilot IDs omitted. No adjudication disagreements.</w:t>
             </w:r>
           </w:p>
@@ -3183,6 +3235,10 @@
           </w:tcPr>
           <w:p>
             <w:r>
+              <w:rPr>
+                <w:rFonts w:ascii="Times New Roman" w:hAnsi="Times New Roman"/>
+                <w:sz w:val="20"/>
+              </w:rPr>
               <w:t>Batch R1-B1: retained provisionally for full text</w:t>
             </w:r>
           </w:p>
@@ -3193,6 +3249,10 @@
           </w:tcPr>
           <w:p>
             <w:r>
+              <w:rPr>
+                <w:rFonts w:ascii="Times New Roman" w:hAnsi="Times New Roman"/>
+                <w:sz w:val="20"/>
+              </w:rPr>
               <w:t>27</w:t>
             </w:r>
           </w:p>
@@ -3203,6 +3263,10 @@
           </w:tcPr>
           <w:p>
             <w:r>
+              <w:rPr>
+                <w:rFonts w:ascii="Times New Roman" w:hAnsi="Times New Roman"/>
+                <w:sz w:val="20"/>
+              </w:rPr>
               <w:t>CAN-0015, CAN-0032, CAN-0033, CAN-0040, CAN-0045, CAN-0046, CAN-0048, CAN-0051, CAN-0052, CAN-0053, CAN-0055, CAN-0058, CAN-0059, CAN-0061, CAN-0063, CAN-0064, CAN-0065, CAN-0066, CAN-0070, CAN-0071, CAN-0080, CAN-0086, CAN-0087, CAN-0089, CAN-0114, CAN-0122, CAN-0132. Not final included studies.</w:t>
             </w:r>
           </w:p>
@@ -3215,6 +3279,10 @@
           </w:tcPr>
           <w:p>
             <w:r>
+              <w:rPr>
+                <w:rFonts w:ascii="Times New Roman" w:hAnsi="Times New Roman"/>
+                <w:sz w:val="20"/>
+              </w:rPr>
               <w:t>Cumulative through pilot + Batch R1-B1: clear exclusions</w:t>
             </w:r>
           </w:p>
@@ -3225,6 +3293,10 @@
           </w:tcPr>
           <w:p>
             <w:r>
+              <w:rPr>
+                <w:rFonts w:ascii="Times New Roman" w:hAnsi="Times New Roman"/>
+                <w:sz w:val="20"/>
+              </w:rPr>
               <w:t>98</w:t>
             </w:r>
           </w:p>
@@ -3235,6 +3307,10 @@
           </w:tcPr>
           <w:p>
             <w:r>
+              <w:rPr>
+                <w:rFonts w:ascii="Times New Roman" w:hAnsi="Times New Roman"/>
+                <w:sz w:val="20"/>
+              </w:rPr>
               <w:t>Title/metadata only; interim milestone, not a final PRISMA exclusion count.</w:t>
             </w:r>
           </w:p>
@@ -3247,6 +3323,10 @@
           </w:tcPr>
           <w:p>
             <w:r>
+              <w:rPr>
+                <w:rFonts w:ascii="Times New Roman" w:hAnsi="Times New Roman"/>
+                <w:sz w:val="20"/>
+              </w:rPr>
               <w:t>Cumulative through pilot + Batch R1-B1: provisional full-text candidates</w:t>
             </w:r>
           </w:p>
@@ -3257,6 +3337,10 @@
           </w:tcPr>
           <w:p>
             <w:r>
+              <w:rPr>
+                <w:rFonts w:ascii="Times New Roman" w:hAnsi="Times New Roman"/>
+                <w:sz w:val="20"/>
+              </w:rPr>
               <w:t>42</w:t>
             </w:r>
           </w:p>
@@ -3267,6 +3351,10 @@
           </w:tcPr>
           <w:p>
             <w:r>
+              <w:rPr>
+                <w:rFonts w:ascii="Times New Roman" w:hAnsi="Times New Roman"/>
+                <w:sz w:val="20"/>
+              </w:rPr>
               <w:t>All retained records remained provisional pending full-text assessment, extraction, risk-of-bias appraisal, certainty assessment and synthesis.</w:t>
             </w:r>
           </w:p>
@@ -3279,6 +3367,10 @@
           </w:tcPr>
           <w:p>
             <w:r>
+              <w:rPr>
+                <w:rFonts w:ascii="Times New Roman" w:hAnsi="Times New Roman"/>
+                <w:sz w:val="20"/>
+              </w:rPr>
               <w:t>Batch B2: scope</w:t>
             </w:r>
           </w:p>
@@ -3289,6 +3381,10 @@
           </w:tcPr>
           <w:p>
             <w:r>
+              <w:rPr>
+                <w:rFonts w:ascii="Times New Roman" w:hAnsi="Times New Roman"/>
+                <w:sz w:val="20"/>
+              </w:rPr>
               <w:t>100</w:t>
             </w:r>
           </w:p>
@@ -3299,6 +3395,10 @@
           </w:tcPr>
           <w:p>
             <w:r>
+              <w:rPr>
+                <w:rFonts w:ascii="Times New Roman" w:hAnsi="Times New Roman"/>
+                <w:sz w:val="20"/>
+              </w:rPr>
               <w:t>Next 100 non-pilot canonical records after B1: CAN-0135-CAN-0240, with pilot IDs omitted. Title/metadata screening only.</w:t>
             </w:r>
           </w:p>
@@ -3311,6 +3411,10 @@
           </w:tcPr>
           <w:p>
             <w:r>
+              <w:rPr>
+                <w:rFonts w:ascii="Times New Roman" w:hAnsi="Times New Roman"/>
+                <w:sz w:val="20"/>
+              </w:rPr>
               <w:t>Batch B2: R1 disposition</w:t>
             </w:r>
           </w:p>
@@ -3321,6 +3425,10 @@
           </w:tcPr>
           <w:p>
             <w:r>
+              <w:rPr>
+                <w:rFonts w:ascii="Times New Roman" w:hAnsi="Times New Roman"/>
+                <w:sz w:val="20"/>
+              </w:rPr>
               <w:t>20 retained; 80 excluded</w:t>
             </w:r>
           </w:p>
@@ -3331,6 +3439,10 @@
           </w:tcPr>
           <w:p>
             <w:r>
+              <w:rPr>
+                <w:rFonts w:ascii="Times New Roman" w:hAnsi="Times New Roman"/>
+                <w:sz w:val="20"/>
+              </w:rPr>
               <w:t>10 Include-for-full-text; 10 Unsure/retain-for-full-text. Independent R1 title/metadata screen.</w:t>
             </w:r>
           </w:p>
@@ -3343,6 +3455,10 @@
           </w:tcPr>
           <w:p>
             <w:r>
+              <w:rPr>
+                <w:rFonts w:ascii="Times New Roman" w:hAnsi="Times New Roman"/>
+                <w:sz w:val="20"/>
+              </w:rPr>
               <w:t>Batch B2: R2 disposition</w:t>
             </w:r>
           </w:p>
@@ -3353,6 +3469,10 @@
           </w:tcPr>
           <w:p>
             <w:r>
+              <w:rPr>
+                <w:rFonts w:ascii="Times New Roman" w:hAnsi="Times New Roman"/>
+                <w:sz w:val="20"/>
+              </w:rPr>
               <w:t>17 retained; 83 excluded</w:t>
             </w:r>
           </w:p>
@@ -3363,6 +3483,10 @@
           </w:tcPr>
           <w:p>
             <w:r>
+              <w:rPr>
+                <w:rFonts w:ascii="Times New Roman" w:hAnsi="Times New Roman"/>
+                <w:sz w:val="20"/>
+              </w:rPr>
               <w:t>Aggregate R2 disposition. Independent R2 title/metadata screen.</w:t>
             </w:r>
           </w:p>
@@ -3375,6 +3499,10 @@
           </w:tcPr>
           <w:p>
             <w:r>
+              <w:rPr>
+                <w:rFonts w:ascii="Times New Roman" w:hAnsi="Times New Roman"/>
+                <w:sz w:val="20"/>
+              </w:rPr>
               <w:t>Batch B2: disagreements and adjudication</w:t>
             </w:r>
           </w:p>
@@ -3385,6 +3513,10 @@
           </w:tcPr>
           <w:p>
             <w:r>
+              <w:rPr>
+                <w:rFonts w:ascii="Times New Roman" w:hAnsi="Times New Roman"/>
+                <w:sz w:val="20"/>
+              </w:rPr>
               <w:t>8</w:t>
             </w:r>
           </w:p>
@@ -3395,6 +3527,10 @@
           </w:tcPr>
           <w:p>
             <w:r>
+              <w:rPr>
+                <w:rFonts w:ascii="Times New Roman" w:hAnsi="Times New Roman"/>
+                <w:sz w:val="20"/>
+              </w:rPr>
               <w:t>CAN-0151, CAN-0154, CAN-0156, CAN-0189, CAN-0210, CAN-0215, CAN-0232 and CAN-0234. Apply the frozen criteria and conservative uncertainty rule; no final study inclusion is inferred.</w:t>
             </w:r>
           </w:p>
@@ -3407,6 +3543,10 @@
           </w:tcPr>
           <w:p>
             <w:r>
+              <w:rPr>
+                <w:rFonts w:ascii="Times New Roman" w:hAnsi="Times New Roman"/>
+                <w:sz w:val="20"/>
+              </w:rPr>
               <w:t>Batch B2: final retained provisionally for full text</w:t>
             </w:r>
           </w:p>
@@ -3417,6 +3557,10 @@
           </w:tcPr>
           <w:p>
             <w:r>
+              <w:rPr>
+                <w:rFonts w:ascii="Times New Roman" w:hAnsi="Times New Roman"/>
+                <w:sz w:val="20"/>
+              </w:rPr>
               <w:t>17</w:t>
             </w:r>
           </w:p>
@@ -3427,6 +3571,10 @@
           </w:tcPr>
           <w:p>
             <w:r>
+              <w:rPr>
+                <w:rFonts w:ascii="Times New Roman" w:hAnsi="Times New Roman"/>
+                <w:sz w:val="20"/>
+              </w:rPr>
               <w:t>The 14 unchanged R1 retained IDs plus CAN-0189, CAN-0215 and CAN-0232. All 17 are provisional full-text candidates, not final included studies.</w:t>
             </w:r>
           </w:p>
@@ -3439,6 +3587,10 @@
           </w:tcPr>
           <w:p>
             <w:r>
+              <w:rPr>
+                <w:rFonts w:ascii="Times New Roman" w:hAnsi="Times New Roman"/>
+                <w:sz w:val="20"/>
+              </w:rPr>
               <w:t>Batch B2: final exclusions</w:t>
             </w:r>
           </w:p>
@@ -3449,6 +3601,10 @@
           </w:tcPr>
           <w:p>
             <w:r>
+              <w:rPr>
+                <w:rFonts w:ascii="Times New Roman" w:hAnsi="Times New Roman"/>
+                <w:sz w:val="20"/>
+              </w:rPr>
               <w:t>83</w:t>
             </w:r>
           </w:p>
@@ -3459,6 +3615,10 @@
           </w:tcPr>
           <w:p>
             <w:r>
+              <w:rPr>
+                <w:rFonts w:ascii="Times New Roman" w:hAnsi="Times New Roman"/>
+                <w:sz w:val="20"/>
+              </w:rPr>
               <w:t>Includes clear global/non-Nigeria CAN-0151, CAN-0154 and CAN-0156, and R2-only CAN-0210 and CAN-0234. CAN-0210 and CAN-0234 lacked title-level evidence of eligible avian-AIV empirical data under the frozen criteria.</w:t>
             </w:r>
           </w:p>
@@ -3471,6 +3631,10 @@
           </w:tcPr>
           <w:p>
             <w:r>
+              <w:rPr>
+                <w:rFonts w:ascii="Times New Roman" w:hAnsi="Times New Roman"/>
+                <w:sz w:val="20"/>
+              </w:rPr>
               <w:t>Cumulative pilot + Batch R1-B1 + Batch B2: clear exclusions</w:t>
             </w:r>
           </w:p>
@@ -3481,6 +3645,10 @@
           </w:tcPr>
           <w:p>
             <w:r>
+              <w:rPr>
+                <w:rFonts w:ascii="Times New Roman" w:hAnsi="Times New Roman"/>
+                <w:sz w:val="20"/>
+              </w:rPr>
               <w:t>181</w:t>
             </w:r>
           </w:p>
@@ -3491,6 +3659,10 @@
           </w:tcPr>
           <w:p>
             <w:r>
+              <w:rPr>
+                <w:rFonts w:ascii="Times New Roman" w:hAnsi="Times New Roman"/>
+                <w:sz w:val="20"/>
+              </w:rPr>
               <w:t>Title/metadata screening only; not a final PRISMA exclusion count.</w:t>
             </w:r>
           </w:p>
@@ -3503,6 +3675,10 @@
           </w:tcPr>
           <w:p>
             <w:r>
+              <w:rPr>
+                <w:rFonts w:ascii="Times New Roman" w:hAnsi="Times New Roman"/>
+                <w:sz w:val="20"/>
+              </w:rPr>
               <w:t>Cumulative pilot + Batch R1-B1 + Batch B2: provisional full-text candidates</w:t>
             </w:r>
           </w:p>
@@ -3513,6 +3689,10 @@
           </w:tcPr>
           <w:p>
             <w:r>
+              <w:rPr>
+                <w:rFonts w:ascii="Times New Roman" w:hAnsi="Times New Roman"/>
+                <w:sz w:val="20"/>
+              </w:rPr>
               <w:t>59</w:t>
             </w:r>
           </w:p>
@@ -3523,6 +3703,10 @@
           </w:tcPr>
           <w:p>
             <w:r>
+              <w:rPr>
+                <w:rFonts w:ascii="Times New Roman" w:hAnsi="Times New Roman"/>
+                <w:sz w:val="20"/>
+              </w:rPr>
               <w:t>All retained records await full-text eligibility assessment. Not final included studies; extraction, RoB, certainty, final PRISMA and SWiM synthesis remain pending.</w:t>
             </w:r>
           </w:p>
@@ -3536,6 +3720,10 @@
           <w:tcPr/>
           <w:p>
             <w:r>
+              <w:rPr>
+                <w:rFonts w:ascii="Times New Roman" w:hAnsi="Times New Roman"/>
+                <w:sz w:val="20"/>
+              </w:rPr>
               <w:t>Batch B3: scope and independent dispositions</w:t>
             </w:r>
           </w:p>
@@ -3547,6 +3735,10 @@
           <w:tcPr/>
           <w:p>
             <w:r>
+              <w:rPr>
+                <w:rFonts w:ascii="Times New Roman" w:hAnsi="Times New Roman"/>
+                <w:sz w:val="20"/>
+              </w:rPr>
               <w:t>100</w:t>
             </w:r>
           </w:p>
@@ -3558,6 +3750,10 @@
           <w:tcPr/>
           <w:p>
             <w:r>
+              <w:rPr>
+                <w:rFonts w:ascii="Times New Roman" w:hAnsi="Times New Roman"/>
+                <w:sz w:val="20"/>
+              </w:rPr>
               <w:t>CAN-0241-CAN-0340. R1: 7 Include-for-full-text + 5 Unsure/retain-for-full-text; 88 Exclude. R2: 7 Retain + 1 Unsure; 92 Exclude.</w:t>
             </w:r>
           </w:p>
@@ -3571,6 +3767,10 @@
           <w:tcPr/>
           <w:p>
             <w:r>
+              <w:rPr>
+                <w:rFonts w:ascii="Times New Roman" w:hAnsi="Times New Roman"/>
+                <w:sz w:val="20"/>
+              </w:rPr>
               <w:t>Batch B3: cross-reviewer uncertainty/disagreement and adjudication</w:t>
             </w:r>
           </w:p>
@@ -3582,6 +3782,10 @@
           <w:tcPr/>
           <w:p>
             <w:r>
+              <w:rPr>
+                <w:rFonts w:ascii="Times New Roman" w:hAnsi="Times New Roman"/>
+                <w:sz w:val="20"/>
+              </w:rPr>
               <w:t>6</w:t>
             </w:r>
           </w:p>
@@ -3593,6 +3797,10 @@
           <w:tcPr/>
           <w:p>
             <w:r>
+              <w:rPr>
+                <w:rFonts w:ascii="Times New Roman" w:hAnsi="Times New Roman"/>
+                <w:sz w:val="20"/>
+              </w:rPr>
               <w:t>CAN-0245, CAN-0258, CAN-0266, CAN-0282, CAN-0317 and CAN-0340. Conservative rule: retain all six for full-text review; no final study inclusion is inferred.</w:t>
             </w:r>
           </w:p>
@@ -3606,6 +3814,10 @@
           <w:tcPr/>
           <w:p>
             <w:r>
+              <w:rPr>
+                <w:rFonts w:ascii="Times New Roman" w:hAnsi="Times New Roman"/>
+                <w:sz w:val="20"/>
+              </w:rPr>
               <w:t>Batch B3: final disposition</w:t>
             </w:r>
           </w:p>
@@ -3617,6 +3829,10 @@
           <w:tcPr/>
           <w:p>
             <w:r>
+              <w:rPr>
+                <w:rFonts w:ascii="Times New Roman" w:hAnsi="Times New Roman"/>
+                <w:sz w:val="20"/>
+              </w:rPr>
               <w:t>13 retained; 87 excluded</w:t>
             </w:r>
           </w:p>
@@ -3628,6 +3844,10 @@
           <w:tcPr/>
           <w:p>
             <w:r>
+              <w:rPr>
+                <w:rFonts w:ascii="Times New Roman" w:hAnsi="Times New Roman"/>
+                <w:sz w:val="20"/>
+              </w:rPr>
               <w:t>The seven clear R1/R2 retains remained retained, with the six uncertainty/disagreement records. All 13 are provisional full-text candidates, not final included studies.</w:t>
             </w:r>
           </w:p>
@@ -3641,6 +3861,10 @@
           <w:tcPr/>
           <w:p>
             <w:r>
+              <w:rPr>
+                <w:rFonts w:ascii="Times New Roman" w:hAnsi="Times New Roman"/>
+                <w:sz w:val="20"/>
+              </w:rPr>
               <w:t>Batch B4: scope and final disposition</w:t>
             </w:r>
           </w:p>
@@ -3652,6 +3876,10 @@
           <w:tcPr/>
           <w:p>
             <w:r>
+              <w:rPr>
+                <w:rFonts w:ascii="Times New Roman" w:hAnsi="Times New Roman"/>
+                <w:sz w:val="20"/>
+              </w:rPr>
               <w:t>100 records CAN-0381-CAN-0480; exact R1/R2 agreement (100/100)</w:t>
             </w:r>
           </w:p>
@@ -3663,6 +3891,10 @@
           <w:tcPr/>
           <w:p>
             <w:r>
+              <w:rPr>
+                <w:rFonts w:ascii="Times New Roman" w:hAnsi="Times New Roman"/>
+                <w:sz w:val="20"/>
+              </w:rPr>
               <w:t>0 clear Include-for-full-text; 11 Unsure/retain-for-full-text, all retained provisionally for full text; 89 Exclude; no disagreements.</w:t>
             </w:r>
           </w:p>
@@ -3754,7 +3986,7 @@
               <w:rPr>
                 <w:rFonts w:ascii="Times New Roman" w:hAnsi="Times New Roman" w:eastAsia="Times New Roman"/>
                 <w:b/>
-                <w:sz w:val="16"/>
+                <w:sz w:val="20"/>
               </w:rPr>
               <w:t>Stage</w:t>
             </w:r>
@@ -3771,7 +4003,7 @@
               <w:rPr>
                 <w:rFonts w:ascii="Times New Roman" w:hAnsi="Times New Roman" w:eastAsia="Times New Roman"/>
                 <w:b/>
-                <w:sz w:val="16"/>
+                <w:sz w:val="20"/>
               </w:rPr>
               <w:t>Fields to complete after eligibility</w:t>
             </w:r>
@@ -3788,7 +4020,7 @@
               <w:rPr>
                 <w:rFonts w:ascii="Times New Roman" w:hAnsi="Times New Roman" w:eastAsia="Times New Roman"/>
                 <w:b/>
-                <w:sz w:val="16"/>
+                <w:sz w:val="20"/>
               </w:rPr>
               <w:t>Status</w:t>
             </w:r>
@@ -3806,7 +4038,7 @@
               <w:rPr>
                 <w:rFonts w:ascii="Times New Roman" w:hAnsi="Times New Roman" w:eastAsia="Times New Roman"/>
                 <w:b w:val="0"/>
-                <w:sz w:val="16"/>
+                <w:sz w:val="20"/>
               </w:rPr>
               <w:t>Title/abstract log</w:t>
             </w:r>
@@ -3822,7 +4054,7 @@
               <w:rPr>
                 <w:rFonts w:ascii="Times New Roman" w:hAnsi="Times New Roman" w:eastAsia="Times New Roman"/>
                 <w:b w:val="0"/>
-                <w:sz w:val="16"/>
+                <w:sz w:val="20"/>
               </w:rPr>
               <w:t>Canonical ID; source lineage; reviewer and date; Nigeria link; avian laboratory confirmation; eligible evidence type; primary/extractable data; Include/Exclude/Unsure; one reason and note.</w:t>
             </w:r>
@@ -3855,7 +4087,7 @@
               <w:rPr>
                 <w:rFonts w:ascii="Times New Roman" w:hAnsi="Times New Roman" w:eastAsia="Times New Roman"/>
                 <w:b w:val="0"/>
-                <w:sz w:val="16"/>
+                <w:sz w:val="20"/>
               </w:rPr>
               <w:t>Full-text eligibility (T6)</w:t>
             </w:r>
@@ -3871,7 +4103,7 @@
               <w:rPr>
                 <w:rFonts w:ascii="Times New Roman" w:hAnsi="Times New Roman" w:eastAsia="Times New Roman"/>
                 <w:b w:val="0"/>
-                <w:sz w:val="16"/>
+                <w:sz w:val="20"/>
               </w:rPr>
               <w:t>Retrieval status; Nigeria-specific data; avian host; laboratory confirmation; evidence type; one fixed exclusion reason; duplicate-dataset link; page/section evidence.</w:t>
             </w:r>
@@ -3904,7 +4136,7 @@
               <w:rPr>
                 <w:rFonts w:ascii="Times New Roman" w:hAnsi="Times New Roman" w:eastAsia="Times New Roman"/>
                 <w:b w:val="0"/>
-                <w:sz w:val="16"/>
+                <w:sz w:val="20"/>
               </w:rPr>
               <w:t>Extraction (T1-T5)</w:t>
             </w:r>
@@ -3920,7 +4152,7 @@
               <w:rPr>
                 <w:rFonts w:ascii="Times New Roman" w:hAnsi="Times New Roman" w:eastAsia="Times New Roman"/>
                 <w:b w:val="0"/>
-                <w:sz w:val="16"/>
+                <w:sz w:val="20"/>
               </w:rPr>
               <w:t>Citation/report and dataset link; design; sampling frame, unit and period; state/zone and setting; host/system; numerator/denominator; assay; subtype; clade/lineage; sequencing; phylogeny/support; accession; reassortment/mutation claim; limitations; quantitative-readiness fields.</w:t>
             </w:r>
@@ -3936,7 +4168,7 @@
               <w:rPr>
                 <w:rFonts w:ascii="Times New Roman" w:hAnsi="Times New Roman" w:eastAsia="Times New Roman"/>
                 <w:b w:val="0"/>
-                <w:sz w:val="16"/>
+                <w:sz w:val="20"/>
               </w:rPr>
               <w:t>Ready; zero records extracted.</w:t>
             </w:r>
@@ -3954,7 +4186,7 @@
               <w:rPr>
                 <w:rFonts w:ascii="Times New Roman" w:hAnsi="Times New Roman" w:eastAsia="Times New Roman"/>
                 <w:b w:val="0"/>
-                <w:sz w:val="16"/>
+                <w:sz w:val="20"/>
               </w:rPr>
               <w:t>Risk of bias/certainty (T7)</w:t>
             </w:r>
@@ -3970,7 +4202,7 @@
               <w:rPr>
                 <w:rFonts w:ascii="Times New Roman" w:hAnsi="Times New Roman" w:eastAsia="Times New Roman"/>
                 <w:b w:val="0"/>
-                <w:sz w:val="16"/>
+                <w:sz w:val="20"/>
               </w:rPr>
               <w:t>Relevant JBI Prevalence, Cross-Sectional or Cohort signalling items; molecular checks for sampling, assay/sequencing transparency, phylogeny/support, accession, nomenclature and reassortment discipline; narrative prognosis-style GRADE certainty note. No score sum.</w:t>
             </w:r>
@@ -3986,7 +4218,7 @@
               <w:rPr>
                 <w:rFonts w:ascii="Times New Roman" w:hAnsi="Times New Roman" w:eastAsia="Times New Roman"/>
                 <w:b w:val="0"/>
-                <w:sz w:val="16"/>
+                <w:sz w:val="20"/>
               </w:rPr>
               <w:t>Ready; zero records appraised.</w:t>
             </w:r>
@@ -4254,6 +4486,10 @@
           </w:tcPr>
           <w:p>
             <w:r>
+              <w:rPr>
+                <w:rFonts w:ascii="Times New Roman" w:hAnsi="Times New Roman"/>
+                <w:sz w:val="20"/>
+              </w:rPr>
               <w:t>Candidate</w:t>
             </w:r>
           </w:p>
@@ -4264,6 +4500,10 @@
           </w:tcPr>
           <w:p>
             <w:r>
+              <w:rPr>
+                <w:rFonts w:ascii="Times New Roman" w:hAnsi="Times New Roman"/>
+                <w:sz w:val="20"/>
+              </w:rPr>
               <w:t>Evidence located</w:t>
             </w:r>
           </w:p>
@@ -4274,6 +4514,10 @@
           </w:tcPr>
           <w:p>
             <w:r>
+              <w:rPr>
+                <w:rFonts w:ascii="Times New Roman" w:hAnsi="Times New Roman"/>
+                <w:sz w:val="20"/>
+              </w:rPr>
               <w:t>Pilot disposition</w:t>
             </w:r>
           </w:p>
@@ -4284,6 +4528,10 @@
           </w:tcPr>
           <w:p>
             <w:r>
+              <w:rPr>
+                <w:rFonts w:ascii="Times New Roman" w:hAnsi="Times New Roman"/>
+                <w:sz w:val="20"/>
+              </w:rPr>
               <w:t>Next action</w:t>
             </w:r>
           </w:p>
@@ -4296,6 +4544,10 @@
           </w:tcPr>
           <w:p>
             <w:r>
+              <w:rPr>
+                <w:rFonts w:ascii="Times New Roman" w:hAnsi="Times New Roman"/>
+                <w:sz w:val="20"/>
+              </w:rPr>
               <w:t>CAN-0243</w:t>
             </w:r>
           </w:p>
@@ -4306,6 +4558,10 @@
           </w:tcPr>
           <w:p>
             <w:r>
+              <w:rPr>
+                <w:rFonts w:ascii="Times New Roman" w:hAnsi="Times New Roman"/>
+                <w:sz w:val="20"/>
+              </w:rPr>
               <w:t>PubMed abstract; DOI 10.1016/j.prevetmed.2010.11.007</w:t>
             </w:r>
           </w:p>
@@ -4316,6 +4572,10 @@
           </w:tcPr>
           <w:p>
             <w:r>
+              <w:rPr>
+                <w:rFonts w:ascii="Times New Roman" w:hAnsi="Times New Roman"/>
+                <w:sz w:val="20"/>
+              </w:rPr>
               <w:t>Retain for full-text eligibility; Nigeria case-control evidence is supported.</w:t>
             </w:r>
           </w:p>
@@ -4326,6 +4586,10 @@
           </w:tcPr>
           <w:p>
             <w:r>
+              <w:rPr>
+                <w:rFonts w:ascii="Times New Roman" w:hAnsi="Times New Roman"/>
+                <w:sz w:val="20"/>
+              </w:rPr>
               <w:t>Retrieve article; extract design, sample, exposures and estimates.</w:t>
             </w:r>
           </w:p>
@@ -4338,6 +4602,10 @@
           </w:tcPr>
           <w:p>
             <w:r>
+              <w:rPr>
+                <w:rFonts w:ascii="Times New Roman" w:hAnsi="Times New Roman"/>
+                <w:sz w:val="20"/>
+              </w:rPr>
               <w:t>CAN-0244</w:t>
             </w:r>
           </w:p>
@@ -4348,6 +4616,10 @@
           </w:tcPr>
           <w:p>
             <w:r>
+              <w:rPr>
+                <w:rFonts w:ascii="Times New Roman" w:hAnsi="Times New Roman"/>
+                <w:sz w:val="20"/>
+              </w:rPr>
               <w:t>Open institutional PDF; DOI 10.1016/j.prevetmed.2011.10.001</w:t>
             </w:r>
           </w:p>
@@ -4358,6 +4630,10 @@
           </w:tcPr>
           <w:p>
             <w:r>
+              <w:rPr>
+                <w:rFonts w:ascii="Times New Roman" w:hAnsi="Times New Roman"/>
+                <w:sz w:val="20"/>
+              </w:rPr>
               <w:t>Retain for full-text eligibility; Nigeria spatio-temporal outbreak evidence is supported.</w:t>
             </w:r>
           </w:p>
@@ -4368,6 +4644,10 @@
           </w:tcPr>
           <w:p>
             <w:r>
+              <w:rPr>
+                <w:rFonts w:ascii="Times New Roman" w:hAnsi="Times New Roman"/>
+                <w:sz w:val="20"/>
+              </w:rPr>
               <w:t>Check full text for dataset overlap and extract spatial/temporal methods.</w:t>
             </w:r>
           </w:p>
@@ -4380,6 +4660,10 @@
           </w:tcPr>
           <w:p>
             <w:r>
+              <w:rPr>
+                <w:rFonts w:ascii="Times New Roman" w:hAnsi="Times New Roman"/>
+                <w:sz w:val="20"/>
+              </w:rPr>
               <w:t>CAN-0245</w:t>
             </w:r>
           </w:p>
@@ -4390,6 +4674,10 @@
           </w:tcPr>
           <w:p>
             <w:r>
+              <w:rPr>
+                <w:rFonts w:ascii="Times New Roman" w:hAnsi="Times New Roman"/>
+                <w:sz w:val="20"/>
+              </w:rPr>
               <w:t>Institutional dissertation record; DOI 10.1016/j.prevetmed.2014.04.003</w:t>
             </w:r>
           </w:p>
@@ -4400,6 +4688,10 @@
           </w:tcPr>
           <w:p>
             <w:r>
+              <w:rPr>
+                <w:rFonts w:ascii="Times New Roman" w:hAnsi="Times New Roman"/>
+                <w:sz w:val="20"/>
+              </w:rPr>
               <w:t>Retrieval unresolved; title supports Nigeria risk-assessment relevance.</w:t>
             </w:r>
           </w:p>
@@ -4410,6 +4702,10 @@
           </w:tcPr>
           <w:p>
             <w:r>
+              <w:rPr>
+                <w:rFonts w:ascii="Times New Roman" w:hAnsi="Times New Roman"/>
+                <w:sz w:val="20"/>
+              </w:rPr>
               <w:t>Retrieve dissertation/full text and confirm primary data and eligibility.</w:t>
             </w:r>
           </w:p>
@@ -4422,6 +4718,10 @@
           </w:tcPr>
           <w:p>
             <w:r>
+              <w:rPr>
+                <w:rFonts w:ascii="Times New Roman" w:hAnsi="Times New Roman"/>
+                <w:sz w:val="20"/>
+              </w:rPr>
               <w:t>CAN-0246</w:t>
             </w:r>
           </w:p>
@@ -4432,6 +4732,10 @@
           </w:tcPr>
           <w:p>
             <w:r>
+              <w:rPr>
+                <w:rFonts w:ascii="Times New Roman" w:hAnsi="Times New Roman"/>
+                <w:sz w:val="20"/>
+              </w:rPr>
               <w:t>Open RVC manuscript PDF and PubMed abstract; DOI 10.1016/j.prevetmed.2016.05.003</w:t>
             </w:r>
           </w:p>
@@ -4442,6 +4746,10 @@
           </w:tcPr>
           <w:p>
             <w:r>
+              <w:rPr>
+                <w:rFonts w:ascii="Times New Roman" w:hAnsi="Times New Roman"/>
+                <w:sz w:val="20"/>
+              </w:rPr>
               <w:t>Retain for full-text eligibility; Nigeria passive-surveillance study is supported.</w:t>
             </w:r>
           </w:p>
@@ -4452,6 +4760,10 @@
           </w:tcPr>
           <w:p>
             <w:r>
+              <w:rPr>
+                <w:rFonts w:ascii="Times New Roman" w:hAnsi="Times New Roman"/>
+                <w:sz w:val="20"/>
+              </w:rPr>
               <w:t>Verify manuscript version against final article and extract model inputs/results.</w:t>
             </w:r>
           </w:p>
@@ -4464,6 +4776,10 @@
           </w:tcPr>
           <w:p>
             <w:r>
+              <w:rPr>
+                <w:rFonts w:ascii="Times New Roman" w:hAnsi="Times New Roman"/>
+                <w:sz w:val="20"/>
+              </w:rPr>
               <w:t>CAN-0258</w:t>
             </w:r>
           </w:p>
@@ -4474,6 +4790,10 @@
           </w:tcPr>
           <w:p>
             <w:r>
+              <w:rPr>
+                <w:rFonts w:ascii="Times New Roman" w:hAnsi="Times New Roman"/>
+                <w:sz w:val="20"/>
+              </w:rPr>
               <w:t>PubMed/PMC full text; DOI 10.1016/j.psj.2022.102156</w:t>
             </w:r>
           </w:p>
@@ -4484,7 +4804,11 @@
           </w:tcPr>
           <w:p>
             <w:r>
-              <w:t>Provisional full-text exclusion: study is based in Egypt, not Nigeria.</w:t>
+              <w:rPr>
+                <w:rFonts w:ascii="Times New Roman" w:hAnsi="Times New Roman"/>
+                <w:sz w:val="20"/>
+              </w:rPr>
+              <w:t>Full-text exclusion confirmed: Egypt-only H5N8 ostrich study; no Nigeria primary data.</w:t>
             </w:r>
           </w:p>
         </w:tc>
@@ -4494,7 +4818,11 @@
           </w:tcPr>
           <w:p>
             <w:r>
-              <w:t>Record final exclusion after duplicate check; do not include in Nigeria synthesis.</w:t>
+              <w:rPr>
+                <w:rFonts w:ascii="Times New Roman" w:hAnsi="Times New Roman"/>
+                <w:sz w:val="20"/>
+              </w:rPr>
+              <w:t>Record fixed exclusion in full-text log; do not include in Nigeria synthesis.</w:t>
             </w:r>
           </w:p>
         </w:tc>
@@ -4506,6 +4834,10 @@
           </w:tcPr>
           <w:p>
             <w:r>
+              <w:rPr>
+                <w:rFonts w:ascii="Times New Roman" w:hAnsi="Times New Roman"/>
+                <w:sz w:val="20"/>
+              </w:rPr>
               <w:t>CAN-0266</w:t>
             </w:r>
           </w:p>
@@ -4516,6 +4848,10 @@
           </w:tcPr>
           <w:p>
             <w:r>
+              <w:rPr>
+                <w:rFonts w:ascii="Times New Roman" w:hAnsi="Times New Roman"/>
+                <w:sz w:val="20"/>
+              </w:rPr>
               <w:t>PubMed record; DOI 10.1016/j.rvsc.2018.06.006</w:t>
             </w:r>
           </w:p>
@@ -4526,6 +4862,10 @@
           </w:tcPr>
           <w:p>
             <w:r>
+              <w:rPr>
+                <w:rFonts w:ascii="Times New Roman" w:hAnsi="Times New Roman"/>
+                <w:sz w:val="20"/>
+              </w:rPr>
               <w:t>Retain for full-text eligibility; Nigeria surveillance/control cost assessment is supported.</w:t>
             </w:r>
           </w:p>
@@ -4536,6 +4876,10 @@
           </w:tcPr>
           <w:p>
             <w:r>
+              <w:rPr>
+                <w:rFonts w:ascii="Times New Roman" w:hAnsi="Times New Roman"/>
+                <w:sz w:val="20"/>
+              </w:rPr>
               <w:t>Retrieve article and confirm whether eligible epidemiologic inputs are extractable.</w:t>
             </w:r>
           </w:p>
@@ -4548,6 +4892,10 @@
           </w:tcPr>
           <w:p>
             <w:r>
+              <w:rPr>
+                <w:rFonts w:ascii="Times New Roman" w:hAnsi="Times New Roman"/>
+                <w:sz w:val="20"/>
+              </w:rPr>
               <w:t>CAN-0269</w:t>
             </w:r>
           </w:p>
@@ -4558,6 +4906,10 @@
           </w:tcPr>
           <w:p>
             <w:r>
+              <w:rPr>
+                <w:rFonts w:ascii="Times New Roman" w:hAnsi="Times New Roman"/>
+                <w:sz w:val="20"/>
+              </w:rPr>
               <w:t>Open institutional full text; DOI 10.1016/j.scitotenv.2024.173692</w:t>
             </w:r>
           </w:p>
@@ -4568,7 +4920,11 @@
           </w:tcPr>
           <w:p>
             <w:r>
-              <w:t>Provisional full-text exclusion: article identifies itself as a review, not primary Nigeria evidence.</w:t>
+              <w:rPr>
+                <w:rFonts w:ascii="Times New Roman" w:hAnsi="Times New Roman"/>
+                <w:sz w:val="20"/>
+              </w:rPr>
+              <w:t>Full-text exclusion confirmed: narrative review, not primary Nigeria evidence.</w:t>
             </w:r>
           </w:p>
         </w:tc>
@@ -4578,7 +4934,11 @@
           </w:tcPr>
           <w:p>
             <w:r>
-              <w:t>Record final exclusion after duplicate check.</w:t>
+              <w:rPr>
+                <w:rFonts w:ascii="Times New Roman" w:hAnsi="Times New Roman"/>
+                <w:sz w:val="20"/>
+              </w:rPr>
+              <w:t>Record fixed exclusion in full-text log; do not include in Nigeria synthesis.</w:t>
             </w:r>
           </w:p>
         </w:tc>
@@ -4590,6 +4950,10 @@
           </w:tcPr>
           <w:p>
             <w:r>
+              <w:rPr>
+                <w:rFonts w:ascii="Times New Roman" w:hAnsi="Times New Roman"/>
+                <w:sz w:val="20"/>
+              </w:rPr>
               <w:t>CAN-0275</w:t>
             </w:r>
           </w:p>
@@ -4600,6 +4964,10 @@
           </w:tcPr>
           <w:p>
             <w:r>
+              <w:rPr>
+                <w:rFonts w:ascii="Times New Roman" w:hAnsi="Times New Roman"/>
+                <w:sz w:val="20"/>
+              </w:rPr>
               <w:t>PubMed abstract; DOI 10.1016/j.trstmh.2008.01.016</w:t>
             </w:r>
           </w:p>
@@ -4610,6 +4978,10 @@
           </w:tcPr>
           <w:p>
             <w:r>
+              <w:rPr>
+                <w:rFonts w:ascii="Times New Roman" w:hAnsi="Times New Roman"/>
+                <w:sz w:val="20"/>
+              </w:rPr>
               <w:t>Retain for full-text eligibility; Nigeria/West Africa ecological modelling is supported.</w:t>
             </w:r>
           </w:p>
@@ -4620,6 +4992,10 @@
           </w:tcPr>
           <w:p>
             <w:r>
+              <w:rPr>
+                <w:rFonts w:ascii="Times New Roman" w:hAnsi="Times New Roman"/>
+                <w:sz w:val="20"/>
+              </w:rPr>
               <w:t>Retrieve article and extract occurrence data, covariates and model validation.</w:t>
             </w:r>
           </w:p>
@@ -4663,6 +5039,10 @@
           </w:tcPr>
           <w:p>
             <w:r>
+              <w:rPr>
+                <w:rFonts w:ascii="Times New Roman" w:hAnsi="Times New Roman"/>
+                <w:sz w:val="20"/>
+              </w:rPr>
               <w:t>Candidate</w:t>
             </w:r>
           </w:p>
@@ -4673,6 +5053,10 @@
           </w:tcPr>
           <w:p>
             <w:r>
+              <w:rPr>
+                <w:rFonts w:ascii="Times New Roman" w:hAnsi="Times New Roman"/>
+                <w:sz w:val="20"/>
+              </w:rPr>
               <w:t>Evidence level</w:t>
             </w:r>
           </w:p>
@@ -4683,6 +5067,10 @@
           </w:tcPr>
           <w:p>
             <w:r>
+              <w:rPr>
+                <w:rFonts w:ascii="Times New Roman" w:hAnsi="Times New Roman"/>
+                <w:sz w:val="20"/>
+              </w:rPr>
               <w:t>Design/setting</w:t>
             </w:r>
           </w:p>
@@ -4693,6 +5081,10 @@
           </w:tcPr>
           <w:p>
             <w:r>
+              <w:rPr>
+                <w:rFonts w:ascii="Times New Roman" w:hAnsi="Times New Roman"/>
+                <w:sz w:val="20"/>
+              </w:rPr>
               <w:t>Population or data</w:t>
             </w:r>
           </w:p>
@@ -4703,6 +5095,10 @@
           </w:tcPr>
           <w:p>
             <w:r>
+              <w:rPr>
+                <w:rFonts w:ascii="Times New Roman" w:hAnsi="Times New Roman"/>
+                <w:sz w:val="20"/>
+              </w:rPr>
               <w:t>Extracted result / pending item</w:t>
             </w:r>
           </w:p>
@@ -4715,6 +5111,10 @@
           </w:tcPr>
           <w:p>
             <w:r>
+              <w:rPr>
+                <w:rFonts w:ascii="Times New Roman" w:hAnsi="Times New Roman"/>
+                <w:sz w:val="20"/>
+              </w:rPr>
               <w:t>CAN-0243</w:t>
             </w:r>
           </w:p>
@@ -4725,6 +5125,10 @@
           </w:tcPr>
           <w:p>
             <w:r>
+              <w:rPr>
+                <w:rFonts w:ascii="Times New Roman" w:hAnsi="Times New Roman"/>
+                <w:sz w:val="20"/>
+              </w:rPr>
               <w:t>PubMed abstract</w:t>
             </w:r>
           </w:p>
@@ -4735,6 +5139,10 @@
           </w:tcPr>
           <w:p>
             <w:r>
+              <w:rPr>
+                <w:rFonts w:ascii="Times New Roman" w:hAnsi="Times New Roman"/>
+                <w:sz w:val="20"/>
+              </w:rPr>
               <w:t>Matched case-control; Nigerian poultry farms, 2006–2007 H5N1 epidemic.</w:t>
             </w:r>
           </w:p>
@@ -4745,6 +5153,10 @@
           </w:tcPr>
           <w:p>
             <w:r>
+              <w:rPr>
+                <w:rFonts w:ascii="Times New Roman" w:hAnsi="Times New Roman"/>
+                <w:sz w:val="20"/>
+              </w:rPr>
               <w:t>32 case farms; 83 control farms.</w:t>
             </w:r>
           </w:p>
@@ -4755,6 +5167,10 @@
           </w:tcPr>
           <w:p>
             <w:r>
+              <w:rPr>
+                <w:rFonts w:ascii="Times New Roman" w:hAnsi="Times New Roman"/>
+                <w:sz w:val="20"/>
+              </w:rPr>
               <w:t>Visitors, purchased live poultry/products, and workers living off-farm were reported risk factors; retrieve article for sampling and model details.</w:t>
             </w:r>
           </w:p>
@@ -4767,6 +5183,10 @@
           </w:tcPr>
           <w:p>
             <w:r>
+              <w:rPr>
+                <w:rFonts w:ascii="Times New Roman" w:hAnsi="Times New Roman"/>
+                <w:sz w:val="20"/>
+              </w:rPr>
               <w:t>CAN-0244</w:t>
             </w:r>
           </w:p>
@@ -4777,6 +5197,10 @@
           </w:tcPr>
           <w:p>
             <w:r>
+              <w:rPr>
+                <w:rFonts w:ascii="Times New Roman" w:hAnsi="Times New Roman"/>
+                <w:sz w:val="20"/>
+              </w:rPr>
               <w:t>Open full article</w:t>
             </w:r>
           </w:p>
@@ -4787,6 +5211,10 @@
           </w:tcPr>
           <w:p>
             <w:r>
+              <w:rPr>
+                <w:rFonts w:ascii="Times New Roman" w:hAnsi="Times New Roman"/>
+                <w:sz w:val="20"/>
+              </w:rPr>
               <w:t>Retrospective outbreak-database analysis; Nigeria, 2006–2008.</w:t>
             </w:r>
           </w:p>
@@ -4797,6 +5225,10 @@
           </w:tcPr>
           <w:p>
             <w:r>
+              <w:rPr>
+                <w:rFonts w:ascii="Times New Roman" w:hAnsi="Times New Roman"/>
+                <w:sz w:val="20"/>
+              </w:rPr>
               <w:t>1,654 suspected outbreaks; 299 laboratory-confirmed H5N1 outbreaks from 27 states and FCT.</w:t>
             </w:r>
           </w:p>
@@ -4807,6 +5239,10 @@
           </w:tcPr>
           <w:p>
             <w:r>
+              <w:rPr>
+                <w:rFonts w:ascii="Times New Roman" w:hAnsi="Times New Roman"/>
+                <w:sz w:val="20"/>
+              </w:rPr>
               <w:t>Three significant spatio-temporal clusters; extract complete cluster definitions, uncertainty and dataset-linkage fields.</w:t>
             </w:r>
           </w:p>
@@ -4819,6 +5255,10 @@
           </w:tcPr>
           <w:p>
             <w:r>
+              <w:rPr>
+                <w:rFonts w:ascii="Times New Roman" w:hAnsi="Times New Roman"/>
+                <w:sz w:val="20"/>
+              </w:rPr>
               <w:t>CAN-0246</w:t>
             </w:r>
           </w:p>
@@ -4829,6 +5269,10 @@
           </w:tcPr>
           <w:p>
             <w:r>
+              <w:rPr>
+                <w:rFonts w:ascii="Times New Roman" w:hAnsi="Times New Roman"/>
+                <w:sz w:val="20"/>
+              </w:rPr>
               <w:t>Open author manuscript plus PubMed abstract</w:t>
             </w:r>
           </w:p>
@@ -4839,6 +5283,10 @@
           </w:tcPr>
           <w:p>
             <w:r>
+              <w:rPr>
+                <w:rFonts w:ascii="Times New Roman" w:hAnsi="Times New Roman"/>
+                <w:sz w:val="20"/>
+              </w:rPr>
               <w:t>Field study and scenario-tree model; commercial/backyard chicken farms in Bayelsa State.</w:t>
             </w:r>
           </w:p>
@@ -4849,6 +5297,10 @@
           </w:tcPr>
           <w:p>
             <w:r>
+              <w:rPr>
+                <w:rFonts w:ascii="Times New Roman" w:hAnsi="Times New Roman"/>
+                <w:sz w:val="20"/>
+              </w:rPr>
               <w:t>Yenegoa and Ogbia LGAs; reporting and farming-practice observations.</w:t>
             </w:r>
           </w:p>
@@ -4859,6 +5311,10 @@
           </w:tcPr>
           <w:p>
             <w:r>
+              <w:rPr>
+                <w:rFonts w:ascii="Times New Roman" w:hAnsi="Times New Roman"/>
+                <w:sz w:val="20"/>
+              </w:rPr>
               <w:t>Median passive-surveillance sensitivity reported as 100%, 67% and 23% under stated prevalence scenarios; verify denominator and model assumptions.</w:t>
             </w:r>
           </w:p>
@@ -4871,6 +5327,10 @@
           </w:tcPr>
           <w:p>
             <w:r>
+              <w:rPr>
+                <w:rFonts w:ascii="Times New Roman" w:hAnsi="Times New Roman"/>
+                <w:sz w:val="20"/>
+              </w:rPr>
               <w:t>CAN-0266</w:t>
             </w:r>
           </w:p>
@@ -4881,6 +5341,10 @@
           </w:tcPr>
           <w:p>
             <w:r>
+              <w:rPr>
+                <w:rFonts w:ascii="Times New Roman" w:hAnsi="Times New Roman"/>
+                <w:sz w:val="20"/>
+              </w:rPr>
               <w:t>PubMed abstract</w:t>
             </w:r>
           </w:p>
@@ -4891,6 +5355,10 @@
           </w:tcPr>
           <w:p>
             <w:r>
+              <w:rPr>
+                <w:rFonts w:ascii="Times New Roman" w:hAnsi="Times New Roman"/>
+                <w:sz w:val="20"/>
+              </w:rPr>
               <w:t>Benefit-cost analysis of H5N1 outbreak and surveillance costs in Nigeria.</w:t>
             </w:r>
           </w:p>
@@ -4901,6 +5369,10 @@
           </w:tcPr>
           <w:p>
             <w:r>
+              <w:rPr>
+                <w:rFonts w:ascii="Times New Roman" w:hAnsi="Times New Roman"/>
+                <w:sz w:val="20"/>
+              </w:rPr>
               <w:t>Field, government, repository and peer-reviewed inputs; bird losses and surveillance costs.</w:t>
             </w:r>
           </w:p>
@@ -4911,6 +5383,10 @@
           </w:tcPr>
           <w:p>
             <w:r>
+              <w:rPr>
+                <w:rFonts w:ascii="Times New Roman" w:hAnsi="Times New Roman"/>
+                <w:sz w:val="20"/>
+              </w:rPr>
               <w:t>Direct bird-death cost and modelled annual loss estimates are reported; retrieve article to extract perspective, time horizon, costing and sensitivity analysis.</w:t>
             </w:r>
           </w:p>
@@ -4923,6 +5399,10 @@
           </w:tcPr>
           <w:p>
             <w:r>
+              <w:rPr>
+                <w:rFonts w:ascii="Times New Roman" w:hAnsi="Times New Roman"/>
+                <w:sz w:val="20"/>
+              </w:rPr>
               <w:t>CAN-0275</w:t>
             </w:r>
           </w:p>
@@ -4933,6 +5413,10 @@
           </w:tcPr>
           <w:p>
             <w:r>
+              <w:rPr>
+                <w:rFonts w:ascii="Times New Roman" w:hAnsi="Times New Roman"/>
+                <w:sz w:val="20"/>
+              </w:rPr>
               <w:t>PubMed abstract</w:t>
             </w:r>
           </w:p>
@@ -4943,6 +5427,10 @@
           </w:tcPr>
           <w:p>
             <w:r>
+              <w:rPr>
+                <w:rFonts w:ascii="Times New Roman" w:hAnsi="Times New Roman"/>
+                <w:sz w:val="20"/>
+              </w:rPr>
               <w:t>Ecological niche modelling of H5N1 transmission in Nigeria and West Africa.</w:t>
             </w:r>
           </w:p>
@@ -4953,6 +5441,10 @@
           </w:tcPr>
           <w:p>
             <w:r>
+              <w:rPr>
+                <w:rFonts w:ascii="Times New Roman" w:hAnsi="Times New Roman"/>
+                <w:sz w:val="20"/>
+              </w:rPr>
               <w:t>Nigerian H5N1 occurrence data with 1-km environmental layers.</w:t>
             </w:r>
           </w:p>
@@ -4963,6 +5455,10 @@
           </w:tcPr>
           <w:p>
             <w:r>
+              <w:rPr>
+                <w:rFonts w:ascii="Times New Roman" w:hAnsi="Times New Roman"/>
+                <w:sz w:val="20"/>
+              </w:rPr>
               <w:t>Environmental conditions predicted occurrence; retrieve article to extract occurrence dates, spatial validation and model limitations.</w:t>
             </w:r>
           </w:p>
@@ -5541,6 +6037,271 @@
                 <w:sz w:val="20"/>
               </w:rPr>
               <w:t>All remain provisional; no final full-text inclusion/exclusion decision has been assigned.</w:t>
+            </w:r>
+          </w:p>
+        </w:tc>
+      </w:tr>
+    </w:tbl>
+    <w:p>
+      <w:pPr>
+        <w:pStyle w:val="Heading2"/>
+      </w:pPr>
+      <w:r>
+        <w:rPr>
+          <w:rFonts w:ascii="Times New Roman" w:hAnsi="Times New Roman"/>
+          <w:sz w:val="22"/>
+        </w:rPr>
+        <w:t>B23. Gate D full-text eligibility pilot</w:t>
+      </w:r>
+    </w:p>
+    <w:p>
+      <w:r>
+        <w:rPr>
+          <w:rFonts w:ascii="Times New Roman" w:hAnsi="Times New Roman"/>
+          <w:sz w:val="22"/>
+        </w:rPr>
+        <w:t>Two accessible full texts from the retrieval pilot were independently assessed by R1 and R2 and concordantly excluded. CAN-0258 was excluded for no Nigeria study data; CAN-0269 was excluded as a narrative review without primary Nigeria evidence. The two fixed exclusions reduce the unresolved full-text queue from 296 to 294; no included study is claimed.</w:t>
+      </w:r>
+    </w:p>
+    <w:tbl>
+      <w:tblPr>
+        <w:tblW w:type="auto" w:w="0"/>
+        <w:tblLook w:firstColumn="1" w:firstRow="1" w:lastColumn="0" w:lastRow="0" w:noHBand="0" w:noVBand="1" w:val="04A0"/>
+      </w:tblPr>
+      <w:tblGrid>
+        <w:gridCol w:w="2340"/>
+        <w:gridCol w:w="2340"/>
+        <w:gridCol w:w="2340"/>
+        <w:gridCol w:w="2340"/>
+      </w:tblGrid>
+      <w:tr>
+        <w:tc>
+          <w:tcPr>
+            <w:tcW w:type="dxa" w:w="2340"/>
+          </w:tcPr>
+          <w:p>
+            <w:r>
+              <w:rPr>
+                <w:rFonts w:ascii="Times New Roman" w:hAnsi="Times New Roman"/>
+                <w:sz w:val="20"/>
+              </w:rPr>
+              <w:t>Candidate</w:t>
+            </w:r>
+          </w:p>
+        </w:tc>
+        <w:tc>
+          <w:tcPr>
+            <w:tcW w:type="dxa" w:w="2340"/>
+          </w:tcPr>
+          <w:p>
+            <w:r>
+              <w:rPr>
+                <w:rFonts w:ascii="Times New Roman" w:hAnsi="Times New Roman"/>
+                <w:sz w:val="20"/>
+              </w:rPr>
+              <w:t>R1/R2 result</w:t>
+            </w:r>
+          </w:p>
+        </w:tc>
+        <w:tc>
+          <w:tcPr>
+            <w:tcW w:type="dxa" w:w="2340"/>
+          </w:tcPr>
+          <w:p>
+            <w:r>
+              <w:rPr>
+                <w:rFonts w:ascii="Times New Roman" w:hAnsi="Times New Roman"/>
+                <w:sz w:val="20"/>
+              </w:rPr>
+              <w:t>Fixed reason</w:t>
+            </w:r>
+          </w:p>
+        </w:tc>
+        <w:tc>
+          <w:tcPr>
+            <w:tcW w:type="dxa" w:w="2340"/>
+          </w:tcPr>
+          <w:p>
+            <w:r>
+              <w:rPr>
+                <w:rFonts w:ascii="Times New Roman" w:hAnsi="Times New Roman"/>
+                <w:sz w:val="20"/>
+              </w:rPr>
+              <w:t>Evidence route</w:t>
+            </w:r>
+          </w:p>
+        </w:tc>
+      </w:tr>
+      <w:tr>
+        <w:tc>
+          <w:tcPr>
+            <w:tcW w:type="dxa" w:w="2340"/>
+          </w:tcPr>
+          <w:p>
+            <w:r>
+              <w:rPr>
+                <w:rFonts w:ascii="Times New Roman" w:hAnsi="Times New Roman"/>
+                <w:sz w:val="20"/>
+              </w:rPr>
+              <w:t>CAN-0258</w:t>
+            </w:r>
+          </w:p>
+        </w:tc>
+        <w:tc>
+          <w:tcPr>
+            <w:tcW w:type="dxa" w:w="2340"/>
+          </w:tcPr>
+          <w:p>
+            <w:r>
+              <w:rPr>
+                <w:rFonts w:ascii="Times New Roman" w:hAnsi="Times New Roman"/>
+                <w:sz w:val="20"/>
+              </w:rPr>
+              <w:t>Concordant exclude</w:t>
+            </w:r>
+          </w:p>
+        </w:tc>
+        <w:tc>
+          <w:tcPr>
+            <w:tcW w:type="dxa" w:w="2340"/>
+          </w:tcPr>
+          <w:p>
+            <w:r>
+              <w:rPr>
+                <w:rFonts w:ascii="Times New Roman" w:hAnsi="Times New Roman"/>
+                <w:sz w:val="20"/>
+              </w:rPr>
+              <w:t>NO_NIGERIA_STUDY_DATA</w:t>
+            </w:r>
+          </w:p>
+        </w:tc>
+        <w:tc>
+          <w:tcPr>
+            <w:tcW w:type="dxa" w:w="2340"/>
+          </w:tcPr>
+          <w:p>
+            <w:r>
+              <w:rPr>
+                <w:rFonts w:ascii="Times New Roman" w:hAnsi="Times New Roman"/>
+                <w:sz w:val="20"/>
+              </w:rPr>
+              <w:t>PMC9582791; PubMed 36252504</w:t>
+            </w:r>
+          </w:p>
+        </w:tc>
+      </w:tr>
+      <w:tr>
+        <w:tc>
+          <w:tcPr>
+            <w:tcW w:type="dxa" w:w="2340"/>
+          </w:tcPr>
+          <w:p>
+            <w:r>
+              <w:rPr>
+                <w:rFonts w:ascii="Times New Roman" w:hAnsi="Times New Roman"/>
+                <w:sz w:val="20"/>
+              </w:rPr>
+              <w:t>CAN-0269</w:t>
+            </w:r>
+          </w:p>
+        </w:tc>
+        <w:tc>
+          <w:tcPr>
+            <w:tcW w:type="dxa" w:w="2340"/>
+          </w:tcPr>
+          <w:p>
+            <w:r>
+              <w:rPr>
+                <w:rFonts w:ascii="Times New Roman" w:hAnsi="Times New Roman"/>
+                <w:sz w:val="20"/>
+              </w:rPr>
+              <w:t>Concordant exclude</w:t>
+            </w:r>
+          </w:p>
+        </w:tc>
+        <w:tc>
+          <w:tcPr>
+            <w:tcW w:type="dxa" w:w="2340"/>
+          </w:tcPr>
+          <w:p>
+            <w:r>
+              <w:rPr>
+                <w:rFonts w:ascii="Times New Roman" w:hAnsi="Times New Roman"/>
+                <w:sz w:val="20"/>
+              </w:rPr>
+              <w:t>NOT_PRIMARY_RESEARCH</w:t>
+            </w:r>
+          </w:p>
+        </w:tc>
+        <w:tc>
+          <w:tcPr>
+            <w:tcW w:type="dxa" w:w="2340"/>
+          </w:tcPr>
+          <w:p>
+            <w:r>
+              <w:rPr>
+                <w:rFonts w:ascii="Times New Roman" w:hAnsi="Times New Roman"/>
+                <w:sz w:val="20"/>
+              </w:rPr>
+              <w:t>Accessible institutional PDF; ScienceDirect record</w:t>
+            </w:r>
+          </w:p>
+        </w:tc>
+      </w:tr>
+      <w:tr>
+        <w:tc>
+          <w:tcPr>
+            <w:tcW w:type="dxa" w:w="2340"/>
+          </w:tcPr>
+          <w:p>
+            <w:r>
+              <w:rPr>
+                <w:rFonts w:ascii="Times New Roman" w:hAnsi="Times New Roman"/>
+                <w:sz w:val="20"/>
+              </w:rPr>
+              <w:t>Queue after pilot</w:t>
+            </w:r>
+          </w:p>
+        </w:tc>
+        <w:tc>
+          <w:tcPr>
+            <w:tcW w:type="dxa" w:w="2340"/>
+          </w:tcPr>
+          <w:p>
+            <w:r>
+              <w:rPr>
+                <w:rFonts w:ascii="Times New Roman" w:hAnsi="Times New Roman"/>
+                <w:sz w:val="20"/>
+              </w:rPr>
+              <w:t>294 pending</w:t>
+            </w:r>
+          </w:p>
+        </w:tc>
+        <w:tc>
+          <w:tcPr>
+            <w:tcW w:type="dxa" w:w="2340"/>
+          </w:tcPr>
+          <w:p>
+            <w:r>
+              <w:rPr>
+                <w:rFonts w:ascii="Times New Roman" w:hAnsi="Times New Roman"/>
+                <w:sz w:val="20"/>
+              </w:rPr>
+              <w:t>No included study count</w:t>
+            </w:r>
+          </w:p>
+        </w:tc>
+        <w:tc>
+          <w:tcPr>
+            <w:tcW w:type="dxa" w:w="2340"/>
+          </w:tcPr>
+          <w:p>
+            <w:r>
+              <w:rPr>
+                <w:rFonts w:ascii="Times New Roman" w:hAnsi="Times New Roman"/>
+                <w:sz w:val="20"/>
+              </w:rPr>
+              <w:t>Full-text eligibility, linkage and extraction remain pending</w:t>
             </w:r>
           </w:p>
         </w:tc>

</xml_diff>

<commit_message>
Record full-text eligibility batch 1
</commit_message>
<xml_diff>
--- a/Avian_review_paper_submission_ready.docx
+++ b/Avian_review_paper_submission_ready.docx
@@ -5777,6 +5777,7 @@
       <w:r>
         <w:rPr>
           <w:rFonts w:ascii="Times New Roman" w:hAnsi="Times New Roman"/>
+          <w:sz w:val="22"/>
         </w:rPr>
         <w:t>B21. Fresh record-level reconstruction and adjudication</w:t>
       </w:r>
@@ -6307,6 +6308,562 @@
         </w:tc>
       </w:tr>
     </w:tbl>
+    <w:p>
+      <w:pPr>
+        <w:pStyle w:val="Heading2"/>
+      </w:pPr>
+      <w:r>
+        <w:rPr>
+          <w:rFonts w:ascii="Times New Roman" w:hAnsi="Times New Roman"/>
+          <w:sz w:val="22"/>
+        </w:rPr>
+        <w:t>B24. Gate D full-text eligibility batch 1</w:t>
+      </w:r>
+    </w:p>
+    <w:p>
+      <w:r>
+        <w:rPr>
+          <w:rFonts w:ascii="Times New Roman" w:hAnsi="Times New Roman"/>
+          <w:sz w:val="22"/>
+        </w:rPr>
+        <w:t>Six located open full texts were retrieved through legitimate public PMC routes and independently assessed by R1 and R2. Five reports were adjudicated as provisionally eligible and one was excluded. These are full-text eligibility outcomes, not a final included-study count: duplicate linkage, extraction and appraisal remain outstanding.</w:t>
+      </w:r>
+    </w:p>
+    <w:p>
+      <w:r>
+        <w:rPr>
+          <w:rFonts w:ascii="Times New Roman" w:hAnsi="Times New Roman"/>
+          <w:sz w:val="22"/>
+        </w:rPr>
+        <w:t>The only reviewer disagreement was CAN-0113. It was retained because the frozen eligibility anchor includes epidemiologic/risk-factor evidence and the article is primary Nigeria-specific HPAI research. It must be extracted as awareness/biosecurity context, not as infection, prevalence or outbreak-incidence evidence. CAN-0132 was retained because Nigeria is an analysed national unit with an extractable niche result.</w:t>
+      </w:r>
+    </w:p>
+    <w:tbl>
+      <w:tblPr>
+        <w:tblW w:type="auto" w:w="0"/>
+        <w:tblLook w:firstColumn="1" w:firstRow="1" w:lastColumn="0" w:lastRow="0" w:noHBand="0" w:noVBand="1" w:val="04A0"/>
+      </w:tblPr>
+      <w:tblGrid>
+        <w:gridCol w:w="1872"/>
+        <w:gridCol w:w="1872"/>
+        <w:gridCol w:w="1872"/>
+        <w:gridCol w:w="1872"/>
+        <w:gridCol w:w="1872"/>
+      </w:tblGrid>
+      <w:tr>
+        <w:tc>
+          <w:tcPr>
+            <w:tcW w:type="dxa" w:w="1872"/>
+          </w:tcPr>
+          <w:p>
+            <w:r>
+              <w:rPr>
+                <w:rFonts w:ascii="Times New Roman" w:hAnsi="Times New Roman"/>
+                <w:sz w:val="18"/>
+              </w:rPr>
+              <w:t>Candidate</w:t>
+            </w:r>
+          </w:p>
+        </w:tc>
+        <w:tc>
+          <w:tcPr>
+            <w:tcW w:type="dxa" w:w="1872"/>
+          </w:tcPr>
+          <w:p>
+            <w:r>
+              <w:rPr>
+                <w:rFonts w:ascii="Times New Roman" w:hAnsi="Times New Roman"/>
+                <w:sz w:val="18"/>
+              </w:rPr>
+              <w:t>R1/R2</w:t>
+            </w:r>
+          </w:p>
+        </w:tc>
+        <w:tc>
+          <w:tcPr>
+            <w:tcW w:type="dxa" w:w="1872"/>
+          </w:tcPr>
+          <w:p>
+            <w:r>
+              <w:rPr>
+                <w:rFonts w:ascii="Times New Roman" w:hAnsi="Times New Roman"/>
+                <w:sz w:val="18"/>
+              </w:rPr>
+              <w:t>Adjudication</w:t>
+            </w:r>
+          </w:p>
+        </w:tc>
+        <w:tc>
+          <w:tcPr>
+            <w:tcW w:type="dxa" w:w="1872"/>
+          </w:tcPr>
+          <w:p>
+            <w:r>
+              <w:rPr>
+                <w:rFonts w:ascii="Times New Roman" w:hAnsi="Times New Roman"/>
+                <w:sz w:val="18"/>
+              </w:rPr>
+              <w:t>Full-text evidence</w:t>
+            </w:r>
+          </w:p>
+        </w:tc>
+        <w:tc>
+          <w:tcPr>
+            <w:tcW w:type="dxa" w:w="1872"/>
+          </w:tcPr>
+          <w:p>
+            <w:r>
+              <w:rPr>
+                <w:rFonts w:ascii="Times New Roman" w:hAnsi="Times New Roman"/>
+                <w:sz w:val="18"/>
+              </w:rPr>
+              <w:t>Caution / next action</w:t>
+            </w:r>
+          </w:p>
+        </w:tc>
+      </w:tr>
+      <w:tr>
+        <w:tc>
+          <w:tcPr>
+            <w:tcW w:type="dxa" w:w="1872"/>
+          </w:tcPr>
+          <w:p>
+            <w:r>
+              <w:rPr>
+                <w:rFonts w:ascii="Times New Roman" w:hAnsi="Times New Roman"/>
+                <w:sz w:val="18"/>
+              </w:rPr>
+              <w:t>CAN-0087</w:t>
+            </w:r>
+          </w:p>
+        </w:tc>
+        <w:tc>
+          <w:tcPr>
+            <w:tcW w:type="dxa" w:w="1872"/>
+          </w:tcPr>
+          <w:p>
+            <w:r>
+              <w:rPr>
+                <w:rFonts w:ascii="Times New Roman" w:hAnsi="Times New Roman"/>
+                <w:sz w:val="18"/>
+              </w:rPr>
+              <w:t>Retain / retain</w:t>
+            </w:r>
+          </w:p>
+        </w:tc>
+        <w:tc>
+          <w:tcPr>
+            <w:tcW w:type="dxa" w:w="1872"/>
+          </w:tcPr>
+          <w:p>
+            <w:r>
+              <w:rPr>
+                <w:rFonts w:ascii="Times New Roman" w:hAnsi="Times New Roman"/>
+                <w:sz w:val="18"/>
+              </w:rPr>
+              <w:t>Provisional eligible</w:t>
+            </w:r>
+          </w:p>
+        </w:tc>
+        <w:tc>
+          <w:tcPr>
+            <w:tcW w:type="dxa" w:w="1872"/>
+          </w:tcPr>
+          <w:p>
+            <w:r>
+              <w:rPr>
+                <w:rFonts w:ascii="Times New Roman" w:hAnsi="Times New Roman"/>
+                <w:sz w:val="18"/>
+              </w:rPr>
+              <w:t>Nigeria surveillance and laboratory-confirmed HPAI outbreaks, 2006–2009; PMC3527058.</w:t>
+            </w:r>
+          </w:p>
+        </w:tc>
+        <w:tc>
+          <w:tcPr>
+            <w:tcW w:type="dxa" w:w="1872"/>
+          </w:tcPr>
+          <w:p>
+            <w:r>
+              <w:rPr>
+                <w:rFonts w:ascii="Times New Roman" w:hAnsi="Times New Roman"/>
+                <w:sz w:val="18"/>
+              </w:rPr>
+              <w:t>Check overlap with national surveillance reports; no causal intervention claim from before/after counts.</w:t>
+            </w:r>
+          </w:p>
+        </w:tc>
+      </w:tr>
+      <w:tr>
+        <w:tc>
+          <w:tcPr>
+            <w:tcW w:type="dxa" w:w="1872"/>
+          </w:tcPr>
+          <w:p>
+            <w:r>
+              <w:rPr>
+                <w:rFonts w:ascii="Times New Roman" w:hAnsi="Times New Roman"/>
+                <w:sz w:val="18"/>
+              </w:rPr>
+              <w:t>CAN-0113</w:t>
+            </w:r>
+          </w:p>
+        </w:tc>
+        <w:tc>
+          <w:tcPr>
+            <w:tcW w:type="dxa" w:w="1872"/>
+          </w:tcPr>
+          <w:p>
+            <w:r>
+              <w:rPr>
+                <w:rFonts w:ascii="Times New Roman" w:hAnsi="Times New Roman"/>
+                <w:sz w:val="18"/>
+              </w:rPr>
+              <w:t>Exclude / retain</w:t>
+            </w:r>
+          </w:p>
+        </w:tc>
+        <w:tc>
+          <w:tcPr>
+            <w:tcW w:type="dxa" w:w="1872"/>
+          </w:tcPr>
+          <w:p>
+            <w:r>
+              <w:rPr>
+                <w:rFonts w:ascii="Times New Roman" w:hAnsi="Times New Roman"/>
+                <w:sz w:val="18"/>
+              </w:rPr>
+              <w:t>Provisional eligible</w:t>
+            </w:r>
+          </w:p>
+        </w:tc>
+        <w:tc>
+          <w:tcPr>
+            <w:tcW w:type="dxa" w:w="1872"/>
+          </w:tcPr>
+          <w:p>
+            <w:r>
+              <w:rPr>
+                <w:rFonts w:ascii="Times New Roman" w:hAnsi="Times New Roman"/>
+                <w:sz w:val="18"/>
+              </w:rPr>
+              <w:t>422-person North-central Nigeria HPAI risk/biosecurity survey; PMC5645842.</w:t>
+            </w:r>
+          </w:p>
+        </w:tc>
+        <w:tc>
+          <w:tcPr>
+            <w:tcW w:type="dxa" w:w="1872"/>
+          </w:tcPr>
+          <w:p>
+            <w:r>
+              <w:rPr>
+                <w:rFonts w:ascii="Times New Roman" w:hAnsi="Times New Roman"/>
+                <w:sz w:val="18"/>
+              </w:rPr>
+              <w:t>Risk-factor context only; no infection, outbreak or virus-distribution outcome.</w:t>
+            </w:r>
+          </w:p>
+        </w:tc>
+      </w:tr>
+      <w:tr>
+        <w:tc>
+          <w:tcPr>
+            <w:tcW w:type="dxa" w:w="1872"/>
+          </w:tcPr>
+          <w:p>
+            <w:r>
+              <w:rPr>
+                <w:rFonts w:ascii="Times New Roman" w:hAnsi="Times New Roman"/>
+                <w:sz w:val="18"/>
+              </w:rPr>
+              <w:t>CAN-0114</w:t>
+            </w:r>
+          </w:p>
+        </w:tc>
+        <w:tc>
+          <w:tcPr>
+            <w:tcW w:type="dxa" w:w="1872"/>
+          </w:tcPr>
+          <w:p>
+            <w:r>
+              <w:rPr>
+                <w:rFonts w:ascii="Times New Roman" w:hAnsi="Times New Roman"/>
+                <w:sz w:val="18"/>
+              </w:rPr>
+              <w:t>Retain / retain</w:t>
+            </w:r>
+          </w:p>
+        </w:tc>
+        <w:tc>
+          <w:tcPr>
+            <w:tcW w:type="dxa" w:w="1872"/>
+          </w:tcPr>
+          <w:p>
+            <w:r>
+              <w:rPr>
+                <w:rFonts w:ascii="Times New Roman" w:hAnsi="Times New Roman"/>
+                <w:sz w:val="18"/>
+              </w:rPr>
+              <w:t>Provisional eligible</w:t>
+            </w:r>
+          </w:p>
+        </w:tc>
+        <w:tc>
+          <w:tcPr>
+            <w:tcW w:type="dxa" w:w="1872"/>
+          </w:tcPr>
+          <w:p>
+            <w:r>
+              <w:rPr>
+                <w:rFonts w:ascii="Times New Roman" w:hAnsi="Times New Roman"/>
+                <w:sz w:val="18"/>
+              </w:rPr>
+              <w:t>H5 serology and risk-factor assessment in Bauchi and Gombe; PMC5677776.</w:t>
+            </w:r>
+          </w:p>
+        </w:tc>
+        <w:tc>
+          <w:tcPr>
+            <w:tcW w:type="dxa" w:w="1872"/>
+          </w:tcPr>
+          <w:p>
+            <w:r>
+              <w:rPr>
+                <w:rFonts w:ascii="Times New Roman" w:hAnsi="Times New Roman"/>
+                <w:sz w:val="18"/>
+              </w:rPr>
+              <w:t>H5 antibodies do not establish H5N1, HPAI or active infection; check related survey overlap.</w:t>
+            </w:r>
+          </w:p>
+        </w:tc>
+      </w:tr>
+      <w:tr>
+        <w:tc>
+          <w:tcPr>
+            <w:tcW w:type="dxa" w:w="1872"/>
+          </w:tcPr>
+          <w:p>
+            <w:r>
+              <w:rPr>
+                <w:rFonts w:ascii="Times New Roman" w:hAnsi="Times New Roman"/>
+                <w:sz w:val="18"/>
+              </w:rPr>
+              <w:t>CAN-0132</w:t>
+            </w:r>
+          </w:p>
+        </w:tc>
+        <w:tc>
+          <w:tcPr>
+            <w:tcW w:type="dxa" w:w="1872"/>
+          </w:tcPr>
+          <w:p>
+            <w:r>
+              <w:rPr>
+                <w:rFonts w:ascii="Times New Roman" w:hAnsi="Times New Roman"/>
+                <w:sz w:val="18"/>
+              </w:rPr>
+              <w:t>Retain / retain</w:t>
+            </w:r>
+          </w:p>
+        </w:tc>
+        <w:tc>
+          <w:tcPr>
+            <w:tcW w:type="dxa" w:w="1872"/>
+          </w:tcPr>
+          <w:p>
+            <w:r>
+              <w:rPr>
+                <w:rFonts w:ascii="Times New Roman" w:hAnsi="Times New Roman"/>
+                <w:sz w:val="18"/>
+              </w:rPr>
+              <w:t>Provisional eligible</w:t>
+            </w:r>
+          </w:p>
+        </w:tc>
+        <w:tc>
+          <w:tcPr>
+            <w:tcW w:type="dxa" w:w="1872"/>
+          </w:tcPr>
+          <w:p>
+            <w:r>
+              <w:rPr>
+                <w:rFonts w:ascii="Times New Roman" w:hAnsi="Times New Roman"/>
+                <w:sz w:val="18"/>
+              </w:rPr>
+              <w:t>Global H5N1 persistence model; Nigeria assigned niche 3 in Methods/Results; PMC3005111.</w:t>
+            </w:r>
+          </w:p>
+        </w:tc>
+        <w:tc>
+          <w:tcPr>
+            <w:tcW w:type="dxa" w:w="1872"/>
+          </w:tcPr>
+          <w:p>
+            <w:r>
+              <w:rPr>
+                <w:rFonts w:ascii="Times New Roman" w:hAnsi="Times New Roman"/>
+                <w:sz w:val="18"/>
+              </w:rPr>
+              <w:t>Extract Nigeria-specific model result only; underlying international surveillance is reused.</w:t>
+            </w:r>
+          </w:p>
+        </w:tc>
+      </w:tr>
+      <w:tr>
+        <w:tc>
+          <w:tcPr>
+            <w:tcW w:type="dxa" w:w="1872"/>
+          </w:tcPr>
+          <w:p>
+            <w:r>
+              <w:rPr>
+                <w:rFonts w:ascii="Times New Roman" w:hAnsi="Times New Roman"/>
+                <w:sz w:val="18"/>
+              </w:rPr>
+              <w:t>CAN-0142</w:t>
+            </w:r>
+          </w:p>
+        </w:tc>
+        <w:tc>
+          <w:tcPr>
+            <w:tcW w:type="dxa" w:w="1872"/>
+          </w:tcPr>
+          <w:p>
+            <w:r>
+              <w:rPr>
+                <w:rFonts w:ascii="Times New Roman" w:hAnsi="Times New Roman"/>
+                <w:sz w:val="18"/>
+              </w:rPr>
+              <w:t>Retain / retain</w:t>
+            </w:r>
+          </w:p>
+        </w:tc>
+        <w:tc>
+          <w:tcPr>
+            <w:tcW w:type="dxa" w:w="1872"/>
+          </w:tcPr>
+          <w:p>
+            <w:r>
+              <w:rPr>
+                <w:rFonts w:ascii="Times New Roman" w:hAnsi="Times New Roman"/>
+                <w:sz w:val="18"/>
+              </w:rPr>
+              <w:t>Provisional eligible</w:t>
+            </w:r>
+          </w:p>
+        </w:tc>
+        <w:tc>
+          <w:tcPr>
+            <w:tcW w:type="dxa" w:w="1872"/>
+          </w:tcPr>
+          <w:p>
+            <w:r>
+              <w:rPr>
+                <w:rFonts w:ascii="Times New Roman" w:hAnsi="Times New Roman"/>
+                <w:sz w:val="18"/>
+              </w:rPr>
+              <w:t>Nigerian state/FCT and Ogun spatial-temporal H5N1 models using 2006–2007 outbreak reports; PMC3627490.</w:t>
+            </w:r>
+          </w:p>
+        </w:tc>
+        <w:tc>
+          <w:tcPr>
+            <w:tcW w:type="dxa" w:w="1872"/>
+          </w:tcPr>
+          <w:p>
+            <w:r>
+              <w:rPr>
+                <w:rFonts w:ascii="Times New Roman" w:hAnsi="Times New Roman"/>
+                <w:sz w:val="18"/>
+              </w:rPr>
+              <w:t>Synthetic premises map and reused outbreak data; check dataset overlap during extraction.</w:t>
+            </w:r>
+          </w:p>
+        </w:tc>
+      </w:tr>
+      <w:tr>
+        <w:tc>
+          <w:tcPr>
+            <w:tcW w:type="dxa" w:w="1872"/>
+          </w:tcPr>
+          <w:p>
+            <w:r>
+              <w:rPr>
+                <w:rFonts w:ascii="Times New Roman" w:hAnsi="Times New Roman"/>
+                <w:sz w:val="18"/>
+              </w:rPr>
+              <w:t>CAN-0151</w:t>
+            </w:r>
+          </w:p>
+        </w:tc>
+        <w:tc>
+          <w:tcPr>
+            <w:tcW w:type="dxa" w:w="1872"/>
+          </w:tcPr>
+          <w:p>
+            <w:r>
+              <w:rPr>
+                <w:rFonts w:ascii="Times New Roman" w:hAnsi="Times New Roman"/>
+                <w:sz w:val="18"/>
+              </w:rPr>
+              <w:t>Exclude / exclude</w:t>
+            </w:r>
+          </w:p>
+        </w:tc>
+        <w:tc>
+          <w:tcPr>
+            <w:tcW w:type="dxa" w:w="1872"/>
+          </w:tcPr>
+          <w:p>
+            <w:r>
+              <w:rPr>
+                <w:rFonts w:ascii="Times New Roman" w:hAnsi="Times New Roman"/>
+                <w:sz w:val="18"/>
+              </w:rPr>
+              <w:t>Excluded: NO_NIGERIA_STUDY_DATA</w:t>
+            </w:r>
+          </w:p>
+        </w:tc>
+        <w:tc>
+          <w:tcPr>
+            <w:tcW w:type="dxa" w:w="1872"/>
+          </w:tcPr>
+          <w:p>
+            <w:r>
+              <w:rPr>
+                <w:rFonts w:ascii="Times New Roman" w:hAnsi="Times New Roman"/>
+                <w:sz w:val="18"/>
+              </w:rPr>
+              <w:t>Egyptian chicken/duck genomes and phylogeny; Nigeria is background context; PMC3112484.</w:t>
+            </w:r>
+          </w:p>
+        </w:tc>
+        <w:tc>
+          <w:tcPr>
+            <w:tcW w:type="dxa" w:w="1872"/>
+          </w:tcPr>
+          <w:p>
+            <w:r>
+              <w:rPr>
+                <w:rFonts w:ascii="Times New Roman" w:hAnsi="Times New Roman"/>
+                <w:sz w:val="18"/>
+              </w:rPr>
+              <w:t>No Nigerian sample or extractable Nigeria-specific result.</w:t>
+            </w:r>
+          </w:p>
+        </w:tc>
+      </w:tr>
+    </w:tbl>
+    <w:p>
+      <w:r>
+        <w:rPr>
+          <w:rFonts w:ascii="Times New Roman" w:hAnsi="Times New Roman"/>
+          <w:sz w:val="22"/>
+        </w:rPr>
+        <w:t>Batch arithmetic: 6 assessed; 5 provisionally eligible; 1 full-text exclusion; 288 candidates remain pending; 0 final included studies claimed.</w:t>
+      </w:r>
+    </w:p>
     <w:sectPr>
       <w:pgSz w:w="12240" w:h="15840"/>
       <w:pgMar w:top="1440" w:right="1440" w:bottom="1440" w:left="1440" w:header="720" w:footer="720" w:gutter="0"/>

</xml_diff>